<commit_message>
Rewrite Master Presentation Guide in ultra-clear, simple plain English
</commit_message>
<xml_diff>
--- a/AMHARIC_MAMBA_PRESENTATION_MASTER_GUIDE.docx
+++ b/AMHARIC_MAMBA_PRESENTATION_MASTER_GUIDE.docx
@@ -14,7 +14,7 @@
           <w:color w:val="1B365D"/>
           <w:sz w:val="34"/>
         </w:rPr>
-        <w:t>MASTER PRESENTATION STUDY GUIDE &amp; DEFENSE CHEAT SHEET</w:t>
+        <w:t>THE COMPLETE SIMPLE-ENGLISH STUDY GUIDE</w:t>
       </w:r>
     </w:p>
     <w:p>
@@ -27,9 +27,9 @@
           <w:rFonts w:ascii="Arial" w:hAnsi="Arial"/>
           <w:b/>
           <w:color w:val="4A607A"/>
-          <w:sz w:val="23"/>
+          <w:sz w:val="22"/>
         </w:rPr>
-        <w:t>Byte-Level Mamba vs. Transformer for Amharic with Brain-Inspired Continual Learning (Hayyuu)</w:t>
+        <w:t>Everything About Your Research Explained in Simple, Clear Words Without Confusing Jargon</w:t>
       </w:r>
     </w:p>
     <w:p>
@@ -44,7 +44,7 @@
           <w:color w:val="5A5A5A"/>
           <w:sz w:val="19"/>
         </w:rPr>
-        <w:t>Presenter &amp; Author: Beknan Chemeda  |  Project: Data- &amp; Compute-Efficient Generative AI</w:t>
+        <w:t>Presenter: Beknan Chemeda  |  Project: Amharic Byte Mamba &amp; Hayyuu AI</w:t>
       </w:r>
     </w:p>
     <w:p>
@@ -53,7 +53,7 @@
         <w:spacing w:before="200" w:after="80"/>
       </w:pPr>
       <w:r>
-        <w:t>1. The 30-Second Elevator Pitch (Start Your Talk With This)</w:t>
+        <w:t>1. The Big Story: What is this project about in 1 minute?</w:t>
       </w:r>
     </w:p>
     <w:tbl>
@@ -70,7 +70,7 @@
         <w:tc>
           <w:tcPr>
             <w:tcW w:type="dxa" w:w="10080"/>
-            <w:shd w:fill="EBF5EE"/>
+            <w:shd w:fill="D1E7DD"/>
             <w:tcMar>
               <w:top w:w="140" w:type="dxa"/>
               <w:bottom w:w="140" w:type="dxa"/>
@@ -86,18 +86,18 @@
               <w:rPr>
                 <w:rFonts w:ascii="Arial" w:hAnsi="Arial"/>
                 <w:b/>
-                <w:color w:val="0D5C3A"/>
+                <w:color w:val="0F5132"/>
                 <w:sz w:val="20"/>
               </w:rPr>
-              <w:t xml:space="preserve">💡 30-SECOND OPENING PITCH: </w:t>
+              <w:t xml:space="preserve">💡 THE SIMPLE SUMMARY YOU CAN SAY TO ANYONE: </w:t>
             </w:r>
             <w:r>
               <w:rPr>
                 <w:rFonts w:ascii="Arial" w:hAnsi="Arial"/>
-                <w:color w:val="282828"/>
+                <w:color w:val="1E1E1E"/>
                 <w:sz w:val="19"/>
               </w:rPr>
-              <w:t>"Current AI models like GPT-4 rely on subword tokenizers that charge a heavy 'Token Tax' on Ethiopian languages—splitting a single Amharic word into 7+ byte fragments and wasting up to 63% of model parameters on vocabulary embedding tables. In this research, we eliminated the tokenizer entirely by feeding raw UTF-8 bytes directly into Mamba (Selective State Space Model), which processes sequences in linear time O(L) instead of quadratic O(L²). We proved that a 2.7M byte-level Mamba outperforms a 13M Transformer while consuming 3x less memory. Furthermore, to solve catastrophic forgetting, we designed a biologically inspired dual-memory system (Hayyuu) that learns new facts in 0.01 seconds and consolidates them into permanent neural weights during sleep!"</w:t>
+              <w:t>Imagine you are trying to teach a computer to speak Amharic. Today's big AI tools (like ChatGPT) were built for English. When they try to read Amharic, they get confused: they cut single Amharic words into 7 or 8 tiny broken pieces. This makes normal models slow, heavy, and wasteful. In our research, we solved this completely! We threw away the word-cutter program and let the AI read raw computer bytes directly using a new, fast model called 'Mamba'. Our small Mamba model beat a model 5 times its size! Then, we gave it a brain memory like a human: it can learn new facts in 0.01 seconds and remembers them permanently by 'sleeping' and replaying them.</w:t>
             </w:r>
           </w:p>
         </w:tc>
@@ -114,7 +114,7 @@
         <w:spacing w:before="240" w:after="80"/>
       </w:pPr>
       <w:r>
-        <w:t>2. The Three Core Research Problems We Solved</w:t>
+        <w:t>2. The 4 Problems We Solved (With Real-Life Analogies)</w:t>
       </w:r>
     </w:p>
     <w:p>
@@ -128,14 +128,14 @@
           <w:color w:val="1B365D"/>
           <w:sz w:val="19"/>
         </w:rPr>
-        <w:t xml:space="preserve">• Problem 1: The Amharic Data Ceiling (&lt;500M Words): </w:t>
+        <w:t xml:space="preserve">• Problem 1: The 'Small Library' Problem (Low-Resource Data): </w:t>
       </w:r>
       <w:r>
         <w:rPr>
           <w:rFonts w:ascii="Arial" w:hAnsi="Arial"/>
           <w:sz w:val="19"/>
         </w:rPr>
-        <w:t>Unlike English which has trillions of web tokens, clean digital Amharic is scarce (&lt;500M words in the entire world). Machine-translated data introduces corrupt grammar. Therefore, AI for Amharic CANNOT scale by brute-force data collection; it requires extreme architectural efficiency.</w:t>
+        <w:t>In English, AI companies download trillions of words from the internet. But for Amharic, the entire world has less than 500 million clean words online. You cannot just download more data because it doesn't exist. If you use machine-translated English text, it has bad grammar and ruins the AI. Therefore, we had to make the AI model itself much smarter and more efficient with the data we have.</w:t>
       </w:r>
     </w:p>
     <w:p>
@@ -149,14 +149,14 @@
           <w:color w:val="1B365D"/>
           <w:sz w:val="19"/>
         </w:rPr>
-        <w:t xml:space="preserve">• Problem 2: The Token Tax &amp; Parameter Allocation Tax: </w:t>
+        <w:t xml:space="preserve">• Problem 2: The 'Broken Word' Problem (The Tokenizer / Token Tax): </w:t>
       </w:r>
       <w:r>
         <w:rPr>
           <w:rFonts w:ascii="Arial" w:hAnsi="Arial"/>
           <w:sz w:val="19"/>
         </w:rPr>
-        <w:t>Standard tokenizers (SentencePiece/BPE) are biased towards Latin alphabets. Ge'ez characters (Unicode U+1200 to U+137F) require 3 bytes per character in UTF-8. In standard tokenized models, 62.8% of all trainable parameters are wasted on the vocabulary embedding matrix (Embedding Tax) rather than reasoning layers.</w:t>
+        <w:t>Before an AI reads words, it uses a helper program called a 'tokenizer' (a word-cutter). Tokenizers were built for English words like 'apple' -&gt; 1 token. But when it sees an Amharic word like 'ኢትዮጵያ', it gets confused because Ge'ez letters take 3 raw computer bytes each. It cuts that one word into 7 or 8 pieces! This means an Amharic speaker has to use 3 to 7 times more computer power and money than an English speaker for the exact same message. We call this unfair cost the 'Token Tax'.</w:t>
       </w:r>
     </w:p>
     <w:p>
@@ -170,14 +170,14 @@
           <w:color w:val="1B365D"/>
           <w:sz w:val="19"/>
         </w:rPr>
-        <w:t xml:space="preserve">• Problem 3: Quadratic Attention Bottleneck O(L²): </w:t>
+        <w:t xml:space="preserve">• Problem 3: The 'Dictionary Waste' Problem (Parameter Tax): </w:t>
       </w:r>
       <w:r>
         <w:rPr>
           <w:rFonts w:ascii="Arial" w:hAnsi="Arial"/>
           <w:sz w:val="19"/>
         </w:rPr>
-        <w:t>Because Amharic byte sequences are 3.5x longer than English token sequences, standard Transformer Self-Attention becomes computationally prohibitive (memory and compute scale with sequence length squared: O(L²)). Mamba scales linearly O(L).</w:t>
+        <w:t>To use a normal tokenizer, the AI must build a massive dictionary table (e.g., 32,000 words). In a small 13-million parameter model, 8.2 million of those parameters (62.8% of the entire model!) were trapped just holding that dictionary list! Only 37% was left for actual thinking and grammar. That is like buying a 100-page book where 63 pages are just an empty index list.</w:t>
       </w:r>
     </w:p>
     <w:p>
@@ -191,14 +191,14 @@
           <w:color w:val="1B365D"/>
           <w:sz w:val="19"/>
         </w:rPr>
-        <w:t xml:space="preserve">• Problem 4: Catastrophic Forgetting in Continual Learning: </w:t>
+        <w:t xml:space="preserve">• Problem 4: The 'Amnesia' Problem (Catastrophic Forgetting): </w:t>
       </w:r>
       <w:r>
         <w:rPr>
           <w:rFonts w:ascii="Arial" w:hAnsi="Arial"/>
           <w:sz w:val="19"/>
         </w:rPr>
-        <w:t>When standard LLMs are updated on new news or live facts via backpropagation, their neural weights overwrite previously learned grammatical knowledge (Stability-Plasticity Dilemma). Our brain-inspired dual-memory solves this with zero forgetting.</w:t>
+        <w:t>Normal AI models have a huge flaw: if you teach them today's new news via standard training, their brain overwrites what they learned before. They learn the new fact, but suddenly forget basic grammar (they start repeating words and babbling). This is called Catastrophic Forgetting.</w:t>
       </w:r>
     </w:p>
     <w:p>
@@ -207,7 +207,79 @@
         <w:spacing w:before="240" w:after="80"/>
       </w:pPr>
       <w:r>
-        <w:t>3. Technical Glossary: Definitions of Every Key Term</w:t>
+        <w:t>3. The 3 Solutions We Built</w:t>
+      </w:r>
+    </w:p>
+    <w:p>
+      <w:pPr>
+        <w:spacing w:before="60" w:after="60" w:line="276" w:lineRule="auto"/>
+      </w:pPr>
+      <w:r>
+        <w:rPr>
+          <w:rFonts w:ascii="Arial" w:hAnsi="Arial"/>
+          <w:b/>
+          <w:color w:val="0F5132"/>
+          <w:sz w:val="19"/>
+        </w:rPr>
+        <w:t xml:space="preserve">✅ Solution 1: Byte-Level AI (Throwing Away the Word Cutter): </w:t>
+      </w:r>
+      <w:r>
+        <w:rPr>
+          <w:rFonts w:ascii="Arial" w:hAnsi="Arial"/>
+          <w:sz w:val="19"/>
+        </w:rPr>
+        <w:t>Instead of guessing how to cut Amharic words with a broken tokenizer, we threw away the tokenizer completely! Computers store everything as numbers from 0 to 255 (raw bytes). We let the AI read raw bytes directly. Now, the dictionary table has only 256 entries instead of 32,000! This means 97.7% of the model's brain is free for pure thinking and grammar.</w:t>
+      </w:r>
+    </w:p>
+    <w:p>
+      <w:pPr>
+        <w:spacing w:before="60" w:after="60" w:line="276" w:lineRule="auto"/>
+      </w:pPr>
+      <w:r>
+        <w:rPr>
+          <w:rFonts w:ascii="Arial" w:hAnsi="Arial"/>
+          <w:b/>
+          <w:color w:val="0F5132"/>
+          <w:sz w:val="19"/>
+        </w:rPr>
+        <w:t xml:space="preserve">✅ Solution 2: Mamba SSM (A Fast Reader That Never Slows Down): </w:t>
+      </w:r>
+      <w:r>
+        <w:rPr>
+          <w:rFonts w:ascii="Arial" w:hAnsi="Arial"/>
+          <w:sz w:val="19"/>
+        </w:rPr>
+        <w:t>When you give raw bytes to a normal Transformer (like GPT), it becomes extremely slow because Transformer attention scales quadratically O(L²)—if text is 3x longer, it takes 9x to 12x more memory. Mamba is a new architecture called a State Space Model. It scans text in a smooth straight line (Linear Time O(L)). It never slows down and uses 3x less GPU memory!</w:t>
+      </w:r>
+    </w:p>
+    <w:p>
+      <w:pPr>
+        <w:spacing w:before="60" w:after="60" w:line="276" w:lineRule="auto"/>
+      </w:pPr>
+      <w:r>
+        <w:rPr>
+          <w:rFonts w:ascii="Arial" w:hAnsi="Arial"/>
+          <w:b/>
+          <w:color w:val="0F5132"/>
+          <w:sz w:val="19"/>
+        </w:rPr>
+        <w:t xml:space="preserve">✅ Solution 3: Human Brain Memory (Fast Notebook + Slow Brain + Sleep Replay): </w:t>
+      </w:r>
+      <w:r>
+        <w:rPr>
+          <w:rFonts w:ascii="Arial" w:hAnsi="Arial"/>
+          <w:sz w:val="19"/>
+        </w:rPr>
+        <w:t>How do humans learn news without forgetting how to speak? The human brain has two parts: (1) A fast Hippocampus (like a quick notepad for today's events) and (2) A slow Neocortex (for permanent language grammar). We copied this! Our model writes new facts to a fast memory matrix in 0.01 seconds without touching its main brain. Then, when it 'sleeps', it replays the facts 20 times faster into its permanent neural weights!</w:t>
+      </w:r>
+    </w:p>
+    <w:p>
+      <w:pPr>
+        <w:pStyle w:val="Heading1"/>
+        <w:spacing w:before="240" w:after="80"/>
+      </w:pPr>
+      <w:r>
+        <w:t>4. Plain-English Dictionary: Simple Definitions of Every Term</w:t>
       </w:r>
     </w:p>
     <w:p>
@@ -221,14 +293,14 @@
           <w:color w:val="8A3B14"/>
           <w:sz w:val="19"/>
         </w:rPr>
-        <w:t xml:space="preserve">📌 Bits-per-Byte (BPB): </w:t>
+        <w:t xml:space="preserve">📖 Bits-Per-Byte (BPB): </w:t>
       </w:r>
       <w:r>
         <w:rPr>
           <w:rFonts w:ascii="Arial" w:hAnsi="Arial"/>
           <w:sz w:val="19"/>
         </w:rPr>
-        <w:t>The mathematically rigorous metric used to compare language models across different tokenizers. Perplexity cannot be compared between a tokenizer with 32k pieces and a byte model (256 pieces). BPB measures the exact information bits required to compress one raw byte: BPB = CrossEntropyLoss / ln(2) * (Tokens/Bytes). Lower is better.</w:t>
+        <w:t>How we measure model performance. Think of it like measuring fuel economy in 'Liters per 100km'. You cannot compare two models using 'Perplexity' if one uses words and the other uses bytes. BPB measures the exact computer bits needed to guess one byte of text. LOWER BPB MEANS A SMARTER, BETTER MODEL.</w:t>
       </w:r>
     </w:p>
     <w:p>
@@ -242,14 +314,14 @@
           <w:color w:val="8A3B14"/>
           <w:sz w:val="19"/>
         </w:rPr>
-        <w:t xml:space="preserve">📌 Mamba (Selective State Space Model - S6): </w:t>
+        <w:t xml:space="preserve">📖 Transformer: </w:t>
       </w:r>
       <w:r>
         <w:rPr>
           <w:rFonts w:ascii="Arial" w:hAnsi="Arial"/>
           <w:sz w:val="19"/>
         </w:rPr>
-        <w:t>A modern neural network architecture that replaces Transformer self-attention with a continuous state-space recurrence. It processes long sequences in O(L) linear time while dynamically selecting what information to remember or forget based on the current input.</w:t>
+        <w:t>The traditional AI architecture used in GPT-4. It compares every word to every other word (Self-Attention). It is great for English, but gets very slow and memory-hungry on long byte text.</w:t>
       </w:r>
     </w:p>
     <w:p>
@@ -263,14 +335,14 @@
           <w:color w:val="8A3B14"/>
           <w:sz w:val="19"/>
         </w:rPr>
-        <w:t xml:space="preserve">📌 Token Tax &amp; Fertility Ratio: </w:t>
+        <w:t xml:space="preserve">📖 Mamba (Selective State Space Model): </w:t>
       </w:r>
       <w:r>
         <w:rPr>
           <w:rFonts w:ascii="Arial" w:hAnsi="Arial"/>
           <w:sz w:val="19"/>
         </w:rPr>
-        <w:t>The ratio of token count to byte count or word count. In Amharic, standard tokenizers generate ~3.5 tokens per word (Fertility = 3.5), meaning an Amharic speaker pays 3.5x more computational cost and latency than an English speaker for the same meaning.</w:t>
+        <w:t>A new, modern AI architecture. Instead of comparing all words to all words, it reads text in a smooth sequence and keeps a rolling mental summary. It is fast, lightweight, and uses linear computer power.</w:t>
       </w:r>
     </w:p>
     <w:p>
@@ -284,14 +356,14 @@
           <w:color w:val="8A3B14"/>
           <w:sz w:val="19"/>
         </w:rPr>
-        <w:t xml:space="preserve">📌 Parameter Allocation Tax: </w:t>
+        <w:t xml:space="preserve">📖 Token Tax: </w:t>
       </w:r>
       <w:r>
         <w:rPr>
           <w:rFonts w:ascii="Arial" w:hAnsi="Arial"/>
           <w:sz w:val="19"/>
         </w:rPr>
-        <w:t>The percentage of a model's total parameter count dedicated exclusively to the embedding layer (vocab_size * d_model). For 32k tokenized Transformer, 62.8% of weights were trapped in embeddings. For Byte-Level Mamba (vocab=256), only 2.3% is used for embeddings, freeing 97.7% of parameters for deep reasoning!</w:t>
+        <w:t>The unfair computational penalty paid by non-English languages because standard tokenizers break their words into multiple pieces.</w:t>
       </w:r>
     </w:p>
     <w:p>
@@ -305,14 +377,14 @@
           <w:color w:val="8A3B14"/>
           <w:sz w:val="19"/>
         </w:rPr>
-        <w:t xml:space="preserve">📌 Catastrophic Forgetting: </w:t>
+        <w:t xml:space="preserve">📖 Parameter Allocation Tax: </w:t>
       </w:r>
       <w:r>
         <w:rPr>
           <w:rFonts w:ascii="Arial" w:hAnsi="Arial"/>
           <w:sz w:val="19"/>
         </w:rPr>
-        <w:t>The tendency of artificial neural networks to completely and abruptly erase previously learned knowledge upon learning new information. It is the primary obstacle to lifelong continual learning in AI.</w:t>
+        <w:t>The percentage of an AI model's brain capacity wasted on holding a dictionary list instead of thinking layers.</w:t>
       </w:r>
     </w:p>
     <w:p>
@@ -326,14 +398,14 @@
           <w:color w:val="8A3B14"/>
           <w:sz w:val="19"/>
         </w:rPr>
-        <w:t xml:space="preserve">📌 Hebbian Learning &amp; Anti-Hopfield Engrams: </w:t>
+        <w:t xml:space="preserve">📖 Hebbian Learning: </w:t>
       </w:r>
       <w:r>
         <w:rPr>
           <w:rFonts w:ascii="Arial" w:hAnsi="Arial"/>
           <w:sz w:val="19"/>
         </w:rPr>
-        <w:t>"Neurons that fire together wire together." A biological 1-shot associative memory rule where memory weights (M) are updated via outer products of normalized key-value vectors: ΔM = η (v - M k) kᵀ without performing expensive backpropagation.</w:t>
+        <w:t>"Neurons that fire together, wire together." A simple biological formula that lets the computer remember a new fact in 0.01 seconds by connecting numbers directly, without running slow training calculations.</w:t>
       </w:r>
     </w:p>
     <w:p>
@@ -347,14 +419,14 @@
           <w:color w:val="8A3B14"/>
           <w:sz w:val="19"/>
         </w:rPr>
-        <w:t xml:space="preserve">📌 Complementary Learning Systems (CLS): </w:t>
+        <w:t xml:space="preserve">📖 Synaptic Consolidation (Sleep Replay): </w:t>
       </w:r>
       <w:r>
         <w:rPr>
           <w:rFonts w:ascii="Arial" w:hAnsi="Arial"/>
           <w:sz w:val="19"/>
         </w:rPr>
-        <w:t>The neuroscience theory (McClelland et al.) stating human memory relies on two collaborating structures: the fast Hippocampus (episodic, 1-shot fact learning) and the slow Neocortex (semantic, gradual generalization). We replicated this with Hebbian Fast Memory + Mamba Neocortex.</w:t>
+        <w:t>What the brain does at night: taking the short-term facts from the day and replaying them quickly into the permanent brain circuits so you never forget them.</w:t>
       </w:r>
     </w:p>
     <w:p>
@@ -368,14 +440,14 @@
           <w:color w:val="8A3B14"/>
           <w:sz w:val="19"/>
         </w:rPr>
-        <w:t xml:space="preserve">📌 Synaptic Consolidation (Sharp-Wave Ripple Replay): </w:t>
+        <w:t xml:space="preserve">📖 SFT (Supervised Fine-Tuning): </w:t>
       </w:r>
       <w:r>
         <w:rPr>
           <w:rFonts w:ascii="Arial" w:hAnsi="Arial"/>
           <w:sz w:val="19"/>
         </w:rPr>
-        <w:t>The biological process during NREM sleep where the hippocampus replays daytime memories at high speed (20x) into neocortical circuits, integrating new facts permanently without disrupting core linguistic grammar.</w:t>
+        <w:t>Teaching the AI how to behave like a helpful assistant by training on question-and-answer pairs.</w:t>
       </w:r>
     </w:p>
     <w:p>
@@ -389,14 +461,14 @@
           <w:color w:val="8A3B14"/>
           <w:sz w:val="19"/>
         </w:rPr>
-        <w:t xml:space="preserve">📌 Prompt-Loss Masking (SFT): </w:t>
+        <w:t xml:space="preserve">📖 Prompt-Loss Masking: </w:t>
       </w:r>
       <w:r>
         <w:rPr>
           <w:rFonts w:ascii="Arial" w:hAnsi="Arial"/>
           <w:sz w:val="19"/>
         </w:rPr>
-        <w:t>In Supervised Fine-Tuning, setting target loss labels to -100 for the user prompt so the model is only penalized on generating the correct assistant response, preventing prompt memorization.</w:t>
+        <w:t>Telling the AI: 'Don't grade yourself on the user's question; only grade yourself on giving the correct answer.'</w:t>
       </w:r>
     </w:p>
     <w:p>
@@ -410,14 +482,14 @@
           <w:color w:val="8A3B14"/>
           <w:sz w:val="19"/>
         </w:rPr>
-        <w:t xml:space="preserve">📌 Replay Buffer Anchoring (RLHF/RLAIF): </w:t>
+        <w:t xml:space="preserve">📖 Hayyuu: </w:t>
       </w:r>
       <w:r>
         <w:rPr>
           <w:rFonts w:ascii="Arial" w:hAnsi="Arial"/>
           <w:sz w:val="19"/>
         </w:rPr>
-        <w:t>A technique that injects foundational anchor pairs (Identity, Geography, Grammar) into online reinforcement learning gradient updates to prevent 'Mode Collapse' (where a model over-optimizes a single rewarded string).</w:t>
+        <w:t>The name of our living AI assistant deployed on Telegram. Named after the Oromo word for a wise elder / counselor / scholar.</w:t>
       </w:r>
     </w:p>
     <w:p>
@@ -426,7 +498,7 @@
         <w:spacing w:before="240" w:after="80"/>
       </w:pPr>
       <w:r>
-        <w:t>4. Experimental Results &amp; Benchmark Comparisons</w:t>
+        <w:t>5. The Results: How to Explain the Numbers Simply</w:t>
       </w:r>
     </w:p>
     <w:p>
@@ -434,687 +506,7 @@
         <w:rPr>
           <w:b/>
         </w:rPr>
-        <w:t>Table 1: Pre-Training Architecture Benchmark on 1.465 GB Amharic Corpus</w:t>
-      </w:r>
-    </w:p>
-    <w:tbl>
-      <w:tblPr>
-        <w:tblW w:type="auto" w:w="0"/>
-        <w:jc w:val="center"/>
-        <w:tblLook w:firstColumn="1" w:firstRow="1" w:lastColumn="0" w:lastRow="0" w:noHBand="0" w:noVBand="1" w:val="04A0"/>
-      </w:tblPr>
-      <w:tblGrid>
-        <w:gridCol w:w="1680"/>
-        <w:gridCol w:w="1680"/>
-        <w:gridCol w:w="1680"/>
-        <w:gridCol w:w="1680"/>
-        <w:gridCol w:w="1680"/>
-        <w:gridCol w:w="1680"/>
-      </w:tblGrid>
-      <w:tr>
-        <w:tc>
-          <w:tcPr>
-            <w:tcW w:type="dxa" w:w="1680"/>
-            <w:shd w:fill="1B365D"/>
-            <w:tcMar>
-              <w:top w:w="80" w:type="dxa"/>
-              <w:bottom w:w="80" w:type="dxa"/>
-              <w:left w:w="100" w:type="dxa"/>
-              <w:right w:w="100" w:type="dxa"/>
-            </w:tcMar>
-          </w:tcPr>
-          <w:p>
-            <w:r>
-              <w:rPr>
-                <w:rFonts w:ascii="Arial" w:hAnsi="Arial"/>
-                <w:b/>
-                <w:color w:val="FFFFFF"/>
-                <w:sz w:val="17"/>
-              </w:rPr>
-              <w:t>Model Architecture</w:t>
-            </w:r>
-          </w:p>
-        </w:tc>
-        <w:tc>
-          <w:tcPr>
-            <w:tcW w:type="dxa" w:w="1680"/>
-            <w:shd w:fill="1B365D"/>
-            <w:tcMar>
-              <w:top w:w="80" w:type="dxa"/>
-              <w:bottom w:w="80" w:type="dxa"/>
-              <w:left w:w="100" w:type="dxa"/>
-              <w:right w:w="100" w:type="dxa"/>
-            </w:tcMar>
-          </w:tcPr>
-          <w:p>
-            <w:r>
-              <w:rPr>
-                <w:rFonts w:ascii="Arial" w:hAnsi="Arial"/>
-                <w:b/>
-                <w:color w:val="FFFFFF"/>
-                <w:sz w:val="17"/>
-              </w:rPr>
-              <w:t>Vocab / Input</w:t>
-            </w:r>
-          </w:p>
-        </w:tc>
-        <w:tc>
-          <w:tcPr>
-            <w:tcW w:type="dxa" w:w="1680"/>
-            <w:shd w:fill="1B365D"/>
-            <w:tcMar>
-              <w:top w:w="80" w:type="dxa"/>
-              <w:bottom w:w="80" w:type="dxa"/>
-              <w:left w:w="100" w:type="dxa"/>
-              <w:right w:w="100" w:type="dxa"/>
-            </w:tcMar>
-          </w:tcPr>
-          <w:p>
-            <w:r>
-              <w:rPr>
-                <w:rFonts w:ascii="Arial" w:hAnsi="Arial"/>
-                <w:b/>
-                <w:color w:val="FFFFFF"/>
-                <w:sz w:val="17"/>
-              </w:rPr>
-              <w:t>Total Params</w:t>
-            </w:r>
-          </w:p>
-        </w:tc>
-        <w:tc>
-          <w:tcPr>
-            <w:tcW w:type="dxa" w:w="1680"/>
-            <w:shd w:fill="1B365D"/>
-            <w:tcMar>
-              <w:top w:w="80" w:type="dxa"/>
-              <w:bottom w:w="80" w:type="dxa"/>
-              <w:left w:w="100" w:type="dxa"/>
-              <w:right w:w="100" w:type="dxa"/>
-            </w:tcMar>
-          </w:tcPr>
-          <w:p>
-            <w:r>
-              <w:rPr>
-                <w:rFonts w:ascii="Arial" w:hAnsi="Arial"/>
-                <w:b/>
-                <w:color w:val="FFFFFF"/>
-                <w:sz w:val="17"/>
-              </w:rPr>
-              <w:t>Embed Tax (%)</w:t>
-            </w:r>
-          </w:p>
-        </w:tc>
-        <w:tc>
-          <w:tcPr>
-            <w:tcW w:type="dxa" w:w="1680"/>
-            <w:shd w:fill="1B365D"/>
-            <w:tcMar>
-              <w:top w:w="80" w:type="dxa"/>
-              <w:bottom w:w="80" w:type="dxa"/>
-              <w:left w:w="100" w:type="dxa"/>
-              <w:right w:w="100" w:type="dxa"/>
-            </w:tcMar>
-          </w:tcPr>
-          <w:p>
-            <w:r>
-              <w:rPr>
-                <w:rFonts w:ascii="Arial" w:hAnsi="Arial"/>
-                <w:b/>
-                <w:color w:val="FFFFFF"/>
-                <w:sz w:val="17"/>
-              </w:rPr>
-              <w:t>Val Loss (BPB)</w:t>
-            </w:r>
-          </w:p>
-        </w:tc>
-        <w:tc>
-          <w:tcPr>
-            <w:tcW w:type="dxa" w:w="1680"/>
-            <w:shd w:fill="1B365D"/>
-            <w:tcMar>
-              <w:top w:w="80" w:type="dxa"/>
-              <w:bottom w:w="80" w:type="dxa"/>
-              <w:left w:w="100" w:type="dxa"/>
-              <w:right w:w="100" w:type="dxa"/>
-            </w:tcMar>
-          </w:tcPr>
-          <w:p>
-            <w:r>
-              <w:rPr>
-                <w:rFonts w:ascii="Arial" w:hAnsi="Arial"/>
-                <w:b/>
-                <w:color w:val="FFFFFF"/>
-                <w:sz w:val="17"/>
-              </w:rPr>
-              <w:t>Linear Complexity</w:t>
-            </w:r>
-          </w:p>
-        </w:tc>
-      </w:tr>
-      <w:tr>
-        <w:tc>
-          <w:tcPr>
-            <w:tcW w:type="dxa" w:w="1680"/>
-            <w:shd w:fill="FAFAFA"/>
-            <w:tcMar>
-              <w:top w:w="70" w:type="dxa"/>
-              <w:bottom w:w="70" w:type="dxa"/>
-              <w:left w:w="90" w:type="dxa"/>
-              <w:right w:w="90" w:type="dxa"/>
-            </w:tcMar>
-          </w:tcPr>
-          <w:p>
-            <w:r>
-              <w:rPr>
-                <w:rFonts w:ascii="Arial" w:hAnsi="Arial"/>
-                <w:sz w:val="17"/>
-              </w:rPr>
-              <w:t>Transformer (32k)</w:t>
-            </w:r>
-          </w:p>
-        </w:tc>
-        <w:tc>
-          <w:tcPr>
-            <w:tcW w:type="dxa" w:w="1680"/>
-            <w:shd w:fill="FAFAFA"/>
-            <w:tcMar>
-              <w:top w:w="70" w:type="dxa"/>
-              <w:bottom w:w="70" w:type="dxa"/>
-              <w:left w:w="90" w:type="dxa"/>
-              <w:right w:w="90" w:type="dxa"/>
-            </w:tcMar>
-          </w:tcPr>
-          <w:p>
-            <w:r>
-              <w:rPr>
-                <w:rFonts w:ascii="Arial" w:hAnsi="Arial"/>
-                <w:sz w:val="17"/>
-              </w:rPr>
-              <w:t>SentencePiece 32k</w:t>
-            </w:r>
-          </w:p>
-        </w:tc>
-        <w:tc>
-          <w:tcPr>
-            <w:tcW w:type="dxa" w:w="1680"/>
-            <w:shd w:fill="FAFAFA"/>
-            <w:tcMar>
-              <w:top w:w="70" w:type="dxa"/>
-              <w:bottom w:w="70" w:type="dxa"/>
-              <w:left w:w="90" w:type="dxa"/>
-              <w:right w:w="90" w:type="dxa"/>
-            </w:tcMar>
-          </w:tcPr>
-          <w:p>
-            <w:r>
-              <w:rPr>
-                <w:rFonts w:ascii="Arial" w:hAnsi="Arial"/>
-                <w:sz w:val="17"/>
-              </w:rPr>
-              <w:t>13.04 M</w:t>
-            </w:r>
-          </w:p>
-        </w:tc>
-        <w:tc>
-          <w:tcPr>
-            <w:tcW w:type="dxa" w:w="1680"/>
-            <w:shd w:fill="FDF2E9"/>
-            <w:tcMar>
-              <w:top w:w="70" w:type="dxa"/>
-              <w:bottom w:w="70" w:type="dxa"/>
-              <w:left w:w="90" w:type="dxa"/>
-              <w:right w:w="90" w:type="dxa"/>
-            </w:tcMar>
-          </w:tcPr>
-          <w:p>
-            <w:r>
-              <w:rPr>
-                <w:rFonts w:ascii="Arial" w:hAnsi="Arial"/>
-                <w:sz w:val="17"/>
-              </w:rPr>
-              <w:t>62.8% (Wasted)</w:t>
-            </w:r>
-          </w:p>
-        </w:tc>
-        <w:tc>
-          <w:tcPr>
-            <w:tcW w:type="dxa" w:w="1680"/>
-            <w:shd w:fill="FAFAFA"/>
-            <w:tcMar>
-              <w:top w:w="70" w:type="dxa"/>
-              <w:bottom w:w="70" w:type="dxa"/>
-              <w:left w:w="90" w:type="dxa"/>
-              <w:right w:w="90" w:type="dxa"/>
-            </w:tcMar>
-          </w:tcPr>
-          <w:p>
-            <w:r>
-              <w:rPr>
-                <w:rFonts w:ascii="Arial" w:hAnsi="Arial"/>
-                <w:sz w:val="17"/>
-              </w:rPr>
-              <w:t>1.5790 BPB</w:t>
-            </w:r>
-          </w:p>
-        </w:tc>
-        <w:tc>
-          <w:tcPr>
-            <w:tcW w:type="dxa" w:w="1680"/>
-            <w:shd w:fill="FAFAFA"/>
-            <w:tcMar>
-              <w:top w:w="70" w:type="dxa"/>
-              <w:bottom w:w="70" w:type="dxa"/>
-              <w:left w:w="90" w:type="dxa"/>
-              <w:right w:w="90" w:type="dxa"/>
-            </w:tcMar>
-          </w:tcPr>
-          <w:p>
-            <w:r>
-              <w:rPr>
-                <w:rFonts w:ascii="Arial" w:hAnsi="Arial"/>
-                <w:sz w:val="17"/>
-              </w:rPr>
-              <w:t>Quadratic O(L²) ❌</w:t>
-            </w:r>
-          </w:p>
-        </w:tc>
-      </w:tr>
-      <w:tr>
-        <w:tc>
-          <w:tcPr>
-            <w:tcW w:type="dxa" w:w="1680"/>
-            <w:shd w:fill="FFFFFF"/>
-            <w:tcMar>
-              <w:top w:w="70" w:type="dxa"/>
-              <w:bottom w:w="70" w:type="dxa"/>
-              <w:left w:w="90" w:type="dxa"/>
-              <w:right w:w="90" w:type="dxa"/>
-            </w:tcMar>
-          </w:tcPr>
-          <w:p>
-            <w:r>
-              <w:rPr>
-                <w:rFonts w:ascii="Arial" w:hAnsi="Arial"/>
-                <w:sz w:val="17"/>
-              </w:rPr>
-              <w:t>Transformer (16k)</w:t>
-            </w:r>
-          </w:p>
-        </w:tc>
-        <w:tc>
-          <w:tcPr>
-            <w:tcW w:type="dxa" w:w="1680"/>
-            <w:shd w:fill="FFFFFF"/>
-            <w:tcMar>
-              <w:top w:w="70" w:type="dxa"/>
-              <w:bottom w:w="70" w:type="dxa"/>
-              <w:left w:w="90" w:type="dxa"/>
-              <w:right w:w="90" w:type="dxa"/>
-            </w:tcMar>
-          </w:tcPr>
-          <w:p>
-            <w:r>
-              <w:rPr>
-                <w:rFonts w:ascii="Arial" w:hAnsi="Arial"/>
-                <w:sz w:val="17"/>
-              </w:rPr>
-              <w:t>SentencePiece 16k</w:t>
-            </w:r>
-          </w:p>
-        </w:tc>
-        <w:tc>
-          <w:tcPr>
-            <w:tcW w:type="dxa" w:w="1680"/>
-            <w:shd w:fill="FFFFFF"/>
-            <w:tcMar>
-              <w:top w:w="70" w:type="dxa"/>
-              <w:bottom w:w="70" w:type="dxa"/>
-              <w:left w:w="90" w:type="dxa"/>
-              <w:right w:w="90" w:type="dxa"/>
-            </w:tcMar>
-          </w:tcPr>
-          <w:p>
-            <w:r>
-              <w:rPr>
-                <w:rFonts w:ascii="Arial" w:hAnsi="Arial"/>
-                <w:sz w:val="17"/>
-              </w:rPr>
-              <w:t>8.96 M</w:t>
-            </w:r>
-          </w:p>
-        </w:tc>
-        <w:tc>
-          <w:tcPr>
-            <w:tcW w:type="dxa" w:w="1680"/>
-            <w:shd w:fill="FFFFFF"/>
-            <w:tcMar>
-              <w:top w:w="70" w:type="dxa"/>
-              <w:bottom w:w="70" w:type="dxa"/>
-              <w:left w:w="90" w:type="dxa"/>
-              <w:right w:w="90" w:type="dxa"/>
-            </w:tcMar>
-          </w:tcPr>
-          <w:p>
-            <w:r>
-              <w:rPr>
-                <w:rFonts w:ascii="Arial" w:hAnsi="Arial"/>
-                <w:sz w:val="17"/>
-              </w:rPr>
-              <w:t>45.7%</w:t>
-            </w:r>
-          </w:p>
-        </w:tc>
-        <w:tc>
-          <w:tcPr>
-            <w:tcW w:type="dxa" w:w="1680"/>
-            <w:shd w:fill="FFFFFF"/>
-            <w:tcMar>
-              <w:top w:w="70" w:type="dxa"/>
-              <w:bottom w:w="70" w:type="dxa"/>
-              <w:left w:w="90" w:type="dxa"/>
-              <w:right w:w="90" w:type="dxa"/>
-            </w:tcMar>
-          </w:tcPr>
-          <w:p>
-            <w:r>
-              <w:rPr>
-                <w:rFonts w:ascii="Arial" w:hAnsi="Arial"/>
-                <w:sz w:val="17"/>
-              </w:rPr>
-              <w:t>1.4920 BPB</w:t>
-            </w:r>
-          </w:p>
-        </w:tc>
-        <w:tc>
-          <w:tcPr>
-            <w:tcW w:type="dxa" w:w="1680"/>
-            <w:shd w:fill="FFFFFF"/>
-            <w:tcMar>
-              <w:top w:w="70" w:type="dxa"/>
-              <w:bottom w:w="70" w:type="dxa"/>
-              <w:left w:w="90" w:type="dxa"/>
-              <w:right w:w="90" w:type="dxa"/>
-            </w:tcMar>
-          </w:tcPr>
-          <w:p>
-            <w:r>
-              <w:rPr>
-                <w:rFonts w:ascii="Arial" w:hAnsi="Arial"/>
-                <w:sz w:val="17"/>
-              </w:rPr>
-              <w:t>Quadratic O(L²) ❌</w:t>
-            </w:r>
-          </w:p>
-        </w:tc>
-      </w:tr>
-      <w:tr>
-        <w:tc>
-          <w:tcPr>
-            <w:tcW w:type="dxa" w:w="1680"/>
-            <w:shd w:fill="EBF5EE"/>
-            <w:tcMar>
-              <w:top w:w="70" w:type="dxa"/>
-              <w:bottom w:w="70" w:type="dxa"/>
-              <w:left w:w="90" w:type="dxa"/>
-              <w:right w:w="90" w:type="dxa"/>
-            </w:tcMar>
-          </w:tcPr>
-          <w:p>
-            <w:r>
-              <w:rPr>
-                <w:rFonts w:ascii="Arial" w:hAnsi="Arial"/>
-                <w:sz w:val="17"/>
-              </w:rPr>
-              <w:t>TinyMamba (Byte)</w:t>
-            </w:r>
-          </w:p>
-        </w:tc>
-        <w:tc>
-          <w:tcPr>
-            <w:tcW w:type="dxa" w:w="1680"/>
-            <w:shd w:fill="FAFAFA"/>
-            <w:tcMar>
-              <w:top w:w="70" w:type="dxa"/>
-              <w:bottom w:w="70" w:type="dxa"/>
-              <w:left w:w="90" w:type="dxa"/>
-              <w:right w:w="90" w:type="dxa"/>
-            </w:tcMar>
-          </w:tcPr>
-          <w:p>
-            <w:r>
-              <w:rPr>
-                <w:rFonts w:ascii="Arial" w:hAnsi="Arial"/>
-                <w:sz w:val="17"/>
-              </w:rPr>
-              <w:t>Raw UTF-8 Bytes</w:t>
-            </w:r>
-          </w:p>
-        </w:tc>
-        <w:tc>
-          <w:tcPr>
-            <w:tcW w:type="dxa" w:w="1680"/>
-            <w:shd w:fill="FAFAFA"/>
-            <w:tcMar>
-              <w:top w:w="70" w:type="dxa"/>
-              <w:bottom w:w="70" w:type="dxa"/>
-              <w:left w:w="90" w:type="dxa"/>
-              <w:right w:w="90" w:type="dxa"/>
-            </w:tcMar>
-          </w:tcPr>
-          <w:p>
-            <w:r>
-              <w:rPr>
-                <w:rFonts w:ascii="Arial" w:hAnsi="Arial"/>
-                <w:sz w:val="17"/>
-              </w:rPr>
-              <w:t>2.73 M</w:t>
-            </w:r>
-          </w:p>
-        </w:tc>
-        <w:tc>
-          <w:tcPr>
-            <w:tcW w:type="dxa" w:w="1680"/>
-            <w:shd w:fill="FAFAFA"/>
-            <w:tcMar>
-              <w:top w:w="70" w:type="dxa"/>
-              <w:bottom w:w="70" w:type="dxa"/>
-              <w:left w:w="90" w:type="dxa"/>
-              <w:right w:w="90" w:type="dxa"/>
-            </w:tcMar>
-          </w:tcPr>
-          <w:p>
-            <w:r>
-              <w:rPr>
-                <w:rFonts w:ascii="Arial" w:hAnsi="Arial"/>
-                <w:sz w:val="17"/>
-              </w:rPr>
-              <w:t>2.3% (Efficient)</w:t>
-            </w:r>
-          </w:p>
-        </w:tc>
-        <w:tc>
-          <w:tcPr>
-            <w:tcW w:type="dxa" w:w="1680"/>
-            <w:shd w:fill="FAFAFA"/>
-            <w:tcMar>
-              <w:top w:w="70" w:type="dxa"/>
-              <w:bottom w:w="70" w:type="dxa"/>
-              <w:left w:w="90" w:type="dxa"/>
-              <w:right w:w="90" w:type="dxa"/>
-            </w:tcMar>
-          </w:tcPr>
-          <w:p>
-            <w:r>
-              <w:rPr>
-                <w:rFonts w:ascii="Arial" w:hAnsi="Arial"/>
-                <w:sz w:val="17"/>
-              </w:rPr>
-              <w:t>1.3220 BPB</w:t>
-            </w:r>
-          </w:p>
-        </w:tc>
-        <w:tc>
-          <w:tcPr>
-            <w:tcW w:type="dxa" w:w="1680"/>
-            <w:shd w:fill="FAFAFA"/>
-            <w:tcMar>
-              <w:top w:w="70" w:type="dxa"/>
-              <w:bottom w:w="70" w:type="dxa"/>
-              <w:left w:w="90" w:type="dxa"/>
-              <w:right w:w="90" w:type="dxa"/>
-            </w:tcMar>
-          </w:tcPr>
-          <w:p>
-            <w:r>
-              <w:rPr>
-                <w:rFonts w:ascii="Arial" w:hAnsi="Arial"/>
-                <w:sz w:val="17"/>
-              </w:rPr>
-              <w:t>Linear O(L) ⚡</w:t>
-            </w:r>
-          </w:p>
-        </w:tc>
-      </w:tr>
-      <w:tr>
-        <w:tc>
-          <w:tcPr>
-            <w:tcW w:type="dxa" w:w="1680"/>
-            <w:shd w:fill="FFFFFF"/>
-            <w:tcMar>
-              <w:top w:w="70" w:type="dxa"/>
-              <w:bottom w:w="70" w:type="dxa"/>
-              <w:left w:w="90" w:type="dxa"/>
-              <w:right w:w="90" w:type="dxa"/>
-            </w:tcMar>
-          </w:tcPr>
-          <w:p>
-            <w:r>
-              <w:rPr>
-                <w:rFonts w:ascii="Arial" w:hAnsi="Arial"/>
-                <w:sz w:val="17"/>
-              </w:rPr>
-              <w:t>Mamba-Base (26M)</w:t>
-            </w:r>
-          </w:p>
-        </w:tc>
-        <w:tc>
-          <w:tcPr>
-            <w:tcW w:type="dxa" w:w="1680"/>
-            <w:shd w:fill="FFFFFF"/>
-            <w:tcMar>
-              <w:top w:w="70" w:type="dxa"/>
-              <w:bottom w:w="70" w:type="dxa"/>
-              <w:left w:w="90" w:type="dxa"/>
-              <w:right w:w="90" w:type="dxa"/>
-            </w:tcMar>
-          </w:tcPr>
-          <w:p>
-            <w:r>
-              <w:rPr>
-                <w:rFonts w:ascii="Arial" w:hAnsi="Arial"/>
-                <w:sz w:val="17"/>
-              </w:rPr>
-              <w:t>Raw UTF-8 Bytes</w:t>
-            </w:r>
-          </w:p>
-        </w:tc>
-        <w:tc>
-          <w:tcPr>
-            <w:tcW w:type="dxa" w:w="1680"/>
-            <w:shd w:fill="FFFFFF"/>
-            <w:tcMar>
-              <w:top w:w="70" w:type="dxa"/>
-              <w:bottom w:w="70" w:type="dxa"/>
-              <w:left w:w="90" w:type="dxa"/>
-              <w:right w:w="90" w:type="dxa"/>
-            </w:tcMar>
-          </w:tcPr>
-          <w:p>
-            <w:r>
-              <w:rPr>
-                <w:rFonts w:ascii="Arial" w:hAnsi="Arial"/>
-                <w:sz w:val="17"/>
-              </w:rPr>
-              <w:t>26.24 M</w:t>
-            </w:r>
-          </w:p>
-        </w:tc>
-        <w:tc>
-          <w:tcPr>
-            <w:tcW w:type="dxa" w:w="1680"/>
-            <w:shd w:fill="FFFFFF"/>
-            <w:tcMar>
-              <w:top w:w="70" w:type="dxa"/>
-              <w:bottom w:w="70" w:type="dxa"/>
-              <w:left w:w="90" w:type="dxa"/>
-              <w:right w:w="90" w:type="dxa"/>
-            </w:tcMar>
-          </w:tcPr>
-          <w:p>
-            <w:r>
-              <w:rPr>
-                <w:rFonts w:ascii="Arial" w:hAnsi="Arial"/>
-                <w:sz w:val="17"/>
-              </w:rPr>
-              <w:t>0.49%</w:t>
-            </w:r>
-          </w:p>
-        </w:tc>
-        <w:tc>
-          <w:tcPr>
-            <w:tcW w:type="dxa" w:w="1680"/>
-            <w:shd w:fill="EBF5EE"/>
-            <w:tcMar>
-              <w:top w:w="70" w:type="dxa"/>
-              <w:bottom w:w="70" w:type="dxa"/>
-              <w:left w:w="90" w:type="dxa"/>
-              <w:right w:w="90" w:type="dxa"/>
-            </w:tcMar>
-          </w:tcPr>
-          <w:p>
-            <w:r>
-              <w:rPr>
-                <w:rFonts w:ascii="Arial" w:hAnsi="Arial"/>
-                <w:sz w:val="17"/>
-              </w:rPr>
-              <w:t>1.0613 BPB 🏆</w:t>
-            </w:r>
-          </w:p>
-        </w:tc>
-        <w:tc>
-          <w:tcPr>
-            <w:tcW w:type="dxa" w:w="1680"/>
-            <w:shd w:fill="FFFFFF"/>
-            <w:tcMar>
-              <w:top w:w="70" w:type="dxa"/>
-              <w:bottom w:w="70" w:type="dxa"/>
-              <w:left w:w="90" w:type="dxa"/>
-              <w:right w:w="90" w:type="dxa"/>
-            </w:tcMar>
-          </w:tcPr>
-          <w:p>
-            <w:r>
-              <w:rPr>
-                <w:rFonts w:ascii="Arial" w:hAnsi="Arial"/>
-                <w:sz w:val="17"/>
-              </w:rPr>
-              <w:t>Linear O(L) ⚡</w:t>
-            </w:r>
-          </w:p>
-        </w:tc>
-      </w:tr>
-    </w:tbl>
-    <w:p>
-      <w:pPr>
-        <w:spacing w:after="80"/>
-      </w:pPr>
-    </w:p>
-    <w:p>
-      <w:r>
-        <w:rPr>
-          <w:b/>
-        </w:rPr>
-        <w:t>Table 2: Continual Learning &amp; Catastrophic Forgetting Benchmark</w:t>
+        <w:t>Table 1: The Core Model Comparison (Lower BPB is Better)</w:t>
       </w:r>
     </w:p>
     <w:tbl>
@@ -1148,9 +540,9 @@
                 <w:rFonts w:ascii="Arial" w:hAnsi="Arial"/>
                 <w:b/>
                 <w:color w:val="FFFFFF"/>
-                <w:sz w:val="17"/>
+                <w:sz w:val="18"/>
               </w:rPr>
-              <w:t>Learning Method</w:t>
+              <w:t>Model Name</w:t>
             </w:r>
           </w:p>
         </w:tc>
@@ -1171,9 +563,9 @@
                 <w:rFonts w:ascii="Arial" w:hAnsi="Arial"/>
                 <w:b/>
                 <w:color w:val="FFFFFF"/>
-                <w:sz w:val="17"/>
+                <w:sz w:val="18"/>
               </w:rPr>
-              <w:t>Learning Speed</w:t>
+              <w:t>Input Format</w:t>
             </w:r>
           </w:p>
         </w:tc>
@@ -1194,9 +586,9 @@
                 <w:rFonts w:ascii="Arial" w:hAnsi="Arial"/>
                 <w:b/>
                 <w:color w:val="FFFFFF"/>
-                <w:sz w:val="17"/>
+                <w:sz w:val="18"/>
               </w:rPr>
-              <w:t>1-Shot Fact Recall</w:t>
+              <w:t>Size (Params)</w:t>
             </w:r>
           </w:p>
         </w:tc>
@@ -1217,9 +609,9 @@
                 <w:rFonts w:ascii="Arial" w:hAnsi="Arial"/>
                 <w:b/>
                 <w:color w:val="FFFFFF"/>
-                <w:sz w:val="17"/>
+                <w:sz w:val="18"/>
               </w:rPr>
-              <w:t>Grammar Retention</w:t>
+              <w:t>Dictionary Waste</w:t>
             </w:r>
           </w:p>
         </w:tc>
@@ -1240,9 +632,9 @@
                 <w:rFonts w:ascii="Arial" w:hAnsi="Arial"/>
                 <w:b/>
                 <w:color w:val="FFFFFF"/>
-                <w:sz w:val="17"/>
+                <w:sz w:val="18"/>
               </w:rPr>
-              <w:t>Forgetting Status</w:t>
+              <w:t>Score (Bits/Byte)</w:t>
             </w:r>
           </w:p>
         </w:tc>
@@ -1251,7 +643,7 @@
         <w:tc>
           <w:tcPr>
             <w:tcW w:type="dxa" w:w="2016"/>
-            <w:shd w:fill="FDF2E9"/>
+            <w:shd w:fill="FAFAFA"/>
             <w:tcMar>
               <w:top w:w="70" w:type="dxa"/>
               <w:bottom w:w="70" w:type="dxa"/>
@@ -1263,16 +655,16 @@
             <w:r>
               <w:rPr>
                 <w:rFonts w:ascii="Arial" w:hAnsi="Arial"/>
-                <w:sz w:val="17"/>
+                <w:sz w:val="18"/>
               </w:rPr>
-              <w:t>Standard Backpropagation</w:t>
+              <w:t>Transformer (32k)</w:t>
             </w:r>
           </w:p>
         </w:tc>
         <w:tc>
           <w:tcPr>
             <w:tcW w:type="dxa" w:w="2016"/>
-            <w:shd w:fill="FDF2E9"/>
+            <w:shd w:fill="FAFAFA"/>
             <w:tcMar>
               <w:top w:w="70" w:type="dxa"/>
               <w:bottom w:w="70" w:type="dxa"/>
@@ -1284,16 +676,16 @@
             <w:r>
               <w:rPr>
                 <w:rFonts w:ascii="Arial" w:hAnsi="Arial"/>
-                <w:sz w:val="17"/>
+                <w:sz w:val="18"/>
               </w:rPr>
-              <w:t>~4.2 seconds (Slow)</w:t>
+              <w:t>32,000 pieces</w:t>
             </w:r>
           </w:p>
         </w:tc>
         <w:tc>
           <w:tcPr>
             <w:tcW w:type="dxa" w:w="2016"/>
-            <w:shd w:fill="FDF2E9"/>
+            <w:shd w:fill="FAFAFA"/>
             <w:tcMar>
               <w:top w:w="70" w:type="dxa"/>
               <w:bottom w:w="70" w:type="dxa"/>
@@ -1305,16 +697,16 @@
             <w:r>
               <w:rPr>
                 <w:rFonts w:ascii="Arial" w:hAnsi="Arial"/>
-                <w:sz w:val="17"/>
+                <w:sz w:val="18"/>
               </w:rPr>
-              <w:t>40.0% (Poor)</w:t>
+              <w:t>13.0 Million</w:t>
             </w:r>
           </w:p>
         </w:tc>
         <w:tc>
           <w:tcPr>
             <w:tcW w:type="dxa" w:w="2016"/>
-            <w:shd w:fill="FDF2E9"/>
+            <w:shd w:fill="F8D7DA"/>
             <w:tcMar>
               <w:top w:w="70" w:type="dxa"/>
               <w:bottom w:w="70" w:type="dxa"/>
@@ -1326,16 +718,16 @@
             <w:r>
               <w:rPr>
                 <w:rFonts w:ascii="Arial" w:hAnsi="Arial"/>
-                <w:sz w:val="17"/>
+                <w:sz w:val="18"/>
               </w:rPr>
-              <w:t>42.1% (Degraded)</w:t>
+              <w:t>62.8% (Huge waste)</w:t>
             </w:r>
           </w:p>
         </w:tc>
         <w:tc>
           <w:tcPr>
             <w:tcW w:type="dxa" w:w="2016"/>
-            <w:shd w:fill="FDF2E9"/>
+            <w:shd w:fill="FAFAFA"/>
             <w:tcMar>
               <w:top w:w="70" w:type="dxa"/>
               <w:bottom w:w="70" w:type="dxa"/>
@@ -1347,9 +739,9 @@
             <w:r>
               <w:rPr>
                 <w:rFonts w:ascii="Arial" w:hAnsi="Arial"/>
-                <w:sz w:val="17"/>
+                <w:sz w:val="18"/>
               </w:rPr>
-              <w:t>Severe Catastrophic Forgetting ❌</w:t>
+              <w:t>1.579 BPB (Worst)</w:t>
             </w:r>
           </w:p>
         </w:tc>
@@ -1358,7 +750,7 @@
         <w:tc>
           <w:tcPr>
             <w:tcW w:type="dxa" w:w="2016"/>
-            <w:shd w:fill="EBF5EE"/>
+            <w:shd w:fill="FFFFFF"/>
             <w:tcMar>
               <w:top w:w="70" w:type="dxa"/>
               <w:bottom w:w="70" w:type="dxa"/>
@@ -1370,16 +762,16 @@
             <w:r>
               <w:rPr>
                 <w:rFonts w:ascii="Arial" w:hAnsi="Arial"/>
-                <w:sz w:val="17"/>
+                <w:sz w:val="18"/>
               </w:rPr>
-              <w:t>Hebbian Engram (Ours)</w:t>
+              <w:t>Transformer (16k)</w:t>
             </w:r>
           </w:p>
         </w:tc>
         <w:tc>
           <w:tcPr>
             <w:tcW w:type="dxa" w:w="2016"/>
-            <w:shd w:fill="FDF2E9"/>
+            <w:shd w:fill="FFFFFF"/>
             <w:tcMar>
               <w:top w:w="70" w:type="dxa"/>
               <w:bottom w:w="70" w:type="dxa"/>
@@ -1391,16 +783,16 @@
             <w:r>
               <w:rPr>
                 <w:rFonts w:ascii="Arial" w:hAnsi="Arial"/>
-                <w:sz w:val="17"/>
+                <w:sz w:val="18"/>
               </w:rPr>
-              <w:t>0.01 seconds (Instant)</w:t>
+              <w:t>16,000 pieces</w:t>
             </w:r>
           </w:p>
         </w:tc>
         <w:tc>
           <w:tcPr>
             <w:tcW w:type="dxa" w:w="2016"/>
-            <w:shd w:fill="FDF2E9"/>
+            <w:shd w:fill="FFFFFF"/>
             <w:tcMar>
               <w:top w:w="70" w:type="dxa"/>
               <w:bottom w:w="70" w:type="dxa"/>
@@ -1412,16 +804,16 @@
             <w:r>
               <w:rPr>
                 <w:rFonts w:ascii="Arial" w:hAnsi="Arial"/>
-                <w:sz w:val="17"/>
+                <w:sz w:val="18"/>
               </w:rPr>
-              <w:t>100.0% (Perfect)</w:t>
+              <w:t>8.9 Million</w:t>
             </w:r>
           </w:p>
         </w:tc>
         <w:tc>
           <w:tcPr>
             <w:tcW w:type="dxa" w:w="2016"/>
-            <w:shd w:fill="FDF2E9"/>
+            <w:shd w:fill="FFFFFF"/>
             <w:tcMar>
               <w:top w:w="70" w:type="dxa"/>
               <w:bottom w:w="70" w:type="dxa"/>
@@ -1433,16 +825,16 @@
             <w:r>
               <w:rPr>
                 <w:rFonts w:ascii="Arial" w:hAnsi="Arial"/>
-                <w:sz w:val="17"/>
+                <w:sz w:val="18"/>
               </w:rPr>
-              <w:t>78.4% (Preserved)</w:t>
+              <w:t>45.7% (High waste)</w:t>
             </w:r>
           </w:p>
         </w:tc>
         <w:tc>
           <w:tcPr>
             <w:tcW w:type="dxa" w:w="2016"/>
-            <w:shd w:fill="FDF2E9"/>
+            <w:shd w:fill="FFFFFF"/>
             <w:tcMar>
               <w:top w:w="70" w:type="dxa"/>
               <w:bottom w:w="70" w:type="dxa"/>
@@ -1454,9 +846,9 @@
             <w:r>
               <w:rPr>
                 <w:rFonts w:ascii="Arial" w:hAnsi="Arial"/>
-                <w:sz w:val="17"/>
+                <w:sz w:val="18"/>
               </w:rPr>
-              <w:t>Zero Interference ✅</w:t>
+              <w:t>1.492 BPB</w:t>
             </w:r>
           </w:p>
         </w:tc>
@@ -1465,7 +857,7 @@
         <w:tc>
           <w:tcPr>
             <w:tcW w:type="dxa" w:w="2016"/>
-            <w:shd w:fill="FDF2E9"/>
+            <w:shd w:fill="FAFAFA"/>
             <w:tcMar>
               <w:top w:w="70" w:type="dxa"/>
               <w:bottom w:w="70" w:type="dxa"/>
@@ -1477,16 +869,16 @@
             <w:r>
               <w:rPr>
                 <w:rFonts w:ascii="Arial" w:hAnsi="Arial"/>
-                <w:sz w:val="17"/>
+                <w:sz w:val="18"/>
               </w:rPr>
-              <w:t>Engram + Sleep Replay (Ours)</w:t>
+              <w:t>TinyMamba (Ours)</w:t>
             </w:r>
           </w:p>
         </w:tc>
         <w:tc>
           <w:tcPr>
             <w:tcW w:type="dxa" w:w="2016"/>
-            <w:shd w:fill="FDF2E9"/>
+            <w:shd w:fill="FAFAFA"/>
             <w:tcMar>
               <w:top w:w="70" w:type="dxa"/>
               <w:bottom w:w="70" w:type="dxa"/>
@@ -1498,16 +890,16 @@
             <w:r>
               <w:rPr>
                 <w:rFonts w:ascii="Arial" w:hAnsi="Arial"/>
-                <w:sz w:val="17"/>
+                <w:sz w:val="18"/>
               </w:rPr>
-              <w:t>20x Offline Consolidation</w:t>
+              <w:t>Raw Bytes</w:t>
             </w:r>
           </w:p>
         </w:tc>
         <w:tc>
           <w:tcPr>
             <w:tcW w:type="dxa" w:w="2016"/>
-            <w:shd w:fill="FDF2E9"/>
+            <w:shd w:fill="FAFAFA"/>
             <w:tcMar>
               <w:top w:w="70" w:type="dxa"/>
               <w:bottom w:w="70" w:type="dxa"/>
@@ -1519,16 +911,16 @@
             <w:r>
               <w:rPr>
                 <w:rFonts w:ascii="Arial" w:hAnsi="Arial"/>
-                <w:sz w:val="17"/>
+                <w:sz w:val="18"/>
               </w:rPr>
-              <w:t>100.0% (Permanent)</w:t>
+              <w:t>2.7 Million</w:t>
             </w:r>
           </w:p>
         </w:tc>
         <w:tc>
           <w:tcPr>
             <w:tcW w:type="dxa" w:w="2016"/>
-            <w:shd w:fill="FDF2E9"/>
+            <w:shd w:fill="FAFAFA"/>
             <w:tcMar>
               <w:top w:w="70" w:type="dxa"/>
               <w:bottom w:w="70" w:type="dxa"/>
@@ -1540,16 +932,16 @@
             <w:r>
               <w:rPr>
                 <w:rFonts w:ascii="Arial" w:hAnsi="Arial"/>
-                <w:sz w:val="17"/>
+                <w:sz w:val="18"/>
               </w:rPr>
-              <w:t>100.0% (Perfect)</w:t>
+              <w:t>2.3% (Minimal)</w:t>
             </w:r>
           </w:p>
         </w:tc>
         <w:tc>
           <w:tcPr>
             <w:tcW w:type="dxa" w:w="2016"/>
-            <w:shd w:fill="EBF5EE"/>
+            <w:shd w:fill="D1E7DD"/>
             <w:tcMar>
               <w:top w:w="70" w:type="dxa"/>
               <w:bottom w:w="70" w:type="dxa"/>
@@ -1561,9 +953,116 @@
             <w:r>
               <w:rPr>
                 <w:rFonts w:ascii="Arial" w:hAnsi="Arial"/>
-                <w:sz w:val="17"/>
+                <w:sz w:val="18"/>
               </w:rPr>
-              <w:t>Biologically Consolidated 🏆</w:t>
+              <w:t>1.322 BPB (Beat 13M!)</w:t>
+            </w:r>
+          </w:p>
+        </w:tc>
+      </w:tr>
+      <w:tr>
+        <w:tc>
+          <w:tcPr>
+            <w:tcW w:type="dxa" w:w="2016"/>
+            <w:shd w:fill="FFFFFF"/>
+            <w:tcMar>
+              <w:top w:w="70" w:type="dxa"/>
+              <w:bottom w:w="70" w:type="dxa"/>
+              <w:left w:w="90" w:type="dxa"/>
+              <w:right w:w="90" w:type="dxa"/>
+            </w:tcMar>
+          </w:tcPr>
+          <w:p>
+            <w:r>
+              <w:rPr>
+                <w:rFonts w:ascii="Arial" w:hAnsi="Arial"/>
+                <w:sz w:val="18"/>
+              </w:rPr>
+              <w:t>Mamba-Base (Ours)</w:t>
+            </w:r>
+          </w:p>
+        </w:tc>
+        <w:tc>
+          <w:tcPr>
+            <w:tcW w:type="dxa" w:w="2016"/>
+            <w:shd w:fill="FFFFFF"/>
+            <w:tcMar>
+              <w:top w:w="70" w:type="dxa"/>
+              <w:bottom w:w="70" w:type="dxa"/>
+              <w:left w:w="90" w:type="dxa"/>
+              <w:right w:w="90" w:type="dxa"/>
+            </w:tcMar>
+          </w:tcPr>
+          <w:p>
+            <w:r>
+              <w:rPr>
+                <w:rFonts w:ascii="Arial" w:hAnsi="Arial"/>
+                <w:sz w:val="18"/>
+              </w:rPr>
+              <w:t>Raw Bytes</w:t>
+            </w:r>
+          </w:p>
+        </w:tc>
+        <w:tc>
+          <w:tcPr>
+            <w:tcW w:type="dxa" w:w="2016"/>
+            <w:shd w:fill="FFFFFF"/>
+            <w:tcMar>
+              <w:top w:w="70" w:type="dxa"/>
+              <w:bottom w:w="70" w:type="dxa"/>
+              <w:left w:w="90" w:type="dxa"/>
+              <w:right w:w="90" w:type="dxa"/>
+            </w:tcMar>
+          </w:tcPr>
+          <w:p>
+            <w:r>
+              <w:rPr>
+                <w:rFonts w:ascii="Arial" w:hAnsi="Arial"/>
+                <w:sz w:val="18"/>
+              </w:rPr>
+              <w:t>26.2 Million</w:t>
+            </w:r>
+          </w:p>
+        </w:tc>
+        <w:tc>
+          <w:tcPr>
+            <w:tcW w:type="dxa" w:w="2016"/>
+            <w:shd w:fill="FFFFFF"/>
+            <w:tcMar>
+              <w:top w:w="70" w:type="dxa"/>
+              <w:bottom w:w="70" w:type="dxa"/>
+              <w:left w:w="90" w:type="dxa"/>
+              <w:right w:w="90" w:type="dxa"/>
+            </w:tcMar>
+          </w:tcPr>
+          <w:p>
+            <w:r>
+              <w:rPr>
+                <w:rFonts w:ascii="Arial" w:hAnsi="Arial"/>
+                <w:sz w:val="18"/>
+              </w:rPr>
+              <w:t>0.4% (Pure thinking)</w:t>
+            </w:r>
+          </w:p>
+        </w:tc>
+        <w:tc>
+          <w:tcPr>
+            <w:tcW w:type="dxa" w:w="2016"/>
+            <w:shd w:fill="D1E7DD"/>
+            <w:tcMar>
+              <w:top w:w="70" w:type="dxa"/>
+              <w:bottom w:w="70" w:type="dxa"/>
+              <w:left w:w="90" w:type="dxa"/>
+              <w:right w:w="90" w:type="dxa"/>
+            </w:tcMar>
+          </w:tcPr>
+          <w:p>
+            <w:r>
+              <w:rPr>
+                <w:rFonts w:ascii="Arial" w:hAnsi="Arial"/>
+                <w:sz w:val="18"/>
+              </w:rPr>
+              <w:t>1.061 BPB 🏆 (Best)</w:t>
             </w:r>
           </w:p>
         </w:tc>
@@ -1571,22 +1070,19 @@
     </w:tbl>
     <w:p>
       <w:pPr>
-        <w:pStyle w:val="Heading1"/>
-        <w:spacing w:before="240" w:after="80"/>
-      </w:pPr>
-      <w:r>
-        <w:t>5. The Living Agent: Hayyuu Autonomous System</w:t>
-      </w:r>
-    </w:p>
-    <w:p>
-      <w:pPr>
-        <w:spacing w:line="276" w:lineRule="auto"/>
+        <w:spacing w:before="160" w:line="276" w:lineRule="auto"/>
       </w:pPr>
       <w:r>
         <w:rPr>
-          <w:sz w:val="19"/>
+          <w:b/>
         </w:rPr>
-        <w:t>To test our findings in real-world environments, we built and deployed 'Hayyuu'—a pure neural conversational AI on Telegram. Hayyuu features a tri-state living cycle: (1) Active Day Phase: interacting with Ethiopian users and harvesting native news streams; (2) 1-Shot Fact Acquisition: forming Hebbian memory engrams instantly upon receiving verified facts; and (3) Circadian Sleep Consolidation: entering NREM sleep every 30 rounds to replay facts into Mamba neocortical weights via Sharp-Wave Ripples at 20x speed.</w:t>
+        <w:t xml:space="preserve">How to say this to the audience: </w:t>
+      </w:r>
+      <w:r>
+        <w:rPr>
+          <w:i/>
+        </w:rPr>
+        <w:t>"Look at Table 1. The Transformer model with 13 million parameters wasted 63% of its size on a dictionary and scored 1.579 BPB. Our TinyMamba model had only 2.7 million parameters (almost 5 times smaller!), wasted almost nothing on dictionaries, and scored 1.322 BPB. This proves that smaller, smarter byte models beat larger, wasteful tokenized models!"</w:t>
       </w:r>
     </w:p>
     <w:p>
@@ -1595,7 +1091,7 @@
         <w:spacing w:before="280" w:after="80"/>
       </w:pPr>
       <w:r>
-        <w:t>6. Anticipated Presentation Questions &amp; Defense Answers (Q&amp;A Cheat Sheet)</w:t>
+        <w:t>6. Questions You Might Get &amp; How to Answer Without Hesitation</w:t>
       </w:r>
     </w:p>
     <w:p>
@@ -1609,7 +1105,7 @@
           <w:color w:val="1B365D"/>
           <w:sz w:val="19"/>
         </w:rPr>
-        <w:t>Q1: Why did you choose Byte-Level modeling instead of simply training a larger SentencePiece tokenizer?</w:t>
+        <w:t>❓ Question: Why didn't you just make a better Amharic tokenizer?</w:t>
         <w:br/>
       </w:r>
       <w:r>
@@ -1618,7 +1114,7 @@
           <w:color w:val="282828"/>
           <w:sz w:val="19"/>
         </w:rPr>
-        <w:t>👉 Answer: In low-resource morphologically rich languages like Amharic, subword tokenizers create severe fragmentation and out-of-vocabulary anomalies. More importantly, large tokenizers create a massive 'Parameter Allocation Tax'—for an 8M parameter model, a 32k vocabulary consumes 62.8% of all parameters in the embedding matrix alone! Byte modeling uses a fixed 256-byte vocabulary (taking &lt;1% of parameters), allowing 99% of model weights to be spent on neural reasoning layers.</w:t>
+        <w:t>👉 Simple Answer: Because Amharic grammar modifies words with prefixes and suffixes in complex ways. Even with a 32,000-word tokenizer, more than 60% of our model's weights were wasted just storing dictionary words instead of learning grammar. By removing the tokenizer, 98% of the model is dedicated to pure thinking.</w:t>
       </w:r>
     </w:p>
     <w:p>
@@ -1632,7 +1128,7 @@
           <w:color w:val="1B365D"/>
           <w:sz w:val="19"/>
         </w:rPr>
-        <w:t>Q2: Since byte sequences are ~3.5x longer, isn't byte-level AI too slow?</w:t>
+        <w:t>❓ Question: If bytes make the text 3 times longer, doesn't that make the AI super slow?</w:t>
         <w:br/>
       </w:r>
       <w:r>
@@ -1641,7 +1137,7 @@
           <w:color w:val="282828"/>
           <w:sz w:val="19"/>
         </w:rPr>
-        <w:t>👉 Answer: That is true for Transformers due to quadratic O(L²) self-attention. However, Mamba uses Selective State Spaces (S6) with linear O(L) complexity and chunked associative parallel scans. Our benchmarks prove that TinyMamba processes 384-byte sequences at 4.3 steps/second with only 4.2GB VRAM, outperforming Transformers while using 3x less GPU memory.</w:t>
+        <w:t>👉 Simple Answer: It makes Transformers slow because Transformers compare every letter to every other letter (O(L²)). But Mamba reads in a straight line (O(L)). Our small Mamba model processed 384 bytes at over 4 steps per second and used 3 times less GPU memory than the Transformer.</w:t>
       </w:r>
     </w:p>
     <w:p>
@@ -1655,7 +1151,7 @@
           <w:color w:val="1B365D"/>
           <w:sz w:val="19"/>
         </w:rPr>
-        <w:t>Q3: How do you mathematically prove that TinyMamba beat the Transformer when they use different tokenizers?</w:t>
+        <w:t>❓ Question: How does the model learn new news on Telegram without forgetting past grammar?</w:t>
         <w:br/>
       </w:r>
       <w:r>
@@ -1664,7 +1160,7 @@
           <w:color w:val="282828"/>
           <w:sz w:val="19"/>
         </w:rPr>
-        <w:t>👉 Answer: We evaluated all models using Bits-per-Byte (BPB) normalized by UTF-8 byte length (BPB = Loss / ln(2) * N_tokens / N_bytes). Perplexity is incomparable across tokenizers, but BPB is a universally invariant information-theoretic metric. TinyMamba achieved 1.322 BPB, strictly compressing text better than the 13M Transformer (1.579 BPB).</w:t>
+        <w:t>👉 Simple Answer: We copied the human brain! When someone teaches Hayyuu a new fact, it writes it to a fast memory notepad in 0.01 seconds without changing its main neural weights. When it sleeps, it replays those notes and slowly integrates them so grammar is never ruined.</w:t>
       </w:r>
     </w:p>
     <w:p>
@@ -1678,7 +1174,7 @@
           <w:color w:val="1B365D"/>
           <w:sz w:val="19"/>
         </w:rPr>
-        <w:t>Q4: How does your Hebbian Engram memory prevent Catastrophic Forgetting during live deployment?</w:t>
+        <w:t>❓ Question: What is the main message of your research?</w:t>
         <w:br/>
       </w:r>
       <w:r>
@@ -1687,30 +1183,7 @@
           <w:color w:val="282828"/>
           <w:sz w:val="19"/>
         </w:rPr>
-        <w:t>👉 Answer: Traditional fine-tuning uses gradient backpropagation, which alters global network weights and causes catastrophic forgetting. We implement a Complementary Learning System (CLS): new facts are written in 0.01s to a dedicated Hebbian fast weight matrix (M) using anti-Hopfield outer product updates without touching the slow Mamba backbone. During offline sleep cycles, these facts are replayed with background replay anchors, permanently transferring memory without linguistic drift.</w:t>
-      </w:r>
-    </w:p>
-    <w:p>
-      <w:pPr>
-        <w:spacing w:before="80" w:after="80" w:line="276" w:lineRule="auto"/>
-      </w:pPr>
-      <w:r>
-        <w:rPr>
-          <w:rFonts w:ascii="Arial" w:hAnsi="Arial"/>
-          <w:b/>
-          <w:color w:val="1B365D"/>
-          <w:sz w:val="19"/>
-        </w:rPr>
-        <w:t>Q5: What is the impact of this research for Ethiopia and African AI?</w:t>
-        <w:br/>
-      </w:r>
-      <w:r>
-        <w:rPr>
-          <w:rFonts w:ascii="Arial" w:hAnsi="Arial"/>
-          <w:color w:val="282828"/>
-          <w:sz w:val="19"/>
-        </w:rPr>
-        <w:t>👉 Answer: This work proves that state-of-the-art AI for low-resource African languages does not require multi-billion-parameter clusters or billions of dollars. By eliminating tokenizers and adopting linear State Space Models with bio-inspired memory, highly capable generative AI can be trained on a single commodity GPU (Nvidia RTX 3090) within a few hours on native datasets.</w:t>
+        <w:t>👉 Simple Answer: You do not need billions of dollars or giant supercomputers to build high-quality AI for African languages. By using raw bytes and efficient Mamba models, anyone can train a powerful Amharic AI on a single standard graphics card (RTX 3090).</w:t>
       </w:r>
     </w:p>
     <w:sectPr>

</xml_diff>

<commit_message>
Update Master Guide to Grade-4 intuitive storytelling level
</commit_message>
<xml_diff>
--- a/AMHARIC_MAMBA_PRESENTATION_MASTER_GUIDE.docx
+++ b/AMHARIC_MAMBA_PRESENTATION_MASTER_GUIDE.docx
@@ -12,9 +12,9 @@
           <w:rFonts w:ascii="Arial" w:hAnsi="Arial"/>
           <w:b/>
           <w:color w:val="1B365D"/>
-          <w:sz w:val="34"/>
+          <w:sz w:val="36"/>
         </w:rPr>
-        <w:t>THE COMPLETE SIMPLE-ENGLISH STUDY GUIDE</w:t>
+        <w:t>MY AMHARIC AI PROJECT (GRADE 4 EXPLANATION)</w:t>
       </w:r>
     </w:p>
     <w:p>
@@ -26,10 +26,10 @@
         <w:rPr>
           <w:rFonts w:ascii="Arial" w:hAnsi="Arial"/>
           <w:b/>
-          <w:color w:val="4A607A"/>
-          <w:sz w:val="22"/>
+          <w:color w:val="D15B1B"/>
+          <w:sz w:val="24"/>
         </w:rPr>
-        <w:t>Everything About Your Research Explained in Simple, Clear Words Without Confusing Jargon</w:t>
+        <w:t>How a Tiny Smart Robot Beat a Big Heavy Robot at Reading Amharic!</w:t>
       </w:r>
     </w:p>
     <w:p>
@@ -44,7 +44,7 @@
           <w:color w:val="5A5A5A"/>
           <w:sz w:val="19"/>
         </w:rPr>
-        <w:t>Presenter: Beknan Chemeda  |  Project: Amharic Byte Mamba &amp; Hayyuu AI</w:t>
+        <w:t>Presenter: Beknan Chemeda  |  Project: Amharic Byte Mamba &amp; Hayyuu</w:t>
       </w:r>
     </w:p>
     <w:p>
@@ -53,7 +53,7 @@
         <w:spacing w:before="200" w:after="80"/>
       </w:pPr>
       <w:r>
-        <w:t>1. The Big Story: What is this project about in 1 minute?</w:t>
+        <w:t>1. Story Time: What is this project?</w:t>
       </w:r>
     </w:p>
     <w:tbl>
@@ -87,17 +87,17 @@
                 <w:rFonts w:ascii="Arial" w:hAnsi="Arial"/>
                 <w:b/>
                 <w:color w:val="0F5132"/>
-                <w:sz w:val="20"/>
+                <w:sz w:val="21"/>
               </w:rPr>
-              <w:t xml:space="preserve">💡 THE SIMPLE SUMMARY YOU CAN SAY TO ANYONE: </w:t>
+              <w:t xml:space="preserve">⭐ THE 1-MINUTE STORY: </w:t>
             </w:r>
             <w:r>
               <w:rPr>
                 <w:rFonts w:ascii="Arial" w:hAnsi="Arial"/>
                 <w:color w:val="1E1E1E"/>
-                <w:sz w:val="19"/>
+                <w:sz w:val="20"/>
               </w:rPr>
-              <w:t>Imagine you are trying to teach a computer to speak Amharic. Today's big AI tools (like ChatGPT) were built for English. When they try to read Amharic, they get confused: they cut single Amharic words into 7 or 8 tiny broken pieces. This makes normal models slow, heavy, and wasteful. In our research, we solved this completely! We threw away the word-cutter program and let the AI read raw computer bytes directly using a new, fast model called 'Mamba'. Our small Mamba model beat a model 5 times its size! Then, we gave it a brain memory like a human: it can learn new facts in 0.01 seconds and remembers them permanently by 'sleeping' and replaying them.</w:t>
+              <w:t>Imagine you want to teach a computer robot how to read and speak Amharic. Today, all the big robots in the world (like ChatGPT) were built for English. When they try to read Amharic, they get super confused! They use broken scissors to cut Amharic words into tiny little pieces. This makes them slow, heavy, and tired. In my project, I threw away the scissors! I gave the robot a fast new brain called 'Mamba' that reads computer numbers directly. My tiny robot beat a giant robot 5 times bigger than itself! Then, I taught it how to take quick notes and 'sleep' at night to remember everything permanently.</w:t>
             </w:r>
           </w:p>
         </w:tc>
@@ -114,7 +114,7 @@
         <w:spacing w:before="240" w:after="80"/>
       </w:pPr>
       <w:r>
-        <w:t>2. The 4 Problems We Solved (With Real-Life Analogies)</w:t>
+        <w:t>2. The 4 Big Problems (Why normal AI struggled)</w:t>
       </w:r>
     </w:p>
     <w:p>
@@ -125,17 +125,17 @@
         <w:rPr>
           <w:rFonts w:ascii="Arial" w:hAnsi="Arial"/>
           <w:b/>
-          <w:color w:val="1B365D"/>
-          <w:sz w:val="19"/>
+          <w:color w:val="B02A37"/>
+          <w:sz w:val="20"/>
         </w:rPr>
-        <w:t xml:space="preserve">• Problem 1: The 'Small Library' Problem (Low-Resource Data): </w:t>
+        <w:t xml:space="preserve">❌ Problem 1: The 'Small Library' Problem: </w:t>
       </w:r>
       <w:r>
         <w:rPr>
           <w:rFonts w:ascii="Arial" w:hAnsi="Arial"/>
-          <w:sz w:val="19"/>
+          <w:sz w:val="20"/>
         </w:rPr>
-        <w:t>In English, AI companies download trillions of words from the internet. But for Amharic, the entire world has less than 500 million clean words online. You cannot just download more data because it doesn't exist. If you use machine-translated English text, it has bad grammar and ruins the AI. Therefore, we had to make the AI model itself much smarter and more efficient with the data we have.</w:t>
+        <w:t>For English, computers have billions of storybooks on the internet. But for Amharic, we only have a very small shelf of clean books. If you try to translate English books with Google Translate, they have broken grammar and confuse the robot. So our robot had to be extra smart with the few books we had!</w:t>
       </w:r>
     </w:p>
     <w:p>
@@ -146,17 +146,17 @@
         <w:rPr>
           <w:rFonts w:ascii="Arial" w:hAnsi="Arial"/>
           <w:b/>
-          <w:color w:val="1B365D"/>
-          <w:sz w:val="19"/>
+          <w:color w:val="B02A37"/>
+          <w:sz w:val="20"/>
         </w:rPr>
-        <w:t xml:space="preserve">• Problem 2: The 'Broken Word' Problem (The Tokenizer / Token Tax): </w:t>
+        <w:t xml:space="preserve">❌ Problem 2: The 'Broken Scissors' Problem (The Token Tax): </w:t>
       </w:r>
       <w:r>
         <w:rPr>
           <w:rFonts w:ascii="Arial" w:hAnsi="Arial"/>
-          <w:sz w:val="19"/>
+          <w:sz w:val="20"/>
         </w:rPr>
-        <w:t>Before an AI reads words, it uses a helper program called a 'tokenizer' (a word-cutter). Tokenizers were built for English words like 'apple' -&gt; 1 token. But when it sees an Amharic word like 'ኢትዮጵያ', it gets confused because Ge'ez letters take 3 raw computer bytes each. It cuts that one word into 7 or 8 pieces! This means an Amharic speaker has to use 3 to 7 times more computer power and money than an English speaker for the exact same message. We call this unfair cost the 'Token Tax'.</w:t>
+        <w:t>Before a computer reads a word, it cuts it into flashcards. For English, the word 'cat' is 1 flashcard. But for Amharic ('ድመት'), the scissors break it into 6 or 7 tiny pieces! Imagine trying to read a story where every single word is chopped into confetti! It takes 4 times longer to read! We call this the 'Token Tax'.</w:t>
       </w:r>
     </w:p>
     <w:p>
@@ -167,17 +167,17 @@
         <w:rPr>
           <w:rFonts w:ascii="Arial" w:hAnsi="Arial"/>
           <w:b/>
-          <w:color w:val="1B365D"/>
-          <w:sz w:val="19"/>
+          <w:color w:val="B02A37"/>
+          <w:sz w:val="20"/>
         </w:rPr>
-        <w:t xml:space="preserve">• Problem 3: The 'Dictionary Waste' Problem (Parameter Tax): </w:t>
+        <w:t xml:space="preserve">❌ Problem 3: The 'Heavy Backpack' Problem (Parameter Tax): </w:t>
       </w:r>
       <w:r>
         <w:rPr>
           <w:rFonts w:ascii="Arial" w:hAnsi="Arial"/>
-          <w:sz w:val="19"/>
+          <w:sz w:val="20"/>
         </w:rPr>
-        <w:t>To use a normal tokenizer, the AI must build a massive dictionary table (e.g., 32,000 words). In a small 13-million parameter model, 8.2 million of those parameters (62.8% of the entire model!) were trapped just holding that dictionary list! Only 37% was left for actual thinking and grammar. That is like buying a 100-page book where 63 pages are just an empty index list.</w:t>
+        <w:t>Because the scissors chopped words into so many pieces, the robot had to carry a giant 32,000-word dictionary in its backpack. In fact, 63% of the robot's entire brain weight was just holding that heavy dictionary list, leaving almost no room in its brain to actually think!</w:t>
       </w:r>
     </w:p>
     <w:p>
@@ -188,17 +188,17 @@
         <w:rPr>
           <w:rFonts w:ascii="Arial" w:hAnsi="Arial"/>
           <w:b/>
-          <w:color w:val="1B365D"/>
-          <w:sz w:val="19"/>
+          <w:color w:val="B02A37"/>
+          <w:sz w:val="20"/>
         </w:rPr>
-        <w:t xml:space="preserve">• Problem 4: The 'Amnesia' Problem (Catastrophic Forgetting): </w:t>
+        <w:t xml:space="preserve">❌ Problem 4: The 'Goldfish Memory' Problem (Catastrophic Forgetting): </w:t>
       </w:r>
       <w:r>
         <w:rPr>
           <w:rFonts w:ascii="Arial" w:hAnsi="Arial"/>
-          <w:sz w:val="19"/>
+          <w:sz w:val="20"/>
         </w:rPr>
-        <w:t>Normal AI models have a huge flaw: if you teach them today's new news via standard training, their brain overwrites what they learned before. They learn the new fact, but suddenly forget basic grammar (they start repeating words and babbling). This is called Catastrophic Forgetting.</w:t>
+        <w:t>Normal robots have a funny brain bug: if you teach them today's new news, they immediately forget how to speak! They learn the new fact, but suddenly start repeating words and talking like a baby. This is called Catastrophic Forgetting.</w:t>
       </w:r>
     </w:p>
     <w:p>
@@ -207,7 +207,7 @@
         <w:spacing w:before="240" w:after="80"/>
       </w:pPr>
       <w:r>
-        <w:t>3. The 3 Solutions We Built</w:t>
+        <w:t>3. Our 3 Superpowers: How we solved everything!</w:t>
       </w:r>
     </w:p>
     <w:p>
@@ -219,16 +219,16 @@
           <w:rFonts w:ascii="Arial" w:hAnsi="Arial"/>
           <w:b/>
           <w:color w:val="0F5132"/>
-          <w:sz w:val="19"/>
+          <w:sz w:val="20"/>
         </w:rPr>
-        <w:t xml:space="preserve">✅ Solution 1: Byte-Level AI (Throwing Away the Word Cutter): </w:t>
+        <w:t xml:space="preserve">⚡ Superpower 1: We Threw Away the Scissors (Byte-Level AI): </w:t>
       </w:r>
       <w:r>
         <w:rPr>
           <w:rFonts w:ascii="Arial" w:hAnsi="Arial"/>
-          <w:sz w:val="19"/>
+          <w:sz w:val="20"/>
         </w:rPr>
-        <w:t>Instead of guessing how to cut Amharic words with a broken tokenizer, we threw away the tokenizer completely! Computers store everything as numbers from 0 to 255 (raw bytes). We let the AI read raw bytes directly. Now, the dictionary table has only 256 entries instead of 32,000! This means 97.7% of the model's brain is free for pure thinking and grammar.</w:t>
+        <w:t>Computers already understand numbers from 0 to 255 (called 'bytes'). Instead of chopping words with scissors, we let the robot read the raw numbers directly! Now the robot's dictionary has only 256 numbers instead of 32,000 words. Its backpack is empty, and 98% of its brain is free for pure thinking!</w:t>
       </w:r>
     </w:p>
     <w:p>
@@ -240,16 +240,16 @@
           <w:rFonts w:ascii="Arial" w:hAnsi="Arial"/>
           <w:b/>
           <w:color w:val="0F5132"/>
-          <w:sz w:val="19"/>
+          <w:sz w:val="20"/>
         </w:rPr>
-        <w:t xml:space="preserve">✅ Solution 2: Mamba SSM (A Fast Reader That Never Slows Down): </w:t>
+        <w:t xml:space="preserve">⚡ Superpower 2: The Fast Mamba Scanner (Linear Speed): </w:t>
       </w:r>
       <w:r>
         <w:rPr>
           <w:rFonts w:ascii="Arial" w:hAnsi="Arial"/>
-          <w:sz w:val="19"/>
+          <w:sz w:val="20"/>
         </w:rPr>
-        <w:t>When you give raw bytes to a normal Transformer (like GPT), it becomes extremely slow because Transformer attention scales quadratically O(L²)—if text is 3x longer, it takes 9x to 12x more memory. Mamba is a new architecture called a State Space Model. It scans text in a smooth straight line (Linear Time O(L)). It never slows down and uses 3x less GPU memory!</w:t>
+        <w:t>Normal Transformer robots (like GPT) get dizzy when reading long sentences because they look at every word and compare it to every other word at the exact same time (like spinning in circles). Mamba is a new robot brain that points its finger and reads smoothly in a straight line. It never gets dizzy and runs 4 times faster!</w:t>
       </w:r>
     </w:p>
     <w:p>
@@ -261,16 +261,16 @@
           <w:rFonts w:ascii="Arial" w:hAnsi="Arial"/>
           <w:b/>
           <w:color w:val="0F5132"/>
-          <w:sz w:val="19"/>
+          <w:sz w:val="20"/>
         </w:rPr>
-        <w:t xml:space="preserve">✅ Solution 3: Human Brain Memory (Fast Notebook + Slow Brain + Sleep Replay): </w:t>
+        <w:t xml:space="preserve">⚡ Superpower 3: The Sticky Note &amp; Sleep Trick (Human Brain Memory): </w:t>
       </w:r>
       <w:r>
         <w:rPr>
           <w:rFonts w:ascii="Arial" w:hAnsi="Arial"/>
-          <w:sz w:val="19"/>
+          <w:sz w:val="20"/>
         </w:rPr>
-        <w:t>How do humans learn news without forgetting how to speak? The human brain has two parts: (1) A fast Hippocampus (like a quick notepad for today's events) and (2) A slow Neocortex (for permanent language grammar). We copied this! Our model writes new facts to a fast memory matrix in 0.01 seconds without touching its main brain. Then, when it 'sleeps', it replays the facts 20 times faster into its permanent neural weights!</w:t>
+        <w:t>How do YOU learn a new friend's name without forgetting how to speak English or Amharic? You write it on a quick mental sticky note! When someone tells our robot 'Hayyuu' a new fact on Telegram, it writes it down in 0.01 seconds on a sticky note. Then, when it 'sleeps' at night, it replays the sticky notes 20 times fast to glue them permanently into its brain!</w:t>
       </w:r>
     </w:p>
     <w:p>
@@ -279,226 +279,7 @@
         <w:spacing w:before="240" w:after="80"/>
       </w:pPr>
       <w:r>
-        <w:t>4. Plain-English Dictionary: Simple Definitions of Every Term</w:t>
-      </w:r>
-    </w:p>
-    <w:p>
-      <w:pPr>
-        <w:spacing w:before="60" w:after="60" w:line="276" w:lineRule="auto"/>
-      </w:pPr>
-      <w:r>
-        <w:rPr>
-          <w:rFonts w:ascii="Arial" w:hAnsi="Arial"/>
-          <w:b/>
-          <w:color w:val="8A3B14"/>
-          <w:sz w:val="19"/>
-        </w:rPr>
-        <w:t xml:space="preserve">📖 Bits-Per-Byte (BPB): </w:t>
-      </w:r>
-      <w:r>
-        <w:rPr>
-          <w:rFonts w:ascii="Arial" w:hAnsi="Arial"/>
-          <w:sz w:val="19"/>
-        </w:rPr>
-        <w:t>How we measure model performance. Think of it like measuring fuel economy in 'Liters per 100km'. You cannot compare two models using 'Perplexity' if one uses words and the other uses bytes. BPB measures the exact computer bits needed to guess one byte of text. LOWER BPB MEANS A SMARTER, BETTER MODEL.</w:t>
-      </w:r>
-    </w:p>
-    <w:p>
-      <w:pPr>
-        <w:spacing w:before="60" w:after="60" w:line="276" w:lineRule="auto"/>
-      </w:pPr>
-      <w:r>
-        <w:rPr>
-          <w:rFonts w:ascii="Arial" w:hAnsi="Arial"/>
-          <w:b/>
-          <w:color w:val="8A3B14"/>
-          <w:sz w:val="19"/>
-        </w:rPr>
-        <w:t xml:space="preserve">📖 Transformer: </w:t>
-      </w:r>
-      <w:r>
-        <w:rPr>
-          <w:rFonts w:ascii="Arial" w:hAnsi="Arial"/>
-          <w:sz w:val="19"/>
-        </w:rPr>
-        <w:t>The traditional AI architecture used in GPT-4. It compares every word to every other word (Self-Attention). It is great for English, but gets very slow and memory-hungry on long byte text.</w:t>
-      </w:r>
-    </w:p>
-    <w:p>
-      <w:pPr>
-        <w:spacing w:before="60" w:after="60" w:line="276" w:lineRule="auto"/>
-      </w:pPr>
-      <w:r>
-        <w:rPr>
-          <w:rFonts w:ascii="Arial" w:hAnsi="Arial"/>
-          <w:b/>
-          <w:color w:val="8A3B14"/>
-          <w:sz w:val="19"/>
-        </w:rPr>
-        <w:t xml:space="preserve">📖 Mamba (Selective State Space Model): </w:t>
-      </w:r>
-      <w:r>
-        <w:rPr>
-          <w:rFonts w:ascii="Arial" w:hAnsi="Arial"/>
-          <w:sz w:val="19"/>
-        </w:rPr>
-        <w:t>A new, modern AI architecture. Instead of comparing all words to all words, it reads text in a smooth sequence and keeps a rolling mental summary. It is fast, lightweight, and uses linear computer power.</w:t>
-      </w:r>
-    </w:p>
-    <w:p>
-      <w:pPr>
-        <w:spacing w:before="60" w:after="60" w:line="276" w:lineRule="auto"/>
-      </w:pPr>
-      <w:r>
-        <w:rPr>
-          <w:rFonts w:ascii="Arial" w:hAnsi="Arial"/>
-          <w:b/>
-          <w:color w:val="8A3B14"/>
-          <w:sz w:val="19"/>
-        </w:rPr>
-        <w:t xml:space="preserve">📖 Token Tax: </w:t>
-      </w:r>
-      <w:r>
-        <w:rPr>
-          <w:rFonts w:ascii="Arial" w:hAnsi="Arial"/>
-          <w:sz w:val="19"/>
-        </w:rPr>
-        <w:t>The unfair computational penalty paid by non-English languages because standard tokenizers break their words into multiple pieces.</w:t>
-      </w:r>
-    </w:p>
-    <w:p>
-      <w:pPr>
-        <w:spacing w:before="60" w:after="60" w:line="276" w:lineRule="auto"/>
-      </w:pPr>
-      <w:r>
-        <w:rPr>
-          <w:rFonts w:ascii="Arial" w:hAnsi="Arial"/>
-          <w:b/>
-          <w:color w:val="8A3B14"/>
-          <w:sz w:val="19"/>
-        </w:rPr>
-        <w:t xml:space="preserve">📖 Parameter Allocation Tax: </w:t>
-      </w:r>
-      <w:r>
-        <w:rPr>
-          <w:rFonts w:ascii="Arial" w:hAnsi="Arial"/>
-          <w:sz w:val="19"/>
-        </w:rPr>
-        <w:t>The percentage of an AI model's brain capacity wasted on holding a dictionary list instead of thinking layers.</w:t>
-      </w:r>
-    </w:p>
-    <w:p>
-      <w:pPr>
-        <w:spacing w:before="60" w:after="60" w:line="276" w:lineRule="auto"/>
-      </w:pPr>
-      <w:r>
-        <w:rPr>
-          <w:rFonts w:ascii="Arial" w:hAnsi="Arial"/>
-          <w:b/>
-          <w:color w:val="8A3B14"/>
-          <w:sz w:val="19"/>
-        </w:rPr>
-        <w:t xml:space="preserve">📖 Hebbian Learning: </w:t>
-      </w:r>
-      <w:r>
-        <w:rPr>
-          <w:rFonts w:ascii="Arial" w:hAnsi="Arial"/>
-          <w:sz w:val="19"/>
-        </w:rPr>
-        <w:t>"Neurons that fire together, wire together." A simple biological formula that lets the computer remember a new fact in 0.01 seconds by connecting numbers directly, without running slow training calculations.</w:t>
-      </w:r>
-    </w:p>
-    <w:p>
-      <w:pPr>
-        <w:spacing w:before="60" w:after="60" w:line="276" w:lineRule="auto"/>
-      </w:pPr>
-      <w:r>
-        <w:rPr>
-          <w:rFonts w:ascii="Arial" w:hAnsi="Arial"/>
-          <w:b/>
-          <w:color w:val="8A3B14"/>
-          <w:sz w:val="19"/>
-        </w:rPr>
-        <w:t xml:space="preserve">📖 Synaptic Consolidation (Sleep Replay): </w:t>
-      </w:r>
-      <w:r>
-        <w:rPr>
-          <w:rFonts w:ascii="Arial" w:hAnsi="Arial"/>
-          <w:sz w:val="19"/>
-        </w:rPr>
-        <w:t>What the brain does at night: taking the short-term facts from the day and replaying them quickly into the permanent brain circuits so you never forget them.</w:t>
-      </w:r>
-    </w:p>
-    <w:p>
-      <w:pPr>
-        <w:spacing w:before="60" w:after="60" w:line="276" w:lineRule="auto"/>
-      </w:pPr>
-      <w:r>
-        <w:rPr>
-          <w:rFonts w:ascii="Arial" w:hAnsi="Arial"/>
-          <w:b/>
-          <w:color w:val="8A3B14"/>
-          <w:sz w:val="19"/>
-        </w:rPr>
-        <w:t xml:space="preserve">📖 SFT (Supervised Fine-Tuning): </w:t>
-      </w:r>
-      <w:r>
-        <w:rPr>
-          <w:rFonts w:ascii="Arial" w:hAnsi="Arial"/>
-          <w:sz w:val="19"/>
-        </w:rPr>
-        <w:t>Teaching the AI how to behave like a helpful assistant by training on question-and-answer pairs.</w:t>
-      </w:r>
-    </w:p>
-    <w:p>
-      <w:pPr>
-        <w:spacing w:before="60" w:after="60" w:line="276" w:lineRule="auto"/>
-      </w:pPr>
-      <w:r>
-        <w:rPr>
-          <w:rFonts w:ascii="Arial" w:hAnsi="Arial"/>
-          <w:b/>
-          <w:color w:val="8A3B14"/>
-          <w:sz w:val="19"/>
-        </w:rPr>
-        <w:t xml:space="preserve">📖 Prompt-Loss Masking: </w:t>
-      </w:r>
-      <w:r>
-        <w:rPr>
-          <w:rFonts w:ascii="Arial" w:hAnsi="Arial"/>
-          <w:sz w:val="19"/>
-        </w:rPr>
-        <w:t>Telling the AI: 'Don't grade yourself on the user's question; only grade yourself on giving the correct answer.'</w:t>
-      </w:r>
-    </w:p>
-    <w:p>
-      <w:pPr>
-        <w:spacing w:before="60" w:after="60" w:line="276" w:lineRule="auto"/>
-      </w:pPr>
-      <w:r>
-        <w:rPr>
-          <w:rFonts w:ascii="Arial" w:hAnsi="Arial"/>
-          <w:b/>
-          <w:color w:val="8A3B14"/>
-          <w:sz w:val="19"/>
-        </w:rPr>
-        <w:t xml:space="preserve">📖 Hayyuu: </w:t>
-      </w:r>
-      <w:r>
-        <w:rPr>
-          <w:rFonts w:ascii="Arial" w:hAnsi="Arial"/>
-          <w:sz w:val="19"/>
-        </w:rPr>
-        <w:t>The name of our living AI assistant deployed on Telegram. Named after the Oromo word for a wise elder / counselor / scholar.</w:t>
-      </w:r>
-    </w:p>
-    <w:p>
-      <w:pPr>
-        <w:pStyle w:val="Heading1"/>
-        <w:spacing w:before="240" w:after="80"/>
-      </w:pPr>
-      <w:r>
-        <w:t>5. The Results: How to Explain the Numbers Simply</w:t>
+        <w:t>4. The Battle: How the Tiny Robot Beat the Giant Robot</w:t>
       </w:r>
     </w:p>
     <w:p>
@@ -506,7 +287,7 @@
         <w:rPr>
           <w:b/>
         </w:rPr>
-        <w:t>Table 1: The Core Model Comparison (Lower BPB is Better)</w:t>
+        <w:t>Table 1: Test Scores (Lower Score = Smarter Robot)</w:t>
       </w:r>
     </w:p>
     <w:tbl>
@@ -542,7 +323,7 @@
                 <w:color w:val="FFFFFF"/>
                 <w:sz w:val="18"/>
               </w:rPr>
-              <w:t>Model Name</w:t>
+              <w:t>Robot Name</w:t>
             </w:r>
           </w:p>
         </w:tc>
@@ -565,7 +346,7 @@
                 <w:color w:val="FFFFFF"/>
                 <w:sz w:val="18"/>
               </w:rPr>
-              <w:t>Input Format</w:t>
+              <w:t>How It Reads</w:t>
             </w:r>
           </w:p>
         </w:tc>
@@ -588,7 +369,7 @@
                 <w:color w:val="FFFFFF"/>
                 <w:sz w:val="18"/>
               </w:rPr>
-              <w:t>Size (Params)</w:t>
+              <w:t>Brain Weight</w:t>
             </w:r>
           </w:p>
         </w:tc>
@@ -611,7 +392,7 @@
                 <w:color w:val="FFFFFF"/>
                 <w:sz w:val="18"/>
               </w:rPr>
-              <w:t>Dictionary Waste</w:t>
+              <w:t>Backpack Waste</w:t>
             </w:r>
           </w:p>
         </w:tc>
@@ -634,7 +415,7 @@
                 <w:color w:val="FFFFFF"/>
                 <w:sz w:val="18"/>
               </w:rPr>
-              <w:t>Score (Bits/Byte)</w:t>
+              <w:t>Test Score (BPB)</w:t>
             </w:r>
           </w:p>
         </w:tc>
@@ -657,7 +438,7 @@
                 <w:rFonts w:ascii="Arial" w:hAnsi="Arial"/>
                 <w:sz w:val="18"/>
               </w:rPr>
-              <w:t>Transformer (32k)</w:t>
+              <w:t>Giant Transformer</w:t>
             </w:r>
           </w:p>
         </w:tc>
@@ -678,7 +459,7 @@
                 <w:rFonts w:ascii="Arial" w:hAnsi="Arial"/>
                 <w:sz w:val="18"/>
               </w:rPr>
-              <w:t>32,000 pieces</w:t>
+              <w:t>32,000 Flashcards</w:t>
             </w:r>
           </w:p>
         </w:tc>
@@ -706,6 +487,27 @@
         <w:tc>
           <w:tcPr>
             <w:tcW w:type="dxa" w:w="2016"/>
+            <w:shd w:fill="FAFAFA"/>
+            <w:tcMar>
+              <w:top w:w="70" w:type="dxa"/>
+              <w:bottom w:w="70" w:type="dxa"/>
+              <w:left w:w="90" w:type="dxa"/>
+              <w:right w:w="90" w:type="dxa"/>
+            </w:tcMar>
+          </w:tcPr>
+          <w:p>
+            <w:r>
+              <w:rPr>
+                <w:rFonts w:ascii="Arial" w:hAnsi="Arial"/>
+                <w:sz w:val="18"/>
+              </w:rPr>
+              <w:t>63% Wasted (Heavy!)</w:t>
+            </w:r>
+          </w:p>
+        </w:tc>
+        <w:tc>
+          <w:tcPr>
+            <w:tcW w:type="dxa" w:w="2016"/>
             <w:shd w:fill="F8D7DA"/>
             <w:tcMar>
               <w:top w:w="70" w:type="dxa"/>
@@ -720,28 +522,7 @@
                 <w:rFonts w:ascii="Arial" w:hAnsi="Arial"/>
                 <w:sz w:val="18"/>
               </w:rPr>
-              <w:t>62.8% (Huge waste)</w:t>
-            </w:r>
-          </w:p>
-        </w:tc>
-        <w:tc>
-          <w:tcPr>
-            <w:tcW w:type="dxa" w:w="2016"/>
-            <w:shd w:fill="FAFAFA"/>
-            <w:tcMar>
-              <w:top w:w="70" w:type="dxa"/>
-              <w:bottom w:w="70" w:type="dxa"/>
-              <w:left w:w="90" w:type="dxa"/>
-              <w:right w:w="90" w:type="dxa"/>
-            </w:tcMar>
-          </w:tcPr>
-          <w:p>
-            <w:r>
-              <w:rPr>
-                <w:rFonts w:ascii="Arial" w:hAnsi="Arial"/>
-                <w:sz w:val="18"/>
-              </w:rPr>
-              <w:t>1.579 BPB (Worst)</w:t>
+              <w:t>1.579 (Worst score ❌)</w:t>
             </w:r>
           </w:p>
         </w:tc>
@@ -764,7 +545,7 @@
                 <w:rFonts w:ascii="Arial" w:hAnsi="Arial"/>
                 <w:sz w:val="18"/>
               </w:rPr>
-              <w:t>Transformer (16k)</w:t>
+              <w:t>Medium Transformer</w:t>
             </w:r>
           </w:p>
         </w:tc>
@@ -785,7 +566,7 @@
                 <w:rFonts w:ascii="Arial" w:hAnsi="Arial"/>
                 <w:sz w:val="18"/>
               </w:rPr>
-              <w:t>16,000 pieces</w:t>
+              <w:t>16,000 Flashcards</w:t>
             </w:r>
           </w:p>
         </w:tc>
@@ -827,7 +608,7 @@
                 <w:rFonts w:ascii="Arial" w:hAnsi="Arial"/>
                 <w:sz w:val="18"/>
               </w:rPr>
-              <w:t>45.7% (High waste)</w:t>
+              <w:t>46% Wasted</w:t>
             </w:r>
           </w:p>
         </w:tc>
@@ -848,7 +629,7 @@
                 <w:rFonts w:ascii="Arial" w:hAnsi="Arial"/>
                 <w:sz w:val="18"/>
               </w:rPr>
-              <w:t>1.492 BPB</w:t>
+              <w:t>1.492</w:t>
             </w:r>
           </w:p>
         </w:tc>
@@ -871,7 +652,7 @@
                 <w:rFonts w:ascii="Arial" w:hAnsi="Arial"/>
                 <w:sz w:val="18"/>
               </w:rPr>
-              <w:t>TinyMamba (Ours)</w:t>
+              <w:t>Tiny Mamba (Ours)</w:t>
             </w:r>
           </w:p>
         </w:tc>
@@ -892,7 +673,7 @@
                 <w:rFonts w:ascii="Arial" w:hAnsi="Arial"/>
                 <w:sz w:val="18"/>
               </w:rPr>
-              <w:t>Raw Bytes</w:t>
+              <w:t>Raw Numbers (Bytes)</w:t>
             </w:r>
           </w:p>
         </w:tc>
@@ -934,7 +715,7 @@
                 <w:rFonts w:ascii="Arial" w:hAnsi="Arial"/>
                 <w:sz w:val="18"/>
               </w:rPr>
-              <w:t>2.3% (Minimal)</w:t>
+              <w:t>2% Wasted (Super Light!)</w:t>
             </w:r>
           </w:p>
         </w:tc>
@@ -955,7 +736,7 @@
                 <w:rFonts w:ascii="Arial" w:hAnsi="Arial"/>
                 <w:sz w:val="18"/>
               </w:rPr>
-              <w:t>1.322 BPB (Beat 13M!)</w:t>
+              <w:t>1.322 (Beat the Giant! ⚡)</w:t>
             </w:r>
           </w:p>
         </w:tc>
@@ -978,7 +759,7 @@
                 <w:rFonts w:ascii="Arial" w:hAnsi="Arial"/>
                 <w:sz w:val="18"/>
               </w:rPr>
-              <w:t>Mamba-Base (Ours)</w:t>
+              <w:t>Big Mamba (Ours)</w:t>
             </w:r>
           </w:p>
         </w:tc>
@@ -999,7 +780,7 @@
                 <w:rFonts w:ascii="Arial" w:hAnsi="Arial"/>
                 <w:sz w:val="18"/>
               </w:rPr>
-              <w:t>Raw Bytes</w:t>
+              <w:t>Raw Numbers (Bytes)</w:t>
             </w:r>
           </w:p>
         </w:tc>
@@ -1041,7 +822,7 @@
                 <w:rFonts w:ascii="Arial" w:hAnsi="Arial"/>
                 <w:sz w:val="18"/>
               </w:rPr>
-              <w:t>0.4% (Pure thinking)</w:t>
+              <w:t>0.4% Wasted (Pure Brain)</w:t>
             </w:r>
           </w:p>
         </w:tc>
@@ -1062,7 +843,7 @@
                 <w:rFonts w:ascii="Arial" w:hAnsi="Arial"/>
                 <w:sz w:val="18"/>
               </w:rPr>
-              <w:t>1.061 BPB 🏆 (Best)</w:t>
+              <w:t>1.061 🏆 (Best Champion!)</w:t>
             </w:r>
           </w:p>
         </w:tc>
@@ -1070,28 +851,11 @@
     </w:tbl>
     <w:p>
       <w:pPr>
-        <w:spacing w:before="160" w:line="276" w:lineRule="auto"/>
-      </w:pPr>
-      <w:r>
-        <w:rPr>
-          <w:b/>
-        </w:rPr>
-        <w:t xml:space="preserve">How to say this to the audience: </w:t>
-      </w:r>
-      <w:r>
-        <w:rPr>
-          <w:i/>
-        </w:rPr>
-        <w:t>"Look at Table 1. The Transformer model with 13 million parameters wasted 63% of its size on a dictionary and scored 1.579 BPB. Our TinyMamba model had only 2.7 million parameters (almost 5 times smaller!), wasted almost nothing on dictionaries, and scored 1.322 BPB. This proves that smaller, smarter byte models beat larger, wasteful tokenized models!"</w:t>
-      </w:r>
-    </w:p>
-    <w:p>
-      <w:pPr>
         <w:pStyle w:val="Heading1"/>
         <w:spacing w:before="280" w:after="80"/>
       </w:pPr>
       <w:r>
-        <w:t>6. Questions You Might Get &amp; How to Answer Without Hesitation</w:t>
+        <w:t>5. How to Answer Any Question in Front of the Class</w:t>
       </w:r>
     </w:p>
     <w:p>
@@ -1103,18 +867,18 @@
           <w:rFonts w:ascii="Arial" w:hAnsi="Arial"/>
           <w:b/>
           <w:color w:val="1B365D"/>
-          <w:sz w:val="19"/>
+          <w:sz w:val="20"/>
         </w:rPr>
-        <w:t>❓ Question: Why didn't you just make a better Amharic tokenizer?</w:t>
+        <w:t>❓ Question: Why did you throw away the tokenizer?</w:t>
         <w:br/>
       </w:r>
       <w:r>
         <w:rPr>
           <w:rFonts w:ascii="Arial" w:hAnsi="Arial"/>
           <w:color w:val="282828"/>
-          <w:sz w:val="19"/>
+          <w:sz w:val="20"/>
         </w:rPr>
-        <w:t>👉 Simple Answer: Because Amharic grammar modifies words with prefixes and suffixes in complex ways. Even with a 32,000-word tokenizer, more than 60% of our model's weights were wasted just storing dictionary words instead of learning grammar. By removing the tokenizer, 98% of the model is dedicated to pure thinking.</w:t>
+        <w:t>👉 What to say: 'Because it was chopping Amharic letters into confetti and making the robot carry a giant heavy dictionary. Reading raw numbers is lighter and gives the robot 98% of its brain to think!'</w:t>
       </w:r>
     </w:p>
     <w:p>
@@ -1126,18 +890,18 @@
           <w:rFonts w:ascii="Arial" w:hAnsi="Arial"/>
           <w:b/>
           <w:color w:val="1B365D"/>
-          <w:sz w:val="19"/>
+          <w:sz w:val="20"/>
         </w:rPr>
-        <w:t>❓ Question: If bytes make the text 3 times longer, doesn't that make the AI super slow?</w:t>
+        <w:t>❓ Question: Why is Mamba better than Transformer?</w:t>
         <w:br/>
       </w:r>
       <w:r>
         <w:rPr>
           <w:rFonts w:ascii="Arial" w:hAnsi="Arial"/>
           <w:color w:val="282828"/>
-          <w:sz w:val="19"/>
+          <w:sz w:val="20"/>
         </w:rPr>
-        <w:t>👉 Simple Answer: It makes Transformers slow because Transformers compare every letter to every other letter (O(L²)). But Mamba reads in a straight line (O(L)). Our small Mamba model processed 384 bytes at over 4 steps per second and used 3 times less GPU memory than the Transformer.</w:t>
+        <w:t>👉 What to say: 'Transformers get dizzy looking at every word all at once. Mamba reads smoothly in a straight line, so it is 4 times faster and never runs out of memory!'</w:t>
       </w:r>
     </w:p>
     <w:p>
@@ -1149,18 +913,18 @@
           <w:rFonts w:ascii="Arial" w:hAnsi="Arial"/>
           <w:b/>
           <w:color w:val="1B365D"/>
-          <w:sz w:val="19"/>
+          <w:sz w:val="20"/>
         </w:rPr>
-        <w:t>❓ Question: How does the model learn new news on Telegram without forgetting past grammar?</w:t>
+        <w:t>❓ Question: How does the robot learn new things on Telegram?</w:t>
         <w:br/>
       </w:r>
       <w:r>
         <w:rPr>
           <w:rFonts w:ascii="Arial" w:hAnsi="Arial"/>
           <w:color w:val="282828"/>
-          <w:sz w:val="19"/>
+          <w:sz w:val="20"/>
         </w:rPr>
-        <w:t>👉 Simple Answer: We copied the human brain! When someone teaches Hayyuu a new fact, it writes it to a fast memory notepad in 0.01 seconds without changing its main neural weights. When it sleeps, it replays those notes and slowly integrates them so grammar is never ruined.</w:t>
+        <w:t>👉 What to say: 'It writes the new fact on a quick sticky note in 0.01 seconds. When it sleeps, it replays the note 20 times fast to permanently glue it into its brain without forgetting how to speak Amharic!'</w:t>
       </w:r>
     </w:p>
     <w:p>
@@ -1172,18 +936,18 @@
           <w:rFonts w:ascii="Arial" w:hAnsi="Arial"/>
           <w:b/>
           <w:color w:val="1B365D"/>
-          <w:sz w:val="19"/>
+          <w:sz w:val="20"/>
         </w:rPr>
-        <w:t>❓ Question: What is the main message of your research?</w:t>
+        <w:t>❓ Question: What is the main achievement of your work?</w:t>
         <w:br/>
       </w:r>
       <w:r>
         <w:rPr>
           <w:rFonts w:ascii="Arial" w:hAnsi="Arial"/>
           <w:color w:val="282828"/>
-          <w:sz w:val="19"/>
+          <w:sz w:val="20"/>
         </w:rPr>
-        <w:t>👉 Simple Answer: You do not need billions of dollars or giant supercomputers to build high-quality AI for African languages. By using raw bytes and efficient Mamba models, anyone can train a powerful Amharic AI on a single standard graphics card (RTX 3090).</w:t>
+        <w:t>👉 What to say: 'We proved you don't need giant million-dollar computers to build smart AI for Ethiopia. You can build a super-fast Amharic AI on a single regular computer graphics card!'</w:t>
       </w:r>
     </w:p>
     <w:sectPr>

</xml_diff>

<commit_message>
Update Master Guide to complete Slide-by-Slide Presentation Companion
</commit_message>
<xml_diff>
--- a/AMHARIC_MAMBA_PRESENTATION_MASTER_GUIDE.docx
+++ b/AMHARIC_MAMBA_PRESENTATION_MASTER_GUIDE.docx
@@ -12,9 +12,9 @@
           <w:rFonts w:ascii="Arial" w:hAnsi="Arial"/>
           <w:b/>
           <w:color w:val="1B365D"/>
-          <w:sz w:val="36"/>
+          <w:sz w:val="34"/>
         </w:rPr>
-        <w:t>MY AMHARIC AI PROJECT (GRADE 4 EXPLANATION)</w:t>
+        <w:t>SLIDE-BY-SLIDE PRESENTATION COMPANION</w:t>
       </w:r>
     </w:p>
     <w:p>
@@ -26,15 +26,15 @@
         <w:rPr>
           <w:rFonts w:ascii="Arial" w:hAnsi="Arial"/>
           <w:b/>
-          <w:color w:val="D15B1B"/>
-          <w:sz w:val="24"/>
+          <w:color w:val="4A607A"/>
+          <w:sz w:val="21"/>
         </w:rPr>
-        <w:t>How a Tiny Smart Robot Beat a Big Heavy Robot at Reading Amharic!</w:t>
+        <w:t>Exactly What Every Slide Means, The Simple Idea, and What to Say Out Loud Without Getting Confused</w:t>
       </w:r>
     </w:p>
     <w:p>
       <w:pPr>
-        <w:spacing w:after="240"/>
+        <w:spacing w:after="200"/>
         <w:jc w:val="center"/>
       </w:pPr>
       <w:r>
@@ -44,16 +44,7 @@
           <w:color w:val="5A5A5A"/>
           <w:sz w:val="19"/>
         </w:rPr>
-        <w:t>Presenter: Beknan Chemeda  |  Project: Amharic Byte Mamba &amp; Hayyuu</w:t>
-      </w:r>
-    </w:p>
-    <w:p>
-      <w:pPr>
-        <w:pStyle w:val="Heading1"/>
-        <w:spacing w:before="200" w:after="80"/>
-      </w:pPr>
-      <w:r>
-        <w:t>1. Story Time: What is this project?</w:t>
+        <w:t>Presenter: Beknan Chemeda  |  Project: Amharic Byte Mamba &amp; Hayyuu AI</w:t>
       </w:r>
     </w:p>
     <w:tbl>
@@ -69,35 +60,107 @@
       <w:tr>
         <w:tc>
           <w:tcPr>
-            <w:tcW w:type="dxa" w:w="10080"/>
-            <w:shd w:fill="D1E7DD"/>
+            <w:tcW w:type="dxa" w:w="10224"/>
+            <w:shd w:fill="F4F7FB"/>
             <w:tcMar>
               <w:top w:w="140" w:type="dxa"/>
               <w:bottom w:w="140" w:type="dxa"/>
-              <w:left w:w="200" w:type="dxa"/>
-              <w:right w:w="200" w:type="dxa"/>
+              <w:left w:w="180" w:type="dxa"/>
+              <w:right w:w="180" w:type="dxa"/>
             </w:tcMar>
           </w:tcPr>
           <w:p>
             <w:pPr>
-              <w:spacing w:before="40" w:after="40" w:line="276" w:lineRule="auto"/>
+              <w:spacing w:before="0" w:after="40" w:line="276" w:lineRule="auto"/>
             </w:pPr>
             <w:r>
               <w:rPr>
                 <w:rFonts w:ascii="Arial" w:hAnsi="Arial"/>
                 <w:b/>
-                <w:color w:val="0F5132"/>
-                <w:sz w:val="21"/>
+                <w:color w:val="1B365D"/>
+                <w:sz w:val="22"/>
               </w:rPr>
-              <w:t xml:space="preserve">⭐ THE 1-MINUTE STORY: </w:t>
+              <w:t>SLIDE 1: TITLE SLIDE: BYTE-LEVEL MAMBA VS. TRANSFORMER</w:t>
+              <w:br/>
+            </w:r>
+          </w:p>
+          <w:p>
+            <w:pPr>
+              <w:spacing w:after="40" w:line="276" w:lineRule="auto"/>
+            </w:pPr>
+            <w:r>
+              <w:rPr>
+                <w:b/>
+                <w:color w:val="8A3B14"/>
+                <w:sz w:val="19"/>
+              </w:rPr>
+              <w:t xml:space="preserve">👁️ What the audience sees: </w:t>
             </w:r>
             <w:r>
               <w:rPr>
-                <w:rFonts w:ascii="Arial" w:hAnsi="Arial"/>
-                <w:color w:val="1E1E1E"/>
-                <w:sz w:val="20"/>
+                <w:sz w:val="19"/>
               </w:rPr>
-              <w:t>Imagine you want to teach a computer robot how to read and speak Amharic. Today, all the big robots in the world (like ChatGPT) were built for English. When they try to read Amharic, they get super confused! They use broken scissors to cut Amharic words into tiny little pieces. This makes them slow, heavy, and tired. In my project, I threw away the scissors! I gave the robot a fast new brain called 'Mamba' that reads computer numbers directly. My tiny robot beat a giant robot 5 times bigger than itself! Then, I taught it how to take quick notes and 'sleep' at night to remember everything permanently.</w:t>
+              <w:t>Dark navy screen with title, your name (Beknan Chemeda), and project topic.</w:t>
+            </w:r>
+          </w:p>
+          <w:p>
+            <w:pPr>
+              <w:spacing w:after="40" w:line="276" w:lineRule="auto"/>
+            </w:pPr>
+            <w:r>
+              <w:rPr>
+                <w:b/>
+                <w:color w:val="0F5132"/>
+                <w:sz w:val="19"/>
+              </w:rPr>
+              <w:t xml:space="preserve">💡 Core Idea to Remember: </w:t>
+            </w:r>
+            <w:r>
+              <w:rPr>
+                <w:sz w:val="19"/>
+              </w:rPr>
+              <w:t>Introduce yourself with confidence and tell the audience that you built a faster, smarter Amharic AI that doesn't waste computer memory.</w:t>
+            </w:r>
+          </w:p>
+          <w:p>
+            <w:pPr>
+              <w:spacing w:after="40" w:line="276" w:lineRule="auto"/>
+            </w:pPr>
+            <w:r>
+              <w:rPr>
+                <w:b/>
+                <w:color w:val="5C3B00"/>
+                <w:sz w:val="19"/>
+              </w:rPr>
+              <w:t xml:space="preserve">🍎 Simple Analogy: </w:t>
+            </w:r>
+            <w:r>
+              <w:rPr>
+                <w:sz w:val="19"/>
+              </w:rPr>
+              <w:t>Think of this like introducing a new lightweight electric race car designed specifically for Ethiopian roads.</w:t>
+            </w:r>
+          </w:p>
+          <w:p>
+            <w:pPr>
+              <w:spacing w:before="80" w:after="40" w:line="276" w:lineRule="auto"/>
+            </w:pPr>
+            <w:r>
+              <w:rPr>
+                <w:b/>
+                <w:color w:val="0D6EFD"/>
+                <w:sz w:val="19"/>
+              </w:rPr>
+              <w:t>🎙️ EXACT WORDS TO SAY OUT LOUD:</w:t>
+              <w:br/>
+            </w:r>
+            <w:r>
+              <w:rPr>
+                <w:i/>
+                <w:color w:val="141414"/>
+                <w:sz w:val="19"/>
+              </w:rPr>
+              <w:t>"Good morning, everyone. My name is Beknan Chemeda. Today I am presenting my research on building a fast, lightweight, and token-free Generative AI for the Amharic language using Mamba State-Space Models and Brain-Inspired Continual Learning."</w:t>
             </w:r>
           </w:p>
         </w:tc>
@@ -105,745 +168,123 @@
     </w:tbl>
     <w:p>
       <w:pPr>
-        <w:spacing w:after="80"/>
+        <w:spacing w:after="120"/>
       </w:pPr>
-    </w:p>
-    <w:p>
-      <w:pPr>
-        <w:pStyle w:val="Heading1"/>
-        <w:spacing w:before="240" w:after="80"/>
-      </w:pPr>
-      <w:r>
-        <w:t>2. The 4 Big Problems (Why normal AI struggled)</w:t>
-      </w:r>
-    </w:p>
-    <w:p>
-      <w:pPr>
-        <w:spacing w:before="60" w:after="60" w:line="276" w:lineRule="auto"/>
-      </w:pPr>
-      <w:r>
-        <w:rPr>
-          <w:rFonts w:ascii="Arial" w:hAnsi="Arial"/>
-          <w:b/>
-          <w:color w:val="B02A37"/>
-          <w:sz w:val="20"/>
-        </w:rPr>
-        <w:t xml:space="preserve">❌ Problem 1: The 'Small Library' Problem: </w:t>
-      </w:r>
-      <w:r>
-        <w:rPr>
-          <w:rFonts w:ascii="Arial" w:hAnsi="Arial"/>
-          <w:sz w:val="20"/>
-        </w:rPr>
-        <w:t>For English, computers have billions of storybooks on the internet. But for Amharic, we only have a very small shelf of clean books. If you try to translate English books with Google Translate, they have broken grammar and confuse the robot. So our robot had to be extra smart with the few books we had!</w:t>
-      </w:r>
-    </w:p>
-    <w:p>
-      <w:pPr>
-        <w:spacing w:before="60" w:after="60" w:line="276" w:lineRule="auto"/>
-      </w:pPr>
-      <w:r>
-        <w:rPr>
-          <w:rFonts w:ascii="Arial" w:hAnsi="Arial"/>
-          <w:b/>
-          <w:color w:val="B02A37"/>
-          <w:sz w:val="20"/>
-        </w:rPr>
-        <w:t xml:space="preserve">❌ Problem 2: The 'Broken Scissors' Problem (The Token Tax): </w:t>
-      </w:r>
-      <w:r>
-        <w:rPr>
-          <w:rFonts w:ascii="Arial" w:hAnsi="Arial"/>
-          <w:sz w:val="20"/>
-        </w:rPr>
-        <w:t>Before a computer reads a word, it cuts it into flashcards. For English, the word 'cat' is 1 flashcard. But for Amharic ('ድመት'), the scissors break it into 6 or 7 tiny pieces! Imagine trying to read a story where every single word is chopped into confetti! It takes 4 times longer to read! We call this the 'Token Tax'.</w:t>
-      </w:r>
-    </w:p>
-    <w:p>
-      <w:pPr>
-        <w:spacing w:before="60" w:after="60" w:line="276" w:lineRule="auto"/>
-      </w:pPr>
-      <w:r>
-        <w:rPr>
-          <w:rFonts w:ascii="Arial" w:hAnsi="Arial"/>
-          <w:b/>
-          <w:color w:val="B02A37"/>
-          <w:sz w:val="20"/>
-        </w:rPr>
-        <w:t xml:space="preserve">❌ Problem 3: The 'Heavy Backpack' Problem (Parameter Tax): </w:t>
-      </w:r>
-      <w:r>
-        <w:rPr>
-          <w:rFonts w:ascii="Arial" w:hAnsi="Arial"/>
-          <w:sz w:val="20"/>
-        </w:rPr>
-        <w:t>Because the scissors chopped words into so many pieces, the robot had to carry a giant 32,000-word dictionary in its backpack. In fact, 63% of the robot's entire brain weight was just holding that heavy dictionary list, leaving almost no room in its brain to actually think!</w:t>
-      </w:r>
-    </w:p>
-    <w:p>
-      <w:pPr>
-        <w:spacing w:before="60" w:after="60" w:line="276" w:lineRule="auto"/>
-      </w:pPr>
-      <w:r>
-        <w:rPr>
-          <w:rFonts w:ascii="Arial" w:hAnsi="Arial"/>
-          <w:b/>
-          <w:color w:val="B02A37"/>
-          <w:sz w:val="20"/>
-        </w:rPr>
-        <w:t xml:space="preserve">❌ Problem 4: The 'Goldfish Memory' Problem (Catastrophic Forgetting): </w:t>
-      </w:r>
-      <w:r>
-        <w:rPr>
-          <w:rFonts w:ascii="Arial" w:hAnsi="Arial"/>
-          <w:sz w:val="20"/>
-        </w:rPr>
-        <w:t>Normal robots have a funny brain bug: if you teach them today's new news, they immediately forget how to speak! They learn the new fact, but suddenly start repeating words and talking like a baby. This is called Catastrophic Forgetting.</w:t>
-      </w:r>
-    </w:p>
-    <w:p>
-      <w:pPr>
-        <w:pStyle w:val="Heading1"/>
-        <w:spacing w:before="240" w:after="80"/>
-      </w:pPr>
-      <w:r>
-        <w:t>3. Our 3 Superpowers: How we solved everything!</w:t>
-      </w:r>
-    </w:p>
-    <w:p>
-      <w:pPr>
-        <w:spacing w:before="60" w:after="60" w:line="276" w:lineRule="auto"/>
-      </w:pPr>
-      <w:r>
-        <w:rPr>
-          <w:rFonts w:ascii="Arial" w:hAnsi="Arial"/>
-          <w:b/>
-          <w:color w:val="0F5132"/>
-          <w:sz w:val="20"/>
-        </w:rPr>
-        <w:t xml:space="preserve">⚡ Superpower 1: We Threw Away the Scissors (Byte-Level AI): </w:t>
-      </w:r>
-      <w:r>
-        <w:rPr>
-          <w:rFonts w:ascii="Arial" w:hAnsi="Arial"/>
-          <w:sz w:val="20"/>
-        </w:rPr>
-        <w:t>Computers already understand numbers from 0 to 255 (called 'bytes'). Instead of chopping words with scissors, we let the robot read the raw numbers directly! Now the robot's dictionary has only 256 numbers instead of 32,000 words. Its backpack is empty, and 98% of its brain is free for pure thinking!</w:t>
-      </w:r>
-    </w:p>
-    <w:p>
-      <w:pPr>
-        <w:spacing w:before="60" w:after="60" w:line="276" w:lineRule="auto"/>
-      </w:pPr>
-      <w:r>
-        <w:rPr>
-          <w:rFonts w:ascii="Arial" w:hAnsi="Arial"/>
-          <w:b/>
-          <w:color w:val="0F5132"/>
-          <w:sz w:val="20"/>
-        </w:rPr>
-        <w:t xml:space="preserve">⚡ Superpower 2: The Fast Mamba Scanner (Linear Speed): </w:t>
-      </w:r>
-      <w:r>
-        <w:rPr>
-          <w:rFonts w:ascii="Arial" w:hAnsi="Arial"/>
-          <w:sz w:val="20"/>
-        </w:rPr>
-        <w:t>Normal Transformer robots (like GPT) get dizzy when reading long sentences because they look at every word and compare it to every other word at the exact same time (like spinning in circles). Mamba is a new robot brain that points its finger and reads smoothly in a straight line. It never gets dizzy and runs 4 times faster!</w:t>
-      </w:r>
-    </w:p>
-    <w:p>
-      <w:pPr>
-        <w:spacing w:before="60" w:after="60" w:line="276" w:lineRule="auto"/>
-      </w:pPr>
-      <w:r>
-        <w:rPr>
-          <w:rFonts w:ascii="Arial" w:hAnsi="Arial"/>
-          <w:b/>
-          <w:color w:val="0F5132"/>
-          <w:sz w:val="20"/>
-        </w:rPr>
-        <w:t xml:space="preserve">⚡ Superpower 3: The Sticky Note &amp; Sleep Trick (Human Brain Memory): </w:t>
-      </w:r>
-      <w:r>
-        <w:rPr>
-          <w:rFonts w:ascii="Arial" w:hAnsi="Arial"/>
-          <w:sz w:val="20"/>
-        </w:rPr>
-        <w:t>How do YOU learn a new friend's name without forgetting how to speak English or Amharic? You write it on a quick mental sticky note! When someone tells our robot 'Hayyuu' a new fact on Telegram, it writes it down in 0.01 seconds on a sticky note. Then, when it 'sleeps' at night, it replays the sticky notes 20 times fast to glue them permanently into its brain!</w:t>
-      </w:r>
-    </w:p>
-    <w:p>
-      <w:pPr>
-        <w:pStyle w:val="Heading1"/>
-        <w:spacing w:before="240" w:after="80"/>
-      </w:pPr>
-      <w:r>
-        <w:t>4. The Battle: How the Tiny Robot Beat the Giant Robot</w:t>
-      </w:r>
-    </w:p>
-    <w:p>
-      <w:r>
-        <w:rPr>
-          <w:b/>
-        </w:rPr>
-        <w:t>Table 1: Test Scores (Lower Score = Smarter Robot)</w:t>
-      </w:r>
     </w:p>
     <w:tbl>
       <w:tblPr>
         <w:tblW w:type="auto" w:w="0"/>
         <w:jc w:val="center"/>
+        <w:tblLayout w:type="fixed"/>
         <w:tblLook w:firstColumn="1" w:firstRow="1" w:lastColumn="0" w:lastRow="0" w:noHBand="0" w:noVBand="1" w:val="04A0"/>
       </w:tblPr>
       <w:tblGrid>
-        <w:gridCol w:w="2016"/>
-        <w:gridCol w:w="2016"/>
-        <w:gridCol w:w="2016"/>
-        <w:gridCol w:w="2016"/>
-        <w:gridCol w:w="2016"/>
+        <w:gridCol w:w="9360"/>
       </w:tblGrid>
       <w:tr>
         <w:tc>
           <w:tcPr>
-            <w:tcW w:type="dxa" w:w="2016"/>
-            <w:shd w:fill="1B365D"/>
+            <w:tcW w:type="dxa" w:w="10224"/>
+            <w:shd w:fill="F4F7FB"/>
             <w:tcMar>
-              <w:top w:w="80" w:type="dxa"/>
-              <w:bottom w:w="80" w:type="dxa"/>
-              <w:left w:w="100" w:type="dxa"/>
-              <w:right w:w="100" w:type="dxa"/>
+              <w:top w:w="140" w:type="dxa"/>
+              <w:bottom w:w="140" w:type="dxa"/>
+              <w:left w:w="180" w:type="dxa"/>
+              <w:right w:w="180" w:type="dxa"/>
             </w:tcMar>
           </w:tcPr>
           <w:p>
+            <w:pPr>
+              <w:spacing w:before="0" w:after="40" w:line="276" w:lineRule="auto"/>
+            </w:pPr>
             <w:r>
               <w:rPr>
                 <w:rFonts w:ascii="Arial" w:hAnsi="Arial"/>
                 <w:b/>
-                <w:color w:val="FFFFFF"/>
-                <w:sz w:val="18"/>
+                <w:color w:val="1B365D"/>
+                <w:sz w:val="22"/>
               </w:rPr>
-              <w:t>Robot Name</w:t>
+              <w:t>SLIDE 2: THE AMHARIC AI CHALLENGE: LOW-RESOURCE &amp; TOKEN TAX</w:t>
+              <w:br/>
             </w:r>
           </w:p>
-        </w:tc>
-        <w:tc>
-          <w:tcPr>
-            <w:tcW w:type="dxa" w:w="2016"/>
-            <w:shd w:fill="1B365D"/>
-            <w:tcMar>
-              <w:top w:w="80" w:type="dxa"/>
-              <w:bottom w:w="80" w:type="dxa"/>
-              <w:left w:w="100" w:type="dxa"/>
-              <w:right w:w="100" w:type="dxa"/>
-            </w:tcMar>
-          </w:tcPr>
           <w:p>
+            <w:pPr>
+              <w:spacing w:after="40" w:line="276" w:lineRule="auto"/>
+            </w:pPr>
             <w:r>
               <w:rPr>
-                <w:rFonts w:ascii="Arial" w:hAnsi="Arial"/>
                 <w:b/>
-                <w:color w:val="FFFFFF"/>
-                <w:sz w:val="18"/>
+                <w:color w:val="8A3B14"/>
+                <w:sz w:val="19"/>
               </w:rPr>
-              <w:t>How It Reads</w:t>
+              <w:t xml:space="preserve">👁️ What the audience sees: </w:t>
+            </w:r>
+            <w:r>
+              <w:rPr>
+                <w:sz w:val="19"/>
+              </w:rPr>
+              <w:t>3 Cards showing: (1) Data Ceiling &lt;500M words, (2) Token Tax (3.5x fertility), (3) Parameter Tax (63% wasted).</w:t>
             </w:r>
           </w:p>
-        </w:tc>
-        <w:tc>
-          <w:tcPr>
-            <w:tcW w:type="dxa" w:w="2016"/>
-            <w:shd w:fill="1B365D"/>
-            <w:tcMar>
-              <w:top w:w="80" w:type="dxa"/>
-              <w:bottom w:w="80" w:type="dxa"/>
-              <w:left w:w="100" w:type="dxa"/>
-              <w:right w:w="100" w:type="dxa"/>
-            </w:tcMar>
-          </w:tcPr>
           <w:p>
+            <w:pPr>
+              <w:spacing w:after="40" w:line="276" w:lineRule="auto"/>
+            </w:pPr>
             <w:r>
               <w:rPr>
-                <w:rFonts w:ascii="Arial" w:hAnsi="Arial"/>
                 <w:b/>
-                <w:color w:val="FFFFFF"/>
-                <w:sz w:val="18"/>
+                <w:color w:val="0F5132"/>
+                <w:sz w:val="19"/>
               </w:rPr>
-              <w:t>Brain Weight</w:t>
+              <w:t xml:space="preserve">💡 Core Idea to Remember: </w:t>
+            </w:r>
+            <w:r>
+              <w:rPr>
+                <w:sz w:val="19"/>
+              </w:rPr>
+              <w:t>Explain why normal AI struggles on Amharic: English has infinite data, but Amharic has very little clean data. Normal tokenizers cut Amharic words into confetti pieces, wasting 63% of the robot's brain.</w:t>
             </w:r>
           </w:p>
-        </w:tc>
-        <w:tc>
-          <w:tcPr>
-            <w:tcW w:type="dxa" w:w="2016"/>
-            <w:shd w:fill="1B365D"/>
-            <w:tcMar>
-              <w:top w:w="80" w:type="dxa"/>
-              <w:bottom w:w="80" w:type="dxa"/>
-              <w:left w:w="100" w:type="dxa"/>
-              <w:right w:w="100" w:type="dxa"/>
-            </w:tcMar>
-          </w:tcPr>
           <w:p>
+            <w:pPr>
+              <w:spacing w:after="40" w:line="276" w:lineRule="auto"/>
+            </w:pPr>
             <w:r>
               <w:rPr>
-                <w:rFonts w:ascii="Arial" w:hAnsi="Arial"/>
                 <w:b/>
-                <w:color w:val="FFFFFF"/>
-                <w:sz w:val="18"/>
+                <w:color w:val="5C3B00"/>
+                <w:sz w:val="19"/>
               </w:rPr>
-              <w:t>Backpack Waste</w:t>
+              <w:t xml:space="preserve">🍎 Simple Analogy: </w:t>
+            </w:r>
+            <w:r>
+              <w:rPr>
+                <w:sz w:val="19"/>
+              </w:rPr>
+              <w:t>Imagine trying to read a story where every single word is shredded into tiny puzzle pieces. You spend all your energy putting pieces together instead of understanding the story.</w:t>
             </w:r>
           </w:p>
-        </w:tc>
-        <w:tc>
-          <w:tcPr>
-            <w:tcW w:type="dxa" w:w="2016"/>
-            <w:shd w:fill="1B365D"/>
-            <w:tcMar>
-              <w:top w:w="80" w:type="dxa"/>
-              <w:bottom w:w="80" w:type="dxa"/>
-              <w:left w:w="100" w:type="dxa"/>
-              <w:right w:w="100" w:type="dxa"/>
-            </w:tcMar>
-          </w:tcPr>
           <w:p>
+            <w:pPr>
+              <w:spacing w:before="80" w:after="40" w:line="276" w:lineRule="auto"/>
+            </w:pPr>
             <w:r>
               <w:rPr>
-                <w:rFonts w:ascii="Arial" w:hAnsi="Arial"/>
                 <w:b/>
-                <w:color w:val="FFFFFF"/>
-                <w:sz w:val="18"/>
+                <w:color w:val="0D6EFD"/>
+                <w:sz w:val="19"/>
               </w:rPr>
-              <w:t>Test Score (BPB)</w:t>
+              <w:t>🎙️ EXACT WORDS TO SAY OUT LOUD:</w:t>
+              <w:br/>
             </w:r>
-          </w:p>
-        </w:tc>
-      </w:tr>
-      <w:tr>
-        <w:tc>
-          <w:tcPr>
-            <w:tcW w:type="dxa" w:w="2016"/>
-            <w:shd w:fill="FAFAFA"/>
-            <w:tcMar>
-              <w:top w:w="70" w:type="dxa"/>
-              <w:bottom w:w="70" w:type="dxa"/>
-              <w:left w:w="90" w:type="dxa"/>
-              <w:right w:w="90" w:type="dxa"/>
-            </w:tcMar>
-          </w:tcPr>
-          <w:p>
             <w:r>
               <w:rPr>
-                <w:rFonts w:ascii="Arial" w:hAnsi="Arial"/>
-                <w:sz w:val="18"/>
+                <w:i/>
+                <w:color w:val="141414"/>
+                <w:sz w:val="19"/>
               </w:rPr>
-              <w:t>Giant Transformer</w:t>
-            </w:r>
-          </w:p>
-        </w:tc>
-        <w:tc>
-          <w:tcPr>
-            <w:tcW w:type="dxa" w:w="2016"/>
-            <w:shd w:fill="FAFAFA"/>
-            <w:tcMar>
-              <w:top w:w="70" w:type="dxa"/>
-              <w:bottom w:w="70" w:type="dxa"/>
-              <w:left w:w="90" w:type="dxa"/>
-              <w:right w:w="90" w:type="dxa"/>
-            </w:tcMar>
-          </w:tcPr>
-          <w:p>
-            <w:r>
-              <w:rPr>
-                <w:rFonts w:ascii="Arial" w:hAnsi="Arial"/>
-                <w:sz w:val="18"/>
-              </w:rPr>
-              <w:t>32,000 Flashcards</w:t>
-            </w:r>
-          </w:p>
-        </w:tc>
-        <w:tc>
-          <w:tcPr>
-            <w:tcW w:type="dxa" w:w="2016"/>
-            <w:shd w:fill="FAFAFA"/>
-            <w:tcMar>
-              <w:top w:w="70" w:type="dxa"/>
-              <w:bottom w:w="70" w:type="dxa"/>
-              <w:left w:w="90" w:type="dxa"/>
-              <w:right w:w="90" w:type="dxa"/>
-            </w:tcMar>
-          </w:tcPr>
-          <w:p>
-            <w:r>
-              <w:rPr>
-                <w:rFonts w:ascii="Arial" w:hAnsi="Arial"/>
-                <w:sz w:val="18"/>
-              </w:rPr>
-              <w:t>13.0 Million</w:t>
-            </w:r>
-          </w:p>
-        </w:tc>
-        <w:tc>
-          <w:tcPr>
-            <w:tcW w:type="dxa" w:w="2016"/>
-            <w:shd w:fill="FAFAFA"/>
-            <w:tcMar>
-              <w:top w:w="70" w:type="dxa"/>
-              <w:bottom w:w="70" w:type="dxa"/>
-              <w:left w:w="90" w:type="dxa"/>
-              <w:right w:w="90" w:type="dxa"/>
-            </w:tcMar>
-          </w:tcPr>
-          <w:p>
-            <w:r>
-              <w:rPr>
-                <w:rFonts w:ascii="Arial" w:hAnsi="Arial"/>
-                <w:sz w:val="18"/>
-              </w:rPr>
-              <w:t>63% Wasted (Heavy!)</w:t>
-            </w:r>
-          </w:p>
-        </w:tc>
-        <w:tc>
-          <w:tcPr>
-            <w:tcW w:type="dxa" w:w="2016"/>
-            <w:shd w:fill="F8D7DA"/>
-            <w:tcMar>
-              <w:top w:w="70" w:type="dxa"/>
-              <w:bottom w:w="70" w:type="dxa"/>
-              <w:left w:w="90" w:type="dxa"/>
-              <w:right w:w="90" w:type="dxa"/>
-            </w:tcMar>
-          </w:tcPr>
-          <w:p>
-            <w:r>
-              <w:rPr>
-                <w:rFonts w:ascii="Arial" w:hAnsi="Arial"/>
-                <w:sz w:val="18"/>
-              </w:rPr>
-              <w:t>1.579 (Worst score ❌)</w:t>
-            </w:r>
-          </w:p>
-        </w:tc>
-      </w:tr>
-      <w:tr>
-        <w:tc>
-          <w:tcPr>
-            <w:tcW w:type="dxa" w:w="2016"/>
-            <w:shd w:fill="FFFFFF"/>
-            <w:tcMar>
-              <w:top w:w="70" w:type="dxa"/>
-              <w:bottom w:w="70" w:type="dxa"/>
-              <w:left w:w="90" w:type="dxa"/>
-              <w:right w:w="90" w:type="dxa"/>
-            </w:tcMar>
-          </w:tcPr>
-          <w:p>
-            <w:r>
-              <w:rPr>
-                <w:rFonts w:ascii="Arial" w:hAnsi="Arial"/>
-                <w:sz w:val="18"/>
-              </w:rPr>
-              <w:t>Medium Transformer</w:t>
-            </w:r>
-          </w:p>
-        </w:tc>
-        <w:tc>
-          <w:tcPr>
-            <w:tcW w:type="dxa" w:w="2016"/>
-            <w:shd w:fill="FFFFFF"/>
-            <w:tcMar>
-              <w:top w:w="70" w:type="dxa"/>
-              <w:bottom w:w="70" w:type="dxa"/>
-              <w:left w:w="90" w:type="dxa"/>
-              <w:right w:w="90" w:type="dxa"/>
-            </w:tcMar>
-          </w:tcPr>
-          <w:p>
-            <w:r>
-              <w:rPr>
-                <w:rFonts w:ascii="Arial" w:hAnsi="Arial"/>
-                <w:sz w:val="18"/>
-              </w:rPr>
-              <w:t>16,000 Flashcards</w:t>
-            </w:r>
-          </w:p>
-        </w:tc>
-        <w:tc>
-          <w:tcPr>
-            <w:tcW w:type="dxa" w:w="2016"/>
-            <w:shd w:fill="FFFFFF"/>
-            <w:tcMar>
-              <w:top w:w="70" w:type="dxa"/>
-              <w:bottom w:w="70" w:type="dxa"/>
-              <w:left w:w="90" w:type="dxa"/>
-              <w:right w:w="90" w:type="dxa"/>
-            </w:tcMar>
-          </w:tcPr>
-          <w:p>
-            <w:r>
-              <w:rPr>
-                <w:rFonts w:ascii="Arial" w:hAnsi="Arial"/>
-                <w:sz w:val="18"/>
-              </w:rPr>
-              <w:t>8.9 Million</w:t>
-            </w:r>
-          </w:p>
-        </w:tc>
-        <w:tc>
-          <w:tcPr>
-            <w:tcW w:type="dxa" w:w="2016"/>
-            <w:shd w:fill="FFFFFF"/>
-            <w:tcMar>
-              <w:top w:w="70" w:type="dxa"/>
-              <w:bottom w:w="70" w:type="dxa"/>
-              <w:left w:w="90" w:type="dxa"/>
-              <w:right w:w="90" w:type="dxa"/>
-            </w:tcMar>
-          </w:tcPr>
-          <w:p>
-            <w:r>
-              <w:rPr>
-                <w:rFonts w:ascii="Arial" w:hAnsi="Arial"/>
-                <w:sz w:val="18"/>
-              </w:rPr>
-              <w:t>46% Wasted</w:t>
-            </w:r>
-          </w:p>
-        </w:tc>
-        <w:tc>
-          <w:tcPr>
-            <w:tcW w:type="dxa" w:w="2016"/>
-            <w:shd w:fill="FFFFFF"/>
-            <w:tcMar>
-              <w:top w:w="70" w:type="dxa"/>
-              <w:bottom w:w="70" w:type="dxa"/>
-              <w:left w:w="90" w:type="dxa"/>
-              <w:right w:w="90" w:type="dxa"/>
-            </w:tcMar>
-          </w:tcPr>
-          <w:p>
-            <w:r>
-              <w:rPr>
-                <w:rFonts w:ascii="Arial" w:hAnsi="Arial"/>
-                <w:sz w:val="18"/>
-              </w:rPr>
-              <w:t>1.492</w:t>
-            </w:r>
-          </w:p>
-        </w:tc>
-      </w:tr>
-      <w:tr>
-        <w:tc>
-          <w:tcPr>
-            <w:tcW w:type="dxa" w:w="2016"/>
-            <w:shd w:fill="FAFAFA"/>
-            <w:tcMar>
-              <w:top w:w="70" w:type="dxa"/>
-              <w:bottom w:w="70" w:type="dxa"/>
-              <w:left w:w="90" w:type="dxa"/>
-              <w:right w:w="90" w:type="dxa"/>
-            </w:tcMar>
-          </w:tcPr>
-          <w:p>
-            <w:r>
-              <w:rPr>
-                <w:rFonts w:ascii="Arial" w:hAnsi="Arial"/>
-                <w:sz w:val="18"/>
-              </w:rPr>
-              <w:t>Tiny Mamba (Ours)</w:t>
-            </w:r>
-          </w:p>
-        </w:tc>
-        <w:tc>
-          <w:tcPr>
-            <w:tcW w:type="dxa" w:w="2016"/>
-            <w:shd w:fill="FAFAFA"/>
-            <w:tcMar>
-              <w:top w:w="70" w:type="dxa"/>
-              <w:bottom w:w="70" w:type="dxa"/>
-              <w:left w:w="90" w:type="dxa"/>
-              <w:right w:w="90" w:type="dxa"/>
-            </w:tcMar>
-          </w:tcPr>
-          <w:p>
-            <w:r>
-              <w:rPr>
-                <w:rFonts w:ascii="Arial" w:hAnsi="Arial"/>
-                <w:sz w:val="18"/>
-              </w:rPr>
-              <w:t>Raw Numbers (Bytes)</w:t>
-            </w:r>
-          </w:p>
-        </w:tc>
-        <w:tc>
-          <w:tcPr>
-            <w:tcW w:type="dxa" w:w="2016"/>
-            <w:shd w:fill="FAFAFA"/>
-            <w:tcMar>
-              <w:top w:w="70" w:type="dxa"/>
-              <w:bottom w:w="70" w:type="dxa"/>
-              <w:left w:w="90" w:type="dxa"/>
-              <w:right w:w="90" w:type="dxa"/>
-            </w:tcMar>
-          </w:tcPr>
-          <w:p>
-            <w:r>
-              <w:rPr>
-                <w:rFonts w:ascii="Arial" w:hAnsi="Arial"/>
-                <w:sz w:val="18"/>
-              </w:rPr>
-              <w:t>2.7 Million</w:t>
-            </w:r>
-          </w:p>
-        </w:tc>
-        <w:tc>
-          <w:tcPr>
-            <w:tcW w:type="dxa" w:w="2016"/>
-            <w:shd w:fill="FAFAFA"/>
-            <w:tcMar>
-              <w:top w:w="70" w:type="dxa"/>
-              <w:bottom w:w="70" w:type="dxa"/>
-              <w:left w:w="90" w:type="dxa"/>
-              <w:right w:w="90" w:type="dxa"/>
-            </w:tcMar>
-          </w:tcPr>
-          <w:p>
-            <w:r>
-              <w:rPr>
-                <w:rFonts w:ascii="Arial" w:hAnsi="Arial"/>
-                <w:sz w:val="18"/>
-              </w:rPr>
-              <w:t>2% Wasted (Super Light!)</w:t>
-            </w:r>
-          </w:p>
-        </w:tc>
-        <w:tc>
-          <w:tcPr>
-            <w:tcW w:type="dxa" w:w="2016"/>
-            <w:shd w:fill="D1E7DD"/>
-            <w:tcMar>
-              <w:top w:w="70" w:type="dxa"/>
-              <w:bottom w:w="70" w:type="dxa"/>
-              <w:left w:w="90" w:type="dxa"/>
-              <w:right w:w="90" w:type="dxa"/>
-            </w:tcMar>
-          </w:tcPr>
-          <w:p>
-            <w:r>
-              <w:rPr>
-                <w:rFonts w:ascii="Arial" w:hAnsi="Arial"/>
-                <w:sz w:val="18"/>
-              </w:rPr>
-              <w:t>1.322 (Beat the Giant! ⚡)</w:t>
-            </w:r>
-          </w:p>
-        </w:tc>
-      </w:tr>
-      <w:tr>
-        <w:tc>
-          <w:tcPr>
-            <w:tcW w:type="dxa" w:w="2016"/>
-            <w:shd w:fill="FFFFFF"/>
-            <w:tcMar>
-              <w:top w:w="70" w:type="dxa"/>
-              <w:bottom w:w="70" w:type="dxa"/>
-              <w:left w:w="90" w:type="dxa"/>
-              <w:right w:w="90" w:type="dxa"/>
-            </w:tcMar>
-          </w:tcPr>
-          <w:p>
-            <w:r>
-              <w:rPr>
-                <w:rFonts w:ascii="Arial" w:hAnsi="Arial"/>
-                <w:sz w:val="18"/>
-              </w:rPr>
-              <w:t>Big Mamba (Ours)</w:t>
-            </w:r>
-          </w:p>
-        </w:tc>
-        <w:tc>
-          <w:tcPr>
-            <w:tcW w:type="dxa" w:w="2016"/>
-            <w:shd w:fill="FFFFFF"/>
-            <w:tcMar>
-              <w:top w:w="70" w:type="dxa"/>
-              <w:bottom w:w="70" w:type="dxa"/>
-              <w:left w:w="90" w:type="dxa"/>
-              <w:right w:w="90" w:type="dxa"/>
-            </w:tcMar>
-          </w:tcPr>
-          <w:p>
-            <w:r>
-              <w:rPr>
-                <w:rFonts w:ascii="Arial" w:hAnsi="Arial"/>
-                <w:sz w:val="18"/>
-              </w:rPr>
-              <w:t>Raw Numbers (Bytes)</w:t>
-            </w:r>
-          </w:p>
-        </w:tc>
-        <w:tc>
-          <w:tcPr>
-            <w:tcW w:type="dxa" w:w="2016"/>
-            <w:shd w:fill="FFFFFF"/>
-            <w:tcMar>
-              <w:top w:w="70" w:type="dxa"/>
-              <w:bottom w:w="70" w:type="dxa"/>
-              <w:left w:w="90" w:type="dxa"/>
-              <w:right w:w="90" w:type="dxa"/>
-            </w:tcMar>
-          </w:tcPr>
-          <w:p>
-            <w:r>
-              <w:rPr>
-                <w:rFonts w:ascii="Arial" w:hAnsi="Arial"/>
-                <w:sz w:val="18"/>
-              </w:rPr>
-              <w:t>26.2 Million</w:t>
-            </w:r>
-          </w:p>
-        </w:tc>
-        <w:tc>
-          <w:tcPr>
-            <w:tcW w:type="dxa" w:w="2016"/>
-            <w:shd w:fill="FFFFFF"/>
-            <w:tcMar>
-              <w:top w:w="70" w:type="dxa"/>
-              <w:bottom w:w="70" w:type="dxa"/>
-              <w:left w:w="90" w:type="dxa"/>
-              <w:right w:w="90" w:type="dxa"/>
-            </w:tcMar>
-          </w:tcPr>
-          <w:p>
-            <w:r>
-              <w:rPr>
-                <w:rFonts w:ascii="Arial" w:hAnsi="Arial"/>
-                <w:sz w:val="18"/>
-              </w:rPr>
-              <w:t>0.4% Wasted (Pure Brain)</w:t>
-            </w:r>
-          </w:p>
-        </w:tc>
-        <w:tc>
-          <w:tcPr>
-            <w:tcW w:type="dxa" w:w="2016"/>
-            <w:shd w:fill="D1E7DD"/>
-            <w:tcMar>
-              <w:top w:w="70" w:type="dxa"/>
-              <w:bottom w:w="70" w:type="dxa"/>
-              <w:left w:w="90" w:type="dxa"/>
-              <w:right w:w="90" w:type="dxa"/>
-            </w:tcMar>
-          </w:tcPr>
-          <w:p>
-            <w:r>
-              <w:rPr>
-                <w:rFonts w:ascii="Arial" w:hAnsi="Arial"/>
-                <w:sz w:val="18"/>
-              </w:rPr>
-              <w:t>1.061 🏆 (Best Champion!)</w:t>
+              <w:t>"Current AI models like ChatGPT were designed for English. For Amharic, we face three big problems: First, we have less than 500 million clean words online. Second, standard tokenizers chop a single Amharic word into 7 or more tiny pieces—charging an unfair 3.5x 'Token Tax'. Third, a standard model wastes up to 63% of its entire brain capacity just storing a massive dictionary table instead of actual reasoning."</w:t>
             </w:r>
           </w:p>
         </w:tc>
@@ -851,108 +292,1252 @@
     </w:tbl>
     <w:p>
       <w:pPr>
-        <w:pStyle w:val="Heading1"/>
-        <w:spacing w:before="280" w:after="80"/>
+        <w:spacing w:after="120"/>
       </w:pPr>
-      <w:r>
-        <w:t>5. How to Answer Any Question in Front of the Class</w:t>
-      </w:r>
     </w:p>
+    <w:tbl>
+      <w:tblPr>
+        <w:tblW w:type="auto" w:w="0"/>
+        <w:jc w:val="center"/>
+        <w:tblLayout w:type="fixed"/>
+        <w:tblLook w:firstColumn="1" w:firstRow="1" w:lastColumn="0" w:lastRow="0" w:noHBand="0" w:noVBand="1" w:val="04A0"/>
+      </w:tblPr>
+      <w:tblGrid>
+        <w:gridCol w:w="9360"/>
+      </w:tblGrid>
+      <w:tr>
+        <w:tc>
+          <w:tcPr>
+            <w:tcW w:type="dxa" w:w="10224"/>
+            <w:shd w:fill="F4F7FB"/>
+            <w:tcMar>
+              <w:top w:w="140" w:type="dxa"/>
+              <w:bottom w:w="140" w:type="dxa"/>
+              <w:left w:w="180" w:type="dxa"/>
+              <w:right w:w="180" w:type="dxa"/>
+            </w:tcMar>
+          </w:tcPr>
+          <w:p>
+            <w:pPr>
+              <w:spacing w:before="0" w:after="40" w:line="276" w:lineRule="auto"/>
+            </w:pPr>
+            <w:r>
+              <w:rPr>
+                <w:rFonts w:ascii="Arial" w:hAnsi="Arial"/>
+                <w:b/>
+                <w:color w:val="1B365D"/>
+                <w:sz w:val="22"/>
+              </w:rPr>
+              <w:t>SLIDE 3: ARCHITECTURE DUALITY: QUADRATIC TRANSFORMER VS. LINEAR MAMBA</w:t>
+              <w:br/>
+            </w:r>
+          </w:p>
+          <w:p>
+            <w:pPr>
+              <w:spacing w:after="40" w:line="276" w:lineRule="auto"/>
+            </w:pPr>
+            <w:r>
+              <w:rPr>
+                <w:b/>
+                <w:color w:val="8A3B14"/>
+                <w:sz w:val="19"/>
+              </w:rPr>
+              <w:t xml:space="preserve">👁️ What the audience sees: </w:t>
+            </w:r>
+            <w:r>
+              <w:rPr>
+                <w:sz w:val="19"/>
+              </w:rPr>
+              <w:t>Side-by-side comparison: Red box (Transformer O(L²)) vs Green box (Mamba SSM O(L)).</w:t>
+            </w:r>
+          </w:p>
+          <w:p>
+            <w:pPr>
+              <w:spacing w:after="40" w:line="276" w:lineRule="auto"/>
+            </w:pPr>
+            <w:r>
+              <w:rPr>
+                <w:b/>
+                <w:color w:val="0F5132"/>
+                <w:sz w:val="19"/>
+              </w:rPr>
+              <w:t xml:space="preserve">💡 Core Idea to Remember: </w:t>
+            </w:r>
+            <w:r>
+              <w:rPr>
+                <w:sz w:val="19"/>
+              </w:rPr>
+              <w:t>Transformers look at every word and compare it to every other word (they get dizzy on long text). Mamba reads smoothly in a straight line, running 4x faster with constant memory.</w:t>
+            </w:r>
+          </w:p>
+          <w:p>
+            <w:pPr>
+              <w:spacing w:after="40" w:line="276" w:lineRule="auto"/>
+            </w:pPr>
+            <w:r>
+              <w:rPr>
+                <w:b/>
+                <w:color w:val="5C3B00"/>
+                <w:sz w:val="19"/>
+              </w:rPr>
+              <w:t xml:space="preserve">🍎 Simple Analogy: </w:t>
+            </w:r>
+            <w:r>
+              <w:rPr>
+                <w:sz w:val="19"/>
+              </w:rPr>
+              <w:t>Transformer is like a student who reads a paragraph by looking back and forth at every single word simultaneously. Mamba is like a reader who smoothly glides their finger along the line.</w:t>
+            </w:r>
+          </w:p>
+          <w:p>
+            <w:pPr>
+              <w:spacing w:before="80" w:after="40" w:line="276" w:lineRule="auto"/>
+            </w:pPr>
+            <w:r>
+              <w:rPr>
+                <w:b/>
+                <w:color w:val="0D6EFD"/>
+                <w:sz w:val="19"/>
+              </w:rPr>
+              <w:t>🎙️ EXACT WORDS TO SAY OUT LOUD:</w:t>
+              <w:br/>
+            </w:r>
+            <w:r>
+              <w:rPr>
+                <w:i/>
+                <w:color w:val="141414"/>
+                <w:sz w:val="19"/>
+              </w:rPr>
+              <w:t>"Because Amharic byte sequences are 3.5 times longer, normal Transformers become very slow because their self-attention compute explodes quadratically. In contrast, Mamba uses a Selective State Space Model that processes text in a straight linear line. It never gets bogged down, cuts latency by 75%, and uses 3 times less GPU memory."</w:t>
+            </w:r>
+          </w:p>
+        </w:tc>
+      </w:tr>
+    </w:tbl>
     <w:p>
       <w:pPr>
-        <w:spacing w:before="80" w:after="80" w:line="276" w:lineRule="auto"/>
+        <w:spacing w:after="120"/>
       </w:pPr>
-      <w:r>
-        <w:rPr>
-          <w:rFonts w:ascii="Arial" w:hAnsi="Arial"/>
-          <w:b/>
-          <w:color w:val="1B365D"/>
-          <w:sz w:val="20"/>
-        </w:rPr>
-        <w:t>❓ Question: Why did you throw away the tokenizer?</w:t>
-        <w:br/>
-      </w:r>
-      <w:r>
-        <w:rPr>
-          <w:rFonts w:ascii="Arial" w:hAnsi="Arial"/>
-          <w:color w:val="282828"/>
-          <w:sz w:val="20"/>
-        </w:rPr>
-        <w:t>👉 What to say: 'Because it was chopping Amharic letters into confetti and making the robot carry a giant heavy dictionary. Reading raw numbers is lighter and gives the robot 98% of its brain to think!'</w:t>
-      </w:r>
     </w:p>
+    <w:tbl>
+      <w:tblPr>
+        <w:tblW w:type="auto" w:w="0"/>
+        <w:jc w:val="center"/>
+        <w:tblLayout w:type="fixed"/>
+        <w:tblLook w:firstColumn="1" w:firstRow="1" w:lastColumn="0" w:lastRow="0" w:noHBand="0" w:noVBand="1" w:val="04A0"/>
+      </w:tblPr>
+      <w:tblGrid>
+        <w:gridCol w:w="9360"/>
+      </w:tblGrid>
+      <w:tr>
+        <w:tc>
+          <w:tcPr>
+            <w:tcW w:type="dxa" w:w="10224"/>
+            <w:shd w:fill="F4F7FB"/>
+            <w:tcMar>
+              <w:top w:w="140" w:type="dxa"/>
+              <w:bottom w:w="140" w:type="dxa"/>
+              <w:left w:w="180" w:type="dxa"/>
+              <w:right w:w="180" w:type="dxa"/>
+            </w:tcMar>
+          </w:tcPr>
+          <w:p>
+            <w:pPr>
+              <w:spacing w:before="0" w:after="40" w:line="276" w:lineRule="auto"/>
+            </w:pPr>
+            <w:r>
+              <w:rPr>
+                <w:rFonts w:ascii="Arial" w:hAnsi="Arial"/>
+                <w:b/>
+                <w:color w:val="1B365D"/>
+                <w:sz w:val="22"/>
+              </w:rPr>
+              <w:t>SLIDE 4: EMPIRICAL BENCHMARK: TINYMAMBA (2.7M) OUTPERFORMS TRANSFORMER (13M)</w:t>
+              <w:br/>
+            </w:r>
+          </w:p>
+          <w:p>
+            <w:pPr>
+              <w:spacing w:after="40" w:line="276" w:lineRule="auto"/>
+            </w:pPr>
+            <w:r>
+              <w:rPr>
+                <w:b/>
+                <w:color w:val="8A3B14"/>
+                <w:sz w:val="19"/>
+              </w:rPr>
+              <w:t xml:space="preserve">👁️ What the audience sees: </w:t>
+            </w:r>
+            <w:r>
+              <w:rPr>
+                <w:sz w:val="19"/>
+              </w:rPr>
+              <w:t>Figure 1 chart comparing model sizes vs Bits-per-Byte (BPB) compression scores.</w:t>
+            </w:r>
+          </w:p>
+          <w:p>
+            <w:pPr>
+              <w:spacing w:after="40" w:line="276" w:lineRule="auto"/>
+            </w:pPr>
+            <w:r>
+              <w:rPr>
+                <w:b/>
+                <w:color w:val="0F5132"/>
+                <w:sz w:val="19"/>
+              </w:rPr>
+              <w:t xml:space="preserve">💡 Core Idea to Remember: </w:t>
+            </w:r>
+            <w:r>
+              <w:rPr>
+                <w:sz w:val="19"/>
+              </w:rPr>
+              <w:t>Our small 2.7M Mamba model beat a giant 13M Transformer! Remember: Lower BPB means a smarter model.</w:t>
+            </w:r>
+          </w:p>
+          <w:p>
+            <w:pPr>
+              <w:spacing w:after="40" w:line="276" w:lineRule="auto"/>
+            </w:pPr>
+            <w:r>
+              <w:rPr>
+                <w:b/>
+                <w:color w:val="5C3B00"/>
+                <w:sz w:val="19"/>
+              </w:rPr>
+              <w:t xml:space="preserve">🍎 Simple Analogy: </w:t>
+            </w:r>
+            <w:r>
+              <w:rPr>
+                <w:sz w:val="19"/>
+              </w:rPr>
+              <w:t>A small 2.7-liter lightweight sports car drove faster and used less fuel than a heavy 13-ton truck.</w:t>
+            </w:r>
+          </w:p>
+          <w:p>
+            <w:pPr>
+              <w:spacing w:before="80" w:after="40" w:line="276" w:lineRule="auto"/>
+            </w:pPr>
+            <w:r>
+              <w:rPr>
+                <w:b/>
+                <w:color w:val="0D6EFD"/>
+                <w:sz w:val="19"/>
+              </w:rPr>
+              <w:t>🎙️ EXACT WORDS TO SAY OUT LOUD:</w:t>
+              <w:br/>
+            </w:r>
+            <w:r>
+              <w:rPr>
+                <w:i/>
+                <w:color w:val="141414"/>
+                <w:sz w:val="19"/>
+              </w:rPr>
+              <w:t>"Here is our primary experimental result on 1.46 GB of clean Amharic text. We measured performance using Bits-per-Byte, where lower is better. Our TinyMamba model with only 2.7 million parameters achieved a score of 1.322 BPB, outperforming a 13 million parameter Transformer that scored 1.579 BPB. Our model was nearly 5 times smaller, but strictly more accurate!"</w:t>
+            </w:r>
+          </w:p>
+        </w:tc>
+      </w:tr>
+    </w:tbl>
     <w:p>
       <w:pPr>
-        <w:spacing w:before="80" w:after="80" w:line="276" w:lineRule="auto"/>
+        <w:spacing w:after="120"/>
       </w:pPr>
-      <w:r>
-        <w:rPr>
-          <w:rFonts w:ascii="Arial" w:hAnsi="Arial"/>
-          <w:b/>
-          <w:color w:val="1B365D"/>
-          <w:sz w:val="20"/>
-        </w:rPr>
-        <w:t>❓ Question: Why is Mamba better than Transformer?</w:t>
-        <w:br/>
-      </w:r>
-      <w:r>
-        <w:rPr>
-          <w:rFonts w:ascii="Arial" w:hAnsi="Arial"/>
-          <w:color w:val="282828"/>
-          <w:sz w:val="20"/>
-        </w:rPr>
-        <w:t>👉 What to say: 'Transformers get dizzy looking at every word all at once. Mamba reads smoothly in a straight line, so it is 4 times faster and never runs out of memory!'</w:t>
-      </w:r>
     </w:p>
+    <w:tbl>
+      <w:tblPr>
+        <w:tblW w:type="auto" w:w="0"/>
+        <w:jc w:val="center"/>
+        <w:tblLayout w:type="fixed"/>
+        <w:tblLook w:firstColumn="1" w:firstRow="1" w:lastColumn="0" w:lastRow="0" w:noHBand="0" w:noVBand="1" w:val="04A0"/>
+      </w:tblPr>
+      <w:tblGrid>
+        <w:gridCol w:w="9360"/>
+      </w:tblGrid>
+      <w:tr>
+        <w:tc>
+          <w:tcPr>
+            <w:tcW w:type="dxa" w:w="10224"/>
+            <w:shd w:fill="F4F7FB"/>
+            <w:tcMar>
+              <w:top w:w="140" w:type="dxa"/>
+              <w:bottom w:w="140" w:type="dxa"/>
+              <w:left w:w="180" w:type="dxa"/>
+              <w:right w:w="180" w:type="dxa"/>
+            </w:tcMar>
+          </w:tcPr>
+          <w:p>
+            <w:pPr>
+              <w:spacing w:before="0" w:after="40" w:line="276" w:lineRule="auto"/>
+            </w:pPr>
+            <w:r>
+              <w:rPr>
+                <w:rFonts w:ascii="Arial" w:hAnsi="Arial"/>
+                <w:b/>
+                <w:color w:val="1B365D"/>
+                <w:sz w:val="22"/>
+              </w:rPr>
+              <w:t>SLIDE 5: PARAMETER ALLOCATION TAX: RECLAIMING NEURAL CAPACITY</w:t>
+              <w:br/>
+            </w:r>
+          </w:p>
+          <w:p>
+            <w:pPr>
+              <w:spacing w:after="40" w:line="276" w:lineRule="auto"/>
+            </w:pPr>
+            <w:r>
+              <w:rPr>
+                <w:b/>
+                <w:color w:val="8A3B14"/>
+                <w:sz w:val="19"/>
+              </w:rPr>
+              <w:t xml:space="preserve">👁️ What the audience sees: </w:t>
+            </w:r>
+            <w:r>
+              <w:rPr>
+                <w:sz w:val="19"/>
+              </w:rPr>
+              <w:t>Figure 2 bar chart showing how much of the model's brain is wasted on dictionaries.</w:t>
+            </w:r>
+          </w:p>
+          <w:p>
+            <w:pPr>
+              <w:spacing w:after="40" w:line="276" w:lineRule="auto"/>
+            </w:pPr>
+            <w:r>
+              <w:rPr>
+                <w:b/>
+                <w:color w:val="0F5132"/>
+                <w:sz w:val="19"/>
+              </w:rPr>
+              <w:t xml:space="preserve">💡 Core Idea to Remember: </w:t>
+            </w:r>
+            <w:r>
+              <w:rPr>
+                <w:sz w:val="19"/>
+              </w:rPr>
+              <w:t>Tokenized models waste 63% of their weights on vocabulary lookup tables. By using raw bytes (256 numbers), we freed 98% of the model for pure thinking.</w:t>
+            </w:r>
+          </w:p>
+          <w:p>
+            <w:pPr>
+              <w:spacing w:after="40" w:line="276" w:lineRule="auto"/>
+            </w:pPr>
+            <w:r>
+              <w:rPr>
+                <w:b/>
+                <w:color w:val="5C3B00"/>
+                <w:sz w:val="19"/>
+              </w:rPr>
+              <w:t xml:space="preserve">🍎 Simple Analogy: </w:t>
+            </w:r>
+            <w:r>
+              <w:rPr>
+                <w:sz w:val="19"/>
+              </w:rPr>
+              <w:t>Buying a 100-page notebook where 63 pages are blank index tables vs a notebook where 98 pages are full of brilliant thinking.</w:t>
+            </w:r>
+          </w:p>
+          <w:p>
+            <w:pPr>
+              <w:spacing w:before="80" w:after="40" w:line="276" w:lineRule="auto"/>
+            </w:pPr>
+            <w:r>
+              <w:rPr>
+                <w:b/>
+                <w:color w:val="0D6EFD"/>
+                <w:sz w:val="19"/>
+              </w:rPr>
+              <w:t>🎙️ EXACT WORDS TO SAY OUT LOUD:</w:t>
+              <w:br/>
+            </w:r>
+            <w:r>
+              <w:rPr>
+                <w:i/>
+                <w:color w:val="141414"/>
+                <w:sz w:val="19"/>
+              </w:rPr>
+              <w:t>"Why did our smaller model win? Because of the Parameter Allocation Tax shown in this chart. The 32k Transformer wasted 62.8% of all its weights on a static vocabulary dictionary. By moving to raw UTF-8 bytes with only 256 entries, our model dedicated 97.7% of its parameters to deep neural reasoning layers."</w:t>
+            </w:r>
+          </w:p>
+        </w:tc>
+      </w:tr>
+    </w:tbl>
     <w:p>
       <w:pPr>
-        <w:spacing w:before="80" w:after="80" w:line="276" w:lineRule="auto"/>
+        <w:spacing w:after="120"/>
       </w:pPr>
-      <w:r>
-        <w:rPr>
-          <w:rFonts w:ascii="Arial" w:hAnsi="Arial"/>
-          <w:b/>
-          <w:color w:val="1B365D"/>
-          <w:sz w:val="20"/>
-        </w:rPr>
-        <w:t>❓ Question: How does the robot learn new things on Telegram?</w:t>
-        <w:br/>
-      </w:r>
-      <w:r>
-        <w:rPr>
-          <w:rFonts w:ascii="Arial" w:hAnsi="Arial"/>
-          <w:color w:val="282828"/>
-          <w:sz w:val="20"/>
-        </w:rPr>
-        <w:t>👉 What to say: 'It writes the new fact on a quick sticky note in 0.01 seconds. When it sleeps, it replays the note 20 times fast to permanently glue it into its brain without forgetting how to speak Amharic!'</w:t>
-      </w:r>
     </w:p>
+    <w:tbl>
+      <w:tblPr>
+        <w:tblW w:type="auto" w:w="0"/>
+        <w:jc w:val="center"/>
+        <w:tblLayout w:type="fixed"/>
+        <w:tblLook w:firstColumn="1" w:firstRow="1" w:lastColumn="0" w:lastRow="0" w:noHBand="0" w:noVBand="1" w:val="04A0"/>
+      </w:tblPr>
+      <w:tblGrid>
+        <w:gridCol w:w="9360"/>
+      </w:tblGrid>
+      <w:tr>
+        <w:tc>
+          <w:tcPr>
+            <w:tcW w:type="dxa" w:w="10224"/>
+            <w:shd w:fill="F4F7FB"/>
+            <w:tcMar>
+              <w:top w:w="140" w:type="dxa"/>
+              <w:bottom w:w="140" w:type="dxa"/>
+              <w:left w:w="180" w:type="dxa"/>
+              <w:right w:w="180" w:type="dxa"/>
+            </w:tcMar>
+          </w:tcPr>
+          <w:p>
+            <w:pPr>
+              <w:spacing w:before="0" w:after="40" w:line="276" w:lineRule="auto"/>
+            </w:pPr>
+            <w:r>
+              <w:rPr>
+                <w:rFonts w:ascii="Arial" w:hAnsi="Arial"/>
+                <w:b/>
+                <w:color w:val="1B365D"/>
+                <w:sz w:val="22"/>
+              </w:rPr>
+              <w:t>SLIDE 6: CATASTROPHIC FORGETTING &amp; COMPLEMENTARY LEARNING SYSTEMS</w:t>
+              <w:br/>
+            </w:r>
+          </w:p>
+          <w:p>
+            <w:pPr>
+              <w:spacing w:after="40" w:line="276" w:lineRule="auto"/>
+            </w:pPr>
+            <w:r>
+              <w:rPr>
+                <w:b/>
+                <w:color w:val="8A3B14"/>
+                <w:sz w:val="19"/>
+              </w:rPr>
+              <w:t xml:space="preserve">👁️ What the audience sees: </w:t>
+            </w:r>
+            <w:r>
+              <w:rPr>
+                <w:sz w:val="19"/>
+              </w:rPr>
+              <w:t>Red box (Standard Backprop forgetting) vs Green box (Brain-Inspired Dual Memory).</w:t>
+            </w:r>
+          </w:p>
+          <w:p>
+            <w:pPr>
+              <w:spacing w:after="40" w:line="276" w:lineRule="auto"/>
+            </w:pPr>
+            <w:r>
+              <w:rPr>
+                <w:b/>
+                <w:color w:val="0F5132"/>
+                <w:sz w:val="19"/>
+              </w:rPr>
+              <w:t xml:space="preserve">💡 Core Idea to Remember: </w:t>
+            </w:r>
+            <w:r>
+              <w:rPr>
+                <w:sz w:val="19"/>
+              </w:rPr>
+              <w:t>Standard AI forgets past grammar when learning today's news. We copied the human brain: a fast notepad for today's facts + a slow permanent brain for language grammar.</w:t>
+            </w:r>
+          </w:p>
+          <w:p>
+            <w:pPr>
+              <w:spacing w:after="40" w:line="276" w:lineRule="auto"/>
+            </w:pPr>
+            <w:r>
+              <w:rPr>
+                <w:b/>
+                <w:color w:val="5C3B00"/>
+                <w:sz w:val="19"/>
+              </w:rPr>
+              <w:t xml:space="preserve">🍎 Simple Analogy: </w:t>
+            </w:r>
+            <w:r>
+              <w:rPr>
+                <w:sz w:val="19"/>
+              </w:rPr>
+              <w:t>When you meet someone new, you write their phone number on a sticky note without forgetting how to speak your native language.</w:t>
+            </w:r>
+          </w:p>
+          <w:p>
+            <w:pPr>
+              <w:spacing w:before="80" w:after="40" w:line="276" w:lineRule="auto"/>
+            </w:pPr>
+            <w:r>
+              <w:rPr>
+                <w:b/>
+                <w:color w:val="0D6EFD"/>
+                <w:sz w:val="19"/>
+              </w:rPr>
+              <w:t>🎙️ EXACT WORDS TO SAY OUT LOUD:</w:t>
+              <w:br/>
+            </w:r>
+            <w:r>
+              <w:rPr>
+                <w:i/>
+                <w:color w:val="141414"/>
+                <w:sz w:val="19"/>
+              </w:rPr>
+              <w:t>"When you update standard AI on live news, it suffers from Catastrophic Forgetting—grammar retention collapses down to 42%. To solve this, we drew inspiration from human neuroscience: the Complementary Learning Systems theory. We gave our AI two cooperating memory systems: a fast Hippocampus for instant fact capture, and a slow Mamba Neocortex for stable grammar."</w:t>
+            </w:r>
+          </w:p>
+        </w:tc>
+      </w:tr>
+    </w:tbl>
     <w:p>
       <w:pPr>
-        <w:spacing w:before="80" w:after="80" w:line="276" w:lineRule="auto"/>
+        <w:spacing w:after="120"/>
       </w:pPr>
-      <w:r>
-        <w:rPr>
-          <w:rFonts w:ascii="Arial" w:hAnsi="Arial"/>
-          <w:b/>
-          <w:color w:val="1B365D"/>
-          <w:sz w:val="20"/>
-        </w:rPr>
-        <w:t>❓ Question: What is the main achievement of your work?</w:t>
-        <w:br/>
-      </w:r>
-      <w:r>
-        <w:rPr>
-          <w:rFonts w:ascii="Arial" w:hAnsi="Arial"/>
-          <w:color w:val="282828"/>
-          <w:sz w:val="20"/>
-        </w:rPr>
-        <w:t>👉 What to say: 'We proved you don't need giant million-dollar computers to build smart AI for Ethiopia. You can build a super-fast Amharic AI on a single regular computer graphics card!'</w:t>
-      </w:r>
+    </w:p>
+    <w:tbl>
+      <w:tblPr>
+        <w:tblW w:type="auto" w:w="0"/>
+        <w:jc w:val="center"/>
+        <w:tblLayout w:type="fixed"/>
+        <w:tblLook w:firstColumn="1" w:firstRow="1" w:lastColumn="0" w:lastRow="0" w:noHBand="0" w:noVBand="1" w:val="04A0"/>
+      </w:tblPr>
+      <w:tblGrid>
+        <w:gridCol w:w="9360"/>
+      </w:tblGrid>
+      <w:tr>
+        <w:tc>
+          <w:tcPr>
+            <w:tcW w:type="dxa" w:w="10224"/>
+            <w:shd w:fill="F4F7FB"/>
+            <w:tcMar>
+              <w:top w:w="140" w:type="dxa"/>
+              <w:bottom w:w="140" w:type="dxa"/>
+              <w:left w:w="180" w:type="dxa"/>
+              <w:right w:w="180" w:type="dxa"/>
+            </w:tcMar>
+          </w:tcPr>
+          <w:p>
+            <w:pPr>
+              <w:spacing w:before="0" w:after="40" w:line="276" w:lineRule="auto"/>
+            </w:pPr>
+            <w:r>
+              <w:rPr>
+                <w:rFonts w:ascii="Arial" w:hAnsi="Arial"/>
+                <w:b/>
+                <w:color w:val="1B365D"/>
+                <w:sz w:val="22"/>
+              </w:rPr>
+              <w:t>SLIDE 7: HEBBIAN FAST WEIGHTS &amp; ANTI-HOPFIELD SYNAPTIC ENGRAMS</w:t>
+              <w:br/>
+            </w:r>
+          </w:p>
+          <w:p>
+            <w:pPr>
+              <w:spacing w:after="40" w:line="276" w:lineRule="auto"/>
+            </w:pPr>
+            <w:r>
+              <w:rPr>
+                <w:b/>
+                <w:color w:val="8A3B14"/>
+                <w:sz w:val="19"/>
+              </w:rPr>
+              <w:t xml:space="preserve">👁️ What the audience sees: </w:t>
+            </w:r>
+            <w:r>
+              <w:rPr>
+                <w:sz w:val="19"/>
+              </w:rPr>
+              <w:t>Figure 5 diagram showing the dual-memory neural flow and 1-shot Hebbian matrix.</w:t>
+            </w:r>
+          </w:p>
+          <w:p>
+            <w:pPr>
+              <w:spacing w:after="40" w:line="276" w:lineRule="auto"/>
+            </w:pPr>
+            <w:r>
+              <w:rPr>
+                <w:b/>
+                <w:color w:val="0F5132"/>
+                <w:sz w:val="19"/>
+              </w:rPr>
+              <w:t xml:space="preserve">💡 Core Idea to Remember: </w:t>
+            </w:r>
+            <w:r>
+              <w:rPr>
+                <w:sz w:val="19"/>
+              </w:rPr>
+              <w:t>New facts are written into a special memory matrix (M) in 0.01 seconds without running slow backpropagation.</w:t>
+            </w:r>
+          </w:p>
+          <w:p>
+            <w:pPr>
+              <w:spacing w:after="40" w:line="276" w:lineRule="auto"/>
+            </w:pPr>
+            <w:r>
+              <w:rPr>
+                <w:b/>
+                <w:color w:val="5C3B00"/>
+                <w:sz w:val="19"/>
+              </w:rPr>
+              <w:t xml:space="preserve">🍎 Simple Analogy: </w:t>
+            </w:r>
+            <w:r>
+              <w:rPr>
+                <w:sz w:val="19"/>
+              </w:rPr>
+              <w:t>Taking a instant Polaroid photo of a fact and pinning it to a corkboard in 0.01 seconds.</w:t>
+            </w:r>
+          </w:p>
+          <w:p>
+            <w:pPr>
+              <w:spacing w:before="80" w:after="40" w:line="276" w:lineRule="auto"/>
+            </w:pPr>
+            <w:r>
+              <w:rPr>
+                <w:b/>
+                <w:color w:val="0D6EFD"/>
+                <w:sz w:val="19"/>
+              </w:rPr>
+              <w:t>🎙️ EXACT WORDS TO SAY OUT LOUD:</w:t>
+              <w:br/>
+            </w:r>
+            <w:r>
+              <w:rPr>
+                <w:i/>
+                <w:color w:val="141414"/>
+                <w:sz w:val="19"/>
+              </w:rPr>
+              <w:t>"When a user teaches Hayyuu a new fact, it writes the information into a Hebbian fast weight matrix in just 0.01 seconds using an anti-Hopfield outer-product update. This completely avoids gradient updates to the main model, achieving 100% immediate factual recall with zero linguistic interference."</w:t>
+            </w:r>
+          </w:p>
+        </w:tc>
+      </w:tr>
+    </w:tbl>
+    <w:p>
+      <w:pPr>
+        <w:spacing w:after="120"/>
+      </w:pPr>
+    </w:p>
+    <w:tbl>
+      <w:tblPr>
+        <w:tblW w:type="auto" w:w="0"/>
+        <w:jc w:val="center"/>
+        <w:tblLayout w:type="fixed"/>
+        <w:tblLook w:firstColumn="1" w:firstRow="1" w:lastColumn="0" w:lastRow="0" w:noHBand="0" w:noVBand="1" w:val="04A0"/>
+      </w:tblPr>
+      <w:tblGrid>
+        <w:gridCol w:w="9360"/>
+      </w:tblGrid>
+      <w:tr>
+        <w:tc>
+          <w:tcPr>
+            <w:tcW w:type="dxa" w:w="10224"/>
+            <w:shd w:fill="F4F7FB"/>
+            <w:tcMar>
+              <w:top w:w="140" w:type="dxa"/>
+              <w:bottom w:w="140" w:type="dxa"/>
+              <w:left w:w="180" w:type="dxa"/>
+              <w:right w:w="180" w:type="dxa"/>
+            </w:tcMar>
+          </w:tcPr>
+          <w:p>
+            <w:pPr>
+              <w:spacing w:before="0" w:after="40" w:line="276" w:lineRule="auto"/>
+            </w:pPr>
+            <w:r>
+              <w:rPr>
+                <w:rFonts w:ascii="Arial" w:hAnsi="Arial"/>
+                <w:b/>
+                <w:color w:val="1B365D"/>
+                <w:sz w:val="22"/>
+              </w:rPr>
+              <w:t>SLIDE 8: OFFLINE SLEEP CONSOLIDATION: SHARP-WAVE RIPPLE REPLAY</w:t>
+              <w:br/>
+            </w:r>
+          </w:p>
+          <w:p>
+            <w:pPr>
+              <w:spacing w:after="40" w:line="276" w:lineRule="auto"/>
+            </w:pPr>
+            <w:r>
+              <w:rPr>
+                <w:b/>
+                <w:color w:val="8A3B14"/>
+                <w:sz w:val="19"/>
+              </w:rPr>
+              <w:t xml:space="preserve">👁️ What the audience sees: </w:t>
+            </w:r>
+            <w:r>
+              <w:rPr>
+                <w:sz w:val="19"/>
+              </w:rPr>
+              <w:t>Figure 3 chart showing grammar retention staying at 100% after sleep consolidation.</w:t>
+            </w:r>
+          </w:p>
+          <w:p>
+            <w:pPr>
+              <w:spacing w:after="40" w:line="276" w:lineRule="auto"/>
+            </w:pPr>
+            <w:r>
+              <w:rPr>
+                <w:b/>
+                <w:color w:val="0F5132"/>
+                <w:sz w:val="19"/>
+              </w:rPr>
+              <w:t xml:space="preserve">💡 Core Idea to Remember: </w:t>
+            </w:r>
+            <w:r>
+              <w:rPr>
+                <w:sz w:val="19"/>
+              </w:rPr>
+              <w:t>Every 30 rounds, the AI takes a sleep break and replays daytime memories 20x faster into its permanent neural weights.</w:t>
+            </w:r>
+          </w:p>
+          <w:p>
+            <w:pPr>
+              <w:spacing w:after="40" w:line="276" w:lineRule="auto"/>
+            </w:pPr>
+            <w:r>
+              <w:rPr>
+                <w:b/>
+                <w:color w:val="5C3B00"/>
+                <w:sz w:val="19"/>
+              </w:rPr>
+              <w:t xml:space="preserve">🍎 Simple Analogy: </w:t>
+            </w:r>
+            <w:r>
+              <w:rPr>
+                <w:sz w:val="19"/>
+              </w:rPr>
+              <w:t>Studying flashcards during the day, and while you sleep at night, your brain moves those memories into long-term storage.</w:t>
+            </w:r>
+          </w:p>
+          <w:p>
+            <w:pPr>
+              <w:spacing w:before="80" w:after="40" w:line="276" w:lineRule="auto"/>
+            </w:pPr>
+            <w:r>
+              <w:rPr>
+                <w:b/>
+                <w:color w:val="0D6EFD"/>
+                <w:sz w:val="19"/>
+              </w:rPr>
+              <w:t>🎙️ EXACT WORDS TO SAY OUT LOUD:</w:t>
+              <w:br/>
+            </w:r>
+            <w:r>
+              <w:rPr>
+                <w:i/>
+                <w:color w:val="141414"/>
+                <w:sz w:val="19"/>
+              </w:rPr>
+              <w:t>"Just like biological brains, our model enters an offline sleep cycle every 30 rounds. During sleep, it replays its daytime memories at 20 times speed alongside foundational anchor buffers. As you can see in Figure 3, this permanently bakes the new facts into the Mamba weights while maintaining 100% grammar retention."</w:t>
+            </w:r>
+          </w:p>
+        </w:tc>
+      </w:tr>
+    </w:tbl>
+    <w:p>
+      <w:pPr>
+        <w:spacing w:after="120"/>
+      </w:pPr>
+    </w:p>
+    <w:tbl>
+      <w:tblPr>
+        <w:tblW w:type="auto" w:w="0"/>
+        <w:jc w:val="center"/>
+        <w:tblLayout w:type="fixed"/>
+        <w:tblLook w:firstColumn="1" w:firstRow="1" w:lastColumn="0" w:lastRow="0" w:noHBand="0" w:noVBand="1" w:val="04A0"/>
+      </w:tblPr>
+      <w:tblGrid>
+        <w:gridCol w:w="9360"/>
+      </w:tblGrid>
+      <w:tr>
+        <w:tc>
+          <w:tcPr>
+            <w:tcW w:type="dxa" w:w="10224"/>
+            <w:shd w:fill="F4F7FB"/>
+            <w:tcMar>
+              <w:top w:w="140" w:type="dxa"/>
+              <w:bottom w:w="140" w:type="dxa"/>
+              <w:left w:w="180" w:type="dxa"/>
+              <w:right w:w="180" w:type="dxa"/>
+            </w:tcMar>
+          </w:tcPr>
+          <w:p>
+            <w:pPr>
+              <w:spacing w:before="0" w:after="40" w:line="276" w:lineRule="auto"/>
+            </w:pPr>
+            <w:r>
+              <w:rPr>
+                <w:rFonts w:ascii="Arial" w:hAnsi="Arial"/>
+                <w:b/>
+                <w:color w:val="1B365D"/>
+                <w:sz w:val="22"/>
+              </w:rPr>
+              <w:t>SLIDE 9: HAYYUU: AUTONOMOUS LIVING CONVERSATIONAL AGENT</w:t>
+              <w:br/>
+            </w:r>
+          </w:p>
+          <w:p>
+            <w:pPr>
+              <w:spacing w:after="40" w:line="276" w:lineRule="auto"/>
+            </w:pPr>
+            <w:r>
+              <w:rPr>
+                <w:b/>
+                <w:color w:val="8A3B14"/>
+                <w:sz w:val="19"/>
+              </w:rPr>
+              <w:t xml:space="preserve">👁️ What the audience sees: </w:t>
+            </w:r>
+            <w:r>
+              <w:rPr>
+                <w:sz w:val="19"/>
+              </w:rPr>
+              <w:t>Figure 4 SFT convergence curve and Telegram bot deployment overview.</w:t>
+            </w:r>
+          </w:p>
+          <w:p>
+            <w:pPr>
+              <w:spacing w:after="40" w:line="276" w:lineRule="auto"/>
+            </w:pPr>
+            <w:r>
+              <w:rPr>
+                <w:b/>
+                <w:color w:val="0F5132"/>
+                <w:sz w:val="19"/>
+              </w:rPr>
+              <w:t xml:space="preserve">💡 Core Idea to Remember: </w:t>
+            </w:r>
+            <w:r>
+              <w:rPr>
+                <w:sz w:val="19"/>
+              </w:rPr>
+              <w:t>We fine-tuned the model on 4,359 high-quality Amharic Q&amp;A pairs (dropping loss to 0.695 BPB) and launched Hayyuu live on Telegram.</w:t>
+            </w:r>
+          </w:p>
+          <w:p>
+            <w:pPr>
+              <w:spacing w:after="40" w:line="276" w:lineRule="auto"/>
+            </w:pPr>
+            <w:r>
+              <w:rPr>
+                <w:b/>
+                <w:color w:val="5C3B00"/>
+                <w:sz w:val="19"/>
+              </w:rPr>
+              <w:t xml:space="preserve">🍎 Simple Analogy: </w:t>
+            </w:r>
+            <w:r>
+              <w:rPr>
+                <w:sz w:val="19"/>
+              </w:rPr>
+              <w:t>Taking our smart student through graduation school so it learns how to politely answer questions on Ethiopian history, culture, and science.</w:t>
+            </w:r>
+          </w:p>
+          <w:p>
+            <w:pPr>
+              <w:spacing w:before="80" w:after="40" w:line="276" w:lineRule="auto"/>
+            </w:pPr>
+            <w:r>
+              <w:rPr>
+                <w:b/>
+                <w:color w:val="0D6EFD"/>
+                <w:sz w:val="19"/>
+              </w:rPr>
+              <w:t>🎙️ EXACT WORDS TO SAY OUT LOUD:</w:t>
+              <w:br/>
+            </w:r>
+            <w:r>
+              <w:rPr>
+                <w:i/>
+                <w:color w:val="141414"/>
+                <w:sz w:val="19"/>
+              </w:rPr>
+              <w:t>"We aligned our pre-trained model into a helpful conversational assistant named Hayyuu by fine-tuning on 4,359 native Amharic instruction pairs. Figure 4 shows the rapid SFT convergence down to 0.695 BPB. We then connected Hayyuu to Telegram with dual-candidate RLHF feedback and an autonomous 24/7 self-teaching teacher."</w:t>
+            </w:r>
+          </w:p>
+        </w:tc>
+      </w:tr>
+    </w:tbl>
+    <w:p>
+      <w:pPr>
+        <w:spacing w:after="120"/>
+      </w:pPr>
+    </w:p>
+    <w:tbl>
+      <w:tblPr>
+        <w:tblW w:type="auto" w:w="0"/>
+        <w:jc w:val="center"/>
+        <w:tblLayout w:type="fixed"/>
+        <w:tblLook w:firstColumn="1" w:firstRow="1" w:lastColumn="0" w:lastRow="0" w:noHBand="0" w:noVBand="1" w:val="04A0"/>
+      </w:tblPr>
+      <w:tblGrid>
+        <w:gridCol w:w="9360"/>
+      </w:tblGrid>
+      <w:tr>
+        <w:tc>
+          <w:tcPr>
+            <w:tcW w:type="dxa" w:w="10224"/>
+            <w:shd w:fill="F4F7FB"/>
+            <w:tcMar>
+              <w:top w:w="140" w:type="dxa"/>
+              <w:bottom w:w="140" w:type="dxa"/>
+              <w:left w:w="180" w:type="dxa"/>
+              <w:right w:w="180" w:type="dxa"/>
+            </w:tcMar>
+          </w:tcPr>
+          <w:p>
+            <w:pPr>
+              <w:spacing w:before="0" w:after="40" w:line="276" w:lineRule="auto"/>
+            </w:pPr>
+            <w:r>
+              <w:rPr>
+                <w:rFonts w:ascii="Arial" w:hAnsi="Arial"/>
+                <w:b/>
+                <w:color w:val="1B365D"/>
+                <w:sz w:val="22"/>
+              </w:rPr>
+              <w:t>SLIDE 10: LIVE DEMONSTRATION: AMHARIC REASONING &amp; IDENTITY</w:t>
+              <w:br/>
+            </w:r>
+          </w:p>
+          <w:p>
+            <w:pPr>
+              <w:spacing w:after="40" w:line="276" w:lineRule="auto"/>
+            </w:pPr>
+            <w:r>
+              <w:rPr>
+                <w:b/>
+                <w:color w:val="8A3B14"/>
+                <w:sz w:val="19"/>
+              </w:rPr>
+              <w:t xml:space="preserve">👁️ What the audience sees: </w:t>
+            </w:r>
+            <w:r>
+              <w:rPr>
+                <w:sz w:val="19"/>
+              </w:rPr>
+              <w:t>2 Cards with real Amharic conversation prompts on History, AI, Culture, and Identity.</w:t>
+            </w:r>
+          </w:p>
+          <w:p>
+            <w:pPr>
+              <w:spacing w:after="40" w:line="276" w:lineRule="auto"/>
+            </w:pPr>
+            <w:r>
+              <w:rPr>
+                <w:b/>
+                <w:color w:val="0F5132"/>
+                <w:sz w:val="19"/>
+              </w:rPr>
+              <w:t xml:space="preserve">💡 Core Idea to Remember: </w:t>
+            </w:r>
+            <w:r>
+              <w:rPr>
+                <w:sz w:val="19"/>
+              </w:rPr>
+              <w:t>Show real examples of Hayyuu answering questions accurately: It knows who created it (Beknan Chemeda), where Axum is, and what AI means in pure Amharic.</w:t>
+            </w:r>
+          </w:p>
+          <w:p>
+            <w:pPr>
+              <w:spacing w:after="40" w:line="276" w:lineRule="auto"/>
+            </w:pPr>
+            <w:r>
+              <w:rPr>
+                <w:b/>
+                <w:color w:val="5C3B00"/>
+                <w:sz w:val="19"/>
+              </w:rPr>
+              <w:t xml:space="preserve">🍎 Simple Analogy: </w:t>
+            </w:r>
+            <w:r>
+              <w:rPr>
+                <w:sz w:val="19"/>
+              </w:rPr>
+              <w:t>Showing the robot speaking fluent Amharic in front of the classroom.</w:t>
+            </w:r>
+          </w:p>
+          <w:p>
+            <w:pPr>
+              <w:spacing w:before="80" w:after="40" w:line="276" w:lineRule="auto"/>
+            </w:pPr>
+            <w:r>
+              <w:rPr>
+                <w:b/>
+                <w:color w:val="0D6EFD"/>
+                <w:sz w:val="19"/>
+              </w:rPr>
+              <w:t>🎙️ EXACT WORDS TO SAY OUT LOUD:</w:t>
+              <w:br/>
+            </w:r>
+            <w:r>
+              <w:rPr>
+                <w:i/>
+                <w:color w:val="141414"/>
+                <w:sz w:val="19"/>
+              </w:rPr>
+              <w:t>"Here are sample outputs from Hayyuu. When asked 'Who created you?', it correctly identifies its creator, Beknan Chemeda. When asked about Ethiopian history like the Obelisk of Axum or modern science like Artificial Intelligence, it generates fluent, grammatically accurate Amharic responses."</w:t>
+            </w:r>
+          </w:p>
+        </w:tc>
+      </w:tr>
+    </w:tbl>
+    <w:p>
+      <w:pPr>
+        <w:spacing w:after="120"/>
+      </w:pPr>
+    </w:p>
+    <w:tbl>
+      <w:tblPr>
+        <w:tblW w:type="auto" w:w="0"/>
+        <w:jc w:val="center"/>
+        <w:tblLayout w:type="fixed"/>
+        <w:tblLook w:firstColumn="1" w:firstRow="1" w:lastColumn="0" w:lastRow="0" w:noHBand="0" w:noVBand="1" w:val="04A0"/>
+      </w:tblPr>
+      <w:tblGrid>
+        <w:gridCol w:w="9360"/>
+      </w:tblGrid>
+      <w:tr>
+        <w:tc>
+          <w:tcPr>
+            <w:tcW w:type="dxa" w:w="10224"/>
+            <w:shd w:fill="F4F7FB"/>
+            <w:tcMar>
+              <w:top w:w="140" w:type="dxa"/>
+              <w:bottom w:w="140" w:type="dxa"/>
+              <w:left w:w="180" w:type="dxa"/>
+              <w:right w:w="180" w:type="dxa"/>
+            </w:tcMar>
+          </w:tcPr>
+          <w:p>
+            <w:pPr>
+              <w:spacing w:before="0" w:after="40" w:line="276" w:lineRule="auto"/>
+            </w:pPr>
+            <w:r>
+              <w:rPr>
+                <w:rFonts w:ascii="Arial" w:hAnsi="Arial"/>
+                <w:b/>
+                <w:color w:val="1B365D"/>
+                <w:sz w:val="22"/>
+              </w:rPr>
+              <w:t>SLIDE 11: SUMMARY OF CONTRIBUTIONS &amp; GLOBAL IMPACT</w:t>
+              <w:br/>
+            </w:r>
+          </w:p>
+          <w:p>
+            <w:pPr>
+              <w:spacing w:after="40" w:line="276" w:lineRule="auto"/>
+            </w:pPr>
+            <w:r>
+              <w:rPr>
+                <w:b/>
+                <w:color w:val="8A3B14"/>
+                <w:sz w:val="19"/>
+              </w:rPr>
+              <w:t xml:space="preserve">👁️ What the audience sees: </w:t>
+            </w:r>
+            <w:r>
+              <w:rPr>
+                <w:sz w:val="19"/>
+              </w:rPr>
+              <w:t>3 Green summary cards: (1) Token-Free Efficiency, (2) Zero-Forgetting CLS, (3) Sovereign Ethiopian AI.</w:t>
+            </w:r>
+          </w:p>
+          <w:p>
+            <w:pPr>
+              <w:spacing w:after="40" w:line="276" w:lineRule="auto"/>
+            </w:pPr>
+            <w:r>
+              <w:rPr>
+                <w:b/>
+                <w:color w:val="0F5132"/>
+                <w:sz w:val="19"/>
+              </w:rPr>
+              <w:t xml:space="preserve">💡 Core Idea to Remember: </w:t>
+            </w:r>
+            <w:r>
+              <w:rPr>
+                <w:sz w:val="19"/>
+              </w:rPr>
+              <w:t>Wrap up with the 3 big wins: No token tax, no forgetting, and proving that African AI can run on a single affordable GPU.</w:t>
+            </w:r>
+          </w:p>
+          <w:p>
+            <w:pPr>
+              <w:spacing w:after="40" w:line="276" w:lineRule="auto"/>
+            </w:pPr>
+            <w:r>
+              <w:rPr>
+                <w:b/>
+                <w:color w:val="5C3B00"/>
+                <w:sz w:val="19"/>
+              </w:rPr>
+              <w:t xml:space="preserve">🍎 Simple Analogy: </w:t>
+            </w:r>
+            <w:r>
+              <w:rPr>
+                <w:sz w:val="19"/>
+              </w:rPr>
+              <w:t>Proving that smart engineering beats expensive supercomputers.</w:t>
+            </w:r>
+          </w:p>
+          <w:p>
+            <w:pPr>
+              <w:spacing w:before="80" w:after="40" w:line="276" w:lineRule="auto"/>
+            </w:pPr>
+            <w:r>
+              <w:rPr>
+                <w:b/>
+                <w:color w:val="0D6EFD"/>
+                <w:sz w:val="19"/>
+              </w:rPr>
+              <w:t>🎙️ EXACT WORDS TO SAY OUT LOUD:</w:t>
+              <w:br/>
+            </w:r>
+            <w:r>
+              <w:rPr>
+                <w:i/>
+                <w:color w:val="141414"/>
+                <w:sz w:val="19"/>
+              </w:rPr>
+              <w:t>"In conclusion, this research makes three major contributions: First, we eliminated the Token Tax for African languages using byte-level Mamba. Second, we solved catastrophic forgetting using a brain-inspired dual-memory architecture. Third, we proved that sovereign, high-performance generative AI can be trained on a single affordable graphics card right here in Ethiopia."</w:t>
+            </w:r>
+          </w:p>
+        </w:tc>
+      </w:tr>
+    </w:tbl>
+    <w:p>
+      <w:pPr>
+        <w:spacing w:after="120"/>
+      </w:pPr>
+    </w:p>
+    <w:tbl>
+      <w:tblPr>
+        <w:tblW w:type="auto" w:w="0"/>
+        <w:jc w:val="center"/>
+        <w:tblLayout w:type="fixed"/>
+        <w:tblLook w:firstColumn="1" w:firstRow="1" w:lastColumn="0" w:lastRow="0" w:noHBand="0" w:noVBand="1" w:val="04A0"/>
+      </w:tblPr>
+      <w:tblGrid>
+        <w:gridCol w:w="9360"/>
+      </w:tblGrid>
+      <w:tr>
+        <w:tc>
+          <w:tcPr>
+            <w:tcW w:type="dxa" w:w="10224"/>
+            <w:shd w:fill="F4F7FB"/>
+            <w:tcMar>
+              <w:top w:w="140" w:type="dxa"/>
+              <w:bottom w:w="140" w:type="dxa"/>
+              <w:left w:w="180" w:type="dxa"/>
+              <w:right w:w="180" w:type="dxa"/>
+            </w:tcMar>
+          </w:tcPr>
+          <w:p>
+            <w:pPr>
+              <w:spacing w:before="0" w:after="40" w:line="276" w:lineRule="auto"/>
+            </w:pPr>
+            <w:r>
+              <w:rPr>
+                <w:rFonts w:ascii="Arial" w:hAnsi="Arial"/>
+                <w:b/>
+                <w:color w:val="1B365D"/>
+                <w:sz w:val="22"/>
+              </w:rPr>
+              <w:t>SLIDE 12: CLOSING / Q&amp;A DEFENSE</w:t>
+              <w:br/>
+            </w:r>
+          </w:p>
+          <w:p>
+            <w:pPr>
+              <w:spacing w:after="40" w:line="276" w:lineRule="auto"/>
+            </w:pPr>
+            <w:r>
+              <w:rPr>
+                <w:b/>
+                <w:color w:val="8A3B14"/>
+                <w:sz w:val="19"/>
+              </w:rPr>
+              <w:t xml:space="preserve">👁️ What the audience sees: </w:t>
+            </w:r>
+            <w:r>
+              <w:rPr>
+                <w:sz w:val="19"/>
+              </w:rPr>
+              <w:t>Dark navy closing screen with 'THANK YOU!', Questions &amp; Discussion, and repository links.</w:t>
+            </w:r>
+          </w:p>
+          <w:p>
+            <w:pPr>
+              <w:spacing w:after="40" w:line="276" w:lineRule="auto"/>
+            </w:pPr>
+            <w:r>
+              <w:rPr>
+                <w:b/>
+                <w:color w:val="0F5132"/>
+                <w:sz w:val="19"/>
+              </w:rPr>
+              <w:t xml:space="preserve">💡 Core Idea to Remember: </w:t>
+            </w:r>
+            <w:r>
+              <w:rPr>
+                <w:sz w:val="19"/>
+              </w:rPr>
+              <w:t>Thank the audience with a smile and invite questions. You know all the answers!</w:t>
+            </w:r>
+          </w:p>
+          <w:p>
+            <w:pPr>
+              <w:spacing w:after="40" w:line="276" w:lineRule="auto"/>
+            </w:pPr>
+            <w:r>
+              <w:rPr>
+                <w:b/>
+                <w:color w:val="5C3B00"/>
+                <w:sz w:val="19"/>
+              </w:rPr>
+              <w:t xml:space="preserve">🍎 Simple Analogy: </w:t>
+            </w:r>
+            <w:r>
+              <w:rPr>
+                <w:sz w:val="19"/>
+              </w:rPr>
+              <w:t>Crossing the finish line after a perfect presentation.</w:t>
+            </w:r>
+          </w:p>
+          <w:p>
+            <w:pPr>
+              <w:spacing w:before="80" w:after="40" w:line="276" w:lineRule="auto"/>
+            </w:pPr>
+            <w:r>
+              <w:rPr>
+                <w:b/>
+                <w:color w:val="0D6EFD"/>
+                <w:sz w:val="19"/>
+              </w:rPr>
+              <w:t>🎙️ EXACT WORDS TO SAY OUT LOUD:</w:t>
+              <w:br/>
+            </w:r>
+            <w:r>
+              <w:rPr>
+                <w:i/>
+                <w:color w:val="141414"/>
+                <w:sz w:val="19"/>
+              </w:rPr>
+              <w:t>"Thank you very much for your time and attention. I am now happy to answer any questions!"</w:t>
+            </w:r>
+          </w:p>
+        </w:tc>
+      </w:tr>
+    </w:tbl>
+    <w:p>
+      <w:pPr>
+        <w:spacing w:after="120"/>
+      </w:pPr>
     </w:p>
     <w:sectPr>
       <w:pgSz w:w="12240" w:h="15840"/>
-      <w:pgMar w:top="1080" w:right="1080" w:bottom="1080" w:left="1080" w:header="720" w:footer="720" w:gutter="0"/>
+      <w:pgMar w:top="1008" w:right="1008" w:bottom="1008" w:left="1008" w:header="720" w:footer="720" w:gutter="0"/>
       <w:cols w:space="720"/>
       <w:docGrid w:linePitch="360"/>
     </w:sectPr>

</xml_diff>

<commit_message>
Restore comprehensive, in-depth academic Master Study Guide & Defense PDF
</commit_message>
<xml_diff>
--- a/AMHARIC_MAMBA_PRESENTATION_MASTER_GUIDE.docx
+++ b/AMHARIC_MAMBA_PRESENTATION_MASTER_GUIDE.docx
@@ -14,7 +14,7 @@
           <w:color w:val="1B365D"/>
           <w:sz w:val="34"/>
         </w:rPr>
-        <w:t>SLIDE-BY-SLIDE PRESENTATION COMPANION</w:t>
+        <w:t>MASTER PRESENTATION RESEARCH &amp; DEFENSE GUIDE</w:t>
       </w:r>
     </w:p>
     <w:p>
@@ -27,14 +27,14 @@
           <w:rFonts w:ascii="Arial" w:hAnsi="Arial"/>
           <w:b/>
           <w:color w:val="4A607A"/>
-          <w:sz w:val="21"/>
+          <w:sz w:val="22"/>
         </w:rPr>
-        <w:t>Exactly What Every Slide Means, The Simple Idea, and What to Say Out Loud Without Getting Confused</w:t>
+        <w:t>Byte-Level Mamba vs. Transformer for Amharic with Brain-Inspired Continual Learning (Hayyuu)</w:t>
       </w:r>
     </w:p>
     <w:p>
       <w:pPr>
-        <w:spacing w:after="200"/>
+        <w:spacing w:after="240"/>
         <w:jc w:val="center"/>
       </w:pPr>
       <w:r>
@@ -44,7 +44,18 @@
           <w:color w:val="5A5A5A"/>
           <w:sz w:val="19"/>
         </w:rPr>
-        <w:t>Presenter: Beknan Chemeda  |  Project: Amharic Byte Mamba &amp; Hayyuu AI</w:t>
+        <w:t>Presenter &amp; Author: Beknan Chemeda  |  Project: Data- &amp; Compute-Efficient Generative AI</w:t>
+        <w:br/>
+        <w:t>Repository: https://github.com/BekiChemeda/ML-Research</w:t>
+      </w:r>
+    </w:p>
+    <w:p>
+      <w:pPr>
+        <w:pStyle w:val="Heading1"/>
+        <w:spacing w:before="200" w:after="80"/>
+      </w:pPr>
+      <w:r>
+        <w:t>1. Executive Summary &amp; Core Research Thesis</w:t>
       </w:r>
     </w:p>
     <w:tbl>
@@ -61,106 +72,34 @@
         <w:tc>
           <w:tcPr>
             <w:tcW w:type="dxa" w:w="10224"/>
-            <w:shd w:fill="F4F7FB"/>
+            <w:shd w:fill="F0F4F8"/>
             <w:tcMar>
               <w:top w:w="140" w:type="dxa"/>
               <w:bottom w:w="140" w:type="dxa"/>
-              <w:left w:w="180" w:type="dxa"/>
-              <w:right w:w="180" w:type="dxa"/>
+              <w:left w:w="200" w:type="dxa"/>
+              <w:right w:w="200" w:type="dxa"/>
             </w:tcMar>
           </w:tcPr>
           <w:p>
             <w:pPr>
-              <w:spacing w:before="0" w:after="40" w:line="276" w:lineRule="auto"/>
+              <w:spacing w:before="40" w:after="40" w:line="276" w:lineRule="auto"/>
             </w:pPr>
             <w:r>
               <w:rPr>
                 <w:rFonts w:ascii="Arial" w:hAnsi="Arial"/>
                 <w:b/>
                 <w:color w:val="1B365D"/>
-                <w:sz w:val="22"/>
+                <w:sz w:val="20"/>
               </w:rPr>
-              <w:t>SLIDE 1: TITLE SLIDE: BYTE-LEVEL MAMBA VS. TRANSFORMER</w:t>
-              <w:br/>
-            </w:r>
-          </w:p>
-          <w:p>
-            <w:pPr>
-              <w:spacing w:after="40" w:line="276" w:lineRule="auto"/>
-            </w:pPr>
-            <w:r>
-              <w:rPr>
-                <w:b/>
-                <w:color w:val="8A3B14"/>
-                <w:sz w:val="19"/>
-              </w:rPr>
-              <w:t xml:space="preserve">👁️ What the audience sees: </w:t>
+              <w:t xml:space="preserve">💡 CORE RESEARCH THESIS: </w:t>
             </w:r>
             <w:r>
               <w:rPr>
+                <w:rFonts w:ascii="Arial" w:hAnsi="Arial"/>
+                <w:color w:val="1E1E1E"/>
                 <w:sz w:val="19"/>
               </w:rPr>
-              <w:t>Dark navy screen with title, your name (Beknan Chemeda), and project topic.</w:t>
-            </w:r>
-          </w:p>
-          <w:p>
-            <w:pPr>
-              <w:spacing w:after="40" w:line="276" w:lineRule="auto"/>
-            </w:pPr>
-            <w:r>
-              <w:rPr>
-                <w:b/>
-                <w:color w:val="0F5132"/>
-                <w:sz w:val="19"/>
-              </w:rPr>
-              <w:t xml:space="preserve">💡 Core Idea to Remember: </w:t>
-            </w:r>
-            <w:r>
-              <w:rPr>
-                <w:sz w:val="19"/>
-              </w:rPr>
-              <w:t>Introduce yourself with confidence and tell the audience that you built a faster, smarter Amharic AI that doesn't waste computer memory.</w:t>
-            </w:r>
-          </w:p>
-          <w:p>
-            <w:pPr>
-              <w:spacing w:after="40" w:line="276" w:lineRule="auto"/>
-            </w:pPr>
-            <w:r>
-              <w:rPr>
-                <w:b/>
-                <w:color w:val="5C3B00"/>
-                <w:sz w:val="19"/>
-              </w:rPr>
-              <w:t xml:space="preserve">🍎 Simple Analogy: </w:t>
-            </w:r>
-            <w:r>
-              <w:rPr>
-                <w:sz w:val="19"/>
-              </w:rPr>
-              <w:t>Think of this like introducing a new lightweight electric race car designed specifically for Ethiopian roads.</w:t>
-            </w:r>
-          </w:p>
-          <w:p>
-            <w:pPr>
-              <w:spacing w:before="80" w:after="40" w:line="276" w:lineRule="auto"/>
-            </w:pPr>
-            <w:r>
-              <w:rPr>
-                <w:b/>
-                <w:color w:val="0D6EFD"/>
-                <w:sz w:val="19"/>
-              </w:rPr>
-              <w:t>🎙️ EXACT WORDS TO SAY OUT LOUD:</w:t>
-              <w:br/>
-            </w:r>
-            <w:r>
-              <w:rPr>
-                <w:i/>
-                <w:color w:val="141414"/>
-                <w:sz w:val="19"/>
-              </w:rPr>
-              <w:t>"Good morning, everyone. My name is Beknan Chemeda. Today I am presenting my research on building a fast, lightweight, and token-free Generative AI for the Amharic language using Mamba State-Space Models and Brain-Inspired Continual Learning."</w:t>
+              <w:t>Modern Large Language Models (LLMs) rely heavily on subword tokenizers (e.g., Byte-Pair Encoding / SentencePiece) that charge an exorbitant 'Token Tax' on African and Semitic languages. In Amharic, standard tokenizers fragment single morphologically rich words into 7+ sub-byte pieces, driving fertility ratios up to 3.5x and trapping up to 63% of the total model parameter budget in vocabulary embedding matrices rather than neural reasoning layers. Furthermore, on long byte sequences, standard Transformers suffer from quadratic computational and memory bottlenecks O(L²). In this research, we demonstrate that by eliminating the tokenizer entirely and training directly on raw UTF-8 bytes using a Selective State Space Model (Mamba), a compact 2.73M Byte-Level Mamba model outperforms a 13.04M Transformer across 1.465 GB of clean Amharic text (1.322 vs 1.579 Bits-Per-Byte), while consuming 3x less GPU memory. Additionally, to resolve Catastrophic Forgetting during live deployment, we integrate a biological Complementary Learning System (CLS): new facts are acquired in 0.01 seconds via Hebbian fast weights, and consolidated into permanent Mamba neocortical weights during offline circadian sleep replay with 100% grammar retention.</w:t>
             </w:r>
           </w:p>
         </w:tc>
@@ -168,123 +107,1007 @@
     </w:tbl>
     <w:p>
       <w:pPr>
-        <w:spacing w:after="120"/>
+        <w:spacing w:after="80"/>
       </w:pPr>
+    </w:p>
+    <w:p>
+      <w:pPr>
+        <w:pStyle w:val="Heading1"/>
+        <w:spacing w:before="240" w:after="80"/>
+      </w:pPr>
+      <w:r>
+        <w:t>2. Scientific Lineage &amp; Literature Foundation</w:t>
+      </w:r>
+    </w:p>
+    <w:p>
+      <w:pPr>
+        <w:spacing w:before="60" w:after="60" w:line="276" w:lineRule="auto"/>
+      </w:pPr>
+      <w:r>
+        <w:rPr>
+          <w:rFonts w:ascii="Arial" w:hAnsi="Arial"/>
+          <w:b/>
+          <w:color w:val="1B365D"/>
+          <w:sz w:val="19"/>
+        </w:rPr>
+        <w:t xml:space="preserve">• The Amharic Data Ceiling (Andersland, 2024; Azime et al., 2024): </w:t>
+      </w:r>
+      <w:r>
+        <w:rPr>
+          <w:rFonts w:ascii="Arial" w:hAnsi="Arial"/>
+          <w:sz w:val="19"/>
+        </w:rPr>
+        <w:t>Empirical studies demonstrate that the total volume of clean, native digital Amharic text in existence is under 500 million tokens. Attempting to artificially expand data via machine translation introduces severe synthetic artifacts and syntactic degradation. Hence, low-resource African AI requires architectural data-efficiency rather than brute-force scaling.</w:t>
+      </w:r>
+    </w:p>
+    <w:p>
+      <w:pPr>
+        <w:spacing w:before="60" w:after="60" w:line="276" w:lineRule="auto"/>
+      </w:pPr>
+      <w:r>
+        <w:rPr>
+          <w:rFonts w:ascii="Arial" w:hAnsi="Arial"/>
+          <w:b/>
+          <w:color w:val="1B365D"/>
+          <w:sz w:val="19"/>
+        </w:rPr>
+        <w:t xml:space="preserve">• The Token Tax &amp; Fertility Ratio (Lundin et al., 2026; Xue et al., ByT5, 2021): </w:t>
+      </w:r>
+      <w:r>
+        <w:rPr>
+          <w:rFonts w:ascii="Arial" w:hAnsi="Arial"/>
+          <w:sz w:val="19"/>
+        </w:rPr>
+        <w:t>Standard subword tokenizers are mathematically optimized for Latin scripts. Ge'ez characters (Unicode U+1200 to U+137F) decompose into 3 raw UTF-8 bytes each. Standard tokenizers fragment Amharic text into an average of 3.5 tokens per word (Fertility = 3.5), imposing a direct 3.5x compute, memory, and inference latency surcharge on Ethiopian users. Byte-level modeling resolves this by treating the 256 byte values directly as vocabulary.</w:t>
+      </w:r>
+    </w:p>
+    <w:p>
+      <w:pPr>
+        <w:spacing w:before="60" w:after="60" w:line="276" w:lineRule="auto"/>
+      </w:pPr>
+      <w:r>
+        <w:rPr>
+          <w:rFonts w:ascii="Arial" w:hAnsi="Arial"/>
+          <w:b/>
+          <w:color w:val="1B365D"/>
+          <w:sz w:val="19"/>
+        </w:rPr>
+        <w:t xml:space="preserve">• Selective State Space Architectures (Gu &amp; Dao, Mamba, 2023; Wang et al., MambaByte, 2024): </w:t>
+      </w:r>
+      <w:r>
+        <w:rPr>
+          <w:rFonts w:ascii="Arial" w:hAnsi="Arial"/>
+          <w:sz w:val="19"/>
+        </w:rPr>
+        <w:t>Transformers suffer from quadratic self-attention complexity O(L²). Mamba replaces attention with continuous state-space recurrence discretized via zero-order hold: h'(t) = A h(t) + B x(t), y(t) = C h(t) + D x(t). Through input-dependent selection mechanisms and Chunked Associative Parallel Scans, Mamba scales linearly O(L) with constant generation memory.</w:t>
+      </w:r>
+    </w:p>
+    <w:p>
+      <w:pPr>
+        <w:spacing w:before="60" w:after="60" w:line="276" w:lineRule="auto"/>
+      </w:pPr>
+      <w:r>
+        <w:rPr>
+          <w:rFonts w:ascii="Arial" w:hAnsi="Arial"/>
+          <w:b/>
+          <w:color w:val="1B365D"/>
+          <w:sz w:val="19"/>
+        </w:rPr>
+        <w:t xml:space="preserve">• Complementary Learning Systems &amp; Sleep Replay (McClelland et al., 1995; Tononi &amp; Cirelli, 2014): </w:t>
+      </w:r>
+      <w:r>
+        <w:rPr>
+          <w:rFonts w:ascii="Arial" w:hAnsi="Arial"/>
+          <w:sz w:val="19"/>
+        </w:rPr>
+        <w:t>Biological brains avoid Catastrophic Forgetting via two coupled memory systems: a fast Hippocampus (rapid 1-shot episodic learning) and a slow Neocortex (gradual semantic generalization). During NREM sleep, Sharp-Wave Ripples replay daytime memories at 20x accelerated speed, consolidating episodic traces into neocortical circuits without disrupting prior knowledge.</w:t>
+      </w:r>
+    </w:p>
+    <w:p>
+      <w:pPr>
+        <w:pStyle w:val="Heading1"/>
+        <w:spacing w:before="240" w:after="80"/>
+      </w:pPr>
+      <w:r>
+        <w:t>3. Deep Technical Glossary: Definitions &amp; Mathematical Formulations</w:t>
+      </w:r>
+    </w:p>
+    <w:p>
+      <w:pPr>
+        <w:spacing w:before="60" w:after="60" w:line="276" w:lineRule="auto"/>
+      </w:pPr>
+      <w:r>
+        <w:rPr>
+          <w:rFonts w:ascii="Arial" w:hAnsi="Arial"/>
+          <w:b/>
+          <w:color w:val="8A3B14"/>
+          <w:sz w:val="19"/>
+        </w:rPr>
+        <w:t xml:space="preserve">📌 Bits-Per-Byte (BPB): </w:t>
+      </w:r>
+      <w:r>
+        <w:rPr>
+          <w:rFonts w:ascii="Arial" w:hAnsi="Arial"/>
+          <w:sz w:val="19"/>
+        </w:rPr>
+        <w:t>The universally invariant information-theoretic evaluation metric for language modeling. Perplexity is confounded by vocabulary size (a 32k-token model cannot be compared to a 256-byte model using perplexity). BPB normalizes cross-entropy loss by raw UTF-8 byte length: BPB = (Loss / ln(2)) * (N_tokens / N_bytes). Lower BPB strictly indicates superior model compression and prediction.</w:t>
+      </w:r>
+    </w:p>
+    <w:p>
+      <w:pPr>
+        <w:spacing w:before="60" w:after="60" w:line="276" w:lineRule="auto"/>
+      </w:pPr>
+      <w:r>
+        <w:rPr>
+          <w:rFonts w:ascii="Arial" w:hAnsi="Arial"/>
+          <w:b/>
+          <w:color w:val="8A3B14"/>
+          <w:sz w:val="19"/>
+        </w:rPr>
+        <w:t xml:space="preserve">📌 Parameter Allocation Tax (Embedding Tax): </w:t>
+      </w:r>
+      <w:r>
+        <w:rPr>
+          <w:rFonts w:ascii="Arial" w:hAnsi="Arial"/>
+          <w:sz w:val="19"/>
+        </w:rPr>
+        <w:t>The proportion of a neural network's trainable parameters dedicated exclusively to the input/output vocabulary projection matrix (V * d_model). In a 13M Transformer with 32k vocabulary, 8.19M parameters (62.8%) are consumed by embeddings. In Byte Mamba (V=256), embeddings consume &lt;2.3%, allocating 97.7% of parameters to deep hidden layers.</w:t>
+      </w:r>
+    </w:p>
+    <w:p>
+      <w:pPr>
+        <w:spacing w:before="60" w:after="60" w:line="276" w:lineRule="auto"/>
+      </w:pPr>
+      <w:r>
+        <w:rPr>
+          <w:rFonts w:ascii="Arial" w:hAnsi="Arial"/>
+          <w:b/>
+          <w:color w:val="8A3B14"/>
+          <w:sz w:val="19"/>
+        </w:rPr>
+        <w:t xml:space="preserve">📌 Selective Scan Mechanism (S6): </w:t>
+      </w:r>
+      <w:r>
+        <w:rPr>
+          <w:rFonts w:ascii="Arial" w:hAnsi="Arial"/>
+          <w:sz w:val="19"/>
+        </w:rPr>
+        <w:t>The core mathematical operator of Mamba. Unlike classical Linear Time-Invariant (LTI) state space models where matrices (A, B, C) are static, S6 projects matrices B, C, and step size Δ dynamically from the input token x_t: B_t = Linear_B(x_t), C_t = Linear_C(x_t), Δ_t = softplus(Linear_Δ(x_t)). This allows the model to selectively filter out irrelevant context and preserve salient information indefinitely.</w:t>
+      </w:r>
+    </w:p>
+    <w:p>
+      <w:pPr>
+        <w:spacing w:before="60" w:after="60" w:line="276" w:lineRule="auto"/>
+      </w:pPr>
+      <w:r>
+        <w:rPr>
+          <w:rFonts w:ascii="Arial" w:hAnsi="Arial"/>
+          <w:b/>
+          <w:color w:val="8A3B14"/>
+          <w:sz w:val="19"/>
+        </w:rPr>
+        <w:t xml:space="preserve">📌 Chunked Associative Parallel Scan: </w:t>
+      </w:r>
+      <w:r>
+        <w:rPr>
+          <w:rFonts w:ascii="Arial" w:hAnsi="Arial"/>
+          <w:sz w:val="19"/>
+        </w:rPr>
+        <w:t>The parallel algorithmic realization of Mamba recurrence. Sequences of length L are divided into contiguous chunks of size C (e.g., C=32). Within each chunk, recurrence is solved in parallel via cumulative sums (torch.cumsum) in logarithmic time, combining the parallel training speed of Transformers with the O(1) inference speed of RNNs.</w:t>
+      </w:r>
+    </w:p>
+    <w:p>
+      <w:pPr>
+        <w:spacing w:before="60" w:after="60" w:line="276" w:lineRule="auto"/>
+      </w:pPr>
+      <w:r>
+        <w:rPr>
+          <w:rFonts w:ascii="Arial" w:hAnsi="Arial"/>
+          <w:b/>
+          <w:color w:val="8A3B14"/>
+          <w:sz w:val="19"/>
+        </w:rPr>
+        <w:t xml:space="preserve">📌 Catastrophic Forgetting &amp; Stability-Plasticity Dilemma: </w:t>
+      </w:r>
+      <w:r>
+        <w:rPr>
+          <w:rFonts w:ascii="Arial" w:hAnsi="Arial"/>
+          <w:sz w:val="19"/>
+        </w:rPr>
+        <w:t>The fundamental failure mode of gradient-based neural networks where optimizing loss on new data (plasticity) causes large gradient steps that overwrite orthogonal parameter subspaces encoding prior tasks (stability), resulting in severe performance collapse on baseline grammar.</w:t>
+      </w:r>
+    </w:p>
+    <w:p>
+      <w:pPr>
+        <w:spacing w:before="60" w:after="60" w:line="276" w:lineRule="auto"/>
+      </w:pPr>
+      <w:r>
+        <w:rPr>
+          <w:rFonts w:ascii="Arial" w:hAnsi="Arial"/>
+          <w:b/>
+          <w:color w:val="8A3B14"/>
+          <w:sz w:val="19"/>
+        </w:rPr>
+        <w:t xml:space="preserve">📌 Hebbian Fast Weights &amp; Anti-Hopfield Synaptic Engrams: </w:t>
+      </w:r>
+      <w:r>
+        <w:rPr>
+          <w:rFonts w:ascii="Arial" w:hAnsi="Arial"/>
+          <w:sz w:val="19"/>
+        </w:rPr>
+        <w:t>A biologically inspired 1-shot associative memory mechanism. A memory matrix M of dimension (mem_dim x mem_dim) is updated via outer products: ΔM = η (v_t - M k_t) k_tᵀ, where k_t and v_t are normalized neocortical projections. This allows instant learning in 0.01 seconds without gradient backpropagation.</w:t>
+      </w:r>
+    </w:p>
+    <w:p>
+      <w:pPr>
+        <w:spacing w:before="60" w:after="60" w:line="276" w:lineRule="auto"/>
+      </w:pPr>
+      <w:r>
+        <w:rPr>
+          <w:rFonts w:ascii="Arial" w:hAnsi="Arial"/>
+          <w:b/>
+          <w:color w:val="8A3B14"/>
+          <w:sz w:val="19"/>
+        </w:rPr>
+        <w:t xml:space="preserve">📌 Sharp-Wave Ripple (SWR) Sleep Replay: </w:t>
+      </w:r>
+      <w:r>
+        <w:rPr>
+          <w:rFonts w:ascii="Arial" w:hAnsi="Arial"/>
+          <w:sz w:val="19"/>
+        </w:rPr>
+        <w:t>Offline memory consolidation algorithm. Episodic memory records stored in the Hebbian matrix are replayed at 20x accelerated rate alongside background anchor pairs at conservative learning rates (1e-5), permanently migrating knowledge into Mamba weights without causing mode collapse or grammatical drift.</w:t>
+      </w:r>
+    </w:p>
+    <w:p>
+      <w:pPr>
+        <w:spacing w:before="60" w:after="60" w:line="276" w:lineRule="auto"/>
+      </w:pPr>
+      <w:r>
+        <w:rPr>
+          <w:rFonts w:ascii="Arial" w:hAnsi="Arial"/>
+          <w:b/>
+          <w:color w:val="8A3B14"/>
+          <w:sz w:val="19"/>
+        </w:rPr>
+        <w:t xml:space="preserve">📌 Prompt-Loss Masking: </w:t>
+      </w:r>
+      <w:r>
+        <w:rPr>
+          <w:rFonts w:ascii="Arial" w:hAnsi="Arial"/>
+          <w:sz w:val="19"/>
+        </w:rPr>
+        <w:t>In Supervised Fine-Tuning (SFT), assigning target loss indices to -100 for all bytes belonging to the user prompt: Target_i = -100 for i &lt; prefix_len. The loss is computed strictly over the model's generated response: Loss = CrossEntropy(logits[prefix:], targets[prefix:]).</w:t>
+      </w:r>
+    </w:p>
+    <w:p>
+      <w:pPr>
+        <w:spacing w:before="60" w:after="60" w:line="276" w:lineRule="auto"/>
+      </w:pPr>
+      <w:r>
+        <w:rPr>
+          <w:rFonts w:ascii="Arial" w:hAnsi="Arial"/>
+          <w:b/>
+          <w:color w:val="8A3B14"/>
+          <w:sz w:val="19"/>
+        </w:rPr>
+        <w:t xml:space="preserve">📌 Replay Buffer Anchoring: </w:t>
+      </w:r>
+      <w:r>
+        <w:rPr>
+          <w:rFonts w:ascii="Arial" w:hAnsi="Arial"/>
+          <w:sz w:val="19"/>
+        </w:rPr>
+        <w:t>Regularization technique during online reinforcement learning (RLHF/RLAIF). Every policy update combines the target feedback sample with a mini-batch of foundational anchor pairs (Identity, Geography, Grammar), preventing the model from collapsing its output distribution onto a single reinforced string.</w:t>
+      </w:r>
+    </w:p>
+    <w:p>
+      <w:pPr>
+        <w:pStyle w:val="Heading1"/>
+        <w:spacing w:before="240" w:after="80"/>
+      </w:pPr>
+      <w:r>
+        <w:t>4. End-to-End Engineering Methodology &amp; Data Pipeline</w:t>
+      </w:r>
+    </w:p>
+    <w:p>
+      <w:pPr>
+        <w:spacing w:line="276" w:lineRule="auto"/>
+      </w:pPr>
+      <w:r>
+        <w:rPr>
+          <w:sz w:val="19"/>
+        </w:rPr>
+        <w:t>Our empirical pipeline was executed on an Nvidia GeForce RTX 3090 GPU (24GB VRAM) across 1.465 GB of strictly native, human-authored Amharic text:</w:t>
+        <w:br/>
+        <w:t>1. Data Curation: Curated from Amharic Wikipedia (21.4MB), MasakhaNews (9.5MB), XL-Sum (33.6MB), and GlotCC (1.40GB). Filtered with a strict 30% Ge'ez character ratio threshold and MD5 deduplication into train.bin (1.465 GB) and val.bin (77.1 MB).</w:t>
+        <w:br/>
+        <w:t>2. Architecture Implementation: Built Byte-Level Mamba with selective scan, SentencePiece 16k/32k tokenizers, and baseline Causal Transformers under identical hidden dimensions (d_model=256, 384, 512).</w:t>
+        <w:br/>
+        <w:t>3. Controlled Pre-Training: Pre-trained across 5,000 to 10,000 steps using AdamW optimizer with Cosine Annealing learning rate schedules and FP16 mixed precision.</w:t>
+        <w:br/>
+        <w:t>4. Continual Learning &amp; SFT Alignment: Evaluated 1-shot Hebbian fact acquisition against standard backpropagation, followed by 5-epoch SFT alignment on 4,359 instruction pairs.</w:t>
+      </w:r>
+    </w:p>
+    <w:p>
+      <w:pPr>
+        <w:pStyle w:val="Heading1"/>
+        <w:spacing w:before="240" w:after="80"/>
+      </w:pPr>
+      <w:r>
+        <w:t>5. Empirical Benchmark Results &amp; Analysis</w:t>
+      </w:r>
+    </w:p>
+    <w:p>
+      <w:r>
+        <w:rPr>
+          <w:b/>
+        </w:rPr>
+        <w:t>Table 1: Pre-Training Architecture Benchmark on 1.465 GB Amharic Corpus</w:t>
+      </w:r>
     </w:p>
     <w:tbl>
       <w:tblPr>
         <w:tblW w:type="auto" w:w="0"/>
         <w:jc w:val="center"/>
-        <w:tblLayout w:type="fixed"/>
         <w:tblLook w:firstColumn="1" w:firstRow="1" w:lastColumn="0" w:lastRow="0" w:noHBand="0" w:noVBand="1" w:val="04A0"/>
       </w:tblPr>
       <w:tblGrid>
-        <w:gridCol w:w="9360"/>
+        <w:gridCol w:w="1704"/>
+        <w:gridCol w:w="1704"/>
+        <w:gridCol w:w="1704"/>
+        <w:gridCol w:w="1704"/>
+        <w:gridCol w:w="1704"/>
+        <w:gridCol w:w="1704"/>
       </w:tblGrid>
       <w:tr>
         <w:tc>
           <w:tcPr>
-            <w:tcW w:type="dxa" w:w="10224"/>
-            <w:shd w:fill="F4F7FB"/>
+            <w:tcW w:type="dxa" w:w="1704"/>
+            <w:shd w:fill="1B365D"/>
             <w:tcMar>
-              <w:top w:w="140" w:type="dxa"/>
-              <w:bottom w:w="140" w:type="dxa"/>
-              <w:left w:w="180" w:type="dxa"/>
-              <w:right w:w="180" w:type="dxa"/>
+              <w:top w:w="80" w:type="dxa"/>
+              <w:bottom w:w="80" w:type="dxa"/>
+              <w:left w:w="100" w:type="dxa"/>
+              <w:right w:w="100" w:type="dxa"/>
             </w:tcMar>
           </w:tcPr>
           <w:p>
-            <w:pPr>
-              <w:spacing w:before="0" w:after="40" w:line="276" w:lineRule="auto"/>
-            </w:pPr>
             <w:r>
               <w:rPr>
                 <w:rFonts w:ascii="Arial" w:hAnsi="Arial"/>
                 <w:b/>
-                <w:color w:val="1B365D"/>
-                <w:sz w:val="22"/>
+                <w:color w:val="FFFFFF"/>
+                <w:sz w:val="17"/>
               </w:rPr>
-              <w:t>SLIDE 2: THE AMHARIC AI CHALLENGE: LOW-RESOURCE &amp; TOKEN TAX</w:t>
-              <w:br/>
+              <w:t>Model Architecture</w:t>
             </w:r>
           </w:p>
+        </w:tc>
+        <w:tc>
+          <w:tcPr>
+            <w:tcW w:type="dxa" w:w="1704"/>
+            <w:shd w:fill="1B365D"/>
+            <w:tcMar>
+              <w:top w:w="80" w:type="dxa"/>
+              <w:bottom w:w="80" w:type="dxa"/>
+              <w:left w:w="100" w:type="dxa"/>
+              <w:right w:w="100" w:type="dxa"/>
+            </w:tcMar>
+          </w:tcPr>
           <w:p>
-            <w:pPr>
-              <w:spacing w:after="40" w:line="276" w:lineRule="auto"/>
-            </w:pPr>
             <w:r>
               <w:rPr>
+                <w:rFonts w:ascii="Arial" w:hAnsi="Arial"/>
                 <w:b/>
-                <w:color w:val="8A3B14"/>
-                <w:sz w:val="19"/>
+                <w:color w:val="FFFFFF"/>
+                <w:sz w:val="17"/>
               </w:rPr>
-              <w:t xml:space="preserve">👁️ What the audience sees: </w:t>
+              <w:t>Input Modality</w:t>
             </w:r>
+          </w:p>
+        </w:tc>
+        <w:tc>
+          <w:tcPr>
+            <w:tcW w:type="dxa" w:w="1704"/>
+            <w:shd w:fill="1B365D"/>
+            <w:tcMar>
+              <w:top w:w="80" w:type="dxa"/>
+              <w:bottom w:w="80" w:type="dxa"/>
+              <w:left w:w="100" w:type="dxa"/>
+              <w:right w:w="100" w:type="dxa"/>
+            </w:tcMar>
+          </w:tcPr>
+          <w:p>
             <w:r>
               <w:rPr>
-                <w:sz w:val="19"/>
+                <w:rFonts w:ascii="Arial" w:hAnsi="Arial"/>
+                <w:b/>
+                <w:color w:val="FFFFFF"/>
+                <w:sz w:val="17"/>
               </w:rPr>
-              <w:t>3 Cards showing: (1) Data Ceiling &lt;500M words, (2) Token Tax (3.5x fertility), (3) Parameter Tax (63% wasted).</w:t>
+              <w:t>Total Params</w:t>
             </w:r>
           </w:p>
+        </w:tc>
+        <w:tc>
+          <w:tcPr>
+            <w:tcW w:type="dxa" w:w="1704"/>
+            <w:shd w:fill="1B365D"/>
+            <w:tcMar>
+              <w:top w:w="80" w:type="dxa"/>
+              <w:bottom w:w="80" w:type="dxa"/>
+              <w:left w:w="100" w:type="dxa"/>
+              <w:right w:w="100" w:type="dxa"/>
+            </w:tcMar>
+          </w:tcPr>
           <w:p>
-            <w:pPr>
-              <w:spacing w:after="40" w:line="276" w:lineRule="auto"/>
-            </w:pPr>
             <w:r>
               <w:rPr>
+                <w:rFonts w:ascii="Arial" w:hAnsi="Arial"/>
                 <w:b/>
-                <w:color w:val="0F5132"/>
-                <w:sz w:val="19"/>
+                <w:color w:val="FFFFFF"/>
+                <w:sz w:val="17"/>
               </w:rPr>
-              <w:t xml:space="preserve">💡 Core Idea to Remember: </w:t>
+              <w:t>Embed Tax (%)</w:t>
             </w:r>
+          </w:p>
+        </w:tc>
+        <w:tc>
+          <w:tcPr>
+            <w:tcW w:type="dxa" w:w="1704"/>
+            <w:shd w:fill="1B365D"/>
+            <w:tcMar>
+              <w:top w:w="80" w:type="dxa"/>
+              <w:bottom w:w="80" w:type="dxa"/>
+              <w:left w:w="100" w:type="dxa"/>
+              <w:right w:w="100" w:type="dxa"/>
+            </w:tcMar>
+          </w:tcPr>
+          <w:p>
             <w:r>
               <w:rPr>
-                <w:sz w:val="19"/>
+                <w:rFonts w:ascii="Arial" w:hAnsi="Arial"/>
+                <w:b/>
+                <w:color w:val="FFFFFF"/>
+                <w:sz w:val="17"/>
               </w:rPr>
-              <w:t>Explain why normal AI struggles on Amharic: English has infinite data, but Amharic has very little clean data. Normal tokenizers cut Amharic words into confetti pieces, wasting 63% of the robot's brain.</w:t>
+              <w:t>Validation BPB</w:t>
             </w:r>
           </w:p>
+        </w:tc>
+        <w:tc>
+          <w:tcPr>
+            <w:tcW w:type="dxa" w:w="1704"/>
+            <w:shd w:fill="1B365D"/>
+            <w:tcMar>
+              <w:top w:w="80" w:type="dxa"/>
+              <w:bottom w:w="80" w:type="dxa"/>
+              <w:left w:w="100" w:type="dxa"/>
+              <w:right w:w="100" w:type="dxa"/>
+            </w:tcMar>
+          </w:tcPr>
           <w:p>
-            <w:pPr>
-              <w:spacing w:after="40" w:line="276" w:lineRule="auto"/>
-            </w:pPr>
             <w:r>
               <w:rPr>
+                <w:rFonts w:ascii="Arial" w:hAnsi="Arial"/>
                 <w:b/>
-                <w:color w:val="5C3B00"/>
-                <w:sz w:val="19"/>
+                <w:color w:val="FFFFFF"/>
+                <w:sz w:val="17"/>
               </w:rPr>
-              <w:t xml:space="preserve">🍎 Simple Analogy: </w:t>
+              <w:t>Attention Complexity</w:t>
             </w:r>
+          </w:p>
+        </w:tc>
+      </w:tr>
+      <w:tr>
+        <w:tc>
+          <w:tcPr>
+            <w:tcW w:type="dxa" w:w="1704"/>
+            <w:shd w:fill="FAFAFA"/>
+            <w:tcMar>
+              <w:top w:w="70" w:type="dxa"/>
+              <w:bottom w:w="70" w:type="dxa"/>
+              <w:left w:w="90" w:type="dxa"/>
+              <w:right w:w="90" w:type="dxa"/>
+            </w:tcMar>
+          </w:tcPr>
+          <w:p>
             <w:r>
               <w:rPr>
-                <w:sz w:val="19"/>
+                <w:rFonts w:ascii="Arial" w:hAnsi="Arial"/>
+                <w:sz w:val="17"/>
               </w:rPr>
-              <w:t>Imagine trying to read a story where every single word is shredded into tiny puzzle pieces. You spend all your energy putting pieces together instead of understanding the story.</w:t>
+              <w:t>Transformer (32k)</w:t>
             </w:r>
           </w:p>
+        </w:tc>
+        <w:tc>
+          <w:tcPr>
+            <w:tcW w:type="dxa" w:w="1704"/>
+            <w:shd w:fill="FAFAFA"/>
+            <w:tcMar>
+              <w:top w:w="70" w:type="dxa"/>
+              <w:bottom w:w="70" w:type="dxa"/>
+              <w:left w:w="90" w:type="dxa"/>
+              <w:right w:w="90" w:type="dxa"/>
+            </w:tcMar>
+          </w:tcPr>
           <w:p>
-            <w:pPr>
-              <w:spacing w:before="80" w:after="40" w:line="276" w:lineRule="auto"/>
-            </w:pPr>
             <w:r>
               <w:rPr>
-                <w:b/>
-                <w:color w:val="0D6EFD"/>
-                <w:sz w:val="19"/>
+                <w:rFonts w:ascii="Arial" w:hAnsi="Arial"/>
+                <w:sz w:val="17"/>
               </w:rPr>
-              <w:t>🎙️ EXACT WORDS TO SAY OUT LOUD:</w:t>
-              <w:br/>
+              <w:t>SentencePiece 32k</w:t>
             </w:r>
+          </w:p>
+        </w:tc>
+        <w:tc>
+          <w:tcPr>
+            <w:tcW w:type="dxa" w:w="1704"/>
+            <w:shd w:fill="FAFAFA"/>
+            <w:tcMar>
+              <w:top w:w="70" w:type="dxa"/>
+              <w:bottom w:w="70" w:type="dxa"/>
+              <w:left w:w="90" w:type="dxa"/>
+              <w:right w:w="90" w:type="dxa"/>
+            </w:tcMar>
+          </w:tcPr>
+          <w:p>
             <w:r>
               <w:rPr>
-                <w:i/>
-                <w:color w:val="141414"/>
-                <w:sz w:val="19"/>
+                <w:rFonts w:ascii="Arial" w:hAnsi="Arial"/>
+                <w:sz w:val="17"/>
               </w:rPr>
-              <w:t>"Current AI models like ChatGPT were designed for English. For Amharic, we face three big problems: First, we have less than 500 million clean words online. Second, standard tokenizers chop a single Amharic word into 7 or more tiny pieces—charging an unfair 3.5x 'Token Tax'. Third, a standard model wastes up to 63% of its entire brain capacity just storing a massive dictionary table instead of actual reasoning."</w:t>
+              <w:t>13.04 M</w:t>
+            </w:r>
+          </w:p>
+        </w:tc>
+        <w:tc>
+          <w:tcPr>
+            <w:tcW w:type="dxa" w:w="1704"/>
+            <w:shd w:fill="FDF2E9"/>
+            <w:tcMar>
+              <w:top w:w="70" w:type="dxa"/>
+              <w:bottom w:w="70" w:type="dxa"/>
+              <w:left w:w="90" w:type="dxa"/>
+              <w:right w:w="90" w:type="dxa"/>
+            </w:tcMar>
+          </w:tcPr>
+          <w:p>
+            <w:r>
+              <w:rPr>
+                <w:rFonts w:ascii="Arial" w:hAnsi="Arial"/>
+                <w:sz w:val="17"/>
+              </w:rPr>
+              <w:t>62.8% (Wasted)</w:t>
+            </w:r>
+          </w:p>
+        </w:tc>
+        <w:tc>
+          <w:tcPr>
+            <w:tcW w:type="dxa" w:w="1704"/>
+            <w:shd w:fill="FAFAFA"/>
+            <w:tcMar>
+              <w:top w:w="70" w:type="dxa"/>
+              <w:bottom w:w="70" w:type="dxa"/>
+              <w:left w:w="90" w:type="dxa"/>
+              <w:right w:w="90" w:type="dxa"/>
+            </w:tcMar>
+          </w:tcPr>
+          <w:p>
+            <w:r>
+              <w:rPr>
+                <w:rFonts w:ascii="Arial" w:hAnsi="Arial"/>
+                <w:sz w:val="17"/>
+              </w:rPr>
+              <w:t>1.5790 BPB</w:t>
+            </w:r>
+          </w:p>
+        </w:tc>
+        <w:tc>
+          <w:tcPr>
+            <w:tcW w:type="dxa" w:w="1704"/>
+            <w:shd w:fill="FAFAFA"/>
+            <w:tcMar>
+              <w:top w:w="70" w:type="dxa"/>
+              <w:bottom w:w="70" w:type="dxa"/>
+              <w:left w:w="90" w:type="dxa"/>
+              <w:right w:w="90" w:type="dxa"/>
+            </w:tcMar>
+          </w:tcPr>
+          <w:p>
+            <w:r>
+              <w:rPr>
+                <w:rFonts w:ascii="Arial" w:hAnsi="Arial"/>
+                <w:sz w:val="17"/>
+              </w:rPr>
+              <w:t>Quadratic O(L²) ❌</w:t>
+            </w:r>
+          </w:p>
+        </w:tc>
+      </w:tr>
+      <w:tr>
+        <w:tc>
+          <w:tcPr>
+            <w:tcW w:type="dxa" w:w="1704"/>
+            <w:shd w:fill="FFFFFF"/>
+            <w:tcMar>
+              <w:top w:w="70" w:type="dxa"/>
+              <w:bottom w:w="70" w:type="dxa"/>
+              <w:left w:w="90" w:type="dxa"/>
+              <w:right w:w="90" w:type="dxa"/>
+            </w:tcMar>
+          </w:tcPr>
+          <w:p>
+            <w:r>
+              <w:rPr>
+                <w:rFonts w:ascii="Arial" w:hAnsi="Arial"/>
+                <w:sz w:val="17"/>
+              </w:rPr>
+              <w:t>Transformer (16k)</w:t>
+            </w:r>
+          </w:p>
+        </w:tc>
+        <w:tc>
+          <w:tcPr>
+            <w:tcW w:type="dxa" w:w="1704"/>
+            <w:shd w:fill="FFFFFF"/>
+            <w:tcMar>
+              <w:top w:w="70" w:type="dxa"/>
+              <w:bottom w:w="70" w:type="dxa"/>
+              <w:left w:w="90" w:type="dxa"/>
+              <w:right w:w="90" w:type="dxa"/>
+            </w:tcMar>
+          </w:tcPr>
+          <w:p>
+            <w:r>
+              <w:rPr>
+                <w:rFonts w:ascii="Arial" w:hAnsi="Arial"/>
+                <w:sz w:val="17"/>
+              </w:rPr>
+              <w:t>SentencePiece 16k</w:t>
+            </w:r>
+          </w:p>
+        </w:tc>
+        <w:tc>
+          <w:tcPr>
+            <w:tcW w:type="dxa" w:w="1704"/>
+            <w:shd w:fill="FFFFFF"/>
+            <w:tcMar>
+              <w:top w:w="70" w:type="dxa"/>
+              <w:bottom w:w="70" w:type="dxa"/>
+              <w:left w:w="90" w:type="dxa"/>
+              <w:right w:w="90" w:type="dxa"/>
+            </w:tcMar>
+          </w:tcPr>
+          <w:p>
+            <w:r>
+              <w:rPr>
+                <w:rFonts w:ascii="Arial" w:hAnsi="Arial"/>
+                <w:sz w:val="17"/>
+              </w:rPr>
+              <w:t>8.96 M</w:t>
+            </w:r>
+          </w:p>
+        </w:tc>
+        <w:tc>
+          <w:tcPr>
+            <w:tcW w:type="dxa" w:w="1704"/>
+            <w:shd w:fill="FFFFFF"/>
+            <w:tcMar>
+              <w:top w:w="70" w:type="dxa"/>
+              <w:bottom w:w="70" w:type="dxa"/>
+              <w:left w:w="90" w:type="dxa"/>
+              <w:right w:w="90" w:type="dxa"/>
+            </w:tcMar>
+          </w:tcPr>
+          <w:p>
+            <w:r>
+              <w:rPr>
+                <w:rFonts w:ascii="Arial" w:hAnsi="Arial"/>
+                <w:sz w:val="17"/>
+              </w:rPr>
+              <w:t>45.7%</w:t>
+            </w:r>
+          </w:p>
+        </w:tc>
+        <w:tc>
+          <w:tcPr>
+            <w:tcW w:type="dxa" w:w="1704"/>
+            <w:shd w:fill="FFFFFF"/>
+            <w:tcMar>
+              <w:top w:w="70" w:type="dxa"/>
+              <w:bottom w:w="70" w:type="dxa"/>
+              <w:left w:w="90" w:type="dxa"/>
+              <w:right w:w="90" w:type="dxa"/>
+            </w:tcMar>
+          </w:tcPr>
+          <w:p>
+            <w:r>
+              <w:rPr>
+                <w:rFonts w:ascii="Arial" w:hAnsi="Arial"/>
+                <w:sz w:val="17"/>
+              </w:rPr>
+              <w:t>1.4920 BPB</w:t>
+            </w:r>
+          </w:p>
+        </w:tc>
+        <w:tc>
+          <w:tcPr>
+            <w:tcW w:type="dxa" w:w="1704"/>
+            <w:shd w:fill="FFFFFF"/>
+            <w:tcMar>
+              <w:top w:w="70" w:type="dxa"/>
+              <w:bottom w:w="70" w:type="dxa"/>
+              <w:left w:w="90" w:type="dxa"/>
+              <w:right w:w="90" w:type="dxa"/>
+            </w:tcMar>
+          </w:tcPr>
+          <w:p>
+            <w:r>
+              <w:rPr>
+                <w:rFonts w:ascii="Arial" w:hAnsi="Arial"/>
+                <w:sz w:val="17"/>
+              </w:rPr>
+              <w:t>Quadratic O(L²) ❌</w:t>
+            </w:r>
+          </w:p>
+        </w:tc>
+      </w:tr>
+      <w:tr>
+        <w:tc>
+          <w:tcPr>
+            <w:tcW w:type="dxa" w:w="1704"/>
+            <w:shd w:fill="EBF5EE"/>
+            <w:tcMar>
+              <w:top w:w="70" w:type="dxa"/>
+              <w:bottom w:w="70" w:type="dxa"/>
+              <w:left w:w="90" w:type="dxa"/>
+              <w:right w:w="90" w:type="dxa"/>
+            </w:tcMar>
+          </w:tcPr>
+          <w:p>
+            <w:r>
+              <w:rPr>
+                <w:rFonts w:ascii="Arial" w:hAnsi="Arial"/>
+                <w:sz w:val="17"/>
+              </w:rPr>
+              <w:t>TinyMamba (Byte)</w:t>
+            </w:r>
+          </w:p>
+        </w:tc>
+        <w:tc>
+          <w:tcPr>
+            <w:tcW w:type="dxa" w:w="1704"/>
+            <w:shd w:fill="FAFAFA"/>
+            <w:tcMar>
+              <w:top w:w="70" w:type="dxa"/>
+              <w:bottom w:w="70" w:type="dxa"/>
+              <w:left w:w="90" w:type="dxa"/>
+              <w:right w:w="90" w:type="dxa"/>
+            </w:tcMar>
+          </w:tcPr>
+          <w:p>
+            <w:r>
+              <w:rPr>
+                <w:rFonts w:ascii="Arial" w:hAnsi="Arial"/>
+                <w:sz w:val="17"/>
+              </w:rPr>
+              <w:t>Raw UTF-8 Bytes</w:t>
+            </w:r>
+          </w:p>
+        </w:tc>
+        <w:tc>
+          <w:tcPr>
+            <w:tcW w:type="dxa" w:w="1704"/>
+            <w:shd w:fill="FAFAFA"/>
+            <w:tcMar>
+              <w:top w:w="70" w:type="dxa"/>
+              <w:bottom w:w="70" w:type="dxa"/>
+              <w:left w:w="90" w:type="dxa"/>
+              <w:right w:w="90" w:type="dxa"/>
+            </w:tcMar>
+          </w:tcPr>
+          <w:p>
+            <w:r>
+              <w:rPr>
+                <w:rFonts w:ascii="Arial" w:hAnsi="Arial"/>
+                <w:sz w:val="17"/>
+              </w:rPr>
+              <w:t>2.73 M</w:t>
+            </w:r>
+          </w:p>
+        </w:tc>
+        <w:tc>
+          <w:tcPr>
+            <w:tcW w:type="dxa" w:w="1704"/>
+            <w:shd w:fill="FAFAFA"/>
+            <w:tcMar>
+              <w:top w:w="70" w:type="dxa"/>
+              <w:bottom w:w="70" w:type="dxa"/>
+              <w:left w:w="90" w:type="dxa"/>
+              <w:right w:w="90" w:type="dxa"/>
+            </w:tcMar>
+          </w:tcPr>
+          <w:p>
+            <w:r>
+              <w:rPr>
+                <w:rFonts w:ascii="Arial" w:hAnsi="Arial"/>
+                <w:sz w:val="17"/>
+              </w:rPr>
+              <w:t>2.3% (Efficient)</w:t>
+            </w:r>
+          </w:p>
+        </w:tc>
+        <w:tc>
+          <w:tcPr>
+            <w:tcW w:type="dxa" w:w="1704"/>
+            <w:shd w:fill="FAFAFA"/>
+            <w:tcMar>
+              <w:top w:w="70" w:type="dxa"/>
+              <w:bottom w:w="70" w:type="dxa"/>
+              <w:left w:w="90" w:type="dxa"/>
+              <w:right w:w="90" w:type="dxa"/>
+            </w:tcMar>
+          </w:tcPr>
+          <w:p>
+            <w:r>
+              <w:rPr>
+                <w:rFonts w:ascii="Arial" w:hAnsi="Arial"/>
+                <w:sz w:val="17"/>
+              </w:rPr>
+              <w:t>1.3220 BPB</w:t>
+            </w:r>
+          </w:p>
+        </w:tc>
+        <w:tc>
+          <w:tcPr>
+            <w:tcW w:type="dxa" w:w="1704"/>
+            <w:shd w:fill="FAFAFA"/>
+            <w:tcMar>
+              <w:top w:w="70" w:type="dxa"/>
+              <w:bottom w:w="70" w:type="dxa"/>
+              <w:left w:w="90" w:type="dxa"/>
+              <w:right w:w="90" w:type="dxa"/>
+            </w:tcMar>
+          </w:tcPr>
+          <w:p>
+            <w:r>
+              <w:rPr>
+                <w:rFonts w:ascii="Arial" w:hAnsi="Arial"/>
+                <w:sz w:val="17"/>
+              </w:rPr>
+              <w:t>Linear O(L) ⚡</w:t>
+            </w:r>
+          </w:p>
+        </w:tc>
+      </w:tr>
+      <w:tr>
+        <w:tc>
+          <w:tcPr>
+            <w:tcW w:type="dxa" w:w="1704"/>
+            <w:shd w:fill="FFFFFF"/>
+            <w:tcMar>
+              <w:top w:w="70" w:type="dxa"/>
+              <w:bottom w:w="70" w:type="dxa"/>
+              <w:left w:w="90" w:type="dxa"/>
+              <w:right w:w="90" w:type="dxa"/>
+            </w:tcMar>
+          </w:tcPr>
+          <w:p>
+            <w:r>
+              <w:rPr>
+                <w:rFonts w:ascii="Arial" w:hAnsi="Arial"/>
+                <w:sz w:val="17"/>
+              </w:rPr>
+              <w:t>Mamba-Base (26M)</w:t>
+            </w:r>
+          </w:p>
+        </w:tc>
+        <w:tc>
+          <w:tcPr>
+            <w:tcW w:type="dxa" w:w="1704"/>
+            <w:shd w:fill="FFFFFF"/>
+            <w:tcMar>
+              <w:top w:w="70" w:type="dxa"/>
+              <w:bottom w:w="70" w:type="dxa"/>
+              <w:left w:w="90" w:type="dxa"/>
+              <w:right w:w="90" w:type="dxa"/>
+            </w:tcMar>
+          </w:tcPr>
+          <w:p>
+            <w:r>
+              <w:rPr>
+                <w:rFonts w:ascii="Arial" w:hAnsi="Arial"/>
+                <w:sz w:val="17"/>
+              </w:rPr>
+              <w:t>Raw UTF-8 Bytes</w:t>
+            </w:r>
+          </w:p>
+        </w:tc>
+        <w:tc>
+          <w:tcPr>
+            <w:tcW w:type="dxa" w:w="1704"/>
+            <w:shd w:fill="FFFFFF"/>
+            <w:tcMar>
+              <w:top w:w="70" w:type="dxa"/>
+              <w:bottom w:w="70" w:type="dxa"/>
+              <w:left w:w="90" w:type="dxa"/>
+              <w:right w:w="90" w:type="dxa"/>
+            </w:tcMar>
+          </w:tcPr>
+          <w:p>
+            <w:r>
+              <w:rPr>
+                <w:rFonts w:ascii="Arial" w:hAnsi="Arial"/>
+                <w:sz w:val="17"/>
+              </w:rPr>
+              <w:t>26.24 M</w:t>
+            </w:r>
+          </w:p>
+        </w:tc>
+        <w:tc>
+          <w:tcPr>
+            <w:tcW w:type="dxa" w:w="1704"/>
+            <w:shd w:fill="FFFFFF"/>
+            <w:tcMar>
+              <w:top w:w="70" w:type="dxa"/>
+              <w:bottom w:w="70" w:type="dxa"/>
+              <w:left w:w="90" w:type="dxa"/>
+              <w:right w:w="90" w:type="dxa"/>
+            </w:tcMar>
+          </w:tcPr>
+          <w:p>
+            <w:r>
+              <w:rPr>
+                <w:rFonts w:ascii="Arial" w:hAnsi="Arial"/>
+                <w:sz w:val="17"/>
+              </w:rPr>
+              <w:t>0.49%</w:t>
+            </w:r>
+          </w:p>
+        </w:tc>
+        <w:tc>
+          <w:tcPr>
+            <w:tcW w:type="dxa" w:w="1704"/>
+            <w:shd w:fill="EBF5EE"/>
+            <w:tcMar>
+              <w:top w:w="70" w:type="dxa"/>
+              <w:bottom w:w="70" w:type="dxa"/>
+              <w:left w:w="90" w:type="dxa"/>
+              <w:right w:w="90" w:type="dxa"/>
+            </w:tcMar>
+          </w:tcPr>
+          <w:p>
+            <w:r>
+              <w:rPr>
+                <w:rFonts w:ascii="Arial" w:hAnsi="Arial"/>
+                <w:sz w:val="17"/>
+              </w:rPr>
+              <w:t>1.0613 BPB 🏆</w:t>
+            </w:r>
+          </w:p>
+        </w:tc>
+        <w:tc>
+          <w:tcPr>
+            <w:tcW w:type="dxa" w:w="1704"/>
+            <w:shd w:fill="FFFFFF"/>
+            <w:tcMar>
+              <w:top w:w="70" w:type="dxa"/>
+              <w:bottom w:w="70" w:type="dxa"/>
+              <w:left w:w="90" w:type="dxa"/>
+              <w:right w:w="90" w:type="dxa"/>
+            </w:tcMar>
+          </w:tcPr>
+          <w:p>
+            <w:r>
+              <w:rPr>
+                <w:rFonts w:ascii="Arial" w:hAnsi="Arial"/>
+                <w:sz w:val="17"/>
+              </w:rPr>
+              <w:t>Linear O(L) ⚡</w:t>
             </w:r>
           </w:p>
         </w:tc>
@@ -292,123 +1115,464 @@
     </w:tbl>
     <w:p>
       <w:pPr>
-        <w:spacing w:after="120"/>
+        <w:spacing w:after="80"/>
       </w:pPr>
+    </w:p>
+    <w:p>
+      <w:r>
+        <w:rPr>
+          <w:b/>
+        </w:rPr>
+        <w:t>Table 2: Continual Learning &amp; Catastrophic Forgetting Benchmark</w:t>
+      </w:r>
     </w:p>
     <w:tbl>
       <w:tblPr>
         <w:tblW w:type="auto" w:w="0"/>
         <w:jc w:val="center"/>
-        <w:tblLayout w:type="fixed"/>
         <w:tblLook w:firstColumn="1" w:firstRow="1" w:lastColumn="0" w:lastRow="0" w:noHBand="0" w:noVBand="1" w:val="04A0"/>
       </w:tblPr>
       <w:tblGrid>
-        <w:gridCol w:w="9360"/>
+        <w:gridCol w:w="2045"/>
+        <w:gridCol w:w="2045"/>
+        <w:gridCol w:w="2045"/>
+        <w:gridCol w:w="2045"/>
+        <w:gridCol w:w="2045"/>
       </w:tblGrid>
       <w:tr>
         <w:tc>
           <w:tcPr>
-            <w:tcW w:type="dxa" w:w="10224"/>
-            <w:shd w:fill="F4F7FB"/>
+            <w:tcW w:type="dxa" w:w="2045"/>
+            <w:shd w:fill="1B365D"/>
             <w:tcMar>
-              <w:top w:w="140" w:type="dxa"/>
-              <w:bottom w:w="140" w:type="dxa"/>
-              <w:left w:w="180" w:type="dxa"/>
-              <w:right w:w="180" w:type="dxa"/>
+              <w:top w:w="80" w:type="dxa"/>
+              <w:bottom w:w="80" w:type="dxa"/>
+              <w:left w:w="100" w:type="dxa"/>
+              <w:right w:w="100" w:type="dxa"/>
             </w:tcMar>
           </w:tcPr>
           <w:p>
-            <w:pPr>
-              <w:spacing w:before="0" w:after="40" w:line="276" w:lineRule="auto"/>
-            </w:pPr>
             <w:r>
               <w:rPr>
                 <w:rFonts w:ascii="Arial" w:hAnsi="Arial"/>
                 <w:b/>
-                <w:color w:val="1B365D"/>
-                <w:sz w:val="22"/>
+                <w:color w:val="FFFFFF"/>
+                <w:sz w:val="17"/>
               </w:rPr>
-              <w:t>SLIDE 3: ARCHITECTURE DUALITY: QUADRATIC TRANSFORMER VS. LINEAR MAMBA</w:t>
-              <w:br/>
+              <w:t>Continual Learning Method</w:t>
             </w:r>
           </w:p>
+        </w:tc>
+        <w:tc>
+          <w:tcPr>
+            <w:tcW w:type="dxa" w:w="2045"/>
+            <w:shd w:fill="1B365D"/>
+            <w:tcMar>
+              <w:top w:w="80" w:type="dxa"/>
+              <w:bottom w:w="80" w:type="dxa"/>
+              <w:left w:w="100" w:type="dxa"/>
+              <w:right w:w="100" w:type="dxa"/>
+            </w:tcMar>
+          </w:tcPr>
           <w:p>
-            <w:pPr>
-              <w:spacing w:after="40" w:line="276" w:lineRule="auto"/>
-            </w:pPr>
             <w:r>
               <w:rPr>
+                <w:rFonts w:ascii="Arial" w:hAnsi="Arial"/>
                 <w:b/>
-                <w:color w:val="8A3B14"/>
-                <w:sz w:val="19"/>
+                <w:color w:val="FFFFFF"/>
+                <w:sz w:val="17"/>
               </w:rPr>
-              <w:t xml:space="preserve">👁️ What the audience sees: </w:t>
+              <w:t>Learning Latency</w:t>
             </w:r>
+          </w:p>
+        </w:tc>
+        <w:tc>
+          <w:tcPr>
+            <w:tcW w:type="dxa" w:w="2045"/>
+            <w:shd w:fill="1B365D"/>
+            <w:tcMar>
+              <w:top w:w="80" w:type="dxa"/>
+              <w:bottom w:w="80" w:type="dxa"/>
+              <w:left w:w="100" w:type="dxa"/>
+              <w:right w:w="100" w:type="dxa"/>
+            </w:tcMar>
+          </w:tcPr>
+          <w:p>
             <w:r>
               <w:rPr>
-                <w:sz w:val="19"/>
+                <w:rFonts w:ascii="Arial" w:hAnsi="Arial"/>
+                <w:b/>
+                <w:color w:val="FFFFFF"/>
+                <w:sz w:val="17"/>
               </w:rPr>
-              <w:t>Side-by-side comparison: Red box (Transformer O(L²)) vs Green box (Mamba SSM O(L)).</w:t>
+              <w:t>1-Shot Fact Recall</w:t>
             </w:r>
           </w:p>
+        </w:tc>
+        <w:tc>
+          <w:tcPr>
+            <w:tcW w:type="dxa" w:w="2045"/>
+            <w:shd w:fill="1B365D"/>
+            <w:tcMar>
+              <w:top w:w="80" w:type="dxa"/>
+              <w:bottom w:w="80" w:type="dxa"/>
+              <w:left w:w="100" w:type="dxa"/>
+              <w:right w:w="100" w:type="dxa"/>
+            </w:tcMar>
+          </w:tcPr>
           <w:p>
-            <w:pPr>
-              <w:spacing w:after="40" w:line="276" w:lineRule="auto"/>
-            </w:pPr>
             <w:r>
               <w:rPr>
+                <w:rFonts w:ascii="Arial" w:hAnsi="Arial"/>
                 <w:b/>
-                <w:color w:val="0F5132"/>
-                <w:sz w:val="19"/>
+                <w:color w:val="FFFFFF"/>
+                <w:sz w:val="17"/>
               </w:rPr>
-              <w:t xml:space="preserve">💡 Core Idea to Remember: </w:t>
+              <w:t>Base Grammar Retention</w:t>
             </w:r>
+          </w:p>
+        </w:tc>
+        <w:tc>
+          <w:tcPr>
+            <w:tcW w:type="dxa" w:w="2045"/>
+            <w:shd w:fill="1B365D"/>
+            <w:tcMar>
+              <w:top w:w="80" w:type="dxa"/>
+              <w:bottom w:w="80" w:type="dxa"/>
+              <w:left w:w="100" w:type="dxa"/>
+              <w:right w:w="100" w:type="dxa"/>
+            </w:tcMar>
+          </w:tcPr>
+          <w:p>
             <w:r>
               <w:rPr>
-                <w:sz w:val="19"/>
+                <w:rFonts w:ascii="Arial" w:hAnsi="Arial"/>
+                <w:b/>
+                <w:color w:val="FFFFFF"/>
+                <w:sz w:val="17"/>
               </w:rPr>
-              <w:t>Transformers look at every word and compare it to every other word (they get dizzy on long text). Mamba reads smoothly in a straight line, running 4x faster with constant memory.</w:t>
+              <w:t>Catastrophic Forgetting Status</w:t>
             </w:r>
           </w:p>
+        </w:tc>
+      </w:tr>
+      <w:tr>
+        <w:tc>
+          <w:tcPr>
+            <w:tcW w:type="dxa" w:w="2045"/>
+            <w:shd w:fill="FDF2E9"/>
+            <w:tcMar>
+              <w:top w:w="70" w:type="dxa"/>
+              <w:bottom w:w="70" w:type="dxa"/>
+              <w:left w:w="90" w:type="dxa"/>
+              <w:right w:w="90" w:type="dxa"/>
+            </w:tcMar>
+          </w:tcPr>
           <w:p>
-            <w:pPr>
-              <w:spacing w:after="40" w:line="276" w:lineRule="auto"/>
-            </w:pPr>
             <w:r>
               <w:rPr>
-                <w:b/>
-                <w:color w:val="5C3B00"/>
-                <w:sz w:val="19"/>
+                <w:rFonts w:ascii="Arial" w:hAnsi="Arial"/>
+                <w:sz w:val="17"/>
               </w:rPr>
-              <w:t xml:space="preserve">🍎 Simple Analogy: </w:t>
+              <w:t>Standard Backpropagation</w:t>
             </w:r>
+          </w:p>
+        </w:tc>
+        <w:tc>
+          <w:tcPr>
+            <w:tcW w:type="dxa" w:w="2045"/>
+            <w:shd w:fill="FDF2E9"/>
+            <w:tcMar>
+              <w:top w:w="70" w:type="dxa"/>
+              <w:bottom w:w="70" w:type="dxa"/>
+              <w:left w:w="90" w:type="dxa"/>
+              <w:right w:w="90" w:type="dxa"/>
+            </w:tcMar>
+          </w:tcPr>
+          <w:p>
             <w:r>
               <w:rPr>
-                <w:sz w:val="19"/>
+                <w:rFonts w:ascii="Arial" w:hAnsi="Arial"/>
+                <w:sz w:val="17"/>
               </w:rPr>
-              <w:t>Transformer is like a student who reads a paragraph by looking back and forth at every single word simultaneously. Mamba is like a reader who smoothly glides their finger along the line.</w:t>
+              <w:t>~4.20 seconds (Slow)</w:t>
             </w:r>
           </w:p>
+        </w:tc>
+        <w:tc>
+          <w:tcPr>
+            <w:tcW w:type="dxa" w:w="2045"/>
+            <w:shd w:fill="FDF2E9"/>
+            <w:tcMar>
+              <w:top w:w="70" w:type="dxa"/>
+              <w:bottom w:w="70" w:type="dxa"/>
+              <w:left w:w="90" w:type="dxa"/>
+              <w:right w:w="90" w:type="dxa"/>
+            </w:tcMar>
+          </w:tcPr>
           <w:p>
-            <w:pPr>
-              <w:spacing w:before="80" w:after="40" w:line="276" w:lineRule="auto"/>
-            </w:pPr>
             <w:r>
               <w:rPr>
-                <w:b/>
-                <w:color w:val="0D6EFD"/>
-                <w:sz w:val="19"/>
+                <w:rFonts w:ascii="Arial" w:hAnsi="Arial"/>
+                <w:sz w:val="17"/>
               </w:rPr>
-              <w:t>🎙️ EXACT WORDS TO SAY OUT LOUD:</w:t>
-              <w:br/>
+              <w:t>40.0% (Poor)</w:t>
             </w:r>
+          </w:p>
+        </w:tc>
+        <w:tc>
+          <w:tcPr>
+            <w:tcW w:type="dxa" w:w="2045"/>
+            <w:shd w:fill="FDF2E9"/>
+            <w:tcMar>
+              <w:top w:w="70" w:type="dxa"/>
+              <w:bottom w:w="70" w:type="dxa"/>
+              <w:left w:w="90" w:type="dxa"/>
+              <w:right w:w="90" w:type="dxa"/>
+            </w:tcMar>
+          </w:tcPr>
+          <w:p>
             <w:r>
               <w:rPr>
-                <w:i/>
-                <w:color w:val="141414"/>
-                <w:sz w:val="19"/>
+                <w:rFonts w:ascii="Arial" w:hAnsi="Arial"/>
+                <w:sz w:val="17"/>
               </w:rPr>
-              <w:t>"Because Amharic byte sequences are 3.5 times longer, normal Transformers become very slow because their self-attention compute explodes quadratically. In contrast, Mamba uses a Selective State Space Model that processes text in a straight linear line. It never gets bogged down, cuts latency by 75%, and uses 3 times less GPU memory."</w:t>
+              <w:t>42.1% (Severe Drift)</w:t>
+            </w:r>
+          </w:p>
+        </w:tc>
+        <w:tc>
+          <w:tcPr>
+            <w:tcW w:type="dxa" w:w="2045"/>
+            <w:shd w:fill="FDF2E9"/>
+            <w:tcMar>
+              <w:top w:w="70" w:type="dxa"/>
+              <w:bottom w:w="70" w:type="dxa"/>
+              <w:left w:w="90" w:type="dxa"/>
+              <w:right w:w="90" w:type="dxa"/>
+            </w:tcMar>
+          </w:tcPr>
+          <w:p>
+            <w:r>
+              <w:rPr>
+                <w:rFonts w:ascii="Arial" w:hAnsi="Arial"/>
+                <w:sz w:val="17"/>
+              </w:rPr>
+              <w:t>Severe Catastrophic Forgetting ❌</w:t>
+            </w:r>
+          </w:p>
+        </w:tc>
+      </w:tr>
+      <w:tr>
+        <w:tc>
+          <w:tcPr>
+            <w:tcW w:type="dxa" w:w="2045"/>
+            <w:shd w:fill="EBF5EE"/>
+            <w:tcMar>
+              <w:top w:w="70" w:type="dxa"/>
+              <w:bottom w:w="70" w:type="dxa"/>
+              <w:left w:w="90" w:type="dxa"/>
+              <w:right w:w="90" w:type="dxa"/>
+            </w:tcMar>
+          </w:tcPr>
+          <w:p>
+            <w:r>
+              <w:rPr>
+                <w:rFonts w:ascii="Arial" w:hAnsi="Arial"/>
+                <w:sz w:val="17"/>
+              </w:rPr>
+              <w:t>Hebbian Engram (Ours)</w:t>
+            </w:r>
+          </w:p>
+        </w:tc>
+        <w:tc>
+          <w:tcPr>
+            <w:tcW w:type="dxa" w:w="2045"/>
+            <w:shd w:fill="FDF2E9"/>
+            <w:tcMar>
+              <w:top w:w="70" w:type="dxa"/>
+              <w:bottom w:w="70" w:type="dxa"/>
+              <w:left w:w="90" w:type="dxa"/>
+              <w:right w:w="90" w:type="dxa"/>
+            </w:tcMar>
+          </w:tcPr>
+          <w:p>
+            <w:r>
+              <w:rPr>
+                <w:rFonts w:ascii="Arial" w:hAnsi="Arial"/>
+                <w:sz w:val="17"/>
+              </w:rPr>
+              <w:t>0.01 seconds (Instant)</w:t>
+            </w:r>
+          </w:p>
+        </w:tc>
+        <w:tc>
+          <w:tcPr>
+            <w:tcW w:type="dxa" w:w="2045"/>
+            <w:shd w:fill="FDF2E9"/>
+            <w:tcMar>
+              <w:top w:w="70" w:type="dxa"/>
+              <w:bottom w:w="70" w:type="dxa"/>
+              <w:left w:w="90" w:type="dxa"/>
+              <w:right w:w="90" w:type="dxa"/>
+            </w:tcMar>
+          </w:tcPr>
+          <w:p>
+            <w:r>
+              <w:rPr>
+                <w:rFonts w:ascii="Arial" w:hAnsi="Arial"/>
+                <w:sz w:val="17"/>
+              </w:rPr>
+              <w:t>100.0% (Perfect)</w:t>
+            </w:r>
+          </w:p>
+        </w:tc>
+        <w:tc>
+          <w:tcPr>
+            <w:tcW w:type="dxa" w:w="2045"/>
+            <w:shd w:fill="FDF2E9"/>
+            <w:tcMar>
+              <w:top w:w="70" w:type="dxa"/>
+              <w:bottom w:w="70" w:type="dxa"/>
+              <w:left w:w="90" w:type="dxa"/>
+              <w:right w:w="90" w:type="dxa"/>
+            </w:tcMar>
+          </w:tcPr>
+          <w:p>
+            <w:r>
+              <w:rPr>
+                <w:rFonts w:ascii="Arial" w:hAnsi="Arial"/>
+                <w:sz w:val="17"/>
+              </w:rPr>
+              <w:t>78.4% (Preserved)</w:t>
+            </w:r>
+          </w:p>
+        </w:tc>
+        <w:tc>
+          <w:tcPr>
+            <w:tcW w:type="dxa" w:w="2045"/>
+            <w:shd w:fill="FDF2E9"/>
+            <w:tcMar>
+              <w:top w:w="70" w:type="dxa"/>
+              <w:bottom w:w="70" w:type="dxa"/>
+              <w:left w:w="90" w:type="dxa"/>
+              <w:right w:w="90" w:type="dxa"/>
+            </w:tcMar>
+          </w:tcPr>
+          <w:p>
+            <w:r>
+              <w:rPr>
+                <w:rFonts w:ascii="Arial" w:hAnsi="Arial"/>
+                <w:sz w:val="17"/>
+              </w:rPr>
+              <w:t>Zero Interference ✅</w:t>
+            </w:r>
+          </w:p>
+        </w:tc>
+      </w:tr>
+      <w:tr>
+        <w:tc>
+          <w:tcPr>
+            <w:tcW w:type="dxa" w:w="2045"/>
+            <w:shd w:fill="FDF2E9"/>
+            <w:tcMar>
+              <w:top w:w="70" w:type="dxa"/>
+              <w:bottom w:w="70" w:type="dxa"/>
+              <w:left w:w="90" w:type="dxa"/>
+              <w:right w:w="90" w:type="dxa"/>
+            </w:tcMar>
+          </w:tcPr>
+          <w:p>
+            <w:r>
+              <w:rPr>
+                <w:rFonts w:ascii="Arial" w:hAnsi="Arial"/>
+                <w:sz w:val="17"/>
+              </w:rPr>
+              <w:t>Engram + Sleep Replay (Ours)</w:t>
+            </w:r>
+          </w:p>
+        </w:tc>
+        <w:tc>
+          <w:tcPr>
+            <w:tcW w:type="dxa" w:w="2045"/>
+            <w:shd w:fill="FDF2E9"/>
+            <w:tcMar>
+              <w:top w:w="70" w:type="dxa"/>
+              <w:bottom w:w="70" w:type="dxa"/>
+              <w:left w:w="90" w:type="dxa"/>
+              <w:right w:w="90" w:type="dxa"/>
+            </w:tcMar>
+          </w:tcPr>
+          <w:p>
+            <w:r>
+              <w:rPr>
+                <w:rFonts w:ascii="Arial" w:hAnsi="Arial"/>
+                <w:sz w:val="17"/>
+              </w:rPr>
+              <w:t>20x Offline Consolidation</w:t>
+            </w:r>
+          </w:p>
+        </w:tc>
+        <w:tc>
+          <w:tcPr>
+            <w:tcW w:type="dxa" w:w="2045"/>
+            <w:shd w:fill="FDF2E9"/>
+            <w:tcMar>
+              <w:top w:w="70" w:type="dxa"/>
+              <w:bottom w:w="70" w:type="dxa"/>
+              <w:left w:w="90" w:type="dxa"/>
+              <w:right w:w="90" w:type="dxa"/>
+            </w:tcMar>
+          </w:tcPr>
+          <w:p>
+            <w:r>
+              <w:rPr>
+                <w:rFonts w:ascii="Arial" w:hAnsi="Arial"/>
+                <w:sz w:val="17"/>
+              </w:rPr>
+              <w:t>100.0% (Permanent)</w:t>
+            </w:r>
+          </w:p>
+        </w:tc>
+        <w:tc>
+          <w:tcPr>
+            <w:tcW w:type="dxa" w:w="2045"/>
+            <w:shd w:fill="FDF2E9"/>
+            <w:tcMar>
+              <w:top w:w="70" w:type="dxa"/>
+              <w:bottom w:w="70" w:type="dxa"/>
+              <w:left w:w="90" w:type="dxa"/>
+              <w:right w:w="90" w:type="dxa"/>
+            </w:tcMar>
+          </w:tcPr>
+          <w:p>
+            <w:r>
+              <w:rPr>
+                <w:rFonts w:ascii="Arial" w:hAnsi="Arial"/>
+                <w:sz w:val="17"/>
+              </w:rPr>
+              <w:t>100.0% (Perfect)</w:t>
+            </w:r>
+          </w:p>
+        </w:tc>
+        <w:tc>
+          <w:tcPr>
+            <w:tcW w:type="dxa" w:w="2045"/>
+            <w:shd w:fill="EBF5EE"/>
+            <w:tcMar>
+              <w:top w:w="70" w:type="dxa"/>
+              <w:bottom w:w="70" w:type="dxa"/>
+              <w:left w:w="90" w:type="dxa"/>
+              <w:right w:w="90" w:type="dxa"/>
+            </w:tcMar>
+          </w:tcPr>
+          <w:p>
+            <w:r>
+              <w:rPr>
+                <w:rFonts w:ascii="Arial" w:hAnsi="Arial"/>
+                <w:sz w:val="17"/>
+              </w:rPr>
+              <w:t>Biologically Consolidated 🏆</w:t>
             </w:r>
           </w:p>
         </w:tc>
@@ -416,1124 +1580,127 @@
     </w:tbl>
     <w:p>
       <w:pPr>
-        <w:spacing w:after="120"/>
+        <w:pStyle w:val="Heading1"/>
+        <w:spacing w:before="280" w:after="80"/>
       </w:pPr>
+      <w:r>
+        <w:t>6. Anticipated Presentation Questions &amp; Expert Defense Answers</w:t>
+      </w:r>
     </w:p>
-    <w:tbl>
-      <w:tblPr>
-        <w:tblW w:type="auto" w:w="0"/>
-        <w:jc w:val="center"/>
-        <w:tblLayout w:type="fixed"/>
-        <w:tblLook w:firstColumn="1" w:firstRow="1" w:lastColumn="0" w:lastRow="0" w:noHBand="0" w:noVBand="1" w:val="04A0"/>
-      </w:tblPr>
-      <w:tblGrid>
-        <w:gridCol w:w="9360"/>
-      </w:tblGrid>
-      <w:tr>
-        <w:tc>
-          <w:tcPr>
-            <w:tcW w:type="dxa" w:w="10224"/>
-            <w:shd w:fill="F4F7FB"/>
-            <w:tcMar>
-              <w:top w:w="140" w:type="dxa"/>
-              <w:bottom w:w="140" w:type="dxa"/>
-              <w:left w:w="180" w:type="dxa"/>
-              <w:right w:w="180" w:type="dxa"/>
-            </w:tcMar>
-          </w:tcPr>
-          <w:p>
-            <w:pPr>
-              <w:spacing w:before="0" w:after="40" w:line="276" w:lineRule="auto"/>
-            </w:pPr>
-            <w:r>
-              <w:rPr>
-                <w:rFonts w:ascii="Arial" w:hAnsi="Arial"/>
-                <w:b/>
-                <w:color w:val="1B365D"/>
-                <w:sz w:val="22"/>
-              </w:rPr>
-              <w:t>SLIDE 4: EMPIRICAL BENCHMARK: TINYMAMBA (2.7M) OUTPERFORMS TRANSFORMER (13M)</w:t>
-              <w:br/>
-            </w:r>
-          </w:p>
-          <w:p>
-            <w:pPr>
-              <w:spacing w:after="40" w:line="276" w:lineRule="auto"/>
-            </w:pPr>
-            <w:r>
-              <w:rPr>
-                <w:b/>
-                <w:color w:val="8A3B14"/>
-                <w:sz w:val="19"/>
-              </w:rPr>
-              <w:t xml:space="preserve">👁️ What the audience sees: </w:t>
-            </w:r>
-            <w:r>
-              <w:rPr>
-                <w:sz w:val="19"/>
-              </w:rPr>
-              <w:t>Figure 1 chart comparing model sizes vs Bits-per-Byte (BPB) compression scores.</w:t>
-            </w:r>
-          </w:p>
-          <w:p>
-            <w:pPr>
-              <w:spacing w:after="40" w:line="276" w:lineRule="auto"/>
-            </w:pPr>
-            <w:r>
-              <w:rPr>
-                <w:b/>
-                <w:color w:val="0F5132"/>
-                <w:sz w:val="19"/>
-              </w:rPr>
-              <w:t xml:space="preserve">💡 Core Idea to Remember: </w:t>
-            </w:r>
-            <w:r>
-              <w:rPr>
-                <w:sz w:val="19"/>
-              </w:rPr>
-              <w:t>Our small 2.7M Mamba model beat a giant 13M Transformer! Remember: Lower BPB means a smarter model.</w:t>
-            </w:r>
-          </w:p>
-          <w:p>
-            <w:pPr>
-              <w:spacing w:after="40" w:line="276" w:lineRule="auto"/>
-            </w:pPr>
-            <w:r>
-              <w:rPr>
-                <w:b/>
-                <w:color w:val="5C3B00"/>
-                <w:sz w:val="19"/>
-              </w:rPr>
-              <w:t xml:space="preserve">🍎 Simple Analogy: </w:t>
-            </w:r>
-            <w:r>
-              <w:rPr>
-                <w:sz w:val="19"/>
-              </w:rPr>
-              <w:t>A small 2.7-liter lightweight sports car drove faster and used less fuel than a heavy 13-ton truck.</w:t>
-            </w:r>
-          </w:p>
-          <w:p>
-            <w:pPr>
-              <w:spacing w:before="80" w:after="40" w:line="276" w:lineRule="auto"/>
-            </w:pPr>
-            <w:r>
-              <w:rPr>
-                <w:b/>
-                <w:color w:val="0D6EFD"/>
-                <w:sz w:val="19"/>
-              </w:rPr>
-              <w:t>🎙️ EXACT WORDS TO SAY OUT LOUD:</w:t>
-              <w:br/>
-            </w:r>
-            <w:r>
-              <w:rPr>
-                <w:i/>
-                <w:color w:val="141414"/>
-                <w:sz w:val="19"/>
-              </w:rPr>
-              <w:t>"Here is our primary experimental result on 1.46 GB of clean Amharic text. We measured performance using Bits-per-Byte, where lower is better. Our TinyMamba model with only 2.7 million parameters achieved a score of 1.322 BPB, outperforming a 13 million parameter Transformer that scored 1.579 BPB. Our model was nearly 5 times smaller, but strictly more accurate!"</w:t>
-            </w:r>
-          </w:p>
-        </w:tc>
-      </w:tr>
-    </w:tbl>
     <w:p>
       <w:pPr>
-        <w:spacing w:after="120"/>
+        <w:spacing w:before="80" w:after="80" w:line="276" w:lineRule="auto"/>
       </w:pPr>
+      <w:r>
+        <w:rPr>
+          <w:rFonts w:ascii="Arial" w:hAnsi="Arial"/>
+          <w:b/>
+          <w:color w:val="1B365D"/>
+          <w:sz w:val="19"/>
+        </w:rPr>
+        <w:t>Q1: Why did you eliminate the subword tokenizer rather than training a domain-adapted SentencePiece tokenizer?</w:t>
+        <w:br/>
+      </w:r>
+      <w:r>
+        <w:rPr>
+          <w:rFonts w:ascii="Arial" w:hAnsi="Arial"/>
+          <w:color w:val="282828"/>
+          <w:sz w:val="19"/>
+        </w:rPr>
+        <w:t>👉 Answer: In non-concatenative Semitic languages like Amharic, root letters are modified internally by vowel patterns and affixes. Subword tokenizers fail to isolate lexical roots, resulting in extreme fragmentation and out-of-vocabulary anomalies. More critically, as shown in Table 1, increasing vocabulary size creates an unsustainable Parameter Allocation Tax: on an 8M parameter budget, a 32k vocabulary consumes 62.8% of all model weights in the static embedding table alone. Byte-level modeling uses a fixed 256-byte vocabulary (taking &lt;1% of weights), dedicating 98% of parameters to deep sequence modeling.</w:t>
+      </w:r>
     </w:p>
-    <w:tbl>
-      <w:tblPr>
-        <w:tblW w:type="auto" w:w="0"/>
-        <w:jc w:val="center"/>
-        <w:tblLayout w:type="fixed"/>
-        <w:tblLook w:firstColumn="1" w:firstRow="1" w:lastColumn="0" w:lastRow="0" w:noHBand="0" w:noVBand="1" w:val="04A0"/>
-      </w:tblPr>
-      <w:tblGrid>
-        <w:gridCol w:w="9360"/>
-      </w:tblGrid>
-      <w:tr>
-        <w:tc>
-          <w:tcPr>
-            <w:tcW w:type="dxa" w:w="10224"/>
-            <w:shd w:fill="F4F7FB"/>
-            <w:tcMar>
-              <w:top w:w="140" w:type="dxa"/>
-              <w:bottom w:w="140" w:type="dxa"/>
-              <w:left w:w="180" w:type="dxa"/>
-              <w:right w:w="180" w:type="dxa"/>
-            </w:tcMar>
-          </w:tcPr>
-          <w:p>
-            <w:pPr>
-              <w:spacing w:before="0" w:after="40" w:line="276" w:lineRule="auto"/>
-            </w:pPr>
-            <w:r>
-              <w:rPr>
-                <w:rFonts w:ascii="Arial" w:hAnsi="Arial"/>
-                <w:b/>
-                <w:color w:val="1B365D"/>
-                <w:sz w:val="22"/>
-              </w:rPr>
-              <w:t>SLIDE 5: PARAMETER ALLOCATION TAX: RECLAIMING NEURAL CAPACITY</w:t>
-              <w:br/>
-            </w:r>
-          </w:p>
-          <w:p>
-            <w:pPr>
-              <w:spacing w:after="40" w:line="276" w:lineRule="auto"/>
-            </w:pPr>
-            <w:r>
-              <w:rPr>
-                <w:b/>
-                <w:color w:val="8A3B14"/>
-                <w:sz w:val="19"/>
-              </w:rPr>
-              <w:t xml:space="preserve">👁️ What the audience sees: </w:t>
-            </w:r>
-            <w:r>
-              <w:rPr>
-                <w:sz w:val="19"/>
-              </w:rPr>
-              <w:t>Figure 2 bar chart showing how much of the model's brain is wasted on dictionaries.</w:t>
-            </w:r>
-          </w:p>
-          <w:p>
-            <w:pPr>
-              <w:spacing w:after="40" w:line="276" w:lineRule="auto"/>
-            </w:pPr>
-            <w:r>
-              <w:rPr>
-                <w:b/>
-                <w:color w:val="0F5132"/>
-                <w:sz w:val="19"/>
-              </w:rPr>
-              <w:t xml:space="preserve">💡 Core Idea to Remember: </w:t>
-            </w:r>
-            <w:r>
-              <w:rPr>
-                <w:sz w:val="19"/>
-              </w:rPr>
-              <w:t>Tokenized models waste 63% of their weights on vocabulary lookup tables. By using raw bytes (256 numbers), we freed 98% of the model for pure thinking.</w:t>
-            </w:r>
-          </w:p>
-          <w:p>
-            <w:pPr>
-              <w:spacing w:after="40" w:line="276" w:lineRule="auto"/>
-            </w:pPr>
-            <w:r>
-              <w:rPr>
-                <w:b/>
-                <w:color w:val="5C3B00"/>
-                <w:sz w:val="19"/>
-              </w:rPr>
-              <w:t xml:space="preserve">🍎 Simple Analogy: </w:t>
-            </w:r>
-            <w:r>
-              <w:rPr>
-                <w:sz w:val="19"/>
-              </w:rPr>
-              <w:t>Buying a 100-page notebook where 63 pages are blank index tables vs a notebook where 98 pages are full of brilliant thinking.</w:t>
-            </w:r>
-          </w:p>
-          <w:p>
-            <w:pPr>
-              <w:spacing w:before="80" w:after="40" w:line="276" w:lineRule="auto"/>
-            </w:pPr>
-            <w:r>
-              <w:rPr>
-                <w:b/>
-                <w:color w:val="0D6EFD"/>
-                <w:sz w:val="19"/>
-              </w:rPr>
-              <w:t>🎙️ EXACT WORDS TO SAY OUT LOUD:</w:t>
-              <w:br/>
-            </w:r>
-            <w:r>
-              <w:rPr>
-                <w:i/>
-                <w:color w:val="141414"/>
-                <w:sz w:val="19"/>
-              </w:rPr>
-              <w:t>"Why did our smaller model win? Because of the Parameter Allocation Tax shown in this chart. The 32k Transformer wasted 62.8% of all its weights on a static vocabulary dictionary. By moving to raw UTF-8 bytes with only 256 entries, our model dedicated 97.7% of its parameters to deep neural reasoning layers."</w:t>
-            </w:r>
-          </w:p>
-        </w:tc>
-      </w:tr>
-    </w:tbl>
     <w:p>
       <w:pPr>
-        <w:spacing w:after="120"/>
+        <w:spacing w:before="80" w:after="80" w:line="276" w:lineRule="auto"/>
       </w:pPr>
+      <w:r>
+        <w:rPr>
+          <w:rFonts w:ascii="Arial" w:hAnsi="Arial"/>
+          <w:b/>
+          <w:color w:val="1B365D"/>
+          <w:sz w:val="19"/>
+        </w:rPr>
+        <w:t>Q2: Raw byte sequences are ~3.5x longer than tokenized sequences. Why didn't this cause a catastrophic latency penalty?</w:t>
+        <w:br/>
+      </w:r>
+      <w:r>
+        <w:rPr>
+          <w:rFonts w:ascii="Arial" w:hAnsi="Arial"/>
+          <w:color w:val="282828"/>
+          <w:sz w:val="19"/>
+        </w:rPr>
+        <w:t>👉 Answer: That bottleneck is specific to Transformers, where Self-Attention compute and memory scale quadratically O(L²). In our work, we replaced Transformers with Mamba Selective State Space Models (S6), which process sequences in strict linear time O(L) via Chunked Associative Parallel Scans. Our benchmarks prove that TinyMamba processed 384-byte sequences at 4.3 steps/second with only 4.2GB VRAM on an RTX 3090, outperforming Transformers while using 3x less GPU memory.</w:t>
+      </w:r>
     </w:p>
-    <w:tbl>
-      <w:tblPr>
-        <w:tblW w:type="auto" w:w="0"/>
-        <w:jc w:val="center"/>
-        <w:tblLayout w:type="fixed"/>
-        <w:tblLook w:firstColumn="1" w:firstRow="1" w:lastColumn="0" w:lastRow="0" w:noHBand="0" w:noVBand="1" w:val="04A0"/>
-      </w:tblPr>
-      <w:tblGrid>
-        <w:gridCol w:w="9360"/>
-      </w:tblGrid>
-      <w:tr>
-        <w:tc>
-          <w:tcPr>
-            <w:tcW w:type="dxa" w:w="10224"/>
-            <w:shd w:fill="F4F7FB"/>
-            <w:tcMar>
-              <w:top w:w="140" w:type="dxa"/>
-              <w:bottom w:w="140" w:type="dxa"/>
-              <w:left w:w="180" w:type="dxa"/>
-              <w:right w:w="180" w:type="dxa"/>
-            </w:tcMar>
-          </w:tcPr>
-          <w:p>
-            <w:pPr>
-              <w:spacing w:before="0" w:after="40" w:line="276" w:lineRule="auto"/>
-            </w:pPr>
-            <w:r>
-              <w:rPr>
-                <w:rFonts w:ascii="Arial" w:hAnsi="Arial"/>
-                <w:b/>
-                <w:color w:val="1B365D"/>
-                <w:sz w:val="22"/>
-              </w:rPr>
-              <w:t>SLIDE 6: CATASTROPHIC FORGETTING &amp; COMPLEMENTARY LEARNING SYSTEMS</w:t>
-              <w:br/>
-            </w:r>
-          </w:p>
-          <w:p>
-            <w:pPr>
-              <w:spacing w:after="40" w:line="276" w:lineRule="auto"/>
-            </w:pPr>
-            <w:r>
-              <w:rPr>
-                <w:b/>
-                <w:color w:val="8A3B14"/>
-                <w:sz w:val="19"/>
-              </w:rPr>
-              <w:t xml:space="preserve">👁️ What the audience sees: </w:t>
-            </w:r>
-            <w:r>
-              <w:rPr>
-                <w:sz w:val="19"/>
-              </w:rPr>
-              <w:t>Red box (Standard Backprop forgetting) vs Green box (Brain-Inspired Dual Memory).</w:t>
-            </w:r>
-          </w:p>
-          <w:p>
-            <w:pPr>
-              <w:spacing w:after="40" w:line="276" w:lineRule="auto"/>
-            </w:pPr>
-            <w:r>
-              <w:rPr>
-                <w:b/>
-                <w:color w:val="0F5132"/>
-                <w:sz w:val="19"/>
-              </w:rPr>
-              <w:t xml:space="preserve">💡 Core Idea to Remember: </w:t>
-            </w:r>
-            <w:r>
-              <w:rPr>
-                <w:sz w:val="19"/>
-              </w:rPr>
-              <w:t>Standard AI forgets past grammar when learning today's news. We copied the human brain: a fast notepad for today's facts + a slow permanent brain for language grammar.</w:t>
-            </w:r>
-          </w:p>
-          <w:p>
-            <w:pPr>
-              <w:spacing w:after="40" w:line="276" w:lineRule="auto"/>
-            </w:pPr>
-            <w:r>
-              <w:rPr>
-                <w:b/>
-                <w:color w:val="5C3B00"/>
-                <w:sz w:val="19"/>
-              </w:rPr>
-              <w:t xml:space="preserve">🍎 Simple Analogy: </w:t>
-            </w:r>
-            <w:r>
-              <w:rPr>
-                <w:sz w:val="19"/>
-              </w:rPr>
-              <w:t>When you meet someone new, you write their phone number on a sticky note without forgetting how to speak your native language.</w:t>
-            </w:r>
-          </w:p>
-          <w:p>
-            <w:pPr>
-              <w:spacing w:before="80" w:after="40" w:line="276" w:lineRule="auto"/>
-            </w:pPr>
-            <w:r>
-              <w:rPr>
-                <w:b/>
-                <w:color w:val="0D6EFD"/>
-                <w:sz w:val="19"/>
-              </w:rPr>
-              <w:t>🎙️ EXACT WORDS TO SAY OUT LOUD:</w:t>
-              <w:br/>
-            </w:r>
-            <w:r>
-              <w:rPr>
-                <w:i/>
-                <w:color w:val="141414"/>
-                <w:sz w:val="19"/>
-              </w:rPr>
-              <w:t>"When you update standard AI on live news, it suffers from Catastrophic Forgetting—grammar retention collapses down to 42%. To solve this, we drew inspiration from human neuroscience: the Complementary Learning Systems theory. We gave our AI two cooperating memory systems: a fast Hippocampus for instant fact capture, and a slow Mamba Neocortex for stable grammar."</w:t>
-            </w:r>
-          </w:p>
-        </w:tc>
-      </w:tr>
-    </w:tbl>
     <w:p>
       <w:pPr>
-        <w:spacing w:after="120"/>
+        <w:spacing w:before="80" w:after="80" w:line="276" w:lineRule="auto"/>
       </w:pPr>
+      <w:r>
+        <w:rPr>
+          <w:rFonts w:ascii="Arial" w:hAnsi="Arial"/>
+          <w:b/>
+          <w:color w:val="1B365D"/>
+          <w:sz w:val="19"/>
+        </w:rPr>
+        <w:t>Q3: How do you justify comparing models with different tokenizers using Bits-Per-Byte (BPB)?</w:t>
+        <w:br/>
+      </w:r>
+      <w:r>
+        <w:rPr>
+          <w:rFonts w:ascii="Arial" w:hAnsi="Arial"/>
+          <w:color w:val="282828"/>
+          <w:sz w:val="19"/>
+        </w:rPr>
+        <w:t>👉 Answer: Perplexity is undefined across differing vocabularies because it measures uncertainty per token. A model predicting over 32,000 classes has an inherently different probability scale than a byte model predicting over 256 classes. Bits-Per-Byte (BPB) is an information-theoretic invariant that measures the exact Shannon entropy bits required to compress one UTF-8 byte of text: BPB = (Loss / ln(2)) * (N_tokens / N_bytes). It provides a mathematically rigorous, unbiased comparison.</w:t>
+      </w:r>
     </w:p>
-    <w:tbl>
-      <w:tblPr>
-        <w:tblW w:type="auto" w:w="0"/>
-        <w:jc w:val="center"/>
-        <w:tblLayout w:type="fixed"/>
-        <w:tblLook w:firstColumn="1" w:firstRow="1" w:lastColumn="0" w:lastRow="0" w:noHBand="0" w:noVBand="1" w:val="04A0"/>
-      </w:tblPr>
-      <w:tblGrid>
-        <w:gridCol w:w="9360"/>
-      </w:tblGrid>
-      <w:tr>
-        <w:tc>
-          <w:tcPr>
-            <w:tcW w:type="dxa" w:w="10224"/>
-            <w:shd w:fill="F4F7FB"/>
-            <w:tcMar>
-              <w:top w:w="140" w:type="dxa"/>
-              <w:bottom w:w="140" w:type="dxa"/>
-              <w:left w:w="180" w:type="dxa"/>
-              <w:right w:w="180" w:type="dxa"/>
-            </w:tcMar>
-          </w:tcPr>
-          <w:p>
-            <w:pPr>
-              <w:spacing w:before="0" w:after="40" w:line="276" w:lineRule="auto"/>
-            </w:pPr>
-            <w:r>
-              <w:rPr>
-                <w:rFonts w:ascii="Arial" w:hAnsi="Arial"/>
-                <w:b/>
-                <w:color w:val="1B365D"/>
-                <w:sz w:val="22"/>
-              </w:rPr>
-              <w:t>SLIDE 7: HEBBIAN FAST WEIGHTS &amp; ANTI-HOPFIELD SYNAPTIC ENGRAMS</w:t>
-              <w:br/>
-            </w:r>
-          </w:p>
-          <w:p>
-            <w:pPr>
-              <w:spacing w:after="40" w:line="276" w:lineRule="auto"/>
-            </w:pPr>
-            <w:r>
-              <w:rPr>
-                <w:b/>
-                <w:color w:val="8A3B14"/>
-                <w:sz w:val="19"/>
-              </w:rPr>
-              <w:t xml:space="preserve">👁️ What the audience sees: </w:t>
-            </w:r>
-            <w:r>
-              <w:rPr>
-                <w:sz w:val="19"/>
-              </w:rPr>
-              <w:t>Figure 5 diagram showing the dual-memory neural flow and 1-shot Hebbian matrix.</w:t>
-            </w:r>
-          </w:p>
-          <w:p>
-            <w:pPr>
-              <w:spacing w:after="40" w:line="276" w:lineRule="auto"/>
-            </w:pPr>
-            <w:r>
-              <w:rPr>
-                <w:b/>
-                <w:color w:val="0F5132"/>
-                <w:sz w:val="19"/>
-              </w:rPr>
-              <w:t xml:space="preserve">💡 Core Idea to Remember: </w:t>
-            </w:r>
-            <w:r>
-              <w:rPr>
-                <w:sz w:val="19"/>
-              </w:rPr>
-              <w:t>New facts are written into a special memory matrix (M) in 0.01 seconds without running slow backpropagation.</w:t>
-            </w:r>
-          </w:p>
-          <w:p>
-            <w:pPr>
-              <w:spacing w:after="40" w:line="276" w:lineRule="auto"/>
-            </w:pPr>
-            <w:r>
-              <w:rPr>
-                <w:b/>
-                <w:color w:val="5C3B00"/>
-                <w:sz w:val="19"/>
-              </w:rPr>
-              <w:t xml:space="preserve">🍎 Simple Analogy: </w:t>
-            </w:r>
-            <w:r>
-              <w:rPr>
-                <w:sz w:val="19"/>
-              </w:rPr>
-              <w:t>Taking a instant Polaroid photo of a fact and pinning it to a corkboard in 0.01 seconds.</w:t>
-            </w:r>
-          </w:p>
-          <w:p>
-            <w:pPr>
-              <w:spacing w:before="80" w:after="40" w:line="276" w:lineRule="auto"/>
-            </w:pPr>
-            <w:r>
-              <w:rPr>
-                <w:b/>
-                <w:color w:val="0D6EFD"/>
-                <w:sz w:val="19"/>
-              </w:rPr>
-              <w:t>🎙️ EXACT WORDS TO SAY OUT LOUD:</w:t>
-              <w:br/>
-            </w:r>
-            <w:r>
-              <w:rPr>
-                <w:i/>
-                <w:color w:val="141414"/>
-                <w:sz w:val="19"/>
-              </w:rPr>
-              <w:t>"When a user teaches Hayyuu a new fact, it writes the information into a Hebbian fast weight matrix in just 0.01 seconds using an anti-Hopfield outer-product update. This completely avoids gradient updates to the main model, achieving 100% immediate factual recall with zero linguistic interference."</w:t>
-            </w:r>
-          </w:p>
-        </w:tc>
-      </w:tr>
-    </w:tbl>
     <w:p>
       <w:pPr>
-        <w:spacing w:after="120"/>
+        <w:spacing w:before="80" w:after="80" w:line="276" w:lineRule="auto"/>
       </w:pPr>
+      <w:r>
+        <w:rPr>
+          <w:rFonts w:ascii="Arial" w:hAnsi="Arial"/>
+          <w:b/>
+          <w:color w:val="1B365D"/>
+          <w:sz w:val="19"/>
+        </w:rPr>
+        <w:t>Q4: How does your Hebbian Engram memory architecture prevent Catastrophic Forgetting during live deployment?</w:t>
+        <w:br/>
+      </w:r>
+      <w:r>
+        <w:rPr>
+          <w:rFonts w:ascii="Arial" w:hAnsi="Arial"/>
+          <w:color w:val="282828"/>
+          <w:sz w:val="19"/>
+        </w:rPr>
+        <w:t>👉 Answer: Traditional fine-tuning uses gradient backpropagation, which alters global network weights and causes catastrophic forgetting. We implement a Complementary Learning System (CLS): new facts are written in 0.01s to a dedicated Hebbian fast weight matrix (M) using anti-Hopfield outer product updates without touching the slow Mamba backbone. During offline sleep cycles, these facts are replayed with background replay anchors, permanently transferring memory without linguistic drift.</w:t>
+      </w:r>
     </w:p>
-    <w:tbl>
-      <w:tblPr>
-        <w:tblW w:type="auto" w:w="0"/>
-        <w:jc w:val="center"/>
-        <w:tblLayout w:type="fixed"/>
-        <w:tblLook w:firstColumn="1" w:firstRow="1" w:lastColumn="0" w:lastRow="0" w:noHBand="0" w:noVBand="1" w:val="04A0"/>
-      </w:tblPr>
-      <w:tblGrid>
-        <w:gridCol w:w="9360"/>
-      </w:tblGrid>
-      <w:tr>
-        <w:tc>
-          <w:tcPr>
-            <w:tcW w:type="dxa" w:w="10224"/>
-            <w:shd w:fill="F4F7FB"/>
-            <w:tcMar>
-              <w:top w:w="140" w:type="dxa"/>
-              <w:bottom w:w="140" w:type="dxa"/>
-              <w:left w:w="180" w:type="dxa"/>
-              <w:right w:w="180" w:type="dxa"/>
-            </w:tcMar>
-          </w:tcPr>
-          <w:p>
-            <w:pPr>
-              <w:spacing w:before="0" w:after="40" w:line="276" w:lineRule="auto"/>
-            </w:pPr>
-            <w:r>
-              <w:rPr>
-                <w:rFonts w:ascii="Arial" w:hAnsi="Arial"/>
-                <w:b/>
-                <w:color w:val="1B365D"/>
-                <w:sz w:val="22"/>
-              </w:rPr>
-              <w:t>SLIDE 8: OFFLINE SLEEP CONSOLIDATION: SHARP-WAVE RIPPLE REPLAY</w:t>
-              <w:br/>
-            </w:r>
-          </w:p>
-          <w:p>
-            <w:pPr>
-              <w:spacing w:after="40" w:line="276" w:lineRule="auto"/>
-            </w:pPr>
-            <w:r>
-              <w:rPr>
-                <w:b/>
-                <w:color w:val="8A3B14"/>
-                <w:sz w:val="19"/>
-              </w:rPr>
-              <w:t xml:space="preserve">👁️ What the audience sees: </w:t>
-            </w:r>
-            <w:r>
-              <w:rPr>
-                <w:sz w:val="19"/>
-              </w:rPr>
-              <w:t>Figure 3 chart showing grammar retention staying at 100% after sleep consolidation.</w:t>
-            </w:r>
-          </w:p>
-          <w:p>
-            <w:pPr>
-              <w:spacing w:after="40" w:line="276" w:lineRule="auto"/>
-            </w:pPr>
-            <w:r>
-              <w:rPr>
-                <w:b/>
-                <w:color w:val="0F5132"/>
-                <w:sz w:val="19"/>
-              </w:rPr>
-              <w:t xml:space="preserve">💡 Core Idea to Remember: </w:t>
-            </w:r>
-            <w:r>
-              <w:rPr>
-                <w:sz w:val="19"/>
-              </w:rPr>
-              <w:t>Every 30 rounds, the AI takes a sleep break and replays daytime memories 20x faster into its permanent neural weights.</w:t>
-            </w:r>
-          </w:p>
-          <w:p>
-            <w:pPr>
-              <w:spacing w:after="40" w:line="276" w:lineRule="auto"/>
-            </w:pPr>
-            <w:r>
-              <w:rPr>
-                <w:b/>
-                <w:color w:val="5C3B00"/>
-                <w:sz w:val="19"/>
-              </w:rPr>
-              <w:t xml:space="preserve">🍎 Simple Analogy: </w:t>
-            </w:r>
-            <w:r>
-              <w:rPr>
-                <w:sz w:val="19"/>
-              </w:rPr>
-              <w:t>Studying flashcards during the day, and while you sleep at night, your brain moves those memories into long-term storage.</w:t>
-            </w:r>
-          </w:p>
-          <w:p>
-            <w:pPr>
-              <w:spacing w:before="80" w:after="40" w:line="276" w:lineRule="auto"/>
-            </w:pPr>
-            <w:r>
-              <w:rPr>
-                <w:b/>
-                <w:color w:val="0D6EFD"/>
-                <w:sz w:val="19"/>
-              </w:rPr>
-              <w:t>🎙️ EXACT WORDS TO SAY OUT LOUD:</w:t>
-              <w:br/>
-            </w:r>
-            <w:r>
-              <w:rPr>
-                <w:i/>
-                <w:color w:val="141414"/>
-                <w:sz w:val="19"/>
-              </w:rPr>
-              <w:t>"Just like biological brains, our model enters an offline sleep cycle every 30 rounds. During sleep, it replays its daytime memories at 20 times speed alongside foundational anchor buffers. As you can see in Figure 3, this permanently bakes the new facts into the Mamba weights while maintaining 100% grammar retention."</w:t>
-            </w:r>
-          </w:p>
-        </w:tc>
-      </w:tr>
-    </w:tbl>
     <w:p>
       <w:pPr>
-        <w:spacing w:after="120"/>
+        <w:spacing w:before="80" w:after="80" w:line="276" w:lineRule="auto"/>
       </w:pPr>
-    </w:p>
-    <w:tbl>
-      <w:tblPr>
-        <w:tblW w:type="auto" w:w="0"/>
-        <w:jc w:val="center"/>
-        <w:tblLayout w:type="fixed"/>
-        <w:tblLook w:firstColumn="1" w:firstRow="1" w:lastColumn="0" w:lastRow="0" w:noHBand="0" w:noVBand="1" w:val="04A0"/>
-      </w:tblPr>
-      <w:tblGrid>
-        <w:gridCol w:w="9360"/>
-      </w:tblGrid>
-      <w:tr>
-        <w:tc>
-          <w:tcPr>
-            <w:tcW w:type="dxa" w:w="10224"/>
-            <w:shd w:fill="F4F7FB"/>
-            <w:tcMar>
-              <w:top w:w="140" w:type="dxa"/>
-              <w:bottom w:w="140" w:type="dxa"/>
-              <w:left w:w="180" w:type="dxa"/>
-              <w:right w:w="180" w:type="dxa"/>
-            </w:tcMar>
-          </w:tcPr>
-          <w:p>
-            <w:pPr>
-              <w:spacing w:before="0" w:after="40" w:line="276" w:lineRule="auto"/>
-            </w:pPr>
-            <w:r>
-              <w:rPr>
-                <w:rFonts w:ascii="Arial" w:hAnsi="Arial"/>
-                <w:b/>
-                <w:color w:val="1B365D"/>
-                <w:sz w:val="22"/>
-              </w:rPr>
-              <w:t>SLIDE 9: HAYYUU: AUTONOMOUS LIVING CONVERSATIONAL AGENT</w:t>
-              <w:br/>
-            </w:r>
-          </w:p>
-          <w:p>
-            <w:pPr>
-              <w:spacing w:after="40" w:line="276" w:lineRule="auto"/>
-            </w:pPr>
-            <w:r>
-              <w:rPr>
-                <w:b/>
-                <w:color w:val="8A3B14"/>
-                <w:sz w:val="19"/>
-              </w:rPr>
-              <w:t xml:space="preserve">👁️ What the audience sees: </w:t>
-            </w:r>
-            <w:r>
-              <w:rPr>
-                <w:sz w:val="19"/>
-              </w:rPr>
-              <w:t>Figure 4 SFT convergence curve and Telegram bot deployment overview.</w:t>
-            </w:r>
-          </w:p>
-          <w:p>
-            <w:pPr>
-              <w:spacing w:after="40" w:line="276" w:lineRule="auto"/>
-            </w:pPr>
-            <w:r>
-              <w:rPr>
-                <w:b/>
-                <w:color w:val="0F5132"/>
-                <w:sz w:val="19"/>
-              </w:rPr>
-              <w:t xml:space="preserve">💡 Core Idea to Remember: </w:t>
-            </w:r>
-            <w:r>
-              <w:rPr>
-                <w:sz w:val="19"/>
-              </w:rPr>
-              <w:t>We fine-tuned the model on 4,359 high-quality Amharic Q&amp;A pairs (dropping loss to 0.695 BPB) and launched Hayyuu live on Telegram.</w:t>
-            </w:r>
-          </w:p>
-          <w:p>
-            <w:pPr>
-              <w:spacing w:after="40" w:line="276" w:lineRule="auto"/>
-            </w:pPr>
-            <w:r>
-              <w:rPr>
-                <w:b/>
-                <w:color w:val="5C3B00"/>
-                <w:sz w:val="19"/>
-              </w:rPr>
-              <w:t xml:space="preserve">🍎 Simple Analogy: </w:t>
-            </w:r>
-            <w:r>
-              <w:rPr>
-                <w:sz w:val="19"/>
-              </w:rPr>
-              <w:t>Taking our smart student through graduation school so it learns how to politely answer questions on Ethiopian history, culture, and science.</w:t>
-            </w:r>
-          </w:p>
-          <w:p>
-            <w:pPr>
-              <w:spacing w:before="80" w:after="40" w:line="276" w:lineRule="auto"/>
-            </w:pPr>
-            <w:r>
-              <w:rPr>
-                <w:b/>
-                <w:color w:val="0D6EFD"/>
-                <w:sz w:val="19"/>
-              </w:rPr>
-              <w:t>🎙️ EXACT WORDS TO SAY OUT LOUD:</w:t>
-              <w:br/>
-            </w:r>
-            <w:r>
-              <w:rPr>
-                <w:i/>
-                <w:color w:val="141414"/>
-                <w:sz w:val="19"/>
-              </w:rPr>
-              <w:t>"We aligned our pre-trained model into a helpful conversational assistant named Hayyuu by fine-tuning on 4,359 native Amharic instruction pairs. Figure 4 shows the rapid SFT convergence down to 0.695 BPB. We then connected Hayyuu to Telegram with dual-candidate RLHF feedback and an autonomous 24/7 self-teaching teacher."</w:t>
-            </w:r>
-          </w:p>
-        </w:tc>
-      </w:tr>
-    </w:tbl>
-    <w:p>
-      <w:pPr>
-        <w:spacing w:after="120"/>
-      </w:pPr>
-    </w:p>
-    <w:tbl>
-      <w:tblPr>
-        <w:tblW w:type="auto" w:w="0"/>
-        <w:jc w:val="center"/>
-        <w:tblLayout w:type="fixed"/>
-        <w:tblLook w:firstColumn="1" w:firstRow="1" w:lastColumn="0" w:lastRow="0" w:noHBand="0" w:noVBand="1" w:val="04A0"/>
-      </w:tblPr>
-      <w:tblGrid>
-        <w:gridCol w:w="9360"/>
-      </w:tblGrid>
-      <w:tr>
-        <w:tc>
-          <w:tcPr>
-            <w:tcW w:type="dxa" w:w="10224"/>
-            <w:shd w:fill="F4F7FB"/>
-            <w:tcMar>
-              <w:top w:w="140" w:type="dxa"/>
-              <w:bottom w:w="140" w:type="dxa"/>
-              <w:left w:w="180" w:type="dxa"/>
-              <w:right w:w="180" w:type="dxa"/>
-            </w:tcMar>
-          </w:tcPr>
-          <w:p>
-            <w:pPr>
-              <w:spacing w:before="0" w:after="40" w:line="276" w:lineRule="auto"/>
-            </w:pPr>
-            <w:r>
-              <w:rPr>
-                <w:rFonts w:ascii="Arial" w:hAnsi="Arial"/>
-                <w:b/>
-                <w:color w:val="1B365D"/>
-                <w:sz w:val="22"/>
-              </w:rPr>
-              <w:t>SLIDE 10: LIVE DEMONSTRATION: AMHARIC REASONING &amp; IDENTITY</w:t>
-              <w:br/>
-            </w:r>
-          </w:p>
-          <w:p>
-            <w:pPr>
-              <w:spacing w:after="40" w:line="276" w:lineRule="auto"/>
-            </w:pPr>
-            <w:r>
-              <w:rPr>
-                <w:b/>
-                <w:color w:val="8A3B14"/>
-                <w:sz w:val="19"/>
-              </w:rPr>
-              <w:t xml:space="preserve">👁️ What the audience sees: </w:t>
-            </w:r>
-            <w:r>
-              <w:rPr>
-                <w:sz w:val="19"/>
-              </w:rPr>
-              <w:t>2 Cards with real Amharic conversation prompts on History, AI, Culture, and Identity.</w:t>
-            </w:r>
-          </w:p>
-          <w:p>
-            <w:pPr>
-              <w:spacing w:after="40" w:line="276" w:lineRule="auto"/>
-            </w:pPr>
-            <w:r>
-              <w:rPr>
-                <w:b/>
-                <w:color w:val="0F5132"/>
-                <w:sz w:val="19"/>
-              </w:rPr>
-              <w:t xml:space="preserve">💡 Core Idea to Remember: </w:t>
-            </w:r>
-            <w:r>
-              <w:rPr>
-                <w:sz w:val="19"/>
-              </w:rPr>
-              <w:t>Show real examples of Hayyuu answering questions accurately: It knows who created it (Beknan Chemeda), where Axum is, and what AI means in pure Amharic.</w:t>
-            </w:r>
-          </w:p>
-          <w:p>
-            <w:pPr>
-              <w:spacing w:after="40" w:line="276" w:lineRule="auto"/>
-            </w:pPr>
-            <w:r>
-              <w:rPr>
-                <w:b/>
-                <w:color w:val="5C3B00"/>
-                <w:sz w:val="19"/>
-              </w:rPr>
-              <w:t xml:space="preserve">🍎 Simple Analogy: </w:t>
-            </w:r>
-            <w:r>
-              <w:rPr>
-                <w:sz w:val="19"/>
-              </w:rPr>
-              <w:t>Showing the robot speaking fluent Amharic in front of the classroom.</w:t>
-            </w:r>
-          </w:p>
-          <w:p>
-            <w:pPr>
-              <w:spacing w:before="80" w:after="40" w:line="276" w:lineRule="auto"/>
-            </w:pPr>
-            <w:r>
-              <w:rPr>
-                <w:b/>
-                <w:color w:val="0D6EFD"/>
-                <w:sz w:val="19"/>
-              </w:rPr>
-              <w:t>🎙️ EXACT WORDS TO SAY OUT LOUD:</w:t>
-              <w:br/>
-            </w:r>
-            <w:r>
-              <w:rPr>
-                <w:i/>
-                <w:color w:val="141414"/>
-                <w:sz w:val="19"/>
-              </w:rPr>
-              <w:t>"Here are sample outputs from Hayyuu. When asked 'Who created you?', it correctly identifies its creator, Beknan Chemeda. When asked about Ethiopian history like the Obelisk of Axum or modern science like Artificial Intelligence, it generates fluent, grammatically accurate Amharic responses."</w:t>
-            </w:r>
-          </w:p>
-        </w:tc>
-      </w:tr>
-    </w:tbl>
-    <w:p>
-      <w:pPr>
-        <w:spacing w:after="120"/>
-      </w:pPr>
-    </w:p>
-    <w:tbl>
-      <w:tblPr>
-        <w:tblW w:type="auto" w:w="0"/>
-        <w:jc w:val="center"/>
-        <w:tblLayout w:type="fixed"/>
-        <w:tblLook w:firstColumn="1" w:firstRow="1" w:lastColumn="0" w:lastRow="0" w:noHBand="0" w:noVBand="1" w:val="04A0"/>
-      </w:tblPr>
-      <w:tblGrid>
-        <w:gridCol w:w="9360"/>
-      </w:tblGrid>
-      <w:tr>
-        <w:tc>
-          <w:tcPr>
-            <w:tcW w:type="dxa" w:w="10224"/>
-            <w:shd w:fill="F4F7FB"/>
-            <w:tcMar>
-              <w:top w:w="140" w:type="dxa"/>
-              <w:bottom w:w="140" w:type="dxa"/>
-              <w:left w:w="180" w:type="dxa"/>
-              <w:right w:w="180" w:type="dxa"/>
-            </w:tcMar>
-          </w:tcPr>
-          <w:p>
-            <w:pPr>
-              <w:spacing w:before="0" w:after="40" w:line="276" w:lineRule="auto"/>
-            </w:pPr>
-            <w:r>
-              <w:rPr>
-                <w:rFonts w:ascii="Arial" w:hAnsi="Arial"/>
-                <w:b/>
-                <w:color w:val="1B365D"/>
-                <w:sz w:val="22"/>
-              </w:rPr>
-              <w:t>SLIDE 11: SUMMARY OF CONTRIBUTIONS &amp; GLOBAL IMPACT</w:t>
-              <w:br/>
-            </w:r>
-          </w:p>
-          <w:p>
-            <w:pPr>
-              <w:spacing w:after="40" w:line="276" w:lineRule="auto"/>
-            </w:pPr>
-            <w:r>
-              <w:rPr>
-                <w:b/>
-                <w:color w:val="8A3B14"/>
-                <w:sz w:val="19"/>
-              </w:rPr>
-              <w:t xml:space="preserve">👁️ What the audience sees: </w:t>
-            </w:r>
-            <w:r>
-              <w:rPr>
-                <w:sz w:val="19"/>
-              </w:rPr>
-              <w:t>3 Green summary cards: (1) Token-Free Efficiency, (2) Zero-Forgetting CLS, (3) Sovereign Ethiopian AI.</w:t>
-            </w:r>
-          </w:p>
-          <w:p>
-            <w:pPr>
-              <w:spacing w:after="40" w:line="276" w:lineRule="auto"/>
-            </w:pPr>
-            <w:r>
-              <w:rPr>
-                <w:b/>
-                <w:color w:val="0F5132"/>
-                <w:sz w:val="19"/>
-              </w:rPr>
-              <w:t xml:space="preserve">💡 Core Idea to Remember: </w:t>
-            </w:r>
-            <w:r>
-              <w:rPr>
-                <w:sz w:val="19"/>
-              </w:rPr>
-              <w:t>Wrap up with the 3 big wins: No token tax, no forgetting, and proving that African AI can run on a single affordable GPU.</w:t>
-            </w:r>
-          </w:p>
-          <w:p>
-            <w:pPr>
-              <w:spacing w:after="40" w:line="276" w:lineRule="auto"/>
-            </w:pPr>
-            <w:r>
-              <w:rPr>
-                <w:b/>
-                <w:color w:val="5C3B00"/>
-                <w:sz w:val="19"/>
-              </w:rPr>
-              <w:t xml:space="preserve">🍎 Simple Analogy: </w:t>
-            </w:r>
-            <w:r>
-              <w:rPr>
-                <w:sz w:val="19"/>
-              </w:rPr>
-              <w:t>Proving that smart engineering beats expensive supercomputers.</w:t>
-            </w:r>
-          </w:p>
-          <w:p>
-            <w:pPr>
-              <w:spacing w:before="80" w:after="40" w:line="276" w:lineRule="auto"/>
-            </w:pPr>
-            <w:r>
-              <w:rPr>
-                <w:b/>
-                <w:color w:val="0D6EFD"/>
-                <w:sz w:val="19"/>
-              </w:rPr>
-              <w:t>🎙️ EXACT WORDS TO SAY OUT LOUD:</w:t>
-              <w:br/>
-            </w:r>
-            <w:r>
-              <w:rPr>
-                <w:i/>
-                <w:color w:val="141414"/>
-                <w:sz w:val="19"/>
-              </w:rPr>
-              <w:t>"In conclusion, this research makes three major contributions: First, we eliminated the Token Tax for African languages using byte-level Mamba. Second, we solved catastrophic forgetting using a brain-inspired dual-memory architecture. Third, we proved that sovereign, high-performance generative AI can be trained on a single affordable graphics card right here in Ethiopia."</w:t>
-            </w:r>
-          </w:p>
-        </w:tc>
-      </w:tr>
-    </w:tbl>
-    <w:p>
-      <w:pPr>
-        <w:spacing w:after="120"/>
-      </w:pPr>
-    </w:p>
-    <w:tbl>
-      <w:tblPr>
-        <w:tblW w:type="auto" w:w="0"/>
-        <w:jc w:val="center"/>
-        <w:tblLayout w:type="fixed"/>
-        <w:tblLook w:firstColumn="1" w:firstRow="1" w:lastColumn="0" w:lastRow="0" w:noHBand="0" w:noVBand="1" w:val="04A0"/>
-      </w:tblPr>
-      <w:tblGrid>
-        <w:gridCol w:w="9360"/>
-      </w:tblGrid>
-      <w:tr>
-        <w:tc>
-          <w:tcPr>
-            <w:tcW w:type="dxa" w:w="10224"/>
-            <w:shd w:fill="F4F7FB"/>
-            <w:tcMar>
-              <w:top w:w="140" w:type="dxa"/>
-              <w:bottom w:w="140" w:type="dxa"/>
-              <w:left w:w="180" w:type="dxa"/>
-              <w:right w:w="180" w:type="dxa"/>
-            </w:tcMar>
-          </w:tcPr>
-          <w:p>
-            <w:pPr>
-              <w:spacing w:before="0" w:after="40" w:line="276" w:lineRule="auto"/>
-            </w:pPr>
-            <w:r>
-              <w:rPr>
-                <w:rFonts w:ascii="Arial" w:hAnsi="Arial"/>
-                <w:b/>
-                <w:color w:val="1B365D"/>
-                <w:sz w:val="22"/>
-              </w:rPr>
-              <w:t>SLIDE 12: CLOSING / Q&amp;A DEFENSE</w:t>
-              <w:br/>
-            </w:r>
-          </w:p>
-          <w:p>
-            <w:pPr>
-              <w:spacing w:after="40" w:line="276" w:lineRule="auto"/>
-            </w:pPr>
-            <w:r>
-              <w:rPr>
-                <w:b/>
-                <w:color w:val="8A3B14"/>
-                <w:sz w:val="19"/>
-              </w:rPr>
-              <w:t xml:space="preserve">👁️ What the audience sees: </w:t>
-            </w:r>
-            <w:r>
-              <w:rPr>
-                <w:sz w:val="19"/>
-              </w:rPr>
-              <w:t>Dark navy closing screen with 'THANK YOU!', Questions &amp; Discussion, and repository links.</w:t>
-            </w:r>
-          </w:p>
-          <w:p>
-            <w:pPr>
-              <w:spacing w:after="40" w:line="276" w:lineRule="auto"/>
-            </w:pPr>
-            <w:r>
-              <w:rPr>
-                <w:b/>
-                <w:color w:val="0F5132"/>
-                <w:sz w:val="19"/>
-              </w:rPr>
-              <w:t xml:space="preserve">💡 Core Idea to Remember: </w:t>
-            </w:r>
-            <w:r>
-              <w:rPr>
-                <w:sz w:val="19"/>
-              </w:rPr>
-              <w:t>Thank the audience with a smile and invite questions. You know all the answers!</w:t>
-            </w:r>
-          </w:p>
-          <w:p>
-            <w:pPr>
-              <w:spacing w:after="40" w:line="276" w:lineRule="auto"/>
-            </w:pPr>
-            <w:r>
-              <w:rPr>
-                <w:b/>
-                <w:color w:val="5C3B00"/>
-                <w:sz w:val="19"/>
-              </w:rPr>
-              <w:t xml:space="preserve">🍎 Simple Analogy: </w:t>
-            </w:r>
-            <w:r>
-              <w:rPr>
-                <w:sz w:val="19"/>
-              </w:rPr>
-              <w:t>Crossing the finish line after a perfect presentation.</w:t>
-            </w:r>
-          </w:p>
-          <w:p>
-            <w:pPr>
-              <w:spacing w:before="80" w:after="40" w:line="276" w:lineRule="auto"/>
-            </w:pPr>
-            <w:r>
-              <w:rPr>
-                <w:b/>
-                <w:color w:val="0D6EFD"/>
-                <w:sz w:val="19"/>
-              </w:rPr>
-              <w:t>🎙️ EXACT WORDS TO SAY OUT LOUD:</w:t>
-              <w:br/>
-            </w:r>
-            <w:r>
-              <w:rPr>
-                <w:i/>
-                <w:color w:val="141414"/>
-                <w:sz w:val="19"/>
-              </w:rPr>
-              <w:t>"Thank you very much for your time and attention. I am now happy to answer any questions!"</w:t>
-            </w:r>
-          </w:p>
-        </w:tc>
-      </w:tr>
-    </w:tbl>
-    <w:p>
-      <w:pPr>
-        <w:spacing w:after="120"/>
-      </w:pPr>
+      <w:r>
+        <w:rPr>
+          <w:rFonts w:ascii="Arial" w:hAnsi="Arial"/>
+          <w:b/>
+          <w:color w:val="1B365D"/>
+          <w:sz w:val="19"/>
+        </w:rPr>
+        <w:t>Q5: What is the broader impact of this research for Ethiopian AI sovereignty?</w:t>
+        <w:br/>
+      </w:r>
+      <w:r>
+        <w:rPr>
+          <w:rFonts w:ascii="Arial" w:hAnsi="Arial"/>
+          <w:color w:val="282828"/>
+          <w:sz w:val="19"/>
+        </w:rPr>
+        <w:t>👉 Answer: This work proves that state-of-the-art AI for low-resource African languages does not require multi-billion-parameter clusters or billions of dollars. By eliminating tokenizers and adopting linear State Space Models with bio-inspired memory, highly capable generative AI can be trained on a single commodity GPU (Nvidia RTX 3090) within a few hours on native datasets.</w:t>
+      </w:r>
     </w:p>
     <w:sectPr>
       <w:pgSz w:w="12240" w:h="15840"/>

</xml_diff>

<commit_message>
Generate Ultimate Master Presentation Guide uniting ML engineering depth with 4th-grade clarity
</commit_message>
<xml_diff>
--- a/AMHARIC_MAMBA_PRESENTATION_MASTER_GUIDE.docx
+++ b/AMHARIC_MAMBA_PRESENTATION_MASTER_GUIDE.docx
@@ -12,9 +12,9 @@
           <w:rFonts w:ascii="Arial" w:hAnsi="Arial"/>
           <w:b/>
           <w:color w:val="1B365D"/>
-          <w:sz w:val="34"/>
+          <w:sz w:val="32"/>
         </w:rPr>
-        <w:t>MASTER PRESENTATION RESEARCH &amp; DEFENSE GUIDE</w:t>
+        <w:t>THE ULTIMATE MASTER PRESENTATION RESEARCH GUIDE</w:t>
       </w:r>
     </w:p>
     <w:p>
@@ -27,14 +27,14 @@
           <w:rFonts w:ascii="Arial" w:hAnsi="Arial"/>
           <w:b/>
           <w:color w:val="4A607A"/>
-          <w:sz w:val="22"/>
+          <w:sz w:val="21"/>
         </w:rPr>
-        <w:t>Byte-Level Mamba vs. Transformer for Amharic with Brain-Inspired Continual Learning (Hayyuu)</w:t>
+        <w:t>Deep Professional ML Engineering Rigor Explained with Crystal-Clear 4th-Grade Intuition</w:t>
       </w:r>
     </w:p>
     <w:p>
       <w:pPr>
-        <w:spacing w:after="240"/>
+        <w:spacing w:after="200"/>
         <w:jc w:val="center"/>
       </w:pPr>
       <w:r>
@@ -44,18 +44,9 @@
           <w:color w:val="5A5A5A"/>
           <w:sz w:val="19"/>
         </w:rPr>
-        <w:t>Presenter &amp; Author: Beknan Chemeda  |  Project: Data- &amp; Compute-Efficient Generative AI</w:t>
+        <w:t>Presenter &amp; Author: Beknan Chemeda  |  Project: Amharic Byte Mamba &amp; Hayyuu AI</w:t>
         <w:br/>
         <w:t>Repository: https://github.com/BekiChemeda/ML-Research</w:t>
-      </w:r>
-    </w:p>
-    <w:p>
-      <w:pPr>
-        <w:pStyle w:val="Heading1"/>
-        <w:spacing w:before="200" w:after="80"/>
-      </w:pPr>
-      <w:r>
-        <w:t>1. Executive Summary &amp; Core Research Thesis</w:t>
       </w:r>
     </w:p>
     <w:tbl>
@@ -66,40 +57,104 @@
         <w:tblLook w:firstColumn="1" w:firstRow="1" w:lastColumn="0" w:lastRow="0" w:noHBand="0" w:noVBand="1" w:val="04A0"/>
       </w:tblPr>
       <w:tblGrid>
-        <w:gridCol w:w="9360"/>
+        <w:gridCol w:w="9504"/>
       </w:tblGrid>
       <w:tr>
         <w:tc>
           <w:tcPr>
-            <w:tcW w:type="dxa" w:w="10224"/>
-            <w:shd w:fill="F0F4F8"/>
+            <w:tcW w:type="dxa" w:w="10368"/>
+            <w:shd w:fill="F8FAFC"/>
             <w:tcMar>
               <w:top w:w="140" w:type="dxa"/>
               <w:bottom w:w="140" w:type="dxa"/>
-              <w:left w:w="200" w:type="dxa"/>
-              <w:right w:w="200" w:type="dxa"/>
+              <w:left w:w="180" w:type="dxa"/>
+              <w:right w:w="180" w:type="dxa"/>
             </w:tcMar>
           </w:tcPr>
           <w:p>
             <w:pPr>
-              <w:spacing w:before="40" w:after="40" w:line="276" w:lineRule="auto"/>
+              <w:spacing w:before="0" w:after="40" w:line="276" w:lineRule="auto"/>
             </w:pPr>
             <w:r>
               <w:rPr>
                 <w:rFonts w:ascii="Arial" w:hAnsi="Arial"/>
                 <w:b/>
                 <w:color w:val="1B365D"/>
-                <w:sz w:val="20"/>
+                <w:sz w:val="22"/>
               </w:rPr>
-              <w:t xml:space="preserve">💡 CORE RESEARCH THESIS: </w:t>
+              <w:t>TOPIC 1: THE EXACT OBJECTIVE OF THE RESEARCH</w:t>
+              <w:br/>
             </w:r>
             <w:r>
               <w:rPr>
                 <w:rFonts w:ascii="Arial" w:hAnsi="Arial"/>
+                <w:i/>
+                <w:color w:val="64748B"/>
+                <w:sz w:val="19"/>
+              </w:rPr>
+              <w:t>What did we set out to prove, and why does this matter for Ethiopia?</w:t>
+            </w:r>
+          </w:p>
+          <w:p>
+            <w:pPr>
+              <w:spacing w:before="80" w:after="40" w:line="276" w:lineRule="auto"/>
+            </w:pPr>
+            <w:r>
+              <w:rPr>
+                <w:b/>
+                <w:color w:val="D97706"/>
+                <w:sz w:val="19"/>
+              </w:rPr>
+              <w:t>🎒 Grade-4 Intuitive Story (The Simple Picture):</w:t>
+              <w:br/>
+            </w:r>
+            <w:r>
+              <w:rPr>
+                <w:sz w:val="19"/>
+              </w:rPr>
+              <w:t>Big AI companies spend billions of dollars building giant English robots. But for Amharic, we have very few books online, and normal AI breaks Amharic words into puzzle pieces. Our goal was to prove that we can build a fast, super-smart Amharic AI on a regular computer graphics card (RTX 3090) that learns raw numbers directly and never forgets what it learned.</w:t>
+            </w:r>
+          </w:p>
+          <w:p>
+            <w:pPr>
+              <w:spacing w:before="80" w:after="40" w:line="276" w:lineRule="auto"/>
+            </w:pPr>
+            <w:r>
+              <w:rPr>
+                <w:b/>
+                <w:color w:val="0F766E"/>
+                <w:sz w:val="19"/>
+              </w:rPr>
+              <w:t>🔬 Professional ML Engineer Depth (The Exact Mechanics &amp; Math):</w:t>
+              <w:br/>
+            </w:r>
+            <w:r>
+              <w:rPr>
+                <w:sz w:val="19"/>
+              </w:rPr>
+              <w:t>The objective is to establish an architectural paradigm for low-resource, morphologically complex languages by: (1) Eliminating subword tokenization (Token Tax) in favor of raw UTF-8 byte streams; (2) Overcoming quadratic self-attention O(L²) bottlenecks by deploying Selective State Space Models (Mamba) with linear O(L) associative scans; and (3) Resolving Catastrophic Forgetting via a bio-inspired Complementary Learning System (Hebbian fast weights + sleep replay).</w:t>
+            </w:r>
+          </w:p>
+          <w:p>
+            <w:pPr>
+              <w:spacing w:before="80" w:after="40" w:line="276" w:lineRule="auto"/>
+            </w:pPr>
+            <w:r>
+              <w:rPr>
+                <w:b/>
+                <w:color w:val="2563EB"/>
+                <w:sz w:val="19"/>
+              </w:rPr>
+              <w:t>🎙️ What to Say in Your Presentation:</w:t>
+              <w:br/>
+            </w:r>
+            <w:r>
+              <w:rPr>
+                <w:i/>
                 <w:color w:val="1E1E1E"/>
                 <w:sz w:val="19"/>
               </w:rPr>
-              <w:t>Modern Large Language Models (LLMs) rely heavily on subword tokenizers (e.g., Byte-Pair Encoding / SentencePiece) that charge an exorbitant 'Token Tax' on African and Semitic languages. In Amharic, standard tokenizers fragment single morphologically rich words into 7+ sub-byte pieces, driving fertility ratios up to 3.5x and trapping up to 63% of the total model parameter budget in vocabulary embedding matrices rather than neural reasoning layers. Furthermore, on long byte sequences, standard Transformers suffer from quadratic computational and memory bottlenecks O(L²). In this research, we demonstrate that by eliminating the tokenizer entirely and training directly on raw UTF-8 bytes using a Selective State Space Model (Mamba), a compact 2.73M Byte-Level Mamba model outperforms a 13.04M Transformer across 1.465 GB of clean Amharic text (1.322 vs 1.579 Bits-Per-Byte), while consuming 3x less GPU memory. Additionally, to resolve Catastrophic Forgetting during live deployment, we integrate a biological Complementary Learning System (CLS): new facts are acquired in 0.01 seconds via Hebbian fast weights, and consolidated into permanent Mamba neocortical weights during offline circadian sleep replay with 100% grammar retention.</w:t>
+              <w:t>"The objective of my research is to build a fast, token-free, and compute-efficient Generative AI for the low-resource Amharic language that eliminates the Token Tax, runs on a single commodity GPU, and continuously learns new facts without catastrophic forgetting."</w:t>
             </w:r>
           </w:p>
         </w:tc>
@@ -107,1007 +162,115 @@
     </w:tbl>
     <w:p>
       <w:pPr>
-        <w:spacing w:after="80"/>
+        <w:spacing w:after="120"/>
       </w:pPr>
-    </w:p>
-    <w:p>
-      <w:pPr>
-        <w:pStyle w:val="Heading1"/>
-        <w:spacing w:before="240" w:after="80"/>
-      </w:pPr>
-      <w:r>
-        <w:t>2. Scientific Lineage &amp; Literature Foundation</w:t>
-      </w:r>
-    </w:p>
-    <w:p>
-      <w:pPr>
-        <w:spacing w:before="60" w:after="60" w:line="276" w:lineRule="auto"/>
-      </w:pPr>
-      <w:r>
-        <w:rPr>
-          <w:rFonts w:ascii="Arial" w:hAnsi="Arial"/>
-          <w:b/>
-          <w:color w:val="1B365D"/>
-          <w:sz w:val="19"/>
-        </w:rPr>
-        <w:t xml:space="preserve">• The Amharic Data Ceiling (Andersland, 2024; Azime et al., 2024): </w:t>
-      </w:r>
-      <w:r>
-        <w:rPr>
-          <w:rFonts w:ascii="Arial" w:hAnsi="Arial"/>
-          <w:sz w:val="19"/>
-        </w:rPr>
-        <w:t>Empirical studies demonstrate that the total volume of clean, native digital Amharic text in existence is under 500 million tokens. Attempting to artificially expand data via machine translation introduces severe synthetic artifacts and syntactic degradation. Hence, low-resource African AI requires architectural data-efficiency rather than brute-force scaling.</w:t>
-      </w:r>
-    </w:p>
-    <w:p>
-      <w:pPr>
-        <w:spacing w:before="60" w:after="60" w:line="276" w:lineRule="auto"/>
-      </w:pPr>
-      <w:r>
-        <w:rPr>
-          <w:rFonts w:ascii="Arial" w:hAnsi="Arial"/>
-          <w:b/>
-          <w:color w:val="1B365D"/>
-          <w:sz w:val="19"/>
-        </w:rPr>
-        <w:t xml:space="preserve">• The Token Tax &amp; Fertility Ratio (Lundin et al., 2026; Xue et al., ByT5, 2021): </w:t>
-      </w:r>
-      <w:r>
-        <w:rPr>
-          <w:rFonts w:ascii="Arial" w:hAnsi="Arial"/>
-          <w:sz w:val="19"/>
-        </w:rPr>
-        <w:t>Standard subword tokenizers are mathematically optimized for Latin scripts. Ge'ez characters (Unicode U+1200 to U+137F) decompose into 3 raw UTF-8 bytes each. Standard tokenizers fragment Amharic text into an average of 3.5 tokens per word (Fertility = 3.5), imposing a direct 3.5x compute, memory, and inference latency surcharge on Ethiopian users. Byte-level modeling resolves this by treating the 256 byte values directly as vocabulary.</w:t>
-      </w:r>
-    </w:p>
-    <w:p>
-      <w:pPr>
-        <w:spacing w:before="60" w:after="60" w:line="276" w:lineRule="auto"/>
-      </w:pPr>
-      <w:r>
-        <w:rPr>
-          <w:rFonts w:ascii="Arial" w:hAnsi="Arial"/>
-          <w:b/>
-          <w:color w:val="1B365D"/>
-          <w:sz w:val="19"/>
-        </w:rPr>
-        <w:t xml:space="preserve">• Selective State Space Architectures (Gu &amp; Dao, Mamba, 2023; Wang et al., MambaByte, 2024): </w:t>
-      </w:r>
-      <w:r>
-        <w:rPr>
-          <w:rFonts w:ascii="Arial" w:hAnsi="Arial"/>
-          <w:sz w:val="19"/>
-        </w:rPr>
-        <w:t>Transformers suffer from quadratic self-attention complexity O(L²). Mamba replaces attention with continuous state-space recurrence discretized via zero-order hold: h'(t) = A h(t) + B x(t), y(t) = C h(t) + D x(t). Through input-dependent selection mechanisms and Chunked Associative Parallel Scans, Mamba scales linearly O(L) with constant generation memory.</w:t>
-      </w:r>
-    </w:p>
-    <w:p>
-      <w:pPr>
-        <w:spacing w:before="60" w:after="60" w:line="276" w:lineRule="auto"/>
-      </w:pPr>
-      <w:r>
-        <w:rPr>
-          <w:rFonts w:ascii="Arial" w:hAnsi="Arial"/>
-          <w:b/>
-          <w:color w:val="1B365D"/>
-          <w:sz w:val="19"/>
-        </w:rPr>
-        <w:t xml:space="preserve">• Complementary Learning Systems &amp; Sleep Replay (McClelland et al., 1995; Tononi &amp; Cirelli, 2014): </w:t>
-      </w:r>
-      <w:r>
-        <w:rPr>
-          <w:rFonts w:ascii="Arial" w:hAnsi="Arial"/>
-          <w:sz w:val="19"/>
-        </w:rPr>
-        <w:t>Biological brains avoid Catastrophic Forgetting via two coupled memory systems: a fast Hippocampus (rapid 1-shot episodic learning) and a slow Neocortex (gradual semantic generalization). During NREM sleep, Sharp-Wave Ripples replay daytime memories at 20x accelerated speed, consolidating episodic traces into neocortical circuits without disrupting prior knowledge.</w:t>
-      </w:r>
-    </w:p>
-    <w:p>
-      <w:pPr>
-        <w:pStyle w:val="Heading1"/>
-        <w:spacing w:before="240" w:after="80"/>
-      </w:pPr>
-      <w:r>
-        <w:t>3. Deep Technical Glossary: Definitions &amp; Mathematical Formulations</w:t>
-      </w:r>
-    </w:p>
-    <w:p>
-      <w:pPr>
-        <w:spacing w:before="60" w:after="60" w:line="276" w:lineRule="auto"/>
-      </w:pPr>
-      <w:r>
-        <w:rPr>
-          <w:rFonts w:ascii="Arial" w:hAnsi="Arial"/>
-          <w:b/>
-          <w:color w:val="8A3B14"/>
-          <w:sz w:val="19"/>
-        </w:rPr>
-        <w:t xml:space="preserve">📌 Bits-Per-Byte (BPB): </w:t>
-      </w:r>
-      <w:r>
-        <w:rPr>
-          <w:rFonts w:ascii="Arial" w:hAnsi="Arial"/>
-          <w:sz w:val="19"/>
-        </w:rPr>
-        <w:t>The universally invariant information-theoretic evaluation metric for language modeling. Perplexity is confounded by vocabulary size (a 32k-token model cannot be compared to a 256-byte model using perplexity). BPB normalizes cross-entropy loss by raw UTF-8 byte length: BPB = (Loss / ln(2)) * (N_tokens / N_bytes). Lower BPB strictly indicates superior model compression and prediction.</w:t>
-      </w:r>
-    </w:p>
-    <w:p>
-      <w:pPr>
-        <w:spacing w:before="60" w:after="60" w:line="276" w:lineRule="auto"/>
-      </w:pPr>
-      <w:r>
-        <w:rPr>
-          <w:rFonts w:ascii="Arial" w:hAnsi="Arial"/>
-          <w:b/>
-          <w:color w:val="8A3B14"/>
-          <w:sz w:val="19"/>
-        </w:rPr>
-        <w:t xml:space="preserve">📌 Parameter Allocation Tax (Embedding Tax): </w:t>
-      </w:r>
-      <w:r>
-        <w:rPr>
-          <w:rFonts w:ascii="Arial" w:hAnsi="Arial"/>
-          <w:sz w:val="19"/>
-        </w:rPr>
-        <w:t>The proportion of a neural network's trainable parameters dedicated exclusively to the input/output vocabulary projection matrix (V * d_model). In a 13M Transformer with 32k vocabulary, 8.19M parameters (62.8%) are consumed by embeddings. In Byte Mamba (V=256), embeddings consume &lt;2.3%, allocating 97.7% of parameters to deep hidden layers.</w:t>
-      </w:r>
-    </w:p>
-    <w:p>
-      <w:pPr>
-        <w:spacing w:before="60" w:after="60" w:line="276" w:lineRule="auto"/>
-      </w:pPr>
-      <w:r>
-        <w:rPr>
-          <w:rFonts w:ascii="Arial" w:hAnsi="Arial"/>
-          <w:b/>
-          <w:color w:val="8A3B14"/>
-          <w:sz w:val="19"/>
-        </w:rPr>
-        <w:t xml:space="preserve">📌 Selective Scan Mechanism (S6): </w:t>
-      </w:r>
-      <w:r>
-        <w:rPr>
-          <w:rFonts w:ascii="Arial" w:hAnsi="Arial"/>
-          <w:sz w:val="19"/>
-        </w:rPr>
-        <w:t>The core mathematical operator of Mamba. Unlike classical Linear Time-Invariant (LTI) state space models where matrices (A, B, C) are static, S6 projects matrices B, C, and step size Δ dynamically from the input token x_t: B_t = Linear_B(x_t), C_t = Linear_C(x_t), Δ_t = softplus(Linear_Δ(x_t)). This allows the model to selectively filter out irrelevant context and preserve salient information indefinitely.</w:t>
-      </w:r>
-    </w:p>
-    <w:p>
-      <w:pPr>
-        <w:spacing w:before="60" w:after="60" w:line="276" w:lineRule="auto"/>
-      </w:pPr>
-      <w:r>
-        <w:rPr>
-          <w:rFonts w:ascii="Arial" w:hAnsi="Arial"/>
-          <w:b/>
-          <w:color w:val="8A3B14"/>
-          <w:sz w:val="19"/>
-        </w:rPr>
-        <w:t xml:space="preserve">📌 Chunked Associative Parallel Scan: </w:t>
-      </w:r>
-      <w:r>
-        <w:rPr>
-          <w:rFonts w:ascii="Arial" w:hAnsi="Arial"/>
-          <w:sz w:val="19"/>
-        </w:rPr>
-        <w:t>The parallel algorithmic realization of Mamba recurrence. Sequences of length L are divided into contiguous chunks of size C (e.g., C=32). Within each chunk, recurrence is solved in parallel via cumulative sums (torch.cumsum) in logarithmic time, combining the parallel training speed of Transformers with the O(1) inference speed of RNNs.</w:t>
-      </w:r>
-    </w:p>
-    <w:p>
-      <w:pPr>
-        <w:spacing w:before="60" w:after="60" w:line="276" w:lineRule="auto"/>
-      </w:pPr>
-      <w:r>
-        <w:rPr>
-          <w:rFonts w:ascii="Arial" w:hAnsi="Arial"/>
-          <w:b/>
-          <w:color w:val="8A3B14"/>
-          <w:sz w:val="19"/>
-        </w:rPr>
-        <w:t xml:space="preserve">📌 Catastrophic Forgetting &amp; Stability-Plasticity Dilemma: </w:t>
-      </w:r>
-      <w:r>
-        <w:rPr>
-          <w:rFonts w:ascii="Arial" w:hAnsi="Arial"/>
-          <w:sz w:val="19"/>
-        </w:rPr>
-        <w:t>The fundamental failure mode of gradient-based neural networks where optimizing loss on new data (plasticity) causes large gradient steps that overwrite orthogonal parameter subspaces encoding prior tasks (stability), resulting in severe performance collapse on baseline grammar.</w:t>
-      </w:r>
-    </w:p>
-    <w:p>
-      <w:pPr>
-        <w:spacing w:before="60" w:after="60" w:line="276" w:lineRule="auto"/>
-      </w:pPr>
-      <w:r>
-        <w:rPr>
-          <w:rFonts w:ascii="Arial" w:hAnsi="Arial"/>
-          <w:b/>
-          <w:color w:val="8A3B14"/>
-          <w:sz w:val="19"/>
-        </w:rPr>
-        <w:t xml:space="preserve">📌 Hebbian Fast Weights &amp; Anti-Hopfield Synaptic Engrams: </w:t>
-      </w:r>
-      <w:r>
-        <w:rPr>
-          <w:rFonts w:ascii="Arial" w:hAnsi="Arial"/>
-          <w:sz w:val="19"/>
-        </w:rPr>
-        <w:t>A biologically inspired 1-shot associative memory mechanism. A memory matrix M of dimension (mem_dim x mem_dim) is updated via outer products: ΔM = η (v_t - M k_t) k_tᵀ, where k_t and v_t are normalized neocortical projections. This allows instant learning in 0.01 seconds without gradient backpropagation.</w:t>
-      </w:r>
-    </w:p>
-    <w:p>
-      <w:pPr>
-        <w:spacing w:before="60" w:after="60" w:line="276" w:lineRule="auto"/>
-      </w:pPr>
-      <w:r>
-        <w:rPr>
-          <w:rFonts w:ascii="Arial" w:hAnsi="Arial"/>
-          <w:b/>
-          <w:color w:val="8A3B14"/>
-          <w:sz w:val="19"/>
-        </w:rPr>
-        <w:t xml:space="preserve">📌 Sharp-Wave Ripple (SWR) Sleep Replay: </w:t>
-      </w:r>
-      <w:r>
-        <w:rPr>
-          <w:rFonts w:ascii="Arial" w:hAnsi="Arial"/>
-          <w:sz w:val="19"/>
-        </w:rPr>
-        <w:t>Offline memory consolidation algorithm. Episodic memory records stored in the Hebbian matrix are replayed at 20x accelerated rate alongside background anchor pairs at conservative learning rates (1e-5), permanently migrating knowledge into Mamba weights without causing mode collapse or grammatical drift.</w:t>
-      </w:r>
-    </w:p>
-    <w:p>
-      <w:pPr>
-        <w:spacing w:before="60" w:after="60" w:line="276" w:lineRule="auto"/>
-      </w:pPr>
-      <w:r>
-        <w:rPr>
-          <w:rFonts w:ascii="Arial" w:hAnsi="Arial"/>
-          <w:b/>
-          <w:color w:val="8A3B14"/>
-          <w:sz w:val="19"/>
-        </w:rPr>
-        <w:t xml:space="preserve">📌 Prompt-Loss Masking: </w:t>
-      </w:r>
-      <w:r>
-        <w:rPr>
-          <w:rFonts w:ascii="Arial" w:hAnsi="Arial"/>
-          <w:sz w:val="19"/>
-        </w:rPr>
-        <w:t>In Supervised Fine-Tuning (SFT), assigning target loss indices to -100 for all bytes belonging to the user prompt: Target_i = -100 for i &lt; prefix_len. The loss is computed strictly over the model's generated response: Loss = CrossEntropy(logits[prefix:], targets[prefix:]).</w:t>
-      </w:r>
-    </w:p>
-    <w:p>
-      <w:pPr>
-        <w:spacing w:before="60" w:after="60" w:line="276" w:lineRule="auto"/>
-      </w:pPr>
-      <w:r>
-        <w:rPr>
-          <w:rFonts w:ascii="Arial" w:hAnsi="Arial"/>
-          <w:b/>
-          <w:color w:val="8A3B14"/>
-          <w:sz w:val="19"/>
-        </w:rPr>
-        <w:t xml:space="preserve">📌 Replay Buffer Anchoring: </w:t>
-      </w:r>
-      <w:r>
-        <w:rPr>
-          <w:rFonts w:ascii="Arial" w:hAnsi="Arial"/>
-          <w:sz w:val="19"/>
-        </w:rPr>
-        <w:t>Regularization technique during online reinforcement learning (RLHF/RLAIF). Every policy update combines the target feedback sample with a mini-batch of foundational anchor pairs (Identity, Geography, Grammar), preventing the model from collapsing its output distribution onto a single reinforced string.</w:t>
-      </w:r>
-    </w:p>
-    <w:p>
-      <w:pPr>
-        <w:pStyle w:val="Heading1"/>
-        <w:spacing w:before="240" w:after="80"/>
-      </w:pPr>
-      <w:r>
-        <w:t>4. End-to-End Engineering Methodology &amp; Data Pipeline</w:t>
-      </w:r>
-    </w:p>
-    <w:p>
-      <w:pPr>
-        <w:spacing w:line="276" w:lineRule="auto"/>
-      </w:pPr>
-      <w:r>
-        <w:rPr>
-          <w:sz w:val="19"/>
-        </w:rPr>
-        <w:t>Our empirical pipeline was executed on an Nvidia GeForce RTX 3090 GPU (24GB VRAM) across 1.465 GB of strictly native, human-authored Amharic text:</w:t>
-        <w:br/>
-        <w:t>1. Data Curation: Curated from Amharic Wikipedia (21.4MB), MasakhaNews (9.5MB), XL-Sum (33.6MB), and GlotCC (1.40GB). Filtered with a strict 30% Ge'ez character ratio threshold and MD5 deduplication into train.bin (1.465 GB) and val.bin (77.1 MB).</w:t>
-        <w:br/>
-        <w:t>2. Architecture Implementation: Built Byte-Level Mamba with selective scan, SentencePiece 16k/32k tokenizers, and baseline Causal Transformers under identical hidden dimensions (d_model=256, 384, 512).</w:t>
-        <w:br/>
-        <w:t>3. Controlled Pre-Training: Pre-trained across 5,000 to 10,000 steps using AdamW optimizer with Cosine Annealing learning rate schedules and FP16 mixed precision.</w:t>
-        <w:br/>
-        <w:t>4. Continual Learning &amp; SFT Alignment: Evaluated 1-shot Hebbian fact acquisition against standard backpropagation, followed by 5-epoch SFT alignment on 4,359 instruction pairs.</w:t>
-      </w:r>
-    </w:p>
-    <w:p>
-      <w:pPr>
-        <w:pStyle w:val="Heading1"/>
-        <w:spacing w:before="240" w:after="80"/>
-      </w:pPr>
-      <w:r>
-        <w:t>5. Empirical Benchmark Results &amp; Analysis</w:t>
-      </w:r>
-    </w:p>
-    <w:p>
-      <w:r>
-        <w:rPr>
-          <w:b/>
-        </w:rPr>
-        <w:t>Table 1: Pre-Training Architecture Benchmark on 1.465 GB Amharic Corpus</w:t>
-      </w:r>
     </w:p>
     <w:tbl>
       <w:tblPr>
         <w:tblW w:type="auto" w:w="0"/>
         <w:jc w:val="center"/>
+        <w:tblLayout w:type="fixed"/>
         <w:tblLook w:firstColumn="1" w:firstRow="1" w:lastColumn="0" w:lastRow="0" w:noHBand="0" w:noVBand="1" w:val="04A0"/>
       </w:tblPr>
       <w:tblGrid>
-        <w:gridCol w:w="1704"/>
-        <w:gridCol w:w="1704"/>
-        <w:gridCol w:w="1704"/>
-        <w:gridCol w:w="1704"/>
-        <w:gridCol w:w="1704"/>
-        <w:gridCol w:w="1704"/>
+        <w:gridCol w:w="9504"/>
       </w:tblGrid>
       <w:tr>
         <w:tc>
           <w:tcPr>
-            <w:tcW w:type="dxa" w:w="1704"/>
-            <w:shd w:fill="1B365D"/>
+            <w:tcW w:type="dxa" w:w="10368"/>
+            <w:shd w:fill="F8FAFC"/>
             <w:tcMar>
-              <w:top w:w="80" w:type="dxa"/>
-              <w:bottom w:w="80" w:type="dxa"/>
-              <w:left w:w="100" w:type="dxa"/>
-              <w:right w:w="100" w:type="dxa"/>
+              <w:top w:w="140" w:type="dxa"/>
+              <w:bottom w:w="140" w:type="dxa"/>
+              <w:left w:w="180" w:type="dxa"/>
+              <w:right w:w="180" w:type="dxa"/>
             </w:tcMar>
           </w:tcPr>
           <w:p>
+            <w:pPr>
+              <w:spacing w:before="0" w:after="40" w:line="276" w:lineRule="auto"/>
+            </w:pPr>
             <w:r>
               <w:rPr>
                 <w:rFonts w:ascii="Arial" w:hAnsi="Arial"/>
                 <w:b/>
-                <w:color w:val="FFFFFF"/>
-                <w:sz w:val="17"/>
+                <w:color w:val="1B365D"/>
+                <w:sz w:val="22"/>
               </w:rPr>
-              <w:t>Model Architecture</w:t>
+              <w:t>TOPIC 2: THE 4 FUNDAMENTAL PROBLEMS IN AMHARIC AI</w:t>
+              <w:br/>
             </w:r>
-          </w:p>
-        </w:tc>
-        <w:tc>
-          <w:tcPr>
-            <w:tcW w:type="dxa" w:w="1704"/>
-            <w:shd w:fill="1B365D"/>
-            <w:tcMar>
-              <w:top w:w="80" w:type="dxa"/>
-              <w:bottom w:w="80" w:type="dxa"/>
-              <w:left w:w="100" w:type="dxa"/>
-              <w:right w:w="100" w:type="dxa"/>
-            </w:tcMar>
-          </w:tcPr>
-          <w:p>
             <w:r>
               <w:rPr>
                 <w:rFonts w:ascii="Arial" w:hAnsi="Arial"/>
-                <w:b/>
-                <w:color w:val="FFFFFF"/>
-                <w:sz w:val="17"/>
+                <w:i/>
+                <w:color w:val="64748B"/>
+                <w:sz w:val="19"/>
               </w:rPr>
-              <w:t>Input Modality</w:t>
+              <w:t>Why normal AI fails on Amharic text</w:t>
             </w:r>
           </w:p>
-        </w:tc>
-        <w:tc>
-          <w:tcPr>
-            <w:tcW w:type="dxa" w:w="1704"/>
-            <w:shd w:fill="1B365D"/>
-            <w:tcMar>
-              <w:top w:w="80" w:type="dxa"/>
-              <w:bottom w:w="80" w:type="dxa"/>
-              <w:left w:w="100" w:type="dxa"/>
-              <w:right w:w="100" w:type="dxa"/>
-            </w:tcMar>
-          </w:tcPr>
           <w:p>
+            <w:pPr>
+              <w:spacing w:before="80" w:after="40" w:line="276" w:lineRule="auto"/>
+            </w:pPr>
             <w:r>
               <w:rPr>
-                <w:rFonts w:ascii="Arial" w:hAnsi="Arial"/>
                 <w:b/>
-                <w:color w:val="FFFFFF"/>
-                <w:sz w:val="17"/>
+                <w:color w:val="D97706"/>
+                <w:sz w:val="19"/>
               </w:rPr>
-              <w:t>Total Params</w:t>
+              <w:t>🎒 Grade-4 Intuitive Story (The Simple Picture):</w:t>
+              <w:br/>
+            </w:r>
+            <w:r>
+              <w:rPr>
+                <w:sz w:val="19"/>
+              </w:rPr>
+              <w:t>Problem 1: 'The Small Library' (Less than 500M clean words exist online). Problem 2: 'The Broken Scissors' (Tokenizers chop 1 Amharic word into 7 pieces). Problem 3: 'The Heavy Backpack' (63% of the robot's brain is wasted carrying a dictionary). Problem 4: 'Goldfish Memory' (Learning today's news makes normal AI forget how to speak Amharic).</w:t>
             </w:r>
           </w:p>
-        </w:tc>
-        <w:tc>
-          <w:tcPr>
-            <w:tcW w:type="dxa" w:w="1704"/>
-            <w:shd w:fill="1B365D"/>
-            <w:tcMar>
-              <w:top w:w="80" w:type="dxa"/>
-              <w:bottom w:w="80" w:type="dxa"/>
-              <w:left w:w="100" w:type="dxa"/>
-              <w:right w:w="100" w:type="dxa"/>
-            </w:tcMar>
-          </w:tcPr>
           <w:p>
+            <w:pPr>
+              <w:spacing w:before="80" w:after="40" w:line="276" w:lineRule="auto"/>
+            </w:pPr>
             <w:r>
               <w:rPr>
-                <w:rFonts w:ascii="Arial" w:hAnsi="Arial"/>
                 <w:b/>
-                <w:color w:val="FFFFFF"/>
-                <w:sz w:val="17"/>
+                <w:color w:val="0F766E"/>
+                <w:sz w:val="19"/>
               </w:rPr>
-              <w:t>Embed Tax (%)</w:t>
+              <w:t>🔬 Professional ML Engineer Depth (The Exact Mechanics &amp; Math):</w:t>
+              <w:br/>
+            </w:r>
+            <w:r>
+              <w:rPr>
+                <w:sz w:val="19"/>
+              </w:rPr>
+              <w:t>1. Data Ceiling: &lt;500M clean tokens available; synthetic translation introduces syntactic corruption. 2. Fertility Tax: UTF-8 Ge'ez (3 bytes/char) causes 3.5x token inflation per word. 3. Parameter Allocation Tax: Embedding matrix V * d_model consumes 62.8% of total parameters in 32k models. 4. Stability-Plasticity Dilemma: Online gradient updates alter orthogonal parameter subspaces, degrading base grammar retention to 42.1%.</w:t>
             </w:r>
           </w:p>
-        </w:tc>
-        <w:tc>
-          <w:tcPr>
-            <w:tcW w:type="dxa" w:w="1704"/>
-            <w:shd w:fill="1B365D"/>
-            <w:tcMar>
-              <w:top w:w="80" w:type="dxa"/>
-              <w:bottom w:w="80" w:type="dxa"/>
-              <w:left w:w="100" w:type="dxa"/>
-              <w:right w:w="100" w:type="dxa"/>
-            </w:tcMar>
-          </w:tcPr>
           <w:p>
+            <w:pPr>
+              <w:spacing w:before="80" w:after="40" w:line="276" w:lineRule="auto"/>
+            </w:pPr>
             <w:r>
               <w:rPr>
-                <w:rFonts w:ascii="Arial" w:hAnsi="Arial"/>
                 <w:b/>
-                <w:color w:val="FFFFFF"/>
-                <w:sz w:val="17"/>
+                <w:color w:val="2563EB"/>
+                <w:sz w:val="19"/>
               </w:rPr>
-              <w:t>Validation BPB</w:t>
+              <w:t>🎙️ What to Say in Your Presentation:</w:t>
+              <w:br/>
             </w:r>
-          </w:p>
-        </w:tc>
-        <w:tc>
-          <w:tcPr>
-            <w:tcW w:type="dxa" w:w="1704"/>
-            <w:shd w:fill="1B365D"/>
-            <w:tcMar>
-              <w:top w:w="80" w:type="dxa"/>
-              <w:bottom w:w="80" w:type="dxa"/>
-              <w:left w:w="100" w:type="dxa"/>
-              <w:right w:w="100" w:type="dxa"/>
-            </w:tcMar>
-          </w:tcPr>
-          <w:p>
             <w:r>
               <w:rPr>
-                <w:rFonts w:ascii="Arial" w:hAnsi="Arial"/>
-                <w:b/>
-                <w:color w:val="FFFFFF"/>
-                <w:sz w:val="17"/>
+                <w:i/>
+                <w:color w:val="1E1E1E"/>
+                <w:sz w:val="19"/>
               </w:rPr>
-              <w:t>Attention Complexity</w:t>
-            </w:r>
-          </w:p>
-        </w:tc>
-      </w:tr>
-      <w:tr>
-        <w:tc>
-          <w:tcPr>
-            <w:tcW w:type="dxa" w:w="1704"/>
-            <w:shd w:fill="FAFAFA"/>
-            <w:tcMar>
-              <w:top w:w="70" w:type="dxa"/>
-              <w:bottom w:w="70" w:type="dxa"/>
-              <w:left w:w="90" w:type="dxa"/>
-              <w:right w:w="90" w:type="dxa"/>
-            </w:tcMar>
-          </w:tcPr>
-          <w:p>
-            <w:r>
-              <w:rPr>
-                <w:rFonts w:ascii="Arial" w:hAnsi="Arial"/>
-                <w:sz w:val="17"/>
-              </w:rPr>
-              <w:t>Transformer (32k)</w:t>
-            </w:r>
-          </w:p>
-        </w:tc>
-        <w:tc>
-          <w:tcPr>
-            <w:tcW w:type="dxa" w:w="1704"/>
-            <w:shd w:fill="FAFAFA"/>
-            <w:tcMar>
-              <w:top w:w="70" w:type="dxa"/>
-              <w:bottom w:w="70" w:type="dxa"/>
-              <w:left w:w="90" w:type="dxa"/>
-              <w:right w:w="90" w:type="dxa"/>
-            </w:tcMar>
-          </w:tcPr>
-          <w:p>
-            <w:r>
-              <w:rPr>
-                <w:rFonts w:ascii="Arial" w:hAnsi="Arial"/>
-                <w:sz w:val="17"/>
-              </w:rPr>
-              <w:t>SentencePiece 32k</w:t>
-            </w:r>
-          </w:p>
-        </w:tc>
-        <w:tc>
-          <w:tcPr>
-            <w:tcW w:type="dxa" w:w="1704"/>
-            <w:shd w:fill="FAFAFA"/>
-            <w:tcMar>
-              <w:top w:w="70" w:type="dxa"/>
-              <w:bottom w:w="70" w:type="dxa"/>
-              <w:left w:w="90" w:type="dxa"/>
-              <w:right w:w="90" w:type="dxa"/>
-            </w:tcMar>
-          </w:tcPr>
-          <w:p>
-            <w:r>
-              <w:rPr>
-                <w:rFonts w:ascii="Arial" w:hAnsi="Arial"/>
-                <w:sz w:val="17"/>
-              </w:rPr>
-              <w:t>13.04 M</w:t>
-            </w:r>
-          </w:p>
-        </w:tc>
-        <w:tc>
-          <w:tcPr>
-            <w:tcW w:type="dxa" w:w="1704"/>
-            <w:shd w:fill="FDF2E9"/>
-            <w:tcMar>
-              <w:top w:w="70" w:type="dxa"/>
-              <w:bottom w:w="70" w:type="dxa"/>
-              <w:left w:w="90" w:type="dxa"/>
-              <w:right w:w="90" w:type="dxa"/>
-            </w:tcMar>
-          </w:tcPr>
-          <w:p>
-            <w:r>
-              <w:rPr>
-                <w:rFonts w:ascii="Arial" w:hAnsi="Arial"/>
-                <w:sz w:val="17"/>
-              </w:rPr>
-              <w:t>62.8% (Wasted)</w:t>
-            </w:r>
-          </w:p>
-        </w:tc>
-        <w:tc>
-          <w:tcPr>
-            <w:tcW w:type="dxa" w:w="1704"/>
-            <w:shd w:fill="FAFAFA"/>
-            <w:tcMar>
-              <w:top w:w="70" w:type="dxa"/>
-              <w:bottom w:w="70" w:type="dxa"/>
-              <w:left w:w="90" w:type="dxa"/>
-              <w:right w:w="90" w:type="dxa"/>
-            </w:tcMar>
-          </w:tcPr>
-          <w:p>
-            <w:r>
-              <w:rPr>
-                <w:rFonts w:ascii="Arial" w:hAnsi="Arial"/>
-                <w:sz w:val="17"/>
-              </w:rPr>
-              <w:t>1.5790 BPB</w:t>
-            </w:r>
-          </w:p>
-        </w:tc>
-        <w:tc>
-          <w:tcPr>
-            <w:tcW w:type="dxa" w:w="1704"/>
-            <w:shd w:fill="FAFAFA"/>
-            <w:tcMar>
-              <w:top w:w="70" w:type="dxa"/>
-              <w:bottom w:w="70" w:type="dxa"/>
-              <w:left w:w="90" w:type="dxa"/>
-              <w:right w:w="90" w:type="dxa"/>
-            </w:tcMar>
-          </w:tcPr>
-          <w:p>
-            <w:r>
-              <w:rPr>
-                <w:rFonts w:ascii="Arial" w:hAnsi="Arial"/>
-                <w:sz w:val="17"/>
-              </w:rPr>
-              <w:t>Quadratic O(L²) ❌</w:t>
-            </w:r>
-          </w:p>
-        </w:tc>
-      </w:tr>
-      <w:tr>
-        <w:tc>
-          <w:tcPr>
-            <w:tcW w:type="dxa" w:w="1704"/>
-            <w:shd w:fill="FFFFFF"/>
-            <w:tcMar>
-              <w:top w:w="70" w:type="dxa"/>
-              <w:bottom w:w="70" w:type="dxa"/>
-              <w:left w:w="90" w:type="dxa"/>
-              <w:right w:w="90" w:type="dxa"/>
-            </w:tcMar>
-          </w:tcPr>
-          <w:p>
-            <w:r>
-              <w:rPr>
-                <w:rFonts w:ascii="Arial" w:hAnsi="Arial"/>
-                <w:sz w:val="17"/>
-              </w:rPr>
-              <w:t>Transformer (16k)</w:t>
-            </w:r>
-          </w:p>
-        </w:tc>
-        <w:tc>
-          <w:tcPr>
-            <w:tcW w:type="dxa" w:w="1704"/>
-            <w:shd w:fill="FFFFFF"/>
-            <w:tcMar>
-              <w:top w:w="70" w:type="dxa"/>
-              <w:bottom w:w="70" w:type="dxa"/>
-              <w:left w:w="90" w:type="dxa"/>
-              <w:right w:w="90" w:type="dxa"/>
-            </w:tcMar>
-          </w:tcPr>
-          <w:p>
-            <w:r>
-              <w:rPr>
-                <w:rFonts w:ascii="Arial" w:hAnsi="Arial"/>
-                <w:sz w:val="17"/>
-              </w:rPr>
-              <w:t>SentencePiece 16k</w:t>
-            </w:r>
-          </w:p>
-        </w:tc>
-        <w:tc>
-          <w:tcPr>
-            <w:tcW w:type="dxa" w:w="1704"/>
-            <w:shd w:fill="FFFFFF"/>
-            <w:tcMar>
-              <w:top w:w="70" w:type="dxa"/>
-              <w:bottom w:w="70" w:type="dxa"/>
-              <w:left w:w="90" w:type="dxa"/>
-              <w:right w:w="90" w:type="dxa"/>
-            </w:tcMar>
-          </w:tcPr>
-          <w:p>
-            <w:r>
-              <w:rPr>
-                <w:rFonts w:ascii="Arial" w:hAnsi="Arial"/>
-                <w:sz w:val="17"/>
-              </w:rPr>
-              <w:t>8.96 M</w:t>
-            </w:r>
-          </w:p>
-        </w:tc>
-        <w:tc>
-          <w:tcPr>
-            <w:tcW w:type="dxa" w:w="1704"/>
-            <w:shd w:fill="FFFFFF"/>
-            <w:tcMar>
-              <w:top w:w="70" w:type="dxa"/>
-              <w:bottom w:w="70" w:type="dxa"/>
-              <w:left w:w="90" w:type="dxa"/>
-              <w:right w:w="90" w:type="dxa"/>
-            </w:tcMar>
-          </w:tcPr>
-          <w:p>
-            <w:r>
-              <w:rPr>
-                <w:rFonts w:ascii="Arial" w:hAnsi="Arial"/>
-                <w:sz w:val="17"/>
-              </w:rPr>
-              <w:t>45.7%</w:t>
-            </w:r>
-          </w:p>
-        </w:tc>
-        <w:tc>
-          <w:tcPr>
-            <w:tcW w:type="dxa" w:w="1704"/>
-            <w:shd w:fill="FFFFFF"/>
-            <w:tcMar>
-              <w:top w:w="70" w:type="dxa"/>
-              <w:bottom w:w="70" w:type="dxa"/>
-              <w:left w:w="90" w:type="dxa"/>
-              <w:right w:w="90" w:type="dxa"/>
-            </w:tcMar>
-          </w:tcPr>
-          <w:p>
-            <w:r>
-              <w:rPr>
-                <w:rFonts w:ascii="Arial" w:hAnsi="Arial"/>
-                <w:sz w:val="17"/>
-              </w:rPr>
-              <w:t>1.4920 BPB</w:t>
-            </w:r>
-          </w:p>
-        </w:tc>
-        <w:tc>
-          <w:tcPr>
-            <w:tcW w:type="dxa" w:w="1704"/>
-            <w:shd w:fill="FFFFFF"/>
-            <w:tcMar>
-              <w:top w:w="70" w:type="dxa"/>
-              <w:bottom w:w="70" w:type="dxa"/>
-              <w:left w:w="90" w:type="dxa"/>
-              <w:right w:w="90" w:type="dxa"/>
-            </w:tcMar>
-          </w:tcPr>
-          <w:p>
-            <w:r>
-              <w:rPr>
-                <w:rFonts w:ascii="Arial" w:hAnsi="Arial"/>
-                <w:sz w:val="17"/>
-              </w:rPr>
-              <w:t>Quadratic O(L²) ❌</w:t>
-            </w:r>
-          </w:p>
-        </w:tc>
-      </w:tr>
-      <w:tr>
-        <w:tc>
-          <w:tcPr>
-            <w:tcW w:type="dxa" w:w="1704"/>
-            <w:shd w:fill="EBF5EE"/>
-            <w:tcMar>
-              <w:top w:w="70" w:type="dxa"/>
-              <w:bottom w:w="70" w:type="dxa"/>
-              <w:left w:w="90" w:type="dxa"/>
-              <w:right w:w="90" w:type="dxa"/>
-            </w:tcMar>
-          </w:tcPr>
-          <w:p>
-            <w:r>
-              <w:rPr>
-                <w:rFonts w:ascii="Arial" w:hAnsi="Arial"/>
-                <w:sz w:val="17"/>
-              </w:rPr>
-              <w:t>TinyMamba (Byte)</w:t>
-            </w:r>
-          </w:p>
-        </w:tc>
-        <w:tc>
-          <w:tcPr>
-            <w:tcW w:type="dxa" w:w="1704"/>
-            <w:shd w:fill="FAFAFA"/>
-            <w:tcMar>
-              <w:top w:w="70" w:type="dxa"/>
-              <w:bottom w:w="70" w:type="dxa"/>
-              <w:left w:w="90" w:type="dxa"/>
-              <w:right w:w="90" w:type="dxa"/>
-            </w:tcMar>
-          </w:tcPr>
-          <w:p>
-            <w:r>
-              <w:rPr>
-                <w:rFonts w:ascii="Arial" w:hAnsi="Arial"/>
-                <w:sz w:val="17"/>
-              </w:rPr>
-              <w:t>Raw UTF-8 Bytes</w:t>
-            </w:r>
-          </w:p>
-        </w:tc>
-        <w:tc>
-          <w:tcPr>
-            <w:tcW w:type="dxa" w:w="1704"/>
-            <w:shd w:fill="FAFAFA"/>
-            <w:tcMar>
-              <w:top w:w="70" w:type="dxa"/>
-              <w:bottom w:w="70" w:type="dxa"/>
-              <w:left w:w="90" w:type="dxa"/>
-              <w:right w:w="90" w:type="dxa"/>
-            </w:tcMar>
-          </w:tcPr>
-          <w:p>
-            <w:r>
-              <w:rPr>
-                <w:rFonts w:ascii="Arial" w:hAnsi="Arial"/>
-                <w:sz w:val="17"/>
-              </w:rPr>
-              <w:t>2.73 M</w:t>
-            </w:r>
-          </w:p>
-        </w:tc>
-        <w:tc>
-          <w:tcPr>
-            <w:tcW w:type="dxa" w:w="1704"/>
-            <w:shd w:fill="FAFAFA"/>
-            <w:tcMar>
-              <w:top w:w="70" w:type="dxa"/>
-              <w:bottom w:w="70" w:type="dxa"/>
-              <w:left w:w="90" w:type="dxa"/>
-              <w:right w:w="90" w:type="dxa"/>
-            </w:tcMar>
-          </w:tcPr>
-          <w:p>
-            <w:r>
-              <w:rPr>
-                <w:rFonts w:ascii="Arial" w:hAnsi="Arial"/>
-                <w:sz w:val="17"/>
-              </w:rPr>
-              <w:t>2.3% (Efficient)</w:t>
-            </w:r>
-          </w:p>
-        </w:tc>
-        <w:tc>
-          <w:tcPr>
-            <w:tcW w:type="dxa" w:w="1704"/>
-            <w:shd w:fill="FAFAFA"/>
-            <w:tcMar>
-              <w:top w:w="70" w:type="dxa"/>
-              <w:bottom w:w="70" w:type="dxa"/>
-              <w:left w:w="90" w:type="dxa"/>
-              <w:right w:w="90" w:type="dxa"/>
-            </w:tcMar>
-          </w:tcPr>
-          <w:p>
-            <w:r>
-              <w:rPr>
-                <w:rFonts w:ascii="Arial" w:hAnsi="Arial"/>
-                <w:sz w:val="17"/>
-              </w:rPr>
-              <w:t>1.3220 BPB</w:t>
-            </w:r>
-          </w:p>
-        </w:tc>
-        <w:tc>
-          <w:tcPr>
-            <w:tcW w:type="dxa" w:w="1704"/>
-            <w:shd w:fill="FAFAFA"/>
-            <w:tcMar>
-              <w:top w:w="70" w:type="dxa"/>
-              <w:bottom w:w="70" w:type="dxa"/>
-              <w:left w:w="90" w:type="dxa"/>
-              <w:right w:w="90" w:type="dxa"/>
-            </w:tcMar>
-          </w:tcPr>
-          <w:p>
-            <w:r>
-              <w:rPr>
-                <w:rFonts w:ascii="Arial" w:hAnsi="Arial"/>
-                <w:sz w:val="17"/>
-              </w:rPr>
-              <w:t>Linear O(L) ⚡</w:t>
-            </w:r>
-          </w:p>
-        </w:tc>
-      </w:tr>
-      <w:tr>
-        <w:tc>
-          <w:tcPr>
-            <w:tcW w:type="dxa" w:w="1704"/>
-            <w:shd w:fill="FFFFFF"/>
-            <w:tcMar>
-              <w:top w:w="70" w:type="dxa"/>
-              <w:bottom w:w="70" w:type="dxa"/>
-              <w:left w:w="90" w:type="dxa"/>
-              <w:right w:w="90" w:type="dxa"/>
-            </w:tcMar>
-          </w:tcPr>
-          <w:p>
-            <w:r>
-              <w:rPr>
-                <w:rFonts w:ascii="Arial" w:hAnsi="Arial"/>
-                <w:sz w:val="17"/>
-              </w:rPr>
-              <w:t>Mamba-Base (26M)</w:t>
-            </w:r>
-          </w:p>
-        </w:tc>
-        <w:tc>
-          <w:tcPr>
-            <w:tcW w:type="dxa" w:w="1704"/>
-            <w:shd w:fill="FFFFFF"/>
-            <w:tcMar>
-              <w:top w:w="70" w:type="dxa"/>
-              <w:bottom w:w="70" w:type="dxa"/>
-              <w:left w:w="90" w:type="dxa"/>
-              <w:right w:w="90" w:type="dxa"/>
-            </w:tcMar>
-          </w:tcPr>
-          <w:p>
-            <w:r>
-              <w:rPr>
-                <w:rFonts w:ascii="Arial" w:hAnsi="Arial"/>
-                <w:sz w:val="17"/>
-              </w:rPr>
-              <w:t>Raw UTF-8 Bytes</w:t>
-            </w:r>
-          </w:p>
-        </w:tc>
-        <w:tc>
-          <w:tcPr>
-            <w:tcW w:type="dxa" w:w="1704"/>
-            <w:shd w:fill="FFFFFF"/>
-            <w:tcMar>
-              <w:top w:w="70" w:type="dxa"/>
-              <w:bottom w:w="70" w:type="dxa"/>
-              <w:left w:w="90" w:type="dxa"/>
-              <w:right w:w="90" w:type="dxa"/>
-            </w:tcMar>
-          </w:tcPr>
-          <w:p>
-            <w:r>
-              <w:rPr>
-                <w:rFonts w:ascii="Arial" w:hAnsi="Arial"/>
-                <w:sz w:val="17"/>
-              </w:rPr>
-              <w:t>26.24 M</w:t>
-            </w:r>
-          </w:p>
-        </w:tc>
-        <w:tc>
-          <w:tcPr>
-            <w:tcW w:type="dxa" w:w="1704"/>
-            <w:shd w:fill="FFFFFF"/>
-            <w:tcMar>
-              <w:top w:w="70" w:type="dxa"/>
-              <w:bottom w:w="70" w:type="dxa"/>
-              <w:left w:w="90" w:type="dxa"/>
-              <w:right w:w="90" w:type="dxa"/>
-            </w:tcMar>
-          </w:tcPr>
-          <w:p>
-            <w:r>
-              <w:rPr>
-                <w:rFonts w:ascii="Arial" w:hAnsi="Arial"/>
-                <w:sz w:val="17"/>
-              </w:rPr>
-              <w:t>0.49%</w:t>
-            </w:r>
-          </w:p>
-        </w:tc>
-        <w:tc>
-          <w:tcPr>
-            <w:tcW w:type="dxa" w:w="1704"/>
-            <w:shd w:fill="EBF5EE"/>
-            <w:tcMar>
-              <w:top w:w="70" w:type="dxa"/>
-              <w:bottom w:w="70" w:type="dxa"/>
-              <w:left w:w="90" w:type="dxa"/>
-              <w:right w:w="90" w:type="dxa"/>
-            </w:tcMar>
-          </w:tcPr>
-          <w:p>
-            <w:r>
-              <w:rPr>
-                <w:rFonts w:ascii="Arial" w:hAnsi="Arial"/>
-                <w:sz w:val="17"/>
-              </w:rPr>
-              <w:t>1.0613 BPB 🏆</w:t>
-            </w:r>
-          </w:p>
-        </w:tc>
-        <w:tc>
-          <w:tcPr>
-            <w:tcW w:type="dxa" w:w="1704"/>
-            <w:shd w:fill="FFFFFF"/>
-            <w:tcMar>
-              <w:top w:w="70" w:type="dxa"/>
-              <w:bottom w:w="70" w:type="dxa"/>
-              <w:left w:w="90" w:type="dxa"/>
-              <w:right w:w="90" w:type="dxa"/>
-            </w:tcMar>
-          </w:tcPr>
-          <w:p>
-            <w:r>
-              <w:rPr>
-                <w:rFonts w:ascii="Arial" w:hAnsi="Arial"/>
-                <w:sz w:val="17"/>
-              </w:rPr>
-              <w:t>Linear O(L) ⚡</w:t>
+              <w:t>"We solved the four major bottlenecks in African AI: the low-resource data ceiling, the 3.5x Token Tax, the 63% vocabulary parameter waste, and catastrophic forgetting during live continual learning."</w:t>
             </w:r>
           </w:p>
         </w:tc>
@@ -1115,464 +278,115 @@
     </w:tbl>
     <w:p>
       <w:pPr>
-        <w:spacing w:after="80"/>
+        <w:spacing w:after="120"/>
       </w:pPr>
-    </w:p>
-    <w:p>
-      <w:r>
-        <w:rPr>
-          <w:b/>
-        </w:rPr>
-        <w:t>Table 2: Continual Learning &amp; Catastrophic Forgetting Benchmark</w:t>
-      </w:r>
     </w:p>
     <w:tbl>
       <w:tblPr>
         <w:tblW w:type="auto" w:w="0"/>
         <w:jc w:val="center"/>
+        <w:tblLayout w:type="fixed"/>
         <w:tblLook w:firstColumn="1" w:firstRow="1" w:lastColumn="0" w:lastRow="0" w:noHBand="0" w:noVBand="1" w:val="04A0"/>
       </w:tblPr>
       <w:tblGrid>
-        <w:gridCol w:w="2045"/>
-        <w:gridCol w:w="2045"/>
-        <w:gridCol w:w="2045"/>
-        <w:gridCol w:w="2045"/>
-        <w:gridCol w:w="2045"/>
+        <w:gridCol w:w="9504"/>
       </w:tblGrid>
       <w:tr>
         <w:tc>
           <w:tcPr>
-            <w:tcW w:type="dxa" w:w="2045"/>
-            <w:shd w:fill="1B365D"/>
+            <w:tcW w:type="dxa" w:w="10368"/>
+            <w:shd w:fill="F8FAFC"/>
             <w:tcMar>
-              <w:top w:w="80" w:type="dxa"/>
-              <w:bottom w:w="80" w:type="dxa"/>
-              <w:left w:w="100" w:type="dxa"/>
-              <w:right w:w="100" w:type="dxa"/>
+              <w:top w:w="140" w:type="dxa"/>
+              <w:bottom w:w="140" w:type="dxa"/>
+              <w:left w:w="180" w:type="dxa"/>
+              <w:right w:w="180" w:type="dxa"/>
             </w:tcMar>
           </w:tcPr>
           <w:p>
+            <w:pPr>
+              <w:spacing w:before="0" w:after="40" w:line="276" w:lineRule="auto"/>
+            </w:pPr>
             <w:r>
               <w:rPr>
                 <w:rFonts w:ascii="Arial" w:hAnsi="Arial"/>
                 <w:b/>
-                <w:color w:val="FFFFFF"/>
-                <w:sz w:val="17"/>
+                <w:color w:val="1B365D"/>
+                <w:sz w:val="22"/>
               </w:rPr>
-              <w:t>Continual Learning Method</w:t>
+              <w:t>TOPIC 3: HOW CAN A VOCABULARY OF ONLY 256 NUMBERS COVER EVERYTHING?</w:t>
+              <w:br/>
             </w:r>
-          </w:p>
-        </w:tc>
-        <w:tc>
-          <w:tcPr>
-            <w:tcW w:type="dxa" w:w="2045"/>
-            <w:shd w:fill="1B365D"/>
-            <w:tcMar>
-              <w:top w:w="80" w:type="dxa"/>
-              <w:bottom w:w="80" w:type="dxa"/>
-              <w:left w:w="100" w:type="dxa"/>
-              <w:right w:w="100" w:type="dxa"/>
-            </w:tcMar>
-          </w:tcPr>
-          <w:p>
             <w:r>
               <w:rPr>
                 <w:rFonts w:ascii="Arial" w:hAnsi="Arial"/>
-                <w:b/>
-                <w:color w:val="FFFFFF"/>
-                <w:sz w:val="17"/>
+                <w:i/>
+                <w:color w:val="64748B"/>
+                <w:sz w:val="19"/>
               </w:rPr>
-              <w:t>Learning Latency</w:t>
+              <w:t>The secret of raw UTF-8 computer bytes</w:t>
             </w:r>
           </w:p>
-        </w:tc>
-        <w:tc>
-          <w:tcPr>
-            <w:tcW w:type="dxa" w:w="2045"/>
-            <w:shd w:fill="1B365D"/>
-            <w:tcMar>
-              <w:top w:w="80" w:type="dxa"/>
-              <w:bottom w:w="80" w:type="dxa"/>
-              <w:left w:w="100" w:type="dxa"/>
-              <w:right w:w="100" w:type="dxa"/>
-            </w:tcMar>
-          </w:tcPr>
           <w:p>
+            <w:pPr>
+              <w:spacing w:before="80" w:after="40" w:line="276" w:lineRule="auto"/>
+            </w:pPr>
             <w:r>
               <w:rPr>
-                <w:rFonts w:ascii="Arial" w:hAnsi="Arial"/>
                 <w:b/>
-                <w:color w:val="FFFFFF"/>
-                <w:sz w:val="17"/>
+                <w:color w:val="D97706"/>
+                <w:sz w:val="19"/>
               </w:rPr>
-              <w:t>1-Shot Fact Recall</w:t>
+              <w:t>🎒 Grade-4 Intuitive Story (The Simple Picture):</w:t>
+              <w:br/>
+            </w:r>
+            <w:r>
+              <w:rPr>
+                <w:sz w:val="19"/>
+              </w:rPr>
+              <w:t>Inside computers, there are only 256 possible bytes (numbers from 0 to 255). English letters use 1 byte (like 'A' = 65). Amharic letters use 3 bytes (like 'ኢ' = 225, 138, 148). The word 'ኢትዮጵያ' is just 18 numbers. Because every number is between 0 and 255, a 256-number vocabulary can read every Ge'ez letter, number, punctuation mark, or slang with ZERO unknown words!</w:t>
             </w:r>
           </w:p>
-        </w:tc>
-        <w:tc>
-          <w:tcPr>
-            <w:tcW w:type="dxa" w:w="2045"/>
-            <w:shd w:fill="1B365D"/>
-            <w:tcMar>
-              <w:top w:w="80" w:type="dxa"/>
-              <w:bottom w:w="80" w:type="dxa"/>
-              <w:left w:w="100" w:type="dxa"/>
-              <w:right w:w="100" w:type="dxa"/>
-            </w:tcMar>
-          </w:tcPr>
           <w:p>
+            <w:pPr>
+              <w:spacing w:before="80" w:after="40" w:line="276" w:lineRule="auto"/>
+            </w:pPr>
             <w:r>
               <w:rPr>
-                <w:rFonts w:ascii="Arial" w:hAnsi="Arial"/>
                 <w:b/>
-                <w:color w:val="FFFFFF"/>
-                <w:sz w:val="17"/>
+                <w:color w:val="0F766E"/>
+                <w:sz w:val="19"/>
               </w:rPr>
-              <w:t>Base Grammar Retention</w:t>
+              <w:t>🔬 Professional ML Engineer Depth (The Exact Mechanics &amp; Math):</w:t>
+              <w:br/>
+            </w:r>
+            <w:r>
+              <w:rPr>
+                <w:sz w:val="19"/>
+              </w:rPr>
+              <w:t>UTF-8 is an 8-bit universal encoding standard (2^8 = 256 discrete values). Ge'ez characters (Unicode U+1200 to U+137F) map deterministically to 3-byte sequences in [0, 255]. A byte-level vocabulary (V=256) provides 100% domain coverage across all unicode blocks, slang, neologisms, and dialectal variations without ever generating an out-of-vocabulary [UNK] token.</w:t>
             </w:r>
           </w:p>
-        </w:tc>
-        <w:tc>
-          <w:tcPr>
-            <w:tcW w:type="dxa" w:w="2045"/>
-            <w:shd w:fill="1B365D"/>
-            <w:tcMar>
-              <w:top w:w="80" w:type="dxa"/>
-              <w:bottom w:w="80" w:type="dxa"/>
-              <w:left w:w="100" w:type="dxa"/>
-              <w:right w:w="100" w:type="dxa"/>
-            </w:tcMar>
-          </w:tcPr>
           <w:p>
+            <w:pPr>
+              <w:spacing w:before="80" w:after="40" w:line="276" w:lineRule="auto"/>
+            </w:pPr>
             <w:r>
               <w:rPr>
-                <w:rFonts w:ascii="Arial" w:hAnsi="Arial"/>
                 <w:b/>
-                <w:color w:val="FFFFFF"/>
-                <w:sz w:val="17"/>
+                <w:color w:val="2563EB"/>
+                <w:sz w:val="19"/>
               </w:rPr>
-              <w:t>Catastrophic Forgetting Status</w:t>
+              <w:t>🎙️ What to Say in Your Presentation:</w:t>
+              <w:br/>
             </w:r>
-          </w:p>
-        </w:tc>
-      </w:tr>
-      <w:tr>
-        <w:tc>
-          <w:tcPr>
-            <w:tcW w:type="dxa" w:w="2045"/>
-            <w:shd w:fill="FDF2E9"/>
-            <w:tcMar>
-              <w:top w:w="70" w:type="dxa"/>
-              <w:bottom w:w="70" w:type="dxa"/>
-              <w:left w:w="90" w:type="dxa"/>
-              <w:right w:w="90" w:type="dxa"/>
-            </w:tcMar>
-          </w:tcPr>
-          <w:p>
             <w:r>
               <w:rPr>
-                <w:rFonts w:ascii="Arial" w:hAnsi="Arial"/>
-                <w:sz w:val="17"/>
+                <w:i/>
+                <w:color w:val="1E1E1E"/>
+                <w:sz w:val="19"/>
               </w:rPr>
-              <w:t>Standard Backpropagation</w:t>
-            </w:r>
-          </w:p>
-        </w:tc>
-        <w:tc>
-          <w:tcPr>
-            <w:tcW w:type="dxa" w:w="2045"/>
-            <w:shd w:fill="FDF2E9"/>
-            <w:tcMar>
-              <w:top w:w="70" w:type="dxa"/>
-              <w:bottom w:w="70" w:type="dxa"/>
-              <w:left w:w="90" w:type="dxa"/>
-              <w:right w:w="90" w:type="dxa"/>
-            </w:tcMar>
-          </w:tcPr>
-          <w:p>
-            <w:r>
-              <w:rPr>
-                <w:rFonts w:ascii="Arial" w:hAnsi="Arial"/>
-                <w:sz w:val="17"/>
-              </w:rPr>
-              <w:t>~4.20 seconds (Slow)</w:t>
-            </w:r>
-          </w:p>
-        </w:tc>
-        <w:tc>
-          <w:tcPr>
-            <w:tcW w:type="dxa" w:w="2045"/>
-            <w:shd w:fill="FDF2E9"/>
-            <w:tcMar>
-              <w:top w:w="70" w:type="dxa"/>
-              <w:bottom w:w="70" w:type="dxa"/>
-              <w:left w:w="90" w:type="dxa"/>
-              <w:right w:w="90" w:type="dxa"/>
-            </w:tcMar>
-          </w:tcPr>
-          <w:p>
-            <w:r>
-              <w:rPr>
-                <w:rFonts w:ascii="Arial" w:hAnsi="Arial"/>
-                <w:sz w:val="17"/>
-              </w:rPr>
-              <w:t>40.0% (Poor)</w:t>
-            </w:r>
-          </w:p>
-        </w:tc>
-        <w:tc>
-          <w:tcPr>
-            <w:tcW w:type="dxa" w:w="2045"/>
-            <w:shd w:fill="FDF2E9"/>
-            <w:tcMar>
-              <w:top w:w="70" w:type="dxa"/>
-              <w:bottom w:w="70" w:type="dxa"/>
-              <w:left w:w="90" w:type="dxa"/>
-              <w:right w:w="90" w:type="dxa"/>
-            </w:tcMar>
-          </w:tcPr>
-          <w:p>
-            <w:r>
-              <w:rPr>
-                <w:rFonts w:ascii="Arial" w:hAnsi="Arial"/>
-                <w:sz w:val="17"/>
-              </w:rPr>
-              <w:t>42.1% (Severe Drift)</w:t>
-            </w:r>
-          </w:p>
-        </w:tc>
-        <w:tc>
-          <w:tcPr>
-            <w:tcW w:type="dxa" w:w="2045"/>
-            <w:shd w:fill="FDF2E9"/>
-            <w:tcMar>
-              <w:top w:w="70" w:type="dxa"/>
-              <w:bottom w:w="70" w:type="dxa"/>
-              <w:left w:w="90" w:type="dxa"/>
-              <w:right w:w="90" w:type="dxa"/>
-            </w:tcMar>
-          </w:tcPr>
-          <w:p>
-            <w:r>
-              <w:rPr>
-                <w:rFonts w:ascii="Arial" w:hAnsi="Arial"/>
-                <w:sz w:val="17"/>
-              </w:rPr>
-              <w:t>Severe Catastrophic Forgetting ❌</w:t>
-            </w:r>
-          </w:p>
-        </w:tc>
-      </w:tr>
-      <w:tr>
-        <w:tc>
-          <w:tcPr>
-            <w:tcW w:type="dxa" w:w="2045"/>
-            <w:shd w:fill="EBF5EE"/>
-            <w:tcMar>
-              <w:top w:w="70" w:type="dxa"/>
-              <w:bottom w:w="70" w:type="dxa"/>
-              <w:left w:w="90" w:type="dxa"/>
-              <w:right w:w="90" w:type="dxa"/>
-            </w:tcMar>
-          </w:tcPr>
-          <w:p>
-            <w:r>
-              <w:rPr>
-                <w:rFonts w:ascii="Arial" w:hAnsi="Arial"/>
-                <w:sz w:val="17"/>
-              </w:rPr>
-              <w:t>Hebbian Engram (Ours)</w:t>
-            </w:r>
-          </w:p>
-        </w:tc>
-        <w:tc>
-          <w:tcPr>
-            <w:tcW w:type="dxa" w:w="2045"/>
-            <w:shd w:fill="FDF2E9"/>
-            <w:tcMar>
-              <w:top w:w="70" w:type="dxa"/>
-              <w:bottom w:w="70" w:type="dxa"/>
-              <w:left w:w="90" w:type="dxa"/>
-              <w:right w:w="90" w:type="dxa"/>
-            </w:tcMar>
-          </w:tcPr>
-          <w:p>
-            <w:r>
-              <w:rPr>
-                <w:rFonts w:ascii="Arial" w:hAnsi="Arial"/>
-                <w:sz w:val="17"/>
-              </w:rPr>
-              <w:t>0.01 seconds (Instant)</w:t>
-            </w:r>
-          </w:p>
-        </w:tc>
-        <w:tc>
-          <w:tcPr>
-            <w:tcW w:type="dxa" w:w="2045"/>
-            <w:shd w:fill="FDF2E9"/>
-            <w:tcMar>
-              <w:top w:w="70" w:type="dxa"/>
-              <w:bottom w:w="70" w:type="dxa"/>
-              <w:left w:w="90" w:type="dxa"/>
-              <w:right w:w="90" w:type="dxa"/>
-            </w:tcMar>
-          </w:tcPr>
-          <w:p>
-            <w:r>
-              <w:rPr>
-                <w:rFonts w:ascii="Arial" w:hAnsi="Arial"/>
-                <w:sz w:val="17"/>
-              </w:rPr>
-              <w:t>100.0% (Perfect)</w:t>
-            </w:r>
-          </w:p>
-        </w:tc>
-        <w:tc>
-          <w:tcPr>
-            <w:tcW w:type="dxa" w:w="2045"/>
-            <w:shd w:fill="FDF2E9"/>
-            <w:tcMar>
-              <w:top w:w="70" w:type="dxa"/>
-              <w:bottom w:w="70" w:type="dxa"/>
-              <w:left w:w="90" w:type="dxa"/>
-              <w:right w:w="90" w:type="dxa"/>
-            </w:tcMar>
-          </w:tcPr>
-          <w:p>
-            <w:r>
-              <w:rPr>
-                <w:rFonts w:ascii="Arial" w:hAnsi="Arial"/>
-                <w:sz w:val="17"/>
-              </w:rPr>
-              <w:t>78.4% (Preserved)</w:t>
-            </w:r>
-          </w:p>
-        </w:tc>
-        <w:tc>
-          <w:tcPr>
-            <w:tcW w:type="dxa" w:w="2045"/>
-            <w:shd w:fill="FDF2E9"/>
-            <w:tcMar>
-              <w:top w:w="70" w:type="dxa"/>
-              <w:bottom w:w="70" w:type="dxa"/>
-              <w:left w:w="90" w:type="dxa"/>
-              <w:right w:w="90" w:type="dxa"/>
-            </w:tcMar>
-          </w:tcPr>
-          <w:p>
-            <w:r>
-              <w:rPr>
-                <w:rFonts w:ascii="Arial" w:hAnsi="Arial"/>
-                <w:sz w:val="17"/>
-              </w:rPr>
-              <w:t>Zero Interference ✅</w:t>
-            </w:r>
-          </w:p>
-        </w:tc>
-      </w:tr>
-      <w:tr>
-        <w:tc>
-          <w:tcPr>
-            <w:tcW w:type="dxa" w:w="2045"/>
-            <w:shd w:fill="FDF2E9"/>
-            <w:tcMar>
-              <w:top w:w="70" w:type="dxa"/>
-              <w:bottom w:w="70" w:type="dxa"/>
-              <w:left w:w="90" w:type="dxa"/>
-              <w:right w:w="90" w:type="dxa"/>
-            </w:tcMar>
-          </w:tcPr>
-          <w:p>
-            <w:r>
-              <w:rPr>
-                <w:rFonts w:ascii="Arial" w:hAnsi="Arial"/>
-                <w:sz w:val="17"/>
-              </w:rPr>
-              <w:t>Engram + Sleep Replay (Ours)</w:t>
-            </w:r>
-          </w:p>
-        </w:tc>
-        <w:tc>
-          <w:tcPr>
-            <w:tcW w:type="dxa" w:w="2045"/>
-            <w:shd w:fill="FDF2E9"/>
-            <w:tcMar>
-              <w:top w:w="70" w:type="dxa"/>
-              <w:bottom w:w="70" w:type="dxa"/>
-              <w:left w:w="90" w:type="dxa"/>
-              <w:right w:w="90" w:type="dxa"/>
-            </w:tcMar>
-          </w:tcPr>
-          <w:p>
-            <w:r>
-              <w:rPr>
-                <w:rFonts w:ascii="Arial" w:hAnsi="Arial"/>
-                <w:sz w:val="17"/>
-              </w:rPr>
-              <w:t>20x Offline Consolidation</w:t>
-            </w:r>
-          </w:p>
-        </w:tc>
-        <w:tc>
-          <w:tcPr>
-            <w:tcW w:type="dxa" w:w="2045"/>
-            <w:shd w:fill="FDF2E9"/>
-            <w:tcMar>
-              <w:top w:w="70" w:type="dxa"/>
-              <w:bottom w:w="70" w:type="dxa"/>
-              <w:left w:w="90" w:type="dxa"/>
-              <w:right w:w="90" w:type="dxa"/>
-            </w:tcMar>
-          </w:tcPr>
-          <w:p>
-            <w:r>
-              <w:rPr>
-                <w:rFonts w:ascii="Arial" w:hAnsi="Arial"/>
-                <w:sz w:val="17"/>
-              </w:rPr>
-              <w:t>100.0% (Permanent)</w:t>
-            </w:r>
-          </w:p>
-        </w:tc>
-        <w:tc>
-          <w:tcPr>
-            <w:tcW w:type="dxa" w:w="2045"/>
-            <w:shd w:fill="FDF2E9"/>
-            <w:tcMar>
-              <w:top w:w="70" w:type="dxa"/>
-              <w:bottom w:w="70" w:type="dxa"/>
-              <w:left w:w="90" w:type="dxa"/>
-              <w:right w:w="90" w:type="dxa"/>
-            </w:tcMar>
-          </w:tcPr>
-          <w:p>
-            <w:r>
-              <w:rPr>
-                <w:rFonts w:ascii="Arial" w:hAnsi="Arial"/>
-                <w:sz w:val="17"/>
-              </w:rPr>
-              <w:t>100.0% (Perfect)</w:t>
-            </w:r>
-          </w:p>
-        </w:tc>
-        <w:tc>
-          <w:tcPr>
-            <w:tcW w:type="dxa" w:w="2045"/>
-            <w:shd w:fill="EBF5EE"/>
-            <w:tcMar>
-              <w:top w:w="70" w:type="dxa"/>
-              <w:bottom w:w="70" w:type="dxa"/>
-              <w:left w:w="90" w:type="dxa"/>
-              <w:right w:w="90" w:type="dxa"/>
-            </w:tcMar>
-          </w:tcPr>
-          <w:p>
-            <w:r>
-              <w:rPr>
-                <w:rFonts w:ascii="Arial" w:hAnsi="Arial"/>
-                <w:sz w:val="17"/>
-              </w:rPr>
-              <w:t>Biologically Consolidated 🏆</w:t>
+              <w:t>"Every character in the universe is encoded in UTF-8 bytes between 0 and 255. In Amharic, each letter is 3 bytes. A vocabulary of 256 numbers gives us 100% universal coverage with zero out-of-vocabulary errors."</w:t>
             </w:r>
           </w:p>
         </w:tc>
@@ -1580,131 +394,824 @@
     </w:tbl>
     <w:p>
       <w:pPr>
-        <w:pStyle w:val="Heading1"/>
-        <w:spacing w:before="280" w:after="80"/>
+        <w:spacing w:after="120"/>
       </w:pPr>
-      <w:r>
-        <w:t>6. Anticipated Presentation Questions &amp; Expert Defense Answers</w:t>
-      </w:r>
     </w:p>
+    <w:tbl>
+      <w:tblPr>
+        <w:tblW w:type="auto" w:w="0"/>
+        <w:jc w:val="center"/>
+        <w:tblLayout w:type="fixed"/>
+        <w:tblLook w:firstColumn="1" w:firstRow="1" w:lastColumn="0" w:lastRow="0" w:noHBand="0" w:noVBand="1" w:val="04A0"/>
+      </w:tblPr>
+      <w:tblGrid>
+        <w:gridCol w:w="9504"/>
+      </w:tblGrid>
+      <w:tr>
+        <w:tc>
+          <w:tcPr>
+            <w:tcW w:type="dxa" w:w="10368"/>
+            <w:shd w:fill="F8FAFC"/>
+            <w:tcMar>
+              <w:top w:w="140" w:type="dxa"/>
+              <w:bottom w:w="140" w:type="dxa"/>
+              <w:left w:w="180" w:type="dxa"/>
+              <w:right w:w="180" w:type="dxa"/>
+            </w:tcMar>
+          </w:tcPr>
+          <w:p>
+            <w:pPr>
+              <w:spacing w:before="0" w:after="40" w:line="276" w:lineRule="auto"/>
+            </w:pPr>
+            <w:r>
+              <w:rPr>
+                <w:rFonts w:ascii="Arial" w:hAnsi="Arial"/>
+                <w:b/>
+                <w:color w:val="1B365D"/>
+                <w:sz w:val="22"/>
+              </w:rPr>
+              <w:t>TOPIC 4: HOW VOCAB SIZE DICTATES MODEL PARAMETERS (AND WHY D_MODEL=256)</w:t>
+              <w:br/>
+            </w:r>
+            <w:r>
+              <w:rPr>
+                <w:rFonts w:ascii="Arial" w:hAnsi="Arial"/>
+                <w:i/>
+                <w:color w:val="64748B"/>
+                <w:sz w:val="19"/>
+              </w:rPr>
+              <w:t>Why large tokenizers waste 63% of a neural network's brain</w:t>
+            </w:r>
+          </w:p>
+          <w:p>
+            <w:pPr>
+              <w:spacing w:before="80" w:after="40" w:line="276" w:lineRule="auto"/>
+            </w:pPr>
+            <w:r>
+              <w:rPr>
+                <w:b/>
+                <w:color w:val="D97706"/>
+                <w:sz w:val="19"/>
+              </w:rPr>
+              <w:t>🎒 Grade-4 Intuitive Story (The Simple Picture):</w:t>
+              <w:br/>
+            </w:r>
+            <w:r>
+              <w:rPr>
+                <w:sz w:val="19"/>
+              </w:rPr>
+              <w:t>Every model has a dictionary table whose size is Vocab Size multiplied by Highway Width (d_model). If Vocab=32,000 and d_model=256, the dictionary alone takes 8.2 million weights! In a 13M model, 63% of the brain is trapped in that dictionary list! With our 256-byte vocab, the dictionary takes only 0.065M (&lt;2.3%), leaving 98% of the model for pure thinking!</w:t>
+            </w:r>
+          </w:p>
+          <w:p>
+            <w:pPr>
+              <w:spacing w:before="80" w:after="40" w:line="276" w:lineRule="auto"/>
+            </w:pPr>
+            <w:r>
+              <w:rPr>
+                <w:b/>
+                <w:color w:val="0F766E"/>
+                <w:sz w:val="19"/>
+              </w:rPr>
+              <w:t>🔬 Professional ML Engineer Depth (The Exact Mechanics &amp; Math):</w:t>
+              <w:br/>
+            </w:r>
+            <w:r>
+              <w:rPr>
+                <w:sz w:val="19"/>
+              </w:rPr>
+              <w:t>The input embedding matrix has dimension V * d_model. For a 32k SentencePiece model with d_model=256, embedding params = 32,000 * 256 = 8,192,000 (62.8% of a 13.04M parameter budget). For byte-level Mamba (V=256), embedding params = 256 * 256 = 65,536 (&lt;2.3%). We set d_model=256 in baselines for controlled scientific parity, scaling to d_model=512 (16 layers, 26.24M) in Mamba-Base.</w:t>
+            </w:r>
+          </w:p>
+          <w:p>
+            <w:pPr>
+              <w:spacing w:before="80" w:after="40" w:line="276" w:lineRule="auto"/>
+            </w:pPr>
+            <w:r>
+              <w:rPr>
+                <w:b/>
+                <w:color w:val="2563EB"/>
+                <w:sz w:val="19"/>
+              </w:rPr>
+              <w:t>🎙️ What to Say in Your Presentation:</w:t>
+              <w:br/>
+            </w:r>
+            <w:r>
+              <w:rPr>
+                <w:i/>
+                <w:color w:val="1E1E1E"/>
+                <w:sz w:val="19"/>
+              </w:rPr>
+              <w:t>"Vocabulary size directly multiplies the embedding matrix. A 32,000-word tokenizer consumes 62.8% of a 13M model's parameter budget. By using a 256-byte vocabulary, we reduce dictionary overhead to under 2.3%, freeing 98% of the parameter capacity for deep multi-layer reasoning."</w:t>
+            </w:r>
+          </w:p>
+        </w:tc>
+      </w:tr>
+    </w:tbl>
     <w:p>
       <w:pPr>
-        <w:spacing w:before="80" w:after="80" w:line="276" w:lineRule="auto"/>
+        <w:spacing w:after="120"/>
       </w:pPr>
-      <w:r>
-        <w:rPr>
-          <w:rFonts w:ascii="Arial" w:hAnsi="Arial"/>
-          <w:b/>
-          <w:color w:val="1B365D"/>
-          <w:sz w:val="19"/>
-        </w:rPr>
-        <w:t>Q1: Why did you eliminate the subword tokenizer rather than training a domain-adapted SentencePiece tokenizer?</w:t>
-        <w:br/>
-      </w:r>
-      <w:r>
-        <w:rPr>
-          <w:rFonts w:ascii="Arial" w:hAnsi="Arial"/>
-          <w:color w:val="282828"/>
-          <w:sz w:val="19"/>
-        </w:rPr>
-        <w:t>👉 Answer: In non-concatenative Semitic languages like Amharic, root letters are modified internally by vowel patterns and affixes. Subword tokenizers fail to isolate lexical roots, resulting in extreme fragmentation and out-of-vocabulary anomalies. More critically, as shown in Table 1, increasing vocabulary size creates an unsustainable Parameter Allocation Tax: on an 8M parameter budget, a 32k vocabulary consumes 62.8% of all model weights in the static embedding table alone. Byte-level modeling uses a fixed 256-byte vocabulary (taking &lt;1% of weights), dedicating 98% of parameters to deep sequence modeling.</w:t>
-      </w:r>
     </w:p>
+    <w:tbl>
+      <w:tblPr>
+        <w:tblW w:type="auto" w:w="0"/>
+        <w:jc w:val="center"/>
+        <w:tblLayout w:type="fixed"/>
+        <w:tblLook w:firstColumn="1" w:firstRow="1" w:lastColumn="0" w:lastRow="0" w:noHBand="0" w:noVBand="1" w:val="04A0"/>
+      </w:tblPr>
+      <w:tblGrid>
+        <w:gridCol w:w="9504"/>
+      </w:tblGrid>
+      <w:tr>
+        <w:tc>
+          <w:tcPr>
+            <w:tcW w:type="dxa" w:w="10368"/>
+            <w:shd w:fill="F8FAFC"/>
+            <w:tcMar>
+              <w:top w:w="140" w:type="dxa"/>
+              <w:bottom w:w="140" w:type="dxa"/>
+              <w:left w:w="180" w:type="dxa"/>
+              <w:right w:w="180" w:type="dxa"/>
+            </w:tcMar>
+          </w:tcPr>
+          <w:p>
+            <w:pPr>
+              <w:spacing w:before="0" w:after="40" w:line="276" w:lineRule="auto"/>
+            </w:pPr>
+            <w:r>
+              <w:rPr>
+                <w:rFonts w:ascii="Arial" w:hAnsi="Arial"/>
+                <w:b/>
+                <w:color w:val="1B365D"/>
+                <w:sz w:val="22"/>
+              </w:rPr>
+              <w:t>TOPIC 5: WHY CHATGPT'S METHOD FAILS &amp; WHY NOT BPE + MAMBA?</w:t>
+              <w:br/>
+            </w:r>
+            <w:r>
+              <w:rPr>
+                <w:rFonts w:ascii="Arial" w:hAnsi="Arial"/>
+                <w:i/>
+                <w:color w:val="64748B"/>
+                <w:sz w:val="19"/>
+              </w:rPr>
+              <w:t>Why pure bytes on Mamba is the superior architectural pairing</w:t>
+            </w:r>
+          </w:p>
+          <w:p>
+            <w:pPr>
+              <w:spacing w:before="80" w:after="40" w:line="276" w:lineRule="auto"/>
+            </w:pPr>
+            <w:r>
+              <w:rPr>
+                <w:b/>
+                <w:color w:val="D97706"/>
+                <w:sz w:val="19"/>
+              </w:rPr>
+              <w:t>🎒 Grade-4 Intuitive Story (The Simple Picture):</w:t>
+              <w:br/>
+            </w:r>
+            <w:r>
+              <w:rPr>
+                <w:sz w:val="19"/>
+              </w:rPr>
+              <w:t>1. ChatGPT's tokenizer does not know Amharic, so it falls back to raw bytes by accident, but gets crushed by quadratic Transformer attention! 2. If we put BPE on Mamba, we would still suffer the 63% Parameter Tax, and rare Amharic words would be underfitted. Furthermore, Amharic modifies words inside 3-letter roots (ስ-ብ-ር). BPE chops roots blindly, while Byte Mamba learns sub-character roots dynamically with 1D convolutions!</w:t>
+            </w:r>
+          </w:p>
+          <w:p>
+            <w:pPr>
+              <w:spacing w:before="80" w:after="40" w:line="276" w:lineRule="auto"/>
+            </w:pPr>
+            <w:r>
+              <w:rPr>
+                <w:b/>
+                <w:color w:val="0F766E"/>
+                <w:sz w:val="19"/>
+              </w:rPr>
+              <w:t>🔬 Professional ML Engineer Depth (The Exact Mechanics &amp; Math):</w:t>
+              <w:br/>
+            </w:r>
+            <w:r>
+              <w:rPr>
+                <w:sz w:val="19"/>
+              </w:rPr>
+              <w:t>ChatGPT's tokenizer (cl100k) lacks Amharic coverage, generating fragmented subwords that explode sequence length under quadratic attention O(L²). Using BPE with Mamba fails because: (1) Embedding tax persists; (2) In &lt;500M token corpora, rare BPE tokens are underfitted due to data sparsity; and (3) Non-concatenative root-and-pattern morphology (e.g. s-b-r) is broken by greedy BPE merges. Byte Mamba's 1D conv (d_conv=4) captures sub-character phonology directly.</w:t>
+            </w:r>
+          </w:p>
+          <w:p>
+            <w:pPr>
+              <w:spacing w:before="80" w:after="40" w:line="276" w:lineRule="auto"/>
+            </w:pPr>
+            <w:r>
+              <w:rPr>
+                <w:b/>
+                <w:color w:val="2563EB"/>
+                <w:sz w:val="19"/>
+              </w:rPr>
+              <w:t>🎙️ What to Say in Your Presentation:</w:t>
+              <w:br/>
+            </w:r>
+            <w:r>
+              <w:rPr>
+                <w:i/>
+                <w:color w:val="1E1E1E"/>
+                <w:sz w:val="19"/>
+              </w:rPr>
+              <w:t>"ChatGPT falls back to bytes accidentally under quadratic attention O(L²). Pairing BPE with Mamba still wastes 60% of weights on embeddings and breaks Semitic root morphology. Byte Mamba uses linear O(L) scans to handle byte length effortlessly while capturing root morphology with local 1D convolutions."</w:t>
+            </w:r>
+          </w:p>
+        </w:tc>
+      </w:tr>
+    </w:tbl>
     <w:p>
       <w:pPr>
-        <w:spacing w:before="80" w:after="80" w:line="276" w:lineRule="auto"/>
+        <w:spacing w:after="120"/>
       </w:pPr>
-      <w:r>
-        <w:rPr>
-          <w:rFonts w:ascii="Arial" w:hAnsi="Arial"/>
-          <w:b/>
-          <w:color w:val="1B365D"/>
-          <w:sz w:val="19"/>
-        </w:rPr>
-        <w:t>Q2: Raw byte sequences are ~3.5x longer than tokenized sequences. Why didn't this cause a catastrophic latency penalty?</w:t>
-        <w:br/>
-      </w:r>
-      <w:r>
-        <w:rPr>
-          <w:rFonts w:ascii="Arial" w:hAnsi="Arial"/>
-          <w:color w:val="282828"/>
-          <w:sz w:val="19"/>
-        </w:rPr>
-        <w:t>👉 Answer: That bottleneck is specific to Transformers, where Self-Attention compute and memory scale quadratically O(L²). In our work, we replaced Transformers with Mamba Selective State Space Models (S6), which process sequences in strict linear time O(L) via Chunked Associative Parallel Scans. Our benchmarks prove that TinyMamba processed 384-byte sequences at 4.3 steps/second with only 4.2GB VRAM on an RTX 3090, outperforming Transformers while using 3x less GPU memory.</w:t>
-      </w:r>
     </w:p>
+    <w:tbl>
+      <w:tblPr>
+        <w:tblW w:type="auto" w:w="0"/>
+        <w:jc w:val="center"/>
+        <w:tblLayout w:type="fixed"/>
+        <w:tblLook w:firstColumn="1" w:firstRow="1" w:lastColumn="0" w:lastRow="0" w:noHBand="0" w:noVBand="1" w:val="04A0"/>
+      </w:tblPr>
+      <w:tblGrid>
+        <w:gridCol w:w="9504"/>
+      </w:tblGrid>
+      <w:tr>
+        <w:tc>
+          <w:tcPr>
+            <w:tcW w:type="dxa" w:w="10368"/>
+            <w:shd w:fill="F8FAFC"/>
+            <w:tcMar>
+              <w:top w:w="140" w:type="dxa"/>
+              <w:bottom w:w="140" w:type="dxa"/>
+              <w:left w:w="180" w:type="dxa"/>
+              <w:right w:w="180" w:type="dxa"/>
+            </w:tcMar>
+          </w:tcPr>
+          <w:p>
+            <w:pPr>
+              <w:spacing w:before="0" w:after="40" w:line="276" w:lineRule="auto"/>
+            </w:pPr>
+            <w:r>
+              <w:rPr>
+                <w:rFonts w:ascii="Arial" w:hAnsi="Arial"/>
+                <w:b/>
+                <w:color w:val="1B365D"/>
+                <w:sz w:val="22"/>
+              </w:rPr>
+              <w:t>TOPIC 6: EXACT ARCHITECTURAL DIFFERENCE: QUADRATIC TRANSFORMER VS. LINEAR MAMBA</w:t>
+              <w:br/>
+            </w:r>
+            <w:r>
+              <w:rPr>
+                <w:rFonts w:ascii="Arial" w:hAnsi="Arial"/>
+                <w:i/>
+                <w:color w:val="64748B"/>
+                <w:sz w:val="19"/>
+              </w:rPr>
+              <w:t>What part of Transformer is O(L²), and how does Mamba's S6 work?</w:t>
+            </w:r>
+          </w:p>
+          <w:p>
+            <w:pPr>
+              <w:spacing w:before="80" w:after="40" w:line="276" w:lineRule="auto"/>
+            </w:pPr>
+            <w:r>
+              <w:rPr>
+                <w:b/>
+                <w:color w:val="D97706"/>
+                <w:sz w:val="19"/>
+              </w:rPr>
+              <w:t>🎒 Grade-4 Intuitive Story (The Simple Picture):</w:t>
+              <w:br/>
+            </w:r>
+            <w:r>
+              <w:rPr>
+                <w:sz w:val="19"/>
+              </w:rPr>
+              <w:t>In a Transformer, the Self-Attention matrix multiplies Query by Key (Q * Kᵀ), creating a giant L × L grid. If a sentence is 1,000 bytes, it calculates 1,000,000 grid cells! If it's 2,000 bytes, it calculates 4,000,000 cells (4x explosion!). Mamba does not build a grid: it reads in a straight line, keeping a rolling mental notepad (hidden state h_t) of 16 numbers, processing text in linear time O(L) with constant memory!</w:t>
+            </w:r>
+          </w:p>
+          <w:p>
+            <w:pPr>
+              <w:spacing w:before="80" w:after="40" w:line="276" w:lineRule="auto"/>
+            </w:pPr>
+            <w:r>
+              <w:rPr>
+                <w:b/>
+                <w:color w:val="0F766E"/>
+                <w:sz w:val="19"/>
+              </w:rPr>
+              <w:t>🔬 Professional ML Engineer Depth (The Exact Mechanics &amp; Math):</w:t>
+              <w:br/>
+            </w:r>
+            <w:r>
+              <w:rPr>
+                <w:sz w:val="19"/>
+              </w:rPr>
+              <w:t>The O(L²) quadratic bottleneck is strictly the causal Self-Attention matrix: A = softmax(Q Kᵀ / sqrt(d)) in R^(L × L). Mamba replaces attention with continuous Selective State Spaces discretized via zero-order hold: h'(t) = A h(t) + B x(t), y(t) = C h(t) + D x(t). Parameters B, C, and step size Δ are input-dependent projections. Using Chunked Associative Parallel Scans (chunk_size=32), Mamba computes recurrence in linear time O(L) with O(1) state memory.</w:t>
+            </w:r>
+          </w:p>
+          <w:p>
+            <w:pPr>
+              <w:spacing w:before="80" w:after="40" w:line="276" w:lineRule="auto"/>
+            </w:pPr>
+            <w:r>
+              <w:rPr>
+                <w:b/>
+                <w:color w:val="2563EB"/>
+                <w:sz w:val="19"/>
+              </w:rPr>
+              <w:t>🎙️ What to Say in Your Presentation:</w:t>
+              <w:br/>
+            </w:r>
+            <w:r>
+              <w:rPr>
+                <w:i/>
+                <w:color w:val="1E1E1E"/>
+                <w:sz w:val="19"/>
+              </w:rPr>
+              <w:t>"The quadratic O(L²) bottleneck in Transformers is specifically the Q * Kᵀ attention matrix. Mamba replaces this with a continuous Selective State Space Model (S6) that tracks a 16-dimensional hidden state in linear time O(L), cutting memory and latency by over 70%."</w:t>
+            </w:r>
+          </w:p>
+        </w:tc>
+      </w:tr>
+    </w:tbl>
     <w:p>
       <w:pPr>
-        <w:spacing w:before="80" w:after="80" w:line="276" w:lineRule="auto"/>
+        <w:spacing w:after="120"/>
       </w:pPr>
-      <w:r>
-        <w:rPr>
-          <w:rFonts w:ascii="Arial" w:hAnsi="Arial"/>
-          <w:b/>
-          <w:color w:val="1B365D"/>
-          <w:sz w:val="19"/>
-        </w:rPr>
-        <w:t>Q3: How do you justify comparing models with different tokenizers using Bits-Per-Byte (BPB)?</w:t>
-        <w:br/>
-      </w:r>
-      <w:r>
-        <w:rPr>
-          <w:rFonts w:ascii="Arial" w:hAnsi="Arial"/>
-          <w:color w:val="282828"/>
-          <w:sz w:val="19"/>
-        </w:rPr>
-        <w:t>👉 Answer: Perplexity is undefined across differing vocabularies because it measures uncertainty per token. A model predicting over 32,000 classes has an inherently different probability scale than a byte model predicting over 256 classes. Bits-Per-Byte (BPB) is an information-theoretic invariant that measures the exact Shannon entropy bits required to compress one UTF-8 byte of text: BPB = (Loss / ln(2)) * (N_tokens / N_bytes). It provides a mathematically rigorous, unbiased comparison.</w:t>
-      </w:r>
     </w:p>
+    <w:tbl>
+      <w:tblPr>
+        <w:tblW w:type="auto" w:w="0"/>
+        <w:jc w:val="center"/>
+        <w:tblLayout w:type="fixed"/>
+        <w:tblLook w:firstColumn="1" w:firstRow="1" w:lastColumn="0" w:lastRow="0" w:noHBand="0" w:noVBand="1" w:val="04A0"/>
+      </w:tblPr>
+      <w:tblGrid>
+        <w:gridCol w:w="9504"/>
+      </w:tblGrid>
+      <w:tr>
+        <w:tc>
+          <w:tcPr>
+            <w:tcW w:type="dxa" w:w="10368"/>
+            <w:shd w:fill="F8FAFC"/>
+            <w:tcMar>
+              <w:top w:w="140" w:type="dxa"/>
+              <w:bottom w:w="140" w:type="dxa"/>
+              <w:left w:w="180" w:type="dxa"/>
+              <w:right w:w="180" w:type="dxa"/>
+            </w:tcMar>
+          </w:tcPr>
+          <w:p>
+            <w:pPr>
+              <w:spacing w:before="0" w:after="40" w:line="276" w:lineRule="auto"/>
+            </w:pPr>
+            <w:r>
+              <w:rPr>
+                <w:rFonts w:ascii="Arial" w:hAnsi="Arial"/>
+                <w:b/>
+                <w:color w:val="1B365D"/>
+                <w:sz w:val="22"/>
+              </w:rPr>
+              <w:t>TOPIC 7: WHAT IS HEBBIAN LEARNING AND WHY DOES IT TAKE 0.01 SECONDS?</w:t>
+              <w:br/>
+            </w:r>
+            <w:r>
+              <w:rPr>
+                <w:rFonts w:ascii="Arial" w:hAnsi="Arial"/>
+                <w:i/>
+                <w:color w:val="64748B"/>
+                <w:sz w:val="19"/>
+              </w:rPr>
+              <w:t>'Neurons that fire together, wire together' without backpropagation</w:t>
+            </w:r>
+          </w:p>
+          <w:p>
+            <w:pPr>
+              <w:spacing w:before="80" w:after="40" w:line="276" w:lineRule="auto"/>
+            </w:pPr>
+            <w:r>
+              <w:rPr>
+                <w:b/>
+                <w:color w:val="D97706"/>
+                <w:sz w:val="19"/>
+              </w:rPr>
+              <w:t>🎒 Grade-4 Intuitive Story (The Simple Picture):</w:t>
+              <w:br/>
+            </w:r>
+            <w:r>
+              <w:rPr>
+                <w:sz w:val="19"/>
+              </w:rPr>
+              <w:t>Standard AI learns by running slow calculus across all 26M weights (takes 4.2 seconds). Hebbian learning is from neuroscience: when two thoughts happen together, it multiplies their vectors in one single mathematical step: ΔM = η (v - M k) kᵀ into a small 256×256 memory matrix. No loss function, no calculus, no gradients! In PyTorch, this takes 0.01 seconds (less than 10 milliseconds) like writing on a sticky note!</w:t>
+            </w:r>
+          </w:p>
+          <w:p>
+            <w:pPr>
+              <w:spacing w:before="80" w:after="40" w:line="276" w:lineRule="auto"/>
+            </w:pPr>
+            <w:r>
+              <w:rPr>
+                <w:b/>
+                <w:color w:val="0F766E"/>
+                <w:sz w:val="19"/>
+              </w:rPr>
+              <w:t>🔬 Professional ML Engineer Depth (The Exact Mechanics &amp; Math):</w:t>
+              <w:br/>
+            </w:r>
+            <w:r>
+              <w:rPr>
+                <w:sz w:val="19"/>
+              </w:rPr>
+              <w:t>Standard fine-tuning requires: forward pass -&gt; loss computation -&gt; backpropagation across all layers -&gt; optimizer state updates (~4.20s). Our Hebbian module executes an Anti-Hopfield outer-product delta update: ΔM = η (v_t - M k_t) k_tᵀ on normalized key/value projections. It operates without backpropagation, computing a closed-form rank-1 matrix addition in under 10ms (0.01s) on GPU.</w:t>
+            </w:r>
+          </w:p>
+          <w:p>
+            <w:pPr>
+              <w:spacing w:before="80" w:after="40" w:line="276" w:lineRule="auto"/>
+            </w:pPr>
+            <w:r>
+              <w:rPr>
+                <w:b/>
+                <w:color w:val="2563EB"/>
+                <w:sz w:val="19"/>
+              </w:rPr>
+              <w:t>🎙️ What to Say in Your Presentation:</w:t>
+              <w:br/>
+            </w:r>
+            <w:r>
+              <w:rPr>
+                <w:i/>
+                <w:color w:val="1E1E1E"/>
+                <w:sz w:val="19"/>
+              </w:rPr>
+              <w:t>"Hebbian learning uses an outer-product associative update from neuroscience. Because it requires no backpropagation or calculus derivatives, it writes new facts into a fast memory matrix in 0.01 seconds with zero computational overhead."</w:t>
+            </w:r>
+          </w:p>
+        </w:tc>
+      </w:tr>
+    </w:tbl>
     <w:p>
       <w:pPr>
-        <w:spacing w:before="80" w:after="80" w:line="276" w:lineRule="auto"/>
+        <w:spacing w:after="120"/>
       </w:pPr>
-      <w:r>
-        <w:rPr>
-          <w:rFonts w:ascii="Arial" w:hAnsi="Arial"/>
-          <w:b/>
-          <w:color w:val="1B365D"/>
-          <w:sz w:val="19"/>
-        </w:rPr>
-        <w:t>Q4: How does your Hebbian Engram memory architecture prevent Catastrophic Forgetting during live deployment?</w:t>
-        <w:br/>
-      </w:r>
-      <w:r>
-        <w:rPr>
-          <w:rFonts w:ascii="Arial" w:hAnsi="Arial"/>
-          <w:color w:val="282828"/>
-          <w:sz w:val="19"/>
-        </w:rPr>
-        <w:t>👉 Answer: Traditional fine-tuning uses gradient backpropagation, which alters global network weights and causes catastrophic forgetting. We implement a Complementary Learning System (CLS): new facts are written in 0.01s to a dedicated Hebbian fast weight matrix (M) using anti-Hopfield outer product updates without touching the slow Mamba backbone. During offline sleep cycles, these facts are replayed with background replay anchors, permanently transferring memory without linguistic drift.</w:t>
-      </w:r>
     </w:p>
+    <w:tbl>
+      <w:tblPr>
+        <w:tblW w:type="auto" w:w="0"/>
+        <w:jc w:val="center"/>
+        <w:tblLayout w:type="fixed"/>
+        <w:tblLook w:firstColumn="1" w:firstRow="1" w:lastColumn="0" w:lastRow="0" w:noHBand="0" w:noVBand="1" w:val="04A0"/>
+      </w:tblPr>
+      <w:tblGrid>
+        <w:gridCol w:w="9504"/>
+      </w:tblGrid>
+      <w:tr>
+        <w:tc>
+          <w:tcPr>
+            <w:tcW w:type="dxa" w:w="10368"/>
+            <w:shd w:fill="F8FAFC"/>
+            <w:tcMar>
+              <w:top w:w="140" w:type="dxa"/>
+              <w:bottom w:w="140" w:type="dxa"/>
+              <w:left w:w="180" w:type="dxa"/>
+              <w:right w:w="180" w:type="dxa"/>
+            </w:tcMar>
+          </w:tcPr>
+          <w:p>
+            <w:pPr>
+              <w:spacing w:before="0" w:after="40" w:line="276" w:lineRule="auto"/>
+            </w:pPr>
+            <w:r>
+              <w:rPr>
+                <w:rFonts w:ascii="Arial" w:hAnsi="Arial"/>
+                <w:b/>
+                <w:color w:val="1B365D"/>
+                <w:sz w:val="22"/>
+              </w:rPr>
+              <w:t>TOPIC 8: DOES IT UPDATE WEIGHTS &amp; HOW IS CATASTROPHIC FORGETTING PREVENTED?</w:t>
+              <w:br/>
+            </w:r>
+            <w:r>
+              <w:rPr>
+                <w:rFonts w:ascii="Arial" w:hAnsi="Arial"/>
+                <w:i/>
+                <w:color w:val="64748B"/>
+                <w:sz w:val="19"/>
+              </w:rPr>
+              <w:t>The 3-shield Complementary Learning System (Day vs Night)</w:t>
+            </w:r>
+          </w:p>
+          <w:p>
+            <w:pPr>
+              <w:spacing w:before="80" w:after="40" w:line="276" w:lineRule="auto"/>
+            </w:pPr>
+            <w:r>
+              <w:rPr>
+                <w:b/>
+                <w:color w:val="D97706"/>
+                <w:sz w:val="19"/>
+              </w:rPr>
+              <w:t>🎒 Grade-4 Intuitive Story (The Simple Picture):</w:t>
+              <w:br/>
+            </w:r>
+            <w:r>
+              <w:rPr>
+                <w:sz w:val="19"/>
+              </w:rPr>
+              <w:t>Daytime: Main 26M Mamba weights are 100% FROZEN. It only updates the fast memory notepad (M) in 0.01s, so grammar is never damaged! Nighttime: Every 30 rounds, it sleeps and replays daytime notes at 20x fast speed mixed with Anchor Sentences (Wikipedia, grammar, geography) at a gentle learning rate (1e-5), permanently baking facts into Mamba weights with 100% grammar retention!</w:t>
+            </w:r>
+          </w:p>
+          <w:p>
+            <w:pPr>
+              <w:spacing w:before="80" w:after="40" w:line="276" w:lineRule="auto"/>
+            </w:pPr>
+            <w:r>
+              <w:rPr>
+                <w:b/>
+                <w:color w:val="0F766E"/>
+                <w:sz w:val="19"/>
+              </w:rPr>
+              <w:t>🔬 Professional ML Engineer Depth (The Exact Mechanics &amp; Math):</w:t>
+              <w:br/>
+            </w:r>
+            <w:r>
+              <w:rPr>
+                <w:sz w:val="19"/>
+              </w:rPr>
+              <w:t>Catastrophic forgetting is eliminated via a 3-stage CLS: (1) Decoupled Fast Weights: Daytime interactive updates modify only the Hebbian matrix M; core Mamba weights remain frozen. (2) Gated Additive Recall: Memory outputs act as an additive residual bias: y = Mamba(x) + 0.5 * W_out(M * k). (3) Replay Buffer Anchoring: During circadian sleep cycles, daytime memories are replayed at 20x speed interleaved with foundational anchor buffers, achieving 100% fact retention and 100% grammar preservation.</w:t>
+            </w:r>
+          </w:p>
+          <w:p>
+            <w:pPr>
+              <w:spacing w:before="80" w:after="40" w:line="276" w:lineRule="auto"/>
+            </w:pPr>
+            <w:r>
+              <w:rPr>
+                <w:b/>
+                <w:color w:val="2563EB"/>
+                <w:sz w:val="19"/>
+              </w:rPr>
+              <w:t>🎙️ What to Say in Your Presentation:</w:t>
+              <w:br/>
+            </w:r>
+            <w:r>
+              <w:rPr>
+                <w:i/>
+                <w:color w:val="1E1E1E"/>
+                <w:sz w:val="19"/>
+              </w:rPr>
+              <w:t>"We prevent catastrophic forgetting using a biological Complementary Learning System: during the day, main Mamba weights remain frozen while facts are stored in fast Hebbian weights. During offline sleep cycles, memories are replayed at 20x speed alongside foundational anchor buffers, permanently transferring knowledge with 100% grammar retention."</w:t>
+            </w:r>
+          </w:p>
+        </w:tc>
+      </w:tr>
+    </w:tbl>
     <w:p>
       <w:pPr>
-        <w:spacing w:before="80" w:after="80" w:line="276" w:lineRule="auto"/>
+        <w:spacing w:after="120"/>
       </w:pPr>
-      <w:r>
-        <w:rPr>
-          <w:rFonts w:ascii="Arial" w:hAnsi="Arial"/>
-          <w:b/>
-          <w:color w:val="1B365D"/>
-          <w:sz w:val="19"/>
-        </w:rPr>
-        <w:t>Q5: What is the broader impact of this research for Ethiopian AI sovereignty?</w:t>
-        <w:br/>
-      </w:r>
-      <w:r>
-        <w:rPr>
-          <w:rFonts w:ascii="Arial" w:hAnsi="Arial"/>
-          <w:color w:val="282828"/>
-          <w:sz w:val="19"/>
-        </w:rPr>
-        <w:t>👉 Answer: This work proves that state-of-the-art AI for low-resource African languages does not require multi-billion-parameter clusters or billions of dollars. By eliminating tokenizers and adopting linear State Space Models with bio-inspired memory, highly capable generative AI can be trained on a single commodity GPU (Nvidia RTX 3090) within a few hours on native datasets.</w:t>
-      </w:r>
+    </w:p>
+    <w:tbl>
+      <w:tblPr>
+        <w:tblW w:type="auto" w:w="0"/>
+        <w:jc w:val="center"/>
+        <w:tblLayout w:type="fixed"/>
+        <w:tblLook w:firstColumn="1" w:firstRow="1" w:lastColumn="0" w:lastRow="0" w:noHBand="0" w:noVBand="1" w:val="04A0"/>
+      </w:tblPr>
+      <w:tblGrid>
+        <w:gridCol w:w="9504"/>
+      </w:tblGrid>
+      <w:tr>
+        <w:tc>
+          <w:tcPr>
+            <w:tcW w:type="dxa" w:w="10368"/>
+            <w:shd w:fill="F8FAFC"/>
+            <w:tcMar>
+              <w:top w:w="140" w:type="dxa"/>
+              <w:bottom w:w="140" w:type="dxa"/>
+              <w:left w:w="180" w:type="dxa"/>
+              <w:right w:w="180" w:type="dxa"/>
+            </w:tcMar>
+          </w:tcPr>
+          <w:p>
+            <w:pPr>
+              <w:spacing w:before="0" w:after="40" w:line="276" w:lineRule="auto"/>
+            </w:pPr>
+            <w:r>
+              <w:rPr>
+                <w:rFonts w:ascii="Arial" w:hAnsi="Arial"/>
+                <w:b/>
+                <w:color w:val="1B365D"/>
+                <w:sz w:val="22"/>
+              </w:rPr>
+              <w:t>TOPIC 9: CORE SCIENTIFIC ASSUMPTIONS MADE IN THIS RESEARCH</w:t>
+              <w:br/>
+            </w:r>
+            <w:r>
+              <w:rPr>
+                <w:rFonts w:ascii="Arial" w:hAnsi="Arial"/>
+                <w:i/>
+                <w:color w:val="64748B"/>
+                <w:sz w:val="19"/>
+              </w:rPr>
+              <w:t>The rigorous theoretical assumptions underlying our findings</w:t>
+            </w:r>
+          </w:p>
+          <w:p>
+            <w:pPr>
+              <w:spacing w:before="80" w:after="40" w:line="276" w:lineRule="auto"/>
+            </w:pPr>
+            <w:r>
+              <w:rPr>
+                <w:b/>
+                <w:color w:val="D97706"/>
+                <w:sz w:val="19"/>
+              </w:rPr>
+              <w:t>🎒 Grade-4 Intuitive Story (The Simple Picture):</w:t>
+              <w:br/>
+            </w:r>
+            <w:r>
+              <w:rPr>
+                <w:sz w:val="19"/>
+              </w:rPr>
+              <w:t>Assumption 1: Native human text is cleaner than machine translations. Assumption 2: Bits-Per-Byte is the only mathematically fair way to compare models with different tokenizers. Assumption 3: Amharic byte streams contain enough local phonetic signal for 1D convolutions to learn character roots without human rules. Assumption 4: Human brain dual-memory can be modeled as Fast Matrix + Slow Neocortex.</w:t>
+            </w:r>
+          </w:p>
+          <w:p>
+            <w:pPr>
+              <w:spacing w:before="80" w:after="40" w:line="276" w:lineRule="auto"/>
+            </w:pPr>
+            <w:r>
+              <w:rPr>
+                <w:b/>
+                <w:color w:val="0F766E"/>
+                <w:sz w:val="19"/>
+              </w:rPr>
+              <w:t>🔬 Professional ML Engineer Depth (The Exact Mechanics &amp; Math):</w:t>
+              <w:br/>
+            </w:r>
+            <w:r>
+              <w:rPr>
+                <w:sz w:val="19"/>
+              </w:rPr>
+              <w:t>1. Data Authenticity: Native human text exhibits lower syntactic entropy than synthetic machine-translated corpora. 2. Metric Invariance: Shannon Bits-Per-Byte (BPB) provides a universally comparable, vocabulary-independent entropy measure across heterogeneous input modalities. 3. Sub-Character Continuity: 1D convolutional receptive fields (d_conv=4) provide sufficient inductive bias to resolve 3-byte Ge'ez character boundaries. 4. Synaptic Decoupling: Dual-timescale weight separation isolates episodic plasticity from semantic stability.</w:t>
+            </w:r>
+          </w:p>
+          <w:p>
+            <w:pPr>
+              <w:spacing w:before="80" w:after="40" w:line="276" w:lineRule="auto"/>
+            </w:pPr>
+            <w:r>
+              <w:rPr>
+                <w:b/>
+                <w:color w:val="2563EB"/>
+                <w:sz w:val="19"/>
+              </w:rPr>
+              <w:t>🎙️ What to Say in Your Presentation:</w:t>
+              <w:br/>
+            </w:r>
+            <w:r>
+              <w:rPr>
+                <w:i/>
+                <w:color w:val="1E1E1E"/>
+                <w:sz w:val="19"/>
+              </w:rPr>
+              <w:t>"Our research rests on four core assumptions: the superiority of native human text over machine translations, the vocabulary-invariant rigor of Bits-Per-Byte evaluation, the ability of 1D convolutions to resolve sub-character Ge'ez roots, and the biological validity of dual-memory consolidation."</w:t>
+            </w:r>
+          </w:p>
+        </w:tc>
+      </w:tr>
+    </w:tbl>
+    <w:p>
+      <w:pPr>
+        <w:spacing w:after="120"/>
+      </w:pPr>
+    </w:p>
+    <w:tbl>
+      <w:tblPr>
+        <w:tblW w:type="auto" w:w="0"/>
+        <w:jc w:val="center"/>
+        <w:tblLayout w:type="fixed"/>
+        <w:tblLook w:firstColumn="1" w:firstRow="1" w:lastColumn="0" w:lastRow="0" w:noHBand="0" w:noVBand="1" w:val="04A0"/>
+      </w:tblPr>
+      <w:tblGrid>
+        <w:gridCol w:w="9504"/>
+      </w:tblGrid>
+      <w:tr>
+        <w:tc>
+          <w:tcPr>
+            <w:tcW w:type="dxa" w:w="10368"/>
+            <w:shd w:fill="F8FAFC"/>
+            <w:tcMar>
+              <w:top w:w="140" w:type="dxa"/>
+              <w:bottom w:w="140" w:type="dxa"/>
+              <w:left w:w="180" w:type="dxa"/>
+              <w:right w:w="180" w:type="dxa"/>
+            </w:tcMar>
+          </w:tcPr>
+          <w:p>
+            <w:pPr>
+              <w:spacing w:before="0" w:after="40" w:line="276" w:lineRule="auto"/>
+            </w:pPr>
+            <w:r>
+              <w:rPr>
+                <w:rFonts w:ascii="Arial" w:hAnsi="Arial"/>
+                <w:b/>
+                <w:color w:val="1B365D"/>
+                <w:sz w:val="22"/>
+              </w:rPr>
+              <w:t>TOPIC 10: FULL ENGINEERING PIPELINE, SFT ALIGNMENT &amp; LIVING AGENT</w:t>
+              <w:br/>
+            </w:r>
+            <w:r>
+              <w:rPr>
+                <w:rFonts w:ascii="Arial" w:hAnsi="Arial"/>
+                <w:i/>
+                <w:color w:val="64748B"/>
+                <w:sz w:val="19"/>
+              </w:rPr>
+              <w:t>From 1.46 GB raw text to a living conversational agent on Telegram</w:t>
+            </w:r>
+          </w:p>
+          <w:p>
+            <w:pPr>
+              <w:spacing w:before="80" w:after="40" w:line="276" w:lineRule="auto"/>
+            </w:pPr>
+            <w:r>
+              <w:rPr>
+                <w:b/>
+                <w:color w:val="D97706"/>
+                <w:sz w:val="19"/>
+              </w:rPr>
+              <w:t>🎒 Grade-4 Intuitive Story (The Simple Picture):</w:t>
+              <w:br/>
+            </w:r>
+            <w:r>
+              <w:rPr>
+                <w:sz w:val="19"/>
+              </w:rPr>
+              <w:t>Step 1: Cleaned 1.46 GB of native Amharic text. Step 2: Pre-trained Mamba-Base (26.24M parameters, 16 layers) for 10,000 steps (achieved record 1.061 BPB). Step 3: SFT Fine-Tuning for 5 epochs on 4,359 Amharic Q&amp;A pairs with Prompt Masking (loss dropped to 0.695 BPB). Step 4: Deployed 'Hayyuu' live on Telegram with dual-candidate voting and an Autonomous 24/7 Self-Play Teacher!</w:t>
+            </w:r>
+          </w:p>
+          <w:p>
+            <w:pPr>
+              <w:spacing w:before="80" w:after="40" w:line="276" w:lineRule="auto"/>
+            </w:pPr>
+            <w:r>
+              <w:rPr>
+                <w:b/>
+                <w:color w:val="0F766E"/>
+                <w:sz w:val="19"/>
+              </w:rPr>
+              <w:t>🔬 Professional ML Engineer Depth (The Exact Mechanics &amp; Math):</w:t>
+              <w:br/>
+            </w:r>
+            <w:r>
+              <w:rPr>
+                <w:sz w:val="19"/>
+              </w:rPr>
+              <w:t>Pipeline execution on Nvidia RTX 3090 (24GB): 1. Pre-training: 10,000 steps on 1.465 GB binary stream (train.bin/val.bin) with activation checkpointing, AMP FP16, AdamW, and cosine decay, reaching validation BPB 1.0613. 2. SFT Alignment: 5 epochs on 4,359 pairs using prompt-loss masking (targets=-100 on user prompt) reaching 0.6949 BPB. 3. Autonomous Living Deployment: Telegram polling daemon coupled with an autonomous self-play RLAIF engine and sleep consolidation cycles.</w:t>
+            </w:r>
+          </w:p>
+          <w:p>
+            <w:pPr>
+              <w:spacing w:before="80" w:after="40" w:line="276" w:lineRule="auto"/>
+            </w:pPr>
+            <w:r>
+              <w:rPr>
+                <w:b/>
+                <w:color w:val="2563EB"/>
+                <w:sz w:val="19"/>
+              </w:rPr>
+              <w:t>🎙️ What to Say in Your Presentation:</w:t>
+              <w:br/>
+            </w:r>
+            <w:r>
+              <w:rPr>
+                <w:i/>
+                <w:color w:val="1E1E1E"/>
+                <w:sz w:val="19"/>
+              </w:rPr>
+              <w:t>"Our pipeline spans 10,000 pre-training steps on 1.46 GB of clean Amharic text, achieving 1.061 BPB, followed by 5-epoch SFT alignment on 4,359 instruction pairs (0.695 BPB) and real-world deployment as the autonomous living agent Hayyuu on Telegram."</w:t>
+            </w:r>
+          </w:p>
+        </w:tc>
+      </w:tr>
+    </w:tbl>
+    <w:p>
+      <w:pPr>
+        <w:spacing w:after="120"/>
+      </w:pPr>
     </w:p>
     <w:sectPr>
       <w:pgSz w:w="12240" w:h="15840"/>
-      <w:pgMar w:top="1008" w:right="1008" w:bottom="1008" w:left="1008" w:header="720" w:footer="720" w:gutter="0"/>
+      <w:pgMar w:top="936" w:right="936" w:bottom="936" w:left="936" w:header="720" w:footer="720" w:gutter="0"/>
       <w:cols w:space="720"/>
       <w:docGrid w:linePitch="360"/>
     </w:sectPr>

</xml_diff>